<commit_message>
Rewrite PROJECT_GUIDE.docx with simpler plain-English explanations
- Step-by-step walkthrough covering all 6 stages
- Every module and file inside core/ explained
- Inputs, outputs, requirements clearly listed
- Simple language for anyone to understand
</commit_message>
<xml_diff>
--- a/InterviewAI/PROJECT_GUIDE.docx
+++ b/InterviewAI/PROJECT_GUIDE.docx
@@ -5,32 +5,14 @@
     <w:p>
       <w:pPr>
         <w:pStyle w:val="Title"/>
-        <w:jc w:val="center"/>
       </w:pPr>
       <w:r>
         <w:t>InterviewAI — Project Guide</w:t>
       </w:r>
     </w:p>
-    <w:p/>
-    <w:p>
-      <w:pPr>
-        <w:jc w:val="center"/>
-      </w:pPr>
-      <w:r>
-        <w:t>CMP7200 Individual Masters Project | Birmingham City University</w:t>
-      </w:r>
-    </w:p>
-    <w:p>
-      <w:pPr>
-        <w:jc w:val="center"/>
-      </w:pPr>
-      <w:r>
-        <w:t>v0.1</w:t>
-      </w:r>
-    </w:p>
     <w:p>
       <w:r>
-        <w:br w:type="page"/>
+        <w:t>A clear explanation of what this project is, how it works, and what every file inside the core/ folder does.</w:t>
       </w:r>
     </w:p>
     <w:p>
@@ -38,12 +20,65 @@
         <w:pStyle w:val="Heading1"/>
       </w:pPr>
       <w:r>
-        <w:t>1. Project Overview</w:t>
+        <w:t>1. What Is This Project?</w:t>
       </w:r>
     </w:p>
     <w:p>
       <w:r>
-        <w:t>InterviewAI is an AI-powered technical interview platform. Candidates upload their CV and a Job Description (JD), and the system performs automated skill gap analysis using the ESCO taxonomy (European standard for skill classification). It then conducts a structured interview in one of two modes:</w:t>
+        <w:t>InterviewAI is an AI-powered interview system. A candidate uploads their Resume (CV) and a Job Description (JD), and the system:</w:t>
+      </w:r>
+    </w:p>
+    <w:p>
+      <w:pPr>
+        <w:pStyle w:val="ListBullet"/>
+      </w:pPr>
+      <w:r>
+        <w:t>Reads the CV and JD to understand the candidate's skills and what the job requires.</w:t>
+      </w:r>
+    </w:p>
+    <w:p>
+      <w:pPr>
+        <w:pStyle w:val="ListBullet"/>
+      </w:pPr>
+      <w:r>
+        <w:t>Builds a skill graph using the ESCO taxonomy (a European standard list of 1,201 IT skills).</w:t>
+      </w:r>
+    </w:p>
+    <w:p>
+      <w:pPr>
+        <w:pStyle w:val="ListBullet"/>
+      </w:pPr>
+      <w:r>
+        <w:t>Compares candidate skills vs job requirements to find gaps.</w:t>
+      </w:r>
+    </w:p>
+    <w:p>
+      <w:pPr>
+        <w:pStyle w:val="ListBullet"/>
+      </w:pPr>
+      <w:r>
+        <w:t>Generates interview questions targeting the weak or missing skills.</w:t>
+      </w:r>
+    </w:p>
+    <w:p>
+      <w:pPr>
+        <w:pStyle w:val="ListBullet"/>
+      </w:pPr>
+      <w:r>
+        <w:t>Asks the questions one by one and evaluates the answers using AI (Gemini).</w:t>
+      </w:r>
+    </w:p>
+    <w:p>
+      <w:pPr>
+        <w:pStyle w:val="ListBullet"/>
+      </w:pPr>
+      <w:r>
+        <w:t>Produces a final report with scores, strengths, gaps, and a hire verdict.</w:t>
+      </w:r>
+    </w:p>
+    <w:p>
+      <w:r>
+        <w:t>The interview can be done in two ways:</w:t>
       </w:r>
     </w:p>
     <w:p>
@@ -54,7 +89,7 @@
         <w:t xml:space="preserve">Text Mode: </w:t>
       </w:r>
       <w:r>
-        <w:t>The candidate types answers to questions in a Streamlit UI. Each answer is evaluated by an LLM-as-Judge (Gemini) and scored in real time.</w:t>
+        <w:t>You type your answers in a web page.</w:t>
       </w:r>
     </w:p>
     <w:p>
@@ -65,12 +100,7 @@
         <w:t xml:space="preserve">LiveKit Mode: </w:t>
       </w:r>
       <w:r>
-        <w:t>A voice-based interview using a self-hosted LiveKit server. The AI agent asks questions via ElevenLabs TTS, listens via Deepgram STT, and the candidate responds through a web-based LiveKit client.</w:t>
-      </w:r>
-    </w:p>
-    <w:p>
-      <w:r>
-        <w:t>After the interview, a structured report is generated showing overall score, per-skill breakdown, strengths, gaps, and recommendations.</w:t>
+        <w:t>You speak your answers through a microphone, and an AI voice agent interviews you.</w:t>
       </w:r>
     </w:p>
     <w:p>
@@ -78,521 +108,79 @@
         <w:pStyle w:val="Heading1"/>
       </w:pPr>
       <w:r>
-        <w:t>2. Directory Structure</w:t>
+        <w:t>2. Inputs &amp; Outputs</w:t>
       </w:r>
     </w:p>
     <w:p>
+      <w:pPr>
+        <w:pStyle w:val="Heading2"/>
+      </w:pPr>
       <w:r>
-        <w:t>Below is the full project layout with a brief description of each file.</w:t>
+        <w:t>Inputs (what you give the system)</w:t>
       </w:r>
     </w:p>
     <w:p>
+      <w:pPr>
+        <w:pStyle w:val="ListBullet"/>
+      </w:pPr>
       <w:r>
-        <w:rPr>
-          <w:rFonts w:ascii="Consolas" w:hAnsi="Consolas"/>
-          <w:sz w:val="18"/>
-        </w:rPr>
-        <w:t xml:space="preserve">  InterviewAI/</w:t>
-      </w:r>
-      <w:r>
-        <w:t xml:space="preserve">  — Project root</w:t>
+        <w:t>Resume / CV — a PDF or text file containing the candidate's work history and skills.</w:t>
       </w:r>
     </w:p>
     <w:p>
+      <w:pPr>
+        <w:pStyle w:val="ListBullet"/>
+      </w:pPr>
       <w:r>
-        <w:rPr>
-          <w:rFonts w:ascii="Consolas" w:hAnsi="Consolas"/>
-          <w:sz w:val="18"/>
-        </w:rPr>
-        <w:t xml:space="preserve">    .env</w:t>
-      </w:r>
-      <w:r>
-        <w:t xml:space="preserve">  — Environment variables (API keys) — not tracked in git</w:t>
+        <w:t>Job Description (JD) — text describing the job role, required skills, and experience level.</w:t>
       </w:r>
     </w:p>
     <w:p>
+      <w:pPr>
+        <w:pStyle w:val="ListBullet"/>
+      </w:pPr>
       <w:r>
-        <w:rPr>
-          <w:rFonts w:ascii="Consolas" w:hAnsi="Consolas"/>
-          <w:sz w:val="18"/>
-        </w:rPr>
-        <w:t xml:space="preserve">    .gitignore</w:t>
-      </w:r>
-      <w:r>
-        <w:t xml:space="preserve">  — Git ignore rules</w:t>
+        <w:t>API Keys — stored in a .env file: Gemini (for AI), Deepgram (for speech-to-text), ElevenLabs (for text-to-speech).</w:t>
       </w:r>
     </w:p>
     <w:p>
+      <w:pPr>
+        <w:pStyle w:val="Heading2"/>
+      </w:pPr>
       <w:r>
-        <w:rPr>
-          <w:rFonts w:ascii="Consolas" w:hAnsi="Consolas"/>
-          <w:sz w:val="18"/>
-        </w:rPr>
-        <w:t xml:space="preserve">    app.py</w:t>
-      </w:r>
-      <w:r>
-        <w:t xml:space="preserve">  — Main entry point (Streamlit). Two-tab UI: Text Mode + LiveKit Mode.</w:t>
+        <w:t>Outputs (what the system gives back)</w:t>
       </w:r>
     </w:p>
     <w:p>
+      <w:pPr>
+        <w:pStyle w:val="ListBullet"/>
+      </w:pPr>
       <w:r>
-        <w:rPr>
-          <w:rFonts w:ascii="Consolas" w:hAnsi="Consolas"/>
-          <w:sz w:val="18"/>
-        </w:rPr>
-        <w:t xml:space="preserve">    requirements.txt</w:t>
-      </w:r>
-      <w:r>
-        <w:t xml:space="preserve">  — Python dependencies</w:t>
+        <w:t>Skill Gap Analysis — which skills the candidate has, which are missing, and which need verification.</w:t>
       </w:r>
     </w:p>
     <w:p>
+      <w:pPr>
+        <w:pStyle w:val="ListBullet"/>
+      </w:pPr>
       <w:r>
-        <w:rPr>
-          <w:rFonts w:ascii="Consolas" w:hAnsi="Consolas"/>
-          <w:sz w:val="18"/>
-        </w:rPr>
-        <w:t xml:space="preserve">    README.md</w:t>
-      </w:r>
-      <w:r>
-        <w:t xml:space="preserve">  — Setup and usage instructions</w:t>
+        <w:t>Interview Questions — a structured set of questions (opening, technical, behavioural, closing).</w:t>
       </w:r>
     </w:p>
     <w:p>
+      <w:pPr>
+        <w:pStyle w:val="ListBullet"/>
+      </w:pPr>
       <w:r>
-        <w:rPr>
-          <w:rFonts w:ascii="Consolas" w:hAnsi="Consolas"/>
-          <w:sz w:val="18"/>
-        </w:rPr>
-        <w:t xml:space="preserve">    generate_guide.py</w:t>
-      </w:r>
-      <w:r>
-        <w:t xml:space="preserve">  — This guide generator script</w:t>
+        <w:t>Answer Scores — each answer gets a score out of 100, with detailed feedback.</w:t>
       </w:r>
     </w:p>
     <w:p>
+      <w:pPr>
+        <w:pStyle w:val="ListBullet"/>
+      </w:pPr>
       <w:r>
-        <w:rPr>
-          <w:rFonts w:ascii="Consolas" w:hAnsi="Consolas"/>
-          <w:sz w:val="18"/>
-        </w:rPr>
-        <w:t xml:space="preserve">    core/</w:t>
-      </w:r>
-      <w:r>
-        <w:t xml:space="preserve">  — Core application package</w:t>
-      </w:r>
-    </w:p>
-    <w:p>
-      <w:r>
-        <w:rPr>
-          <w:rFonts w:ascii="Consolas" w:hAnsi="Consolas"/>
-          <w:sz w:val="18"/>
-        </w:rPr>
-        <w:t xml:space="preserve">      config.py</w:t>
-      </w:r>
-      <w:r>
-        <w:t xml:space="preserve">  — Configuration: env vars, scoring thresholds, interview settings</w:t>
-      </w:r>
-    </w:p>
-    <w:p>
-      <w:r>
-        <w:rPr>
-          <w:rFonts w:ascii="Consolas" w:hAnsi="Consolas"/>
-          <w:sz w:val="18"/>
-        </w:rPr>
-        <w:t xml:space="preserve">      llm.py</w:t>
-      </w:r>
-      <w:r>
-        <w:t xml:space="preserve">  — Unified LLM client — calls Gemini API (text + JSON modes)</w:t>
-      </w:r>
-    </w:p>
-    <w:p>
-      <w:r>
-        <w:rPr>
-          <w:rFonts w:ascii="Consolas" w:hAnsi="Consolas"/>
-          <w:sz w:val="18"/>
-        </w:rPr>
-        <w:t xml:space="preserve">      __init__.py</w:t>
-      </w:r>
-      <w:r>
-        <w:t xml:space="preserve">  — Package marker</w:t>
-      </w:r>
-    </w:p>
-    <w:p>
-      <w:r>
-        <w:rPr>
-          <w:rFonts w:ascii="Consolas" w:hAnsi="Consolas"/>
-          <w:sz w:val="18"/>
-        </w:rPr>
-        <w:t xml:space="preserve">      agents/</w:t>
-      </w:r>
-      <w:r>
-        <w:t xml:space="preserve">  — AI agent modules</w:t>
-      </w:r>
-    </w:p>
-    <w:p>
-      <w:r>
-        <w:rPr>
-          <w:rFonts w:ascii="Consolas" w:hAnsi="Consolas"/>
-          <w:sz w:val="18"/>
-        </w:rPr>
-        <w:t xml:space="preserve">        cv_agent.py</w:t>
-      </w:r>
-      <w:r>
-        <w:t xml:space="preserve">  — CV parser: extracts skills/experience from uploaded PDF or text</w:t>
-      </w:r>
-    </w:p>
-    <w:p>
-      <w:r>
-        <w:rPr>
-          <w:rFonts w:ascii="Consolas" w:hAnsi="Consolas"/>
-          <w:sz w:val="18"/>
-        </w:rPr>
-        <w:t xml:space="preserve">        jd_agent.py</w:t>
-      </w:r>
-      <w:r>
-        <w:t xml:space="preserve">  — JD parser: extracts job title, role level, required skills</w:t>
-      </w:r>
-    </w:p>
-    <w:p>
-      <w:r>
-        <w:rPr>
-          <w:rFonts w:ascii="Consolas" w:hAnsi="Consolas"/>
-          <w:sz w:val="18"/>
-        </w:rPr>
-        <w:t xml:space="preserve">        question_agent.py</w:t>
-      </w:r>
-      <w:r>
-        <w:t xml:space="preserve">  — Question generator: produces structured question sets via LLM</w:t>
-      </w:r>
-    </w:p>
-    <w:p>
-      <w:r>
-        <w:rPr>
-          <w:rFonts w:ascii="Consolas" w:hAnsi="Consolas"/>
-          <w:sz w:val="18"/>
-        </w:rPr>
-        <w:t xml:space="preserve">        __init__.py</w:t>
-      </w:r>
-      <w:r>
-        <w:t xml:space="preserve">  — Package marker</w:t>
-      </w:r>
-    </w:p>
-    <w:p>
-      <w:r>
-        <w:rPr>
-          <w:rFonts w:ascii="Consolas" w:hAnsi="Consolas"/>
-          <w:sz w:val="18"/>
-        </w:rPr>
-        <w:t xml:space="preserve">      evaluator/</w:t>
-      </w:r>
-      <w:r>
-        <w:t xml:space="preserve">  — Answer evaluation module</w:t>
-      </w:r>
-    </w:p>
-    <w:p>
-      <w:r>
-        <w:rPr>
-          <w:rFonts w:ascii="Consolas" w:hAnsi="Consolas"/>
-          <w:sz w:val="18"/>
-        </w:rPr>
-        <w:t xml:space="preserve">        evaluator.py</w:t>
-      </w:r>
-      <w:r>
-        <w:t xml:space="preserve">  — LLM-as-Judge: scores answers (Track A), generates reference answers</w:t>
-      </w:r>
-    </w:p>
-    <w:p>
-      <w:r>
-        <w:rPr>
-          <w:rFonts w:ascii="Consolas" w:hAnsi="Consolas"/>
-          <w:sz w:val="18"/>
-        </w:rPr>
-        <w:t xml:space="preserve">        __init__.py</w:t>
-      </w:r>
-      <w:r>
-        <w:t xml:space="preserve">  — Package marker</w:t>
-      </w:r>
-    </w:p>
-    <w:p>
-      <w:r>
-        <w:rPr>
-          <w:rFonts w:ascii="Consolas" w:hAnsi="Consolas"/>
-          <w:sz w:val="18"/>
-        </w:rPr>
-        <w:t xml:space="preserve">      graph/</w:t>
-      </w:r>
-      <w:r>
-        <w:t xml:space="preserve">  — Skill knowledge graph (ESCO taxonomy)</w:t>
-      </w:r>
-    </w:p>
-    <w:p>
-      <w:r>
-        <w:rPr>
-          <w:rFonts w:ascii="Consolas" w:hAnsi="Consolas"/>
-          <w:sz w:val="18"/>
-        </w:rPr>
-        <w:t xml:space="preserve">        skill_graph.py</w:t>
-      </w:r>
-      <w:r>
-        <w:t xml:space="preserve">  — Builds NetworkX DiGraph from ESCO CSV data</w:t>
-      </w:r>
-    </w:p>
-    <w:p>
-      <w:r>
-        <w:rPr>
-          <w:rFonts w:ascii="Consolas" w:hAnsi="Consolas"/>
-          <w:sz w:val="18"/>
-        </w:rPr>
-        <w:t xml:space="preserve">        state.py</w:t>
-      </w:r>
-      <w:r>
-        <w:t xml:space="preserve">  — InterviewState: tracks per-skill progress during interview</w:t>
-      </w:r>
-    </w:p>
-    <w:p>
-      <w:r>
-        <w:rPr>
-          <w:rFonts w:ascii="Consolas" w:hAnsi="Consolas"/>
-          <w:sz w:val="18"/>
-        </w:rPr>
-        <w:t xml:space="preserve">        traversal.py</w:t>
-      </w:r>
-      <w:r>
-        <w:t xml:space="preserve">  — Adaptive skill picker: selects next skill based on scores</w:t>
-      </w:r>
-    </w:p>
-    <w:p>
-      <w:r>
-        <w:rPr>
-          <w:rFonts w:ascii="Consolas" w:hAnsi="Consolas"/>
-          <w:sz w:val="18"/>
-        </w:rPr>
-        <w:t xml:space="preserve">        visualize.py</w:t>
-      </w:r>
-      <w:r>
-        <w:t xml:space="preserve">  — Graph visualization: renders candidate/JD/gap charts</w:t>
-      </w:r>
-    </w:p>
-    <w:p>
-      <w:r>
-        <w:rPr>
-          <w:rFonts w:ascii="Consolas" w:hAnsi="Consolas"/>
-          <w:sz w:val="18"/>
-        </w:rPr>
-        <w:t xml:space="preserve">        __init__.py</w:t>
-      </w:r>
-      <w:r>
-        <w:t xml:space="preserve">  — Package marker</w:t>
-      </w:r>
-    </w:p>
-    <w:p>
-      <w:r>
-        <w:rPr>
-          <w:rFonts w:ascii="Consolas" w:hAnsi="Consolas"/>
-          <w:sz w:val="18"/>
-        </w:rPr>
-        <w:t xml:space="preserve">      pipeline/</w:t>
-      </w:r>
-      <w:r>
-        <w:t xml:space="preserve">  — Interview orchestration</w:t>
-      </w:r>
-    </w:p>
-    <w:p>
-      <w:r>
-        <w:rPr>
-          <w:rFonts w:ascii="Consolas" w:hAnsi="Consolas"/>
-          <w:sz w:val="18"/>
-        </w:rPr>
-        <w:t xml:space="preserve">        interview_loop.py</w:t>
-      </w:r>
-      <w:r>
-        <w:t xml:space="preserve">  — InterviewLoop class: orchestrates question-&gt;answer-&gt;evaluate cycle</w:t>
-      </w:r>
-    </w:p>
-    <w:p>
-      <w:r>
-        <w:rPr>
-          <w:rFonts w:ascii="Consolas" w:hAnsi="Consolas"/>
-          <w:sz w:val="18"/>
-        </w:rPr>
-        <w:t xml:space="preserve">        __init__.py</w:t>
-      </w:r>
-      <w:r>
-        <w:t xml:space="preserve">  — Package marker</w:t>
-      </w:r>
-    </w:p>
-    <w:p>
-      <w:r>
-        <w:rPr>
-          <w:rFonts w:ascii="Consolas" w:hAnsi="Consolas"/>
-          <w:sz w:val="18"/>
-        </w:rPr>
-        <w:t xml:space="preserve">      report/</w:t>
-      </w:r>
-      <w:r>
-        <w:t xml:space="preserve">  — Report generation</w:t>
-      </w:r>
-    </w:p>
-    <w:p>
-      <w:r>
-        <w:rPr>
-          <w:rFonts w:ascii="Consolas" w:hAnsi="Consolas"/>
-          <w:sz w:val="18"/>
-        </w:rPr>
-        <w:t xml:space="preserve">        generator.py</w:t>
-      </w:r>
-      <w:r>
-        <w:t xml:space="preserve">  — Generates final interview report with scores/verdict/breakdown</w:t>
-      </w:r>
-    </w:p>
-    <w:p>
-      <w:r>
-        <w:rPr>
-          <w:rFonts w:ascii="Consolas" w:hAnsi="Consolas"/>
-          <w:sz w:val="18"/>
-        </w:rPr>
-        <w:t xml:space="preserve">        __init__.py</w:t>
-      </w:r>
-      <w:r>
-        <w:t xml:space="preserve">  — Package marker</w:t>
-      </w:r>
-    </w:p>
-    <w:p>
-      <w:r>
-        <w:rPr>
-          <w:rFonts w:ascii="Consolas" w:hAnsi="Consolas"/>
-          <w:sz w:val="18"/>
-        </w:rPr>
-        <w:t xml:space="preserve">      livekit/</w:t>
-      </w:r>
-      <w:r>
-        <w:t xml:space="preserve">  — LiveKit voice interview system</w:t>
-      </w:r>
-    </w:p>
-    <w:p>
-      <w:r>
-        <w:rPr>
-          <w:rFonts w:ascii="Consolas" w:hAnsi="Consolas"/>
-          <w:sz w:val="18"/>
-        </w:rPr>
-        <w:t xml:space="preserve">        run_agent.py</w:t>
-      </w:r>
-      <w:r>
-        <w:t xml:space="preserve">  — Voice agent: speaks questions (ElevenLabs), listens (Deepgram)</w:t>
-      </w:r>
-    </w:p>
-    <w:p>
-      <w:r>
-        <w:rPr>
-          <w:rFonts w:ascii="Consolas" w:hAnsi="Consolas"/>
-          <w:sz w:val="18"/>
-        </w:rPr>
-        <w:t xml:space="preserve">        whisper_server.py</w:t>
-      </w:r>
-      <w:r>
-        <w:t xml:space="preserve">  — HTTP server: serves client.html, generates LiveKit tokens</w:t>
-      </w:r>
-    </w:p>
-    <w:p>
-      <w:r>
-        <w:rPr>
-          <w:rFonts w:ascii="Consolas" w:hAnsi="Consolas"/>
-          <w:sz w:val="18"/>
-        </w:rPr>
-        <w:t xml:space="preserve">        launcher.py</w:t>
-      </w:r>
-      <w:r>
-        <w:t xml:space="preserve">  — Launches/manages LiveKit server process</w:t>
-      </w:r>
-    </w:p>
-    <w:p>
-      <w:r>
-        <w:rPr>
-          <w:rFonts w:ascii="Consolas" w:hAnsi="Consolas"/>
-          <w:sz w:val="18"/>
-        </w:rPr>
-        <w:t xml:space="preserve">        client.html</w:t>
-      </w:r>
-      <w:r>
-        <w:t xml:space="preserve">  — Web UI for voice interview (camera, chat, transcription)</w:t>
-      </w:r>
-    </w:p>
-    <w:p>
-      <w:r>
-        <w:rPr>
-          <w:rFonts w:ascii="Consolas" w:hAnsi="Consolas"/>
-          <w:sz w:val="18"/>
-        </w:rPr>
-        <w:t xml:space="preserve">        livekit.yaml</w:t>
-      </w:r>
-      <w:r>
-        <w:t xml:space="preserve">  — LiveKit server configuration</w:t>
-      </w:r>
-    </w:p>
-    <w:p>
-      <w:r>
-        <w:rPr>
-          <w:rFonts w:ascii="Consolas" w:hAnsi="Consolas"/>
-          <w:sz w:val="18"/>
-        </w:rPr>
-        <w:t xml:space="preserve">        __init__.py</w:t>
-      </w:r>
-      <w:r>
-        <w:t xml:space="preserve">  — Package marker</w:t>
-      </w:r>
-    </w:p>
-    <w:p>
-      <w:r>
-        <w:rPr>
-          <w:rFonts w:ascii="Consolas" w:hAnsi="Consolas"/>
-          <w:sz w:val="18"/>
-        </w:rPr>
-        <w:t xml:space="preserve">    data/</w:t>
-      </w:r>
-      <w:r>
-        <w:t xml:space="preserve">  — Data files</w:t>
-      </w:r>
-    </w:p>
-    <w:p>
-      <w:r>
-        <w:rPr>
-          <w:rFonts w:ascii="Consolas" w:hAnsi="Consolas"/>
-          <w:sz w:val="18"/>
-        </w:rPr>
-        <w:t xml:space="preserve">      esco/</w:t>
-      </w:r>
-      <w:r>
-        <w:t xml:space="preserve">  — ESCO taxonomy CSVs</w:t>
-      </w:r>
-    </w:p>
-    <w:p>
-      <w:r>
-        <w:rPr>
-          <w:rFonts w:ascii="Consolas" w:hAnsi="Consolas"/>
-          <w:sz w:val="18"/>
-        </w:rPr>
-        <w:t xml:space="preserve">        digitalSkillsCollection_en.csv</w:t>
-      </w:r>
-      <w:r>
-        <w:t xml:space="preserve">  — 1,201 IT skills with descriptions</w:t>
-      </w:r>
-    </w:p>
-    <w:p>
-      <w:r>
-        <w:rPr>
-          <w:rFonts w:ascii="Consolas" w:hAnsi="Consolas"/>
-          <w:sz w:val="18"/>
-        </w:rPr>
-        <w:t xml:space="preserve">        broaderRelationsSkillPillar.csv</w:t>
-      </w:r>
-      <w:r>
-        <w:t xml:space="preserve">  — Skill hierarchy/relationships</w:t>
-      </w:r>
-    </w:p>
-    <w:p>
-      <w:r>
-        <w:br w:type="page"/>
+        <w:t>Final Report — overall score, hire verdict (Strong Hire / Weak Hire / No Hire), per-skill breakdown, strengths, gaps, and full answer log.</w:t>
       </w:r>
     </w:p>
     <w:p>
@@ -600,7 +188,7 @@
         <w:pStyle w:val="Heading1"/>
       </w:pPr>
       <w:r>
-        <w:t>3. Architecture &amp; Flow</w:t>
+        <w:t>3. How It Works — Step by Step</w:t>
       </w:r>
     </w:p>
     <w:p>
@@ -608,7 +196,253 @@
         <w:pStyle w:val="Heading2"/>
       </w:pPr>
       <w:r>
-        <w:t>3.1 Data Flow</w:t>
+        <w:t>Step 1: Parse CV &amp; JD</w:t>
+      </w:r>
+    </w:p>
+    <w:p>
+      <w:pPr>
+        <w:pStyle w:val="ListBullet"/>
+      </w:pPr>
+      <w:r>
+        <w:t>cv_agent.py reads the uploaded CV (PDF or text) and uses Gemini AI to extract: name, list of skills, experience summary.</w:t>
+      </w:r>
+    </w:p>
+    <w:p>
+      <w:pPr>
+        <w:pStyle w:val="ListBullet"/>
+      </w:pPr>
+      <w:r>
+        <w:t>jd_agent.py reads the Job Description and uses Gemini to extract: job title, role level (junior/mid/senior), required skills.</w:t>
+      </w:r>
+    </w:p>
+    <w:p>
+      <w:pPr>
+        <w:pStyle w:val="Heading2"/>
+      </w:pPr>
+      <w:r>
+        <w:t>Step 2: Build Skill Graph</w:t>
+      </w:r>
+    </w:p>
+    <w:p>
+      <w:pPr>
+        <w:pStyle w:val="ListBullet"/>
+      </w:pPr>
+      <w:r>
+        <w:t>skill_graph.py loads the ESCO taxonomy (1,201 IT skills from a CSV file) into a graph structure using NetworkX.</w:t>
+      </w:r>
+    </w:p>
+    <w:p>
+      <w:pPr>
+        <w:pStyle w:val="ListBullet"/>
+      </w:pPr>
+      <w:r>
+        <w:t>It adds modern technologies (Python, React, Docker, etc.) that are not in the official ESCO list.</w:t>
+      </w:r>
+    </w:p>
+    <w:p>
+      <w:pPr>
+        <w:pStyle w:val="ListBullet"/>
+      </w:pPr>
+      <w:r>
+        <w:t>The candidate's skills and the job's required skills are matched against the graph using fuzzy matching.</w:t>
+      </w:r>
+    </w:p>
+    <w:p>
+      <w:pPr>
+        <w:pStyle w:val="Heading2"/>
+      </w:pPr>
+      <w:r>
+        <w:t>Step 3: Gap Analysis</w:t>
+      </w:r>
+    </w:p>
+    <w:p>
+      <w:pPr>
+        <w:pStyle w:val="ListBullet"/>
+      </w:pPr>
+      <w:r>
+        <w:t>The system compares what the candidate knows vs what the job requires.</w:t>
+      </w:r>
+    </w:p>
+    <w:p>
+      <w:pPr>
+        <w:pStyle w:val="ListBullet"/>
+      </w:pPr>
+      <w:r>
+        <w:t>Skills that are missing or weak become "topics" for the interview.</w:t>
+      </w:r>
+    </w:p>
+    <w:p>
+      <w:pPr>
+        <w:pStyle w:val="ListBullet"/>
+      </w:pPr>
+      <w:r>
+        <w:t>Each topic gets a priority (high/medium/low) and a reason explaining why it was selected.</w:t>
+      </w:r>
+    </w:p>
+    <w:p>
+      <w:pPr>
+        <w:pStyle w:val="Heading2"/>
+      </w:pPr>
+      <w:r>
+        <w:t>Step 4: Generate Questions</w:t>
+      </w:r>
+    </w:p>
+    <w:p>
+      <w:pPr>
+        <w:pStyle w:val="ListBullet"/>
+      </w:pPr>
+      <w:r>
+        <w:t>question_agent.py takes the topics and uses Gemini to generate a full interview question set.</w:t>
+      </w:r>
+    </w:p>
+    <w:p>
+      <w:pPr>
+        <w:pStyle w:val="ListBullet"/>
+      </w:pPr>
+      <w:r>
+        <w:t>The set includes: opening questions (warm-up), technical questions (one per skill), behavioural questions (STAR format), closing questions.</w:t>
+      </w:r>
+    </w:p>
+    <w:p>
+      <w:pPr>
+        <w:pStyle w:val="ListBullet"/>
+      </w:pPr>
+      <w:r>
+        <w:t>Each question has a difficulty level, follow-up probe, and estimated duration.</w:t>
+      </w:r>
+    </w:p>
+    <w:p>
+      <w:pPr>
+        <w:pStyle w:val="Heading2"/>
+      </w:pPr>
+      <w:r>
+        <w:t>Step 5: Conduct Interview</w:t>
+      </w:r>
+    </w:p>
+    <w:p>
+      <w:pPr>
+        <w:pStyle w:val="ListBullet"/>
+      </w:pPr>
+      <w:r>
+        <w:t>The InterviewLoop (interview_loop.py) takes control.</w:t>
+      </w:r>
+    </w:p>
+    <w:p>
+      <w:pPr>
+        <w:pStyle w:val="ListBullet"/>
+      </w:pPr>
+      <w:r>
+        <w:t>It picks the next skill to test — always the one with the lowest score first (adaptive strategy).</w:t>
+      </w:r>
+    </w:p>
+    <w:p>
+      <w:pPr>
+        <w:pStyle w:val="ListBullet"/>
+      </w:pPr>
+      <w:r>
+        <w:t>For each skill, it generates a fresh question on the fly using Gemini.</w:t>
+      </w:r>
+    </w:p>
+    <w:p>
+      <w:pPr>
+        <w:pStyle w:val="ListBullet"/>
+      </w:pPr>
+      <w:r>
+        <w:t>The candidate answers (either by typing in Text Mode or speaking in LiveKit Mode).</w:t>
+      </w:r>
+    </w:p>
+    <w:p>
+      <w:pPr>
+        <w:pStyle w:val="ListBullet"/>
+      </w:pPr>
+      <w:r>
+        <w:t>The answer is scored by evaluator.py using LLM-as-Judge (two parallel Gemini calls to reduce bias).</w:t>
+      </w:r>
+    </w:p>
+    <w:p>
+      <w:pPr>
+        <w:pStyle w:val="ListBullet"/>
+      </w:pPr>
+      <w:r>
+        <w:t>If the answer is weak, a follow-up question may be asked (max 1 per skill).</w:t>
+      </w:r>
+    </w:p>
+    <w:p>
+      <w:pPr>
+        <w:pStyle w:val="ListBullet"/>
+      </w:pPr>
+      <w:r>
+        <w:t>The loop continues until all skills are verified or the question limit is reached.</w:t>
+      </w:r>
+    </w:p>
+    <w:p>
+      <w:pPr>
+        <w:pStyle w:val="Heading2"/>
+      </w:pPr>
+      <w:r>
+        <w:t>Step 6: Generate Report</w:t>
+      </w:r>
+    </w:p>
+    <w:p>
+      <w:pPr>
+        <w:pStyle w:val="ListBullet"/>
+      </w:pPr>
+      <w:r>
+        <w:t>After the interview, report/generator.py creates a final report.</w:t>
+      </w:r>
+    </w:p>
+    <w:p>
+      <w:pPr>
+        <w:pStyle w:val="ListBullet"/>
+      </w:pPr>
+      <w:r>
+        <w:t>It calculates the overall score (average of all answers).</w:t>
+      </w:r>
+    </w:p>
+    <w:p>
+      <w:pPr>
+        <w:pStyle w:val="ListBullet"/>
+      </w:pPr>
+      <w:r>
+        <w:t>It assigns a verdict: Strong Hire (≥70), Weak Hire (40-69), No Hire (&lt;40).</w:t>
+      </w:r>
+    </w:p>
+    <w:p>
+      <w:pPr>
+        <w:pStyle w:val="ListBullet"/>
+      </w:pPr>
+      <w:r>
+        <w:t>It lists strengths (skills scoring ≥70), gaps (skills scoring &lt;40), and development areas.</w:t>
+      </w:r>
+    </w:p>
+    <w:p>
+      <w:pPr>
+        <w:pStyle w:val="ListBullet"/>
+      </w:pPr>
+      <w:r>
+        <w:t>It includes a full answer log with questions, answers, scores, and feedback.</w:t>
+      </w:r>
+    </w:p>
+    <w:p>
+      <w:pPr>
+        <w:pStyle w:val="Heading1"/>
+      </w:pPr>
+      <w:r>
+        <w:t>4. Modules &amp; Components</w:t>
+      </w:r>
+    </w:p>
+    <w:p>
+      <w:r>
+        <w:t>The project has 7 main modules inside core/. Each module has a specific job:</w:t>
+      </w:r>
+    </w:p>
+    <w:p>
+      <w:r>
+        <w:rPr>
+          <w:b/>
+          <w:sz w:val="24"/>
+        </w:rPr>
+        <w:t xml:space="preserve">agents/ </w:t>
       </w:r>
     </w:p>
     <w:p>
@@ -616,10 +450,19 @@
         <w:rPr>
           <w:b/>
         </w:rPr>
-        <w:t xml:space="preserve">1. Input: </w:t>
+        <w:t xml:space="preserve">Parsing &amp; Question Generation: </w:t>
       </w:r>
       <w:r>
-        <w:t>User uploads CV (PDF/text) and pastes a Job Description in the Streamlit UI.</w:t>
+        <w:t>Contains 3 files: cv_agent.py (reads CV), jd_agent.py (reads JD), question_agent.py (generates interview questions).</w:t>
+      </w:r>
+    </w:p>
+    <w:p>
+      <w:r>
+        <w:rPr>
+          <w:b/>
+          <w:sz w:val="24"/>
+        </w:rPr>
+        <w:t xml:space="preserve">evaluator/ </w:t>
       </w:r>
     </w:p>
     <w:p>
@@ -627,10 +470,19 @@
         <w:rPr>
           <w:b/>
         </w:rPr>
-        <w:t xml:space="preserve">2. Parsing: </w:t>
+        <w:t xml:space="preserve">Answer Scoring: </w:t>
       </w:r>
       <w:r>
-        <w:t>cv_agent.py extracts candidate skills/experience. jd_agent.py extracts job title, role level, and required skills.</w:t>
+        <w:t>Contains evaluator.py which uses Gemini to score answers on 4 criteria: technical accuracy, completeness, clarity, relevance.</w:t>
+      </w:r>
+    </w:p>
+    <w:p>
+      <w:r>
+        <w:rPr>
+          <w:b/>
+          <w:sz w:val="24"/>
+        </w:rPr>
+        <w:t xml:space="preserve">graph/ </w:t>
       </w:r>
     </w:p>
     <w:p>
@@ -638,10 +490,19 @@
         <w:rPr>
           <w:b/>
         </w:rPr>
-        <w:t xml:space="preserve">3. Skill Graph: </w:t>
+        <w:t xml:space="preserve">Skill Knowledge Graph: </w:t>
       </w:r>
       <w:r>
-        <w:t>skill_graph.py builds a NetworkX graph from ESCO taxonomy (1,201 IT skills). Candidate and JD skills are mapped to ESCO URIs via fuzzy matching.</w:t>
+        <w:t>Contains 4 files: skill_graph.py (builds ESCO graph), state.py (tracks interview progress), traversal.py (chooses next skill), visualize.py (draws charts).</w:t>
+      </w:r>
+    </w:p>
+    <w:p>
+      <w:r>
+        <w:rPr>
+          <w:b/>
+          <w:sz w:val="24"/>
+        </w:rPr>
+        <w:t xml:space="preserve">pipeline/ </w:t>
       </w:r>
     </w:p>
     <w:p>
@@ -649,10 +510,19 @@
         <w:rPr>
           <w:b/>
         </w:rPr>
-        <w:t xml:space="preserve">4. Gap Analysis: </w:t>
+        <w:t xml:space="preserve">Interview Orchestrator: </w:t>
       </w:r>
       <w:r>
-        <w:t>The graph compares candidate skills vs JD requirements to identify gaps. Topics are generated for skills needing verification.</w:t>
+        <w:t>Contains interview_loop.py which runs the question → answer → evaluate cycle.</w:t>
+      </w:r>
+    </w:p>
+    <w:p>
+      <w:r>
+        <w:rPr>
+          <w:b/>
+          <w:sz w:val="24"/>
+        </w:rPr>
+        <w:t xml:space="preserve">report/ </w:t>
       </w:r>
     </w:p>
     <w:p>
@@ -660,10 +530,19 @@
         <w:rPr>
           <w:b/>
         </w:rPr>
-        <w:t xml:space="preserve">5. Question Generation: </w:t>
+        <w:t xml:space="preserve">Final Report: </w:t>
       </w:r>
       <w:r>
-        <w:t>question_agent.py uses Gemini LLM to generate a structured interview: opening questions, technical questions per skill, behavioural questions, closing.</w:t>
+        <w:t>Contains generator.py which builds the final structured report.</w:t>
+      </w:r>
+    </w:p>
+    <w:p>
+      <w:r>
+        <w:rPr>
+          <w:b/>
+          <w:sz w:val="24"/>
+        </w:rPr>
+        <w:t xml:space="preserve">livekit/ </w:t>
       </w:r>
     </w:p>
     <w:p>
@@ -671,10 +550,19 @@
         <w:rPr>
           <w:b/>
         </w:rPr>
-        <w:t xml:space="preserve">6. Interview Loop: </w:t>
+        <w:t xml:space="preserve">Voice Interview System: </w:t>
       </w:r>
       <w:r>
-        <w:t>InterviewLoop (interview_loop.py) cycles through skills, generating position-specific questions on the fly, collecting answers, and evaluating them.</w:t>
+        <w:t>Contains 4 files + client.html: run_agent.py (voice agent), whisper_server.py (HTTP server), launcher.py (server manager), livekit.yaml (config).</w:t>
+      </w:r>
+    </w:p>
+    <w:p>
+      <w:r>
+        <w:rPr>
+          <w:b/>
+          <w:sz w:val="24"/>
+        </w:rPr>
+        <w:t xml:space="preserve">config.py + llm.py </w:t>
       </w:r>
     </w:p>
     <w:p>
@@ -682,164 +570,10 @@
         <w:rPr>
           <w:b/>
         </w:rPr>
-        <w:t xml:space="preserve">7. Evaluation: </w:t>
+        <w:t xml:space="preserve">Configuration &amp; AI Client: </w:t>
       </w:r>
       <w:r>
-        <w:t>evaluator.py uses LLM-as-Judge (Track A — two parallel Gemini calls with different criterion orderings, scores averaged).</w:t>
-      </w:r>
-    </w:p>
-    <w:p>
-      <w:r>
-        <w:rPr>
-          <w:b/>
-        </w:rPr>
-        <w:t xml:space="preserve">8. Report: </w:t>
-      </w:r>
-      <w:r>
-        <w:t>generator.py produces a final report with overall score, per-skill breakdown, strengths/gaps, and answer log.</w:t>
-      </w:r>
-    </w:p>
-    <w:p>
-      <w:pPr>
-        <w:pStyle w:val="Heading2"/>
-      </w:pPr>
-      <w:r>
-        <w:t>3.2 Two Interview Modes</w:t>
-      </w:r>
-    </w:p>
-    <w:p>
-      <w:pPr>
-        <w:pStyle w:val="Heading3"/>
-      </w:pPr>
-      <w:r>
-        <w:t>Text Mode</w:t>
-      </w:r>
-    </w:p>
-    <w:p>
-      <w:r>
-        <w:t>In Text Mode, the candidate answers questions by typing in a Streamlit text area. The flow is:</w:t>
-      </w:r>
-    </w:p>
-    <w:p>
-      <w:pPr>
-        <w:pStyle w:val="ListBullet"/>
-      </w:pPr>
-      <w:r>
-        <w:t>InterviewLoop.get_next_question() picks the next skill adaptively (lowest score first).</w:t>
-      </w:r>
-    </w:p>
-    <w:p>
-      <w:pPr>
-        <w:pStyle w:val="ListBullet"/>
-      </w:pPr>
-      <w:r>
-        <w:t>generate_position_question() creates a question tailored to the skill, difficulty, and job context.</w:t>
-      </w:r>
-    </w:p>
-    <w:p>
-      <w:pPr>
-        <w:pStyle w:val="ListBullet"/>
-      </w:pPr>
-      <w:r>
-        <w:t>The candidate types an answer and clicks Submit.</w:t>
-      </w:r>
-    </w:p>
-    <w:p>
-      <w:pPr>
-        <w:pStyle w:val="ListBullet"/>
-      </w:pPr>
-      <w:r>
-        <w:t>evaluate_answer() runs LLM-as-Judge (two Gemini calls, scores averaged).</w:t>
-      </w:r>
-    </w:p>
-    <w:p>
-      <w:pPr>
-        <w:pStyle w:val="ListBullet"/>
-      </w:pPr>
-      <w:r>
-        <w:t>The result (score, verdict, feedback) is displayed. The loop continues until all skills are verified or max questions reached.</w:t>
-      </w:r>
-    </w:p>
-    <w:p>
-      <w:pPr>
-        <w:pStyle w:val="ListBullet"/>
-      </w:pPr>
-      <w:r>
-        <w:t>A final report is generated with full breakdown.</w:t>
-      </w:r>
-    </w:p>
-    <w:p>
-      <w:pPr>
-        <w:pStyle w:val="Heading3"/>
-      </w:pPr>
-      <w:r>
-        <w:t>LiveKit Mode</w:t>
-      </w:r>
-    </w:p>
-    <w:p>
-      <w:r>
-        <w:t>In LiveKit Mode, the interview is conducted via voice using a self-hosted LiveKit server. The flow is:</w:t>
-      </w:r>
-    </w:p>
-    <w:p>
-      <w:pPr>
-        <w:pStyle w:val="ListBullet"/>
-      </w:pPr>
-      <w:r>
-        <w:t>whisper_server.py serves an HTML page (client.html) and generates LiveKit access tokens.</w:t>
-      </w:r>
-    </w:p>
-    <w:p>
-      <w:pPr>
-        <w:pStyle w:val="ListBullet"/>
-      </w:pPr>
-      <w:r>
-        <w:t>launcher.py starts the LiveKit server if not already running.</w:t>
-      </w:r>
-    </w:p>
-    <w:p>
-      <w:pPr>
-        <w:pStyle w:val="ListBullet"/>
-      </w:pPr>
-      <w:r>
-        <w:t>The user connects from client.html (browser), publishing their mic + camera tracks.</w:t>
-      </w:r>
-    </w:p>
-    <w:p>
-      <w:pPr>
-        <w:pStyle w:val="ListBullet"/>
-      </w:pPr>
-      <w:r>
-        <w:t>run_agent.py connects as an AI agent, speaking pre-generated questions via ElevenLabs TTS.</w:t>
-      </w:r>
-    </w:p>
-    <w:p>
-      <w:pPr>
-        <w:pStyle w:val="ListBullet"/>
-      </w:pPr>
-      <w:r>
-        <w:t>The candidate's spoken answers are transcribed via Deepgram STT.</w:t>
-      </w:r>
-    </w:p>
-    <w:p>
-      <w:pPr>
-        <w:pStyle w:val="ListBullet"/>
-      </w:pPr>
-      <w:r>
-        <w:t>The conversation (questions + answers) is displayed in real time in client.html.</w:t>
-      </w:r>
-    </w:p>
-    <w:p>
-      <w:pPr>
-        <w:pStyle w:val="ListBullet"/>
-      </w:pPr>
-      <w:r>
-        <w:t>After all questions, a transcript JSON is saved to temp directory.</w:t>
-      </w:r>
-    </w:p>
-    <w:p>
-      <w:r>
-        <w:br w:type="page"/>
+        <w:t>config.py loads settings from .env. llm.py is the unified client for calling Gemini AI.</w:t>
       </w:r>
     </w:p>
     <w:p>
@@ -847,55 +581,12 @@
         <w:pStyle w:val="Heading1"/>
       </w:pPr>
       <w:r>
-        <w:t>4. Key Components Explained</w:t>
+        <w:t>5. Directory Structure — InterviewAI/core/</w:t>
       </w:r>
     </w:p>
     <w:p>
-      <w:pPr>
-        <w:pStyle w:val="Heading2"/>
-      </w:pPr>
       <w:r>
-        <w:t>app.py (Main Entry Point)</w:t>
-      </w:r>
-    </w:p>
-    <w:p>
-      <w:pPr>
-        <w:pStyle w:val="ListBullet"/>
-      </w:pPr>
-      <w:r>
-        <w:t>Streamlit application with two tabs: "Text Interview" and "Live Interview".</w:t>
-      </w:r>
-    </w:p>
-    <w:p>
-      <w:pPr>
-        <w:pStyle w:val="ListBullet"/>
-      </w:pPr>
-      <w:r>
-        <w:t>Tab 1 (Text): user uploads CV + JD, system parses/builds graph/generates questions, then runs the interview loop inline.</w:t>
-      </w:r>
-    </w:p>
-    <w:p>
-      <w:pPr>
-        <w:pStyle w:val="ListBullet"/>
-      </w:pPr>
-      <w:r>
-        <w:t>Tab 2 (LiveKit): user uploads CV + JD, generates questions, then launches the LiveKit client in a new browser tab.</w:t>
-      </w:r>
-    </w:p>
-    <w:p>
-      <w:pPr>
-        <w:pStyle w:val="ListBullet"/>
-      </w:pPr>
-      <w:r>
-        <w:t>Contains collapsible debug panel showing state/logs.</w:t>
-      </w:r>
-    </w:p>
-    <w:p>
-      <w:pPr>
-        <w:pStyle w:val="ListBullet"/>
-      </w:pPr>
-      <w:r>
-        <w:t>Starts a background HTTP server (whisper_server.py) on import to serve LiveKit tokens and client page.</w:t>
+        <w:t>Below is every file and folder inside core/, with a plain-English explanation of what it does.</w:t>
       </w:r>
     </w:p>
     <w:p>
@@ -907,27 +598,8 @@
       </w:r>
     </w:p>
     <w:p>
-      <w:pPr>
-        <w:pStyle w:val="ListBullet"/>
-      </w:pPr>
       <w:r>
-        <w:t>Loads .env from project root via python-dotenv.</w:t>
-      </w:r>
-    </w:p>
-    <w:p>
-      <w:pPr>
-        <w:pStyle w:val="ListBullet"/>
-      </w:pPr>
-      <w:r>
-        <w:t>Exposes constants: GEMINI_API_KEY, scoring thresholds (70 strong, 40 weak), max questions (3 per session), skill verification questions (3 per skill), LLM temperature/max tokens.</w:t>
-      </w:r>
-    </w:p>
-    <w:p>
-      <w:pPr>
-        <w:pStyle w:val="ListBullet"/>
-      </w:pPr>
-      <w:r>
-        <w:t>Status constants for graph state machine: pending, verified_strong, verified_weak, confirmed_gap.</w:t>
+        <w:t>This is the settings file. It loads the .env file and defines all the numbers and rules the project uses: the Gemini API key and model name, the temperature (creativity) of the AI, the maximum number of tokens, the scoring thresholds (70 = strong, 40 = weak), how many questions to ask per session (3), how many follow-ups allowed (1), and the status labels for the graph (pending, verified, confirmed gap). Every other file imports from here so there is one central place to change settings.</w:t>
       </w:r>
     </w:p>
     <w:p>
@@ -935,39 +607,12 @@
         <w:pStyle w:val="Heading2"/>
       </w:pPr>
       <w:r>
-        <w:t>core/llm.py (LLM Client)</w:t>
+        <w:t>core/llm.py</w:t>
       </w:r>
     </w:p>
     <w:p>
-      <w:pPr>
-        <w:pStyle w:val="ListBullet"/>
-      </w:pPr>
       <w:r>
-        <w:t>Single unified client for Gemini API.</w:t>
-      </w:r>
-    </w:p>
-    <w:p>
-      <w:pPr>
-        <w:pStyle w:val="ListBullet"/>
-      </w:pPr>
-      <w:r>
-        <w:t>_call_gemini(): POST to Gemini generateContent endpoint with prompt + config. Returns raw text.</w:t>
-      </w:r>
-    </w:p>
-    <w:p>
-      <w:pPr>
-        <w:pStyle w:val="ListBullet"/>
-      </w:pPr>
-      <w:r>
-        <w:t>call_llm(): public wrapper for text generation.</w:t>
-      </w:r>
-    </w:p>
-    <w:p>
-      <w:pPr>
-        <w:pStyle w:val="ListBullet"/>
-      </w:pPr>
-      <w:r>
-        <w:t>call_llm_json(): calls LLM, strips markdown fences, attempts JSON.parse. Falls back to json_repair library if standard parsing fails.</w:t>
+        <w:t>This is the AI communication module. It contains the code that talks to Google's Gemini API. There are three functions: call_llm() sends a text prompt and gets text back. call_llm_json() sends a prompt and expects JSON back — it also cleans up the response (removes markdown formatting) and if the JSON is broken, it uses a library called json_repair to fix it. This is used by the question generator and evaluator to get structured data from the AI.</w:t>
       </w:r>
     </w:p>
     <w:p>
@@ -975,31 +620,51 @@
         <w:pStyle w:val="Heading2"/>
       </w:pPr>
       <w:r>
-        <w:t>core/agents/</w:t>
+        <w:t>core/agents/ (folder)</w:t>
+      </w:r>
+    </w:p>
+    <w:p>
+      <w:r>
+        <w:t>This folder contains 3 files that handle input parsing and question creation.</w:t>
       </w:r>
     </w:p>
     <w:p>
       <w:pPr>
-        <w:pStyle w:val="ListBullet"/>
+        <w:pStyle w:val="Heading3"/>
       </w:pPr>
       <w:r>
-        <w:t>cv_agent.py: Parses resume text/PDF to extract name, skills list, and experience summary using Gemini.</w:t>
+        <w:t>core/agents/cv_agent.py</w:t>
+      </w:r>
+    </w:p>
+    <w:p>
+      <w:r>
+        <w:t>Reads a candidate's CV (resume). If the file is a PDF, it first extracts the text using PyPDF2. Then it sends the full text to Gemini with a prompt asking it to extract: the candidate's name, their list of skills, and a short experience summary. Returns this as a dictionary.</w:t>
       </w:r>
     </w:p>
     <w:p>
       <w:pPr>
-        <w:pStyle w:val="ListBullet"/>
+        <w:pStyle w:val="Heading3"/>
       </w:pPr>
       <w:r>
-        <w:t>jd_agent.py: Parses job description to extract job title, role level (junior/mid/senior), and required skills using Gemini.</w:t>
+        <w:t>core/agents/jd_agent.py</w:t>
+      </w:r>
+    </w:p>
+    <w:p>
+      <w:r>
+        <w:t>Reads a Job Description text. Sends it to Gemini with a prompt asking it to extract: the job title, the role level (junior/mid/senior), and the list of required skills. Returns this as a dictionary.</w:t>
       </w:r>
     </w:p>
     <w:p>
       <w:pPr>
-        <w:pStyle w:val="ListBullet"/>
+        <w:pStyle w:val="Heading3"/>
       </w:pPr>
       <w:r>
-        <w:t>question_agent.py: Two functions — generate_interview_questions() creates full structured set (opening, technical, behavioural, closing) from graph topics; generate_position_question() creates a single on-the-fly question for a specific skill during live interview.</w:t>
+        <w:t>core/agents/question_agent.py</w:t>
+      </w:r>
+    </w:p>
+    <w:p>
+      <w:r>
+        <w:t>Generates interview questions. It has three functions: generate_interview_questions() takes the skill graph topics and creates a full structured question set (opening questions, technical questions per skill, behavioural questions, closing questions) using Gemini. It also calculates estimated total interview duration. generate_position_question() is used during the live interview — it creates a single question on the fly for a specific skill, adjusted for difficulty and whether it's a follow-up. build_interview_flow() takes the structured set and flattens it into a simple ordered list.</w:t>
       </w:r>
     </w:p>
     <w:p>
@@ -1007,39 +672,25 @@
         <w:pStyle w:val="Heading2"/>
       </w:pPr>
       <w:r>
-        <w:t>core/graph/</w:t>
+        <w:t>core/evaluator/ (folder)</w:t>
+      </w:r>
+    </w:p>
+    <w:p>
+      <w:r>
+        <w:t>This folder contains 1 file that scores answers.</w:t>
       </w:r>
     </w:p>
     <w:p>
       <w:pPr>
-        <w:pStyle w:val="ListBullet"/>
+        <w:pStyle w:val="Heading3"/>
       </w:pPr>
       <w:r>
-        <w:t>skill_graph.py: Loads ESCO digital skills CSV into a NetworkX DiGraph. Skills connected via broader/narrower relationships. Fuzzy-matches candidate/JD skills to ESCO URIs using difflib. Extends ESCO with modern tech (Python, React, Docker, etc.).</w:t>
+        <w:t>core/evaluator/evaluator.py</w:t>
       </w:r>
     </w:p>
     <w:p>
-      <w:pPr>
-        <w:pStyle w:val="ListBullet"/>
-      </w:pPr>
       <w:r>
-        <w:t>state.py: InterviewState contains per-skill SkillNodeState dataclasses tracking status, scores, questions asked. Key methods: record_answer() transitions skill states based on scores; is_complete() checks if all skills verified.</w:t>
-      </w:r>
-    </w:p>
-    <w:p>
-      <w:pPr>
-        <w:pStyle w:val="ListBullet"/>
-      </w:pPr>
-      <w:r>
-        <w:t>traversal.py: pick_next_skill() selects the next skill adaptively — lowest average score first, with priority weighting. decide_follow_up() determines if a weak answer warrants a follow-up question.</w:t>
-      </w:r>
-    </w:p>
-    <w:p>
-      <w:pPr>
-        <w:pStyle w:val="ListBullet"/>
-      </w:pPr>
-      <w:r>
-        <w:t>visualize.py: Renders matplotlib graphs showing candidate skills, JD requirements, gaps, and the full unified skill map — displayed in the Streamlit UI.</w:t>
+        <w:t>This is the scoring engine. It works like this: first, it generates a "reference answer" (an ideal answer) for the question using Gemini. Then it compares the candidate's real answer against this reference. It scores on 4 criteria: technical accuracy (0-25), completeness (0-25), clarity (0-25), relevance (0-25). To reduce AI bias, it runs the evaluation twice with the criteria in different orders and averages the scores. If the answer is very short (under 10 words), it automatically scores 0. Returns a result with final score (0-100), verdict (strong/weak/gap), feedback, and the reference answer.</w:t>
       </w:r>
     </w:p>
     <w:p>
@@ -1047,47 +698,64 @@
         <w:pStyle w:val="Heading2"/>
       </w:pPr>
       <w:r>
-        <w:t>core/evaluator/evaluator.py</w:t>
+        <w:t>core/graph/ (folder)</w:t>
+      </w:r>
+    </w:p>
+    <w:p>
+      <w:r>
+        <w:t>This folder contains 4 files that build and manage the skill knowledge graph.</w:t>
       </w:r>
     </w:p>
     <w:p>
       <w:pPr>
-        <w:pStyle w:val="ListBullet"/>
+        <w:pStyle w:val="Heading3"/>
       </w:pPr>
       <w:r>
-        <w:t>Track A LLM-as-Judge evaluation.</w:t>
+        <w:t>core/graph/skill_graph.py</w:t>
+      </w:r>
+    </w:p>
+    <w:p>
+      <w:r>
+        <w:t>Builds a graph of skills using the ESCO taxonomy (a European standard list of 1,201 IT skills). It loads two CSV files: one with skill names and descriptions, another with relationships between skills (broader/narrower). It creates a NetworkX directed graph where skills are nodes and relationships are edges. Since ESCO is missing many modern tools (Python, React, Docker, etc.), it adds them manually. It can fuzzy-match skill names to the graph using difflib. The gap_analysis() function compares a candidate's skills against job requirements and identifies what's missing.</w:t>
       </w:r>
     </w:p>
     <w:p>
       <w:pPr>
-        <w:pStyle w:val="ListBullet"/>
+        <w:pStyle w:val="Heading3"/>
       </w:pPr>
       <w:r>
-        <w:t>generate_reference_answer(): Creates an ideal answer for a question using Gemini (acts as benchmark).</w:t>
+        <w:t>core/graph/state.py</w:t>
+      </w:r>
+    </w:p>
+    <w:p>
+      <w:r>
+        <w:t>Tracks the progress of the interview. For each skill being tested, it stores: current status (pending, verified_strong, verified_weak, confirmed_gap), list of scores, how many questions asked, best score so far, and feedback. The record_answer() method updates the status automatically based on the score. The InterviewState class holds all skills together and provides methods like pending_skills, is_complete(), and summary() to check overall progress.</w:t>
       </w:r>
     </w:p>
     <w:p>
       <w:pPr>
-        <w:pStyle w:val="ListBullet"/>
+        <w:pStyle w:val="Heading3"/>
       </w:pPr>
       <w:r>
-        <w:t>evaluate_answer(): Skips &lt;10 word answers (immediate gap verdict). Otherwise generates reference, then runs two parallel evaluations with different criterion orderings to reduce bias. Scores averaged from both calls.</w:t>
+        <w:t>core/graph/traversal.py</w:t>
+      </w:r>
+    </w:p>
+    <w:p>
+      <w:r>
+        <w:t>Decides which skill to ask about next. The pick_next_skill() function looks at all incomplete skills and picks the one with the lowest average score first (prioritizing high-priority skills). It avoids asking the same skill twice in a row. The decide_follow_up() function checks if a weak answer (below 70) needs a follow-up question, capped at one follow-up per skill.</w:t>
       </w:r>
     </w:p>
     <w:p>
       <w:pPr>
-        <w:pStyle w:val="ListBullet"/>
+        <w:pStyle w:val="Heading3"/>
       </w:pPr>
       <w:r>
-        <w:t>Scoring criteria: technical_accuracy (0-25), completeness (0-25), clarity (0-25), relevance (0-25). Total = 0-100.</w:t>
+        <w:t>core/graph/visualize.py</w:t>
       </w:r>
     </w:p>
     <w:p>
-      <w:pPr>
-        <w:pStyle w:val="ListBullet"/>
-      </w:pPr>
       <w:r>
-        <w:t>Returns: final_score, verdict (strong/weak/gap), reference_answer, track_a details.</w:t>
+        <w:t>Creates charts (matplotlib figures) to show the skill analysis visually. render_candidate_graph() shows the candidate's skills grouped by category. render_job_graph() shows the job's required skills. render_gap_graph() highlights missing or weak skills. render_full_graph() shows everything together. These charts appear in the Streamlit UI.</w:t>
       </w:r>
     </w:p>
     <w:p>
@@ -1095,39 +763,25 @@
         <w:pStyle w:val="Heading2"/>
       </w:pPr>
       <w:r>
+        <w:t>core/pipeline/ (folder)</w:t>
+      </w:r>
+    </w:p>
+    <w:p>
+      <w:r>
+        <w:t>This folder contains 1 file that orchestrates the interview.</w:t>
+      </w:r>
+    </w:p>
+    <w:p>
+      <w:pPr>
+        <w:pStyle w:val="Heading3"/>
+      </w:pPr>
+      <w:r>
         <w:t>core/pipeline/interview_loop.py</w:t>
       </w:r>
     </w:p>
     <w:p>
-      <w:pPr>
-        <w:pStyle w:val="ListBullet"/>
-      </w:pPr>
       <w:r>
-        <w:t>InterviewLoop class orchestrates the entire text interview lifecycle.</w:t>
-      </w:r>
-    </w:p>
-    <w:p>
-      <w:pPr>
-        <w:pStyle w:val="ListBullet"/>
-      </w:pPr>
-      <w:r>
-        <w:t>get_next_question(): picks next skill adaptively, generates a position-specific question via LLM.</w:t>
-      </w:r>
-    </w:p>
-    <w:p>
-      <w:pPr>
-        <w:pStyle w:val="ListBullet"/>
-      </w:pPr>
-      <w:r>
-        <w:t>submit_answer(): evaluates the answer via evaluator.py, updates state, decides follow-ups.</w:t>
-      </w:r>
-    </w:p>
-    <w:p>
-      <w:pPr>
-        <w:pStyle w:val="ListBullet"/>
-      </w:pPr>
-      <w:r>
-        <w:t>get_summary(): returns current state snapshot for report generation.</w:t>
+        <w:t>This is the brain of the Text Mode interview. The InterviewLoop class: get_next_question() picks the next skill using traversal.py, determines difficulty based on how the candidate has scored so far on that skill, generates a fresh question via question_agent.py, and returns it. submit_answer() takes the candidate's typed answer, sends it to evaluator.py for scoring, updates the graph state, and decides if a follow-up is needed. The loop keeps going until all skills are verified or the maximum questions (3) are asked. get_summary() collects everything for the final report.</w:t>
       </w:r>
     </w:p>
     <w:p>
@@ -1135,23 +789,25 @@
         <w:pStyle w:val="Heading2"/>
       </w:pPr>
       <w:r>
+        <w:t>core/report/ (folder)</w:t>
+      </w:r>
+    </w:p>
+    <w:p>
+      <w:r>
+        <w:t>This folder contains 1 file that creates the final output.</w:t>
+      </w:r>
+    </w:p>
+    <w:p>
+      <w:pPr>
+        <w:pStyle w:val="Heading3"/>
+      </w:pPr>
+      <w:r>
         <w:t>core/report/generator.py</w:t>
       </w:r>
     </w:p>
     <w:p>
-      <w:pPr>
-        <w:pStyle w:val="ListBullet"/>
-      </w:pPr>
       <w:r>
-        <w:t>generate_report() takes an InterviewLoop, computes overall score (average of all answers), generates a verdict (strong_hire/weak_hire/no_hire), produces per-skill breakdown, identifies strengths and gaps.</w:t>
-      </w:r>
-    </w:p>
-    <w:p>
-      <w:pPr>
-        <w:pStyle w:val="ListBullet"/>
-      </w:pPr>
-      <w:r>
-        <w:t>Returns a structured dict suitable for display in Streamlit.</w:t>
+        <w:t>After the interview ends, this builds the final report. It takes the InterviewLoop, computes the overall score (average of all answers), picks a verdict: Strong Hire (≥70), Weak Hire (40-69), or No Hire (&lt;40). It creates a per-skill breakdown showing scores and feedback. It identifies strengths (skills scoring ≥70), gaps (skills scoring &lt;40), and development areas. Returns a dictionary with all this information plus a full answer log.</w:t>
       </w:r>
     </w:p>
     <w:p>
@@ -1159,52 +815,77 @@
         <w:pStyle w:val="Heading2"/>
       </w:pPr>
       <w:r>
-        <w:t>core/livekit/ (Voice System)</w:t>
+        <w:t>core/livekit/ (folder)</w:t>
+      </w:r>
+    </w:p>
+    <w:p>
+      <w:r>
+        <w:t>This folder handles the voice interview mode (LiveKit). It has 4 Python files, a config file, and an HTML file.</w:t>
       </w:r>
     </w:p>
     <w:p>
       <w:pPr>
-        <w:pStyle w:val="ListBullet"/>
+        <w:pStyle w:val="Heading3"/>
       </w:pPr>
       <w:r>
-        <w:t>whisper_server.py: Minimal HTTP server (port 18765) serving client.html at /livekit, generating LiveKit tokens at /token, and saving transcripts at /save_transcript. Starts agent subprocess (run_agent.py) when a token is requested.</w:t>
+        <w:t>core/livekit/run_agent.py</w:t>
+      </w:r>
+    </w:p>
+    <w:p>
+      <w:r>
+        <w:t>This is the AI voice agent. It connects to a LiveKit room and conducts the interview by voice. It speaks pre-generated questions using ElevenLabs TTS (text-to-speech). It listens to the candidate's answers using Deepgram STT (speech-to-text). It does NOT use Gemini for conversation — all questions are pre-loaded. The agent publishes real-time transcript data to the room so the web client can display it. After all questions are done, it saves a transcript JSON file and disconnects.</w:t>
       </w:r>
     </w:p>
     <w:p>
       <w:pPr>
-        <w:pStyle w:val="ListBullet"/>
+        <w:pStyle w:val="Heading3"/>
       </w:pPr>
       <w:r>
-        <w:t>run_agent.py: LiveKit Agent that speaks 5 pre-generated questions via ElevenLabs TTS, listens for answers via Deepgram STT, and publishes transcript data to the room.</w:t>
+        <w:t>core/livekit/whisper_server.py</w:t>
+      </w:r>
+    </w:p>
+    <w:p>
+      <w:r>
+        <w:t>A tiny web server (runs on port 18765) that provides three services: GET /livekit serves the client.html page (the voice interview UI). GET /token generates a LiveKit access token and starts the agent subprocess. POST /save_transcript saves the conversation transcript. It runs in a background thread and is started automatically when app.py launches.</w:t>
       </w:r>
     </w:p>
     <w:p>
       <w:pPr>
-        <w:pStyle w:val="ListBullet"/>
+        <w:pStyle w:val="Heading3"/>
       </w:pPr>
       <w:r>
-        <w:t>launcher.py: Manages the LiveKit server process lifecycle (start/stop/cleanup).</w:t>
+        <w:t>core/livekit/launcher.py</w:t>
+      </w:r>
+    </w:p>
+    <w:p>
+      <w:r>
+        <w:t>Manages the LiveKit server process. start_livekit_server() checks if LiveKit is already running (on port 7880) and starts it if not. launch() starts both the LiveKit server and the web server, and returns the client URL. cleanup() shuts everything down when the application exits.</w:t>
       </w:r>
     </w:p>
     <w:p>
       <w:pPr>
-        <w:pStyle w:val="ListBullet"/>
+        <w:pStyle w:val="Heading3"/>
       </w:pPr>
       <w:r>
-        <w:t>client.html: Full-featured browser client with webcam, real-time transcription display, chat-style conversation log, and connect/disconnect controls.</w:t>
+        <w:t>core/livekit/livekit.yaml</w:t>
+      </w:r>
+    </w:p>
+    <w:p>
+      <w:r>
+        <w:t>Configuration file for the LiveKit server. Sets the ports, API keys, logging level, and WebRTC settings. The launcher.py passes this to the livekit-server executable.</w:t>
       </w:r>
     </w:p>
     <w:p>
       <w:pPr>
-        <w:pStyle w:val="ListBullet"/>
+        <w:pStyle w:val="Heading3"/>
       </w:pPr>
       <w:r>
-        <w:t>livekit.yaml: Configuration for self-hosted LiveKit server (ports, logging, keys).</w:t>
+        <w:t>core/livekit/client.html</w:t>
       </w:r>
     </w:p>
     <w:p>
       <w:r>
-        <w:br w:type="page"/>
+        <w:t>A web page that the candidate uses for the voice interview. It shows: the candidate's webcam feed, real-time transcription of what the AI agent says, a chat-style conversation history, and the current question being asked. It connects to LiveKit using the livekit-client JavaScript SDK, publishes the mic and camera tracks, and subscribes to the agent's audio. It auto-connects when the page loads and saves a transcript when disconnected.</w:t>
       </w:r>
     </w:p>
     <w:p>
@@ -1212,143 +893,17 @@
         <w:pStyle w:val="Heading1"/>
       </w:pPr>
       <w:r>
-        <w:t>5. API Keys &amp; Configuration</w:t>
+        <w:t>6. Summary</w:t>
       </w:r>
     </w:p>
     <w:p>
       <w:r>
-        <w:t>The following environment variables must be set in .env:</w:t>
+        <w:t>InterviewAI takes a Resume + Job Description → parses them → builds a skill graph → finds gaps → generates questions → conducts an interview (text or voice) → scores each answer using AI → produces a final report with verdict and recommendations.</w:t>
       </w:r>
     </w:p>
     <w:p>
       <w:r>
-        <w:rPr>
-          <w:b/>
-        </w:rPr>
-        <w:t xml:space="preserve">GEMINI_API_KEY: </w:t>
-      </w:r>
-      <w:r>
-        <w:t>Required for all LLM operations (question gen, evaluation, parsing)</w:t>
-      </w:r>
-    </w:p>
-    <w:p>
-      <w:r>
-        <w:rPr>
-          <w:b/>
-        </w:rPr>
-        <w:t xml:space="preserve">DEEPGRAM_API_KEY: </w:t>
-      </w:r>
-      <w:r>
-        <w:t>Required for LiveKit Mode (speech-to-text)</w:t>
-      </w:r>
-    </w:p>
-    <w:p>
-      <w:r>
-        <w:rPr>
-          <w:b/>
-        </w:rPr>
-        <w:t xml:space="preserve">ELEVENLABS_API_KEY: </w:t>
-      </w:r>
-      <w:r>
-        <w:t>Required for LiveKit Mode (text-to-speech)</w:t>
-      </w:r>
-    </w:p>
-    <w:p>
-      <w:r>
-        <w:rPr>
-          <w:b/>
-        </w:rPr>
-        <w:t xml:space="preserve">LIVEKIT_URL: </w:t>
-      </w:r>
-      <w:r>
-        <w:t>WebSocket URL for self-hosted LiveKit (default: ws://localhost:7880)</w:t>
-      </w:r>
-    </w:p>
-    <w:p>
-      <w:r>
-        <w:rPr>
-          <w:b/>
-        </w:rPr>
-        <w:t xml:space="preserve">LIVEKIT_API_KEY: </w:t>
-      </w:r>
-      <w:r>
-        <w:t>LiveKit API key (default: devkey)</w:t>
-      </w:r>
-    </w:p>
-    <w:p>
-      <w:r>
-        <w:rPr>
-          <w:b/>
-        </w:rPr>
-        <w:t xml:space="preserve">LIVEKIT_API_SECRET: </w:t>
-      </w:r>
-      <w:r>
-        <w:t>LiveKit API secret (default: secret)</w:t>
-      </w:r>
-    </w:p>
-    <w:p/>
-    <w:p>
-      <w:r>
-        <w:t>Scoring thresholds (configurable in core/config.py):</w:t>
-      </w:r>
-    </w:p>
-    <w:p>
-      <w:r>
-        <w:rPr>
-          <w:b/>
-        </w:rPr>
-        <w:t>SCORE_STRONG_THRESHOLD = 70</w:t>
-      </w:r>
-    </w:p>
-    <w:p>
-      <w:r>
-        <w:t>Score &gt;= 70 → strong_hire verdict</w:t>
-      </w:r>
-    </w:p>
-    <w:p>
-      <w:r>
-        <w:rPr>
-          <w:b/>
-        </w:rPr>
-        <w:t>SCORE_WEAK_THRESHOLD = 40</w:t>
-      </w:r>
-    </w:p>
-    <w:p>
-      <w:r>
-        <w:t>Score &gt;= 40 but &lt; 70 → weak_hire. Score &lt; 40 → no_hire (gap)</w:t>
-      </w:r>
-    </w:p>
-    <w:p>
-      <w:pPr>
-        <w:pStyle w:val="Heading1"/>
-      </w:pPr>
-      <w:r>
-        <w:t>6. How to Run</w:t>
-      </w:r>
-    </w:p>
-    <w:p>
-      <w:r>
-        <w:t>1. Install dependencies: pip install -r requirements.txt</w:t>
-      </w:r>
-    </w:p>
-    <w:p>
-      <w:r>
-        <w:t>2. Create .env file with required API keys (see Section 5)</w:t>
-      </w:r>
-    </w:p>
-    <w:p>
-      <w:r>
-        <w:t>3. For LiveKit Mode: download livekit-server from github.com/livekit/livekit/releases</w:t>
-      </w:r>
-    </w:p>
-    <w:p>
-      <w:r>
-        <w:t>4. Run: streamlit run app.py</w:t>
-      </w:r>
-    </w:p>
-    <w:p>
-      <w:r>
-        <w:t>5. Open the URL shown in terminal (default: http://localhost:8501)</w:t>
+        <w:t>All the logic lives inside core/: config (settings), llm (AI client), agents (parsing &amp; questions), evaluator (scoring), graph (skill knowledge &amp; state), pipeline (interview loop), report (final output), and livekit (voice system).</w:t>
       </w:r>
     </w:p>
     <w:sectPr>

</xml_diff>

<commit_message>
Rewrite PROJECT_GUIDE.docx with clearer structure and simpler explanations
- 8 sections covering what, how, inputs, outputs, stages, modules,
  every file in core/ explained in plain English
- LiveKit voice mode explained in simplest terms
- API keys clearly listed with what each does
- Perfect for anyone to read and understand the project
</commit_message>
<xml_diff>
--- a/InterviewAI/PROJECT_GUIDE.docx
+++ b/InterviewAI/PROJECT_GUIDE.docx
@@ -5,14 +5,46 @@
     <w:p>
       <w:pPr>
         <w:pStyle w:val="Title"/>
+        <w:jc w:val="center"/>
       </w:pPr>
       <w:r>
-        <w:t>InterviewAI — Project Guide</w:t>
+        <w:t>InterviewAI — Complete Project Guide</w:t>
+      </w:r>
+    </w:p>
+    <w:p>
+      <w:pPr>
+        <w:jc w:val="center"/>
+      </w:pPr>
+      <w:r>
+        <w:rPr>
+          <w:i/>
+        </w:rPr>
+        <w:t>A simple, clear explanation of the entire project</w:t>
+      </w:r>
+    </w:p>
+    <w:p/>
+    <w:p>
+      <w:pPr>
+        <w:jc w:val="center"/>
+      </w:pPr>
+      <w:r>
+        <w:rPr>
+          <w:b/>
+        </w:rPr>
+        <w:t>CMP7200 Individual Masters Project</w:t>
+      </w:r>
+    </w:p>
+    <w:p>
+      <w:pPr>
+        <w:jc w:val="center"/>
+      </w:pPr>
+      <w:r>
+        <w:t>Birmingham City University</w:t>
       </w:r>
     </w:p>
     <w:p>
       <w:r>
-        <w:t>A clear explanation of what this project is, how it works, and what every file inside the core/ folder does.</w:t>
+        <w:br w:type="page"/>
       </w:r>
     </w:p>
     <w:p>
@@ -25,7 +57,7 @@
     </w:p>
     <w:p>
       <w:r>
-        <w:t>InterviewAI is an AI-powered interview system. A candidate uploads their Resume (CV) and a Job Description (JD), and the system:</w:t>
+        <w:t>InterviewAI is an AI-powered system that conducts technical interviews automatically. A candidate uploads their Resume and a Job Description, and the system:</w:t>
       </w:r>
     </w:p>
     <w:p>
@@ -33,7 +65,7 @@
         <w:pStyle w:val="ListBullet"/>
       </w:pPr>
       <w:r>
-        <w:t>Reads the CV and JD to understand the candidate's skills and what the job requires.</w:t>
+        <w:t>Reads the Resume to find the candidate's skills and experience.</w:t>
       </w:r>
     </w:p>
     <w:p>
@@ -41,7 +73,7 @@
         <w:pStyle w:val="ListBullet"/>
       </w:pPr>
       <w:r>
-        <w:t>Builds a skill graph using the ESCO taxonomy (a European standard list of 1,201 IT skills).</w:t>
+        <w:t>Reads the Job Description to find what skills the job requires.</w:t>
       </w:r>
     </w:p>
     <w:p>
@@ -49,7 +81,7 @@
         <w:pStyle w:val="ListBullet"/>
       </w:pPr>
       <w:r>
-        <w:t>Compares candidate skills vs job requirements to find gaps.</w:t>
+        <w:t>Compares both using a standard skill database (ESCO taxonomy) to find gaps.</w:t>
       </w:r>
     </w:p>
     <w:p>
@@ -65,7 +97,7 @@
         <w:pStyle w:val="ListBullet"/>
       </w:pPr>
       <w:r>
-        <w:t>Asks the questions one by one and evaluates the answers using AI (Gemini).</w:t>
+        <w:t>Asks questions one by one — either by typing (Text Mode) or by voice (LiveKit Mode).</w:t>
       </w:r>
     </w:p>
     <w:p>
@@ -73,12 +105,79 @@
         <w:pStyle w:val="ListBullet"/>
       </w:pPr>
       <w:r>
-        <w:t>Produces a final report with scores, strengths, gaps, and a hire verdict.</w:t>
+        <w:t>Scores each answer using AI (Google Gemini).</w:t>
+      </w:r>
+    </w:p>
+    <w:p>
+      <w:pPr>
+        <w:pStyle w:val="ListBullet"/>
+      </w:pPr>
+      <w:r>
+        <w:t>Produces a final report: overall score, strengths, gaps, and hire decision.</w:t>
+      </w:r>
+    </w:p>
+    <w:p/>
+    <w:p>
+      <w:r>
+        <w:rPr>
+          <w:b/>
+        </w:rPr>
+        <w:t xml:space="preserve">You do NOT need any coding knowledge to use this. </w:t>
+      </w:r>
+      <w:r>
+        <w:t>Everything runs through a web browser.</w:t>
+      </w:r>
+    </w:p>
+    <w:p>
+      <w:pPr>
+        <w:pStyle w:val="Heading1"/>
+      </w:pPr>
+      <w:r>
+        <w:t>2. What Inputs Does It Need?</w:t>
       </w:r>
     </w:p>
     <w:p>
       <w:r>
-        <w:t>The interview can be done in two ways:</w:t>
+        <w:t>The system needs 3 things to work:</w:t>
+      </w:r>
+    </w:p>
+    <w:p>
+      <w:pPr>
+        <w:pStyle w:val="Heading2"/>
+      </w:pPr>
+      <w:r>
+        <w:t>1. Resume / CV (PDF or text)</w:t>
+      </w:r>
+    </w:p>
+    <w:p>
+      <w:r>
+        <w:t>A file containing the candidate's work history, skills, and qualifications. The system reads this to understand what the candidate already knows.</w:t>
+      </w:r>
+    </w:p>
+    <w:p>
+      <w:pPr>
+        <w:pStyle w:val="Heading2"/>
+      </w:pPr>
+      <w:r>
+        <w:t>2. Job Description (text)</w:t>
+      </w:r>
+    </w:p>
+    <w:p>
+      <w:r>
+        <w:t>A description of the job role — what skills are required, what experience level (junior/mid/senior), and what the role involves. The system reads this to know what skills to test.</w:t>
+      </w:r>
+    </w:p>
+    <w:p>
+      <w:pPr>
+        <w:pStyle w:val="Heading2"/>
+      </w:pPr>
+      <w:r>
+        <w:t>3. API Keys (in .env file)</w:t>
+      </w:r>
+    </w:p>
+    <w:p>
+      <w:r>
+        <w:t>Three API keys are required. These are stored in a file called .env:</w:t>
       </w:r>
     </w:p>
     <w:p>
@@ -86,10 +185,10 @@
         <w:rPr>
           <w:b/>
         </w:rPr>
-        <w:t xml:space="preserve">Text Mode: </w:t>
+        <w:t xml:space="preserve">GEMINI_API_KEY </w:t>
       </w:r>
       <w:r>
-        <w:t>You type your answers in a web page.</w:t>
+        <w:t>— For all AI operations: reading CV/JD, generating questions, evaluating answers.</w:t>
       </w:r>
     </w:p>
     <w:p>
@@ -97,10 +196,27 @@
         <w:rPr>
           <w:b/>
         </w:rPr>
-        <w:t xml:space="preserve">LiveKit Mode: </w:t>
+        <w:t xml:space="preserve">DEEPGRAM_API_KEY </w:t>
       </w:r>
       <w:r>
-        <w:t>You speak your answers through a microphone, and an AI voice agent interviews you.</w:t>
+        <w:t>— For voice mode only: converts speech to text (what the candidate says).</w:t>
+      </w:r>
+    </w:p>
+    <w:p>
+      <w:r>
+        <w:rPr>
+          <w:b/>
+        </w:rPr>
+        <w:t xml:space="preserve">ELEVENLABS_API_KEY </w:t>
+      </w:r>
+      <w:r>
+        <w:t>— For voice mode only: converts text to speech (the AI asking questions out loud).</w:t>
+      </w:r>
+    </w:p>
+    <w:p/>
+    <w:p>
+      <w:r>
+        <w:t>For LiveKit Mode, the system also uses its own built-in LiveKit server for managing the voice/video connection. This runs automatically — no extra setup needed.</w:t>
       </w:r>
     </w:p>
     <w:p>
@@ -108,7 +224,81 @@
         <w:pStyle w:val="Heading1"/>
       </w:pPr>
       <w:r>
-        <w:t>2. Inputs &amp; Outputs</w:t>
+        <w:t>3. What Outputs Does It Produce?</w:t>
+      </w:r>
+    </w:p>
+    <w:p>
+      <w:r>
+        <w:t>After the interview, the system produces a Final Report containing:</w:t>
+      </w:r>
+    </w:p>
+    <w:p>
+      <w:pPr>
+        <w:pStyle w:val="ListBullet"/>
+      </w:pPr>
+      <w:r>
+        <w:t>Overall Score — an average of all answers (out of 100).</w:t>
+      </w:r>
+    </w:p>
+    <w:p>
+      <w:pPr>
+        <w:pStyle w:val="ListBullet"/>
+      </w:pPr>
+      <w:r>
+        <w:t>Verdict — Strong Hire (score ≥70), Weak Hire (40-69), or No Hire (&lt;40).</w:t>
+      </w:r>
+    </w:p>
+    <w:p>
+      <w:pPr>
+        <w:pStyle w:val="ListBullet"/>
+      </w:pPr>
+      <w:r>
+        <w:t>Per-Skill Breakdown — each skill tested, its score, and feedback.</w:t>
+      </w:r>
+    </w:p>
+    <w:p>
+      <w:pPr>
+        <w:pStyle w:val="ListBullet"/>
+      </w:pPr>
+      <w:r>
+        <w:t>Strengths — skills where the candidate scored ≥70.</w:t>
+      </w:r>
+    </w:p>
+    <w:p>
+      <w:pPr>
+        <w:pStyle w:val="ListBullet"/>
+      </w:pPr>
+      <w:r>
+        <w:t>Gaps — skills where the candidate scored &lt;40.</w:t>
+      </w:r>
+    </w:p>
+    <w:p>
+      <w:pPr>
+        <w:pStyle w:val="ListBullet"/>
+      </w:pPr>
+      <w:r>
+        <w:t>Development Areas — skills that need improvement (40-69).</w:t>
+      </w:r>
+    </w:p>
+    <w:p>
+      <w:pPr>
+        <w:pStyle w:val="ListBullet"/>
+      </w:pPr>
+      <w:r>
+        <w:t>Full Answer Log — every question asked, the candidate's answer, the score, and the AI's feedback.</w:t>
+      </w:r>
+    </w:p>
+    <w:p>
+      <w:pPr>
+        <w:pStyle w:val="Heading1"/>
+      </w:pPr>
+      <w:r>
+        <w:t>4. How It Works — Step by Step</w:t>
+      </w:r>
+    </w:p>
+    <w:p>
+      <w:r>
+        <w:t>The system runs in 6 stages, one after another:</w:t>
       </w:r>
     </w:p>
     <w:p>
@@ -116,7 +306,112 @@
         <w:pStyle w:val="Heading2"/>
       </w:pPr>
       <w:r>
-        <w:t>Inputs (what you give the system)</w:t>
+        <w:t>Stage 1: Parse CV &amp; JD</w:t>
+      </w:r>
+    </w:p>
+    <w:p>
+      <w:r>
+        <w:t>The candidate uploads their Resume and pastes the Job Description. The system sends both to Gemini AI, which extracts: the candidate's name and skills (from Resume), and the job title, level, and required skills (from JD). All of this is returned as structured data.</w:t>
+      </w:r>
+    </w:p>
+    <w:p>
+      <w:pPr>
+        <w:pStyle w:val="Heading2"/>
+      </w:pPr>
+      <w:r>
+        <w:t>Stage 2: Build Skill Graph</w:t>
+      </w:r>
+    </w:p>
+    <w:p>
+      <w:r>
+        <w:t>The system loads the ESCO taxonomy — a European-standard database of 1,201 IT skills — into a graph (like a map where skills are connected to related skills). It adds modern technologies like Python, React, and Docker that ESCO doesn't cover. The candidate's skills and the job's required skills are matched against this graph.</w:t>
+      </w:r>
+    </w:p>
+    <w:p>
+      <w:pPr>
+        <w:pStyle w:val="Heading2"/>
+      </w:pPr>
+      <w:r>
+        <w:t>Stage 3: Gap Analysis</w:t>
+      </w:r>
+    </w:p>
+    <w:p>
+      <w:r>
+        <w:t>The system compares what the candidate knows vs what the job needs. Skills that are missing or weak become "topics" for the interview. Each topic gets a priority level and a reason.</w:t>
+      </w:r>
+    </w:p>
+    <w:p>
+      <w:pPr>
+        <w:pStyle w:val="Heading2"/>
+      </w:pPr>
+      <w:r>
+        <w:t>Stage 4: Generate Questions</w:t>
+      </w:r>
+    </w:p>
+    <w:p>
+      <w:r>
+        <w:t>Using Gemini AI, the system creates a full interview question set: opening questions (warm-up), technical questions (one per skill to test), behavioural questions (STAR format), and closing questions. Each question has a difficulty level and a follow-up probe.</w:t>
+      </w:r>
+    </w:p>
+    <w:p>
+      <w:pPr>
+        <w:pStyle w:val="Heading2"/>
+      </w:pPr>
+      <w:r>
+        <w:t>Stage 5: Conduct Interview</w:t>
+      </w:r>
+    </w:p>
+    <w:p>
+      <w:r>
+        <w:t>The interview runs in one of two modes:</w:t>
+        <w:br/>
+        <w:t>• Text Mode: Questions appear on screen. The candidate types answers and clicks Submit. Each answer is immediately scored by Gemini AI (two evaluations averaged for accuracy). The system adapts — it picks the weakest skill first and asks follow-ups if needed.</w:t>
+        <w:br/>
+        <w:t>• LiveKit Mode: A voice agent speaks the questions using ElevenLabs (AI voice). The candidate speaks their answers. Deepgram converts speech to text. Everything happens in real time through a web page. At the end, a transcript is saved.</w:t>
+      </w:r>
+    </w:p>
+    <w:p>
+      <w:pPr>
+        <w:pStyle w:val="Heading2"/>
+      </w:pPr>
+      <w:r>
+        <w:t>Stage 6: Generate Report</w:t>
+      </w:r>
+    </w:p>
+    <w:p>
+      <w:r>
+        <w:t>After the interview ends, the system builds the final report: overall score, verdict, per-skill breakdown, strengths, gaps, development areas, and full answer log.</w:t>
+      </w:r>
+    </w:p>
+    <w:p>
+      <w:r>
+        <w:br w:type="page"/>
+      </w:r>
+    </w:p>
+    <w:p>
+      <w:pPr>
+        <w:pStyle w:val="Heading1"/>
+      </w:pPr>
+      <w:r>
+        <w:t>5. The Two Interview Modes</w:t>
+      </w:r>
+    </w:p>
+    <w:p>
+      <w:pPr>
+        <w:pStyle w:val="Heading2"/>
+      </w:pPr>
+      <w:r>
+        <w:t>Text Mode</w:t>
+      </w:r>
+    </w:p>
+    <w:p>
+      <w:r>
+        <w:t>This is the simpler mode. The candidate sees questions on a web page, types their answer in a text box, and clicks Submit. The AI scores it immediately and moves to the next question. No microphone or camera needed.</w:t>
+      </w:r>
+    </w:p>
+    <w:p>
+      <w:r>
+        <w:t>Flow:</w:t>
       </w:r>
     </w:p>
     <w:p>
@@ -124,7 +419,7 @@
         <w:pStyle w:val="ListBullet"/>
       </w:pPr>
       <w:r>
-        <w:t>Resume / CV — a PDF or text file containing the candidate's work history and skills.</w:t>
+        <w:t>System picks the lowest-scored skill first.</w:t>
       </w:r>
     </w:p>
     <w:p>
@@ -132,7 +427,7 @@
         <w:pStyle w:val="ListBullet"/>
       </w:pPr>
       <w:r>
-        <w:t>Job Description (JD) — text describing the job role, required skills, and experience level.</w:t>
+        <w:t>Generates a fresh question for that skill using Gemini.</w:t>
       </w:r>
     </w:p>
     <w:p>
@@ -140,7 +435,47 @@
         <w:pStyle w:val="ListBullet"/>
       </w:pPr>
       <w:r>
-        <w:t>API Keys — stored in a .env file: Gemini (for AI), Deepgram (for speech-to-text), ElevenLabs (for text-to-speech).</w:t>
+        <w:t>Displays the question on screen.</w:t>
+      </w:r>
+    </w:p>
+    <w:p>
+      <w:pPr>
+        <w:pStyle w:val="ListBullet"/>
+      </w:pPr>
+      <w:r>
+        <w:t>Candidate types answer and clicks Submit.</w:t>
+      </w:r>
+    </w:p>
+    <w:p>
+      <w:pPr>
+        <w:pStyle w:val="ListBullet"/>
+      </w:pPr>
+      <w:r>
+        <w:t>AI evaluates the answer (two Gemini calls, scores averaged).</w:t>
+      </w:r>
+    </w:p>
+    <w:p>
+      <w:pPr>
+        <w:pStyle w:val="ListBullet"/>
+      </w:pPr>
+      <w:r>
+        <w:t>Result shown immediately. If weak, a follow-up may be asked.</w:t>
+      </w:r>
+    </w:p>
+    <w:p>
+      <w:pPr>
+        <w:pStyle w:val="ListBullet"/>
+      </w:pPr>
+      <w:r>
+        <w:t>Repeats until all skills tested or max questions reached.</w:t>
+      </w:r>
+    </w:p>
+    <w:p>
+      <w:pPr>
+        <w:pStyle w:val="ListBullet"/>
+      </w:pPr>
+      <w:r>
+        <w:t>Final report generated automatically.</w:t>
       </w:r>
     </w:p>
     <w:p>
@@ -148,7 +483,27 @@
         <w:pStyle w:val="Heading2"/>
       </w:pPr>
       <w:r>
-        <w:t>Outputs (what the system gives back)</w:t>
+        <w:t>LiveKit Mode (Voice Interview)</w:t>
+      </w:r>
+    </w:p>
+    <w:p>
+      <w:r>
+        <w:t>In this mode, the candidate speaks their answers through a microphone and the AI speaks the questions out loud. It works like a real voice call.</w:t>
+      </w:r>
+    </w:p>
+    <w:p>
+      <w:r>
+        <w:t>What is LiveKit?</w:t>
+      </w:r>
+    </w:p>
+    <w:p>
+      <w:r>
+        <w:t>LiveKit is an open-source platform for real-time voice/video communication (similar to Zoom). It runs as a server on your machine. The system starts it automatically when you use voice mode.</w:t>
+      </w:r>
+    </w:p>
+    <w:p>
+      <w:r>
+        <w:t>How the Voice Interview Works:</w:t>
       </w:r>
     </w:p>
     <w:p>
@@ -156,7 +511,7 @@
         <w:pStyle w:val="ListBullet"/>
       </w:pPr>
       <w:r>
-        <w:t>Skill Gap Analysis — which skills the candidate has, which are missing, and which need verification.</w:t>
+        <w:t>1. The system starts a small web server (port 18765) and the LiveKit server (port 7880).</w:t>
       </w:r>
     </w:p>
     <w:p>
@@ -164,7 +519,7 @@
         <w:pStyle w:val="ListBullet"/>
       </w:pPr>
       <w:r>
-        <w:t>Interview Questions — a structured set of questions (opening, technical, behavioural, closing).</w:t>
+        <w:t>2. The candidate's browser opens a web page (client.html) that shows their webcam and a chat log.</w:t>
       </w:r>
     </w:p>
     <w:p>
@@ -172,7 +527,7 @@
         <w:pStyle w:val="ListBullet"/>
       </w:pPr>
       <w:r>
-        <w:t>Answer Scores — each answer gets a score out of 100, with detailed feedback.</w:t>
+        <w:t>3. An AI "agent" (run_agent.py) joins the same room as the candidate.</w:t>
       </w:r>
     </w:p>
     <w:p>
@@ -180,7 +535,72 @@
         <w:pStyle w:val="ListBullet"/>
       </w:pPr>
       <w:r>
-        <w:t>Final Report — overall score, hire verdict (Strong Hire / Weak Hire / No Hire), per-skill breakdown, strengths, gaps, and full answer log.</w:t>
+        <w:t>4. The agent speaks pre-generated questions one by one using ElevenLabs TTS (text-to-speech).</w:t>
+      </w:r>
+    </w:p>
+    <w:p>
+      <w:pPr>
+        <w:pStyle w:val="ListBullet"/>
+      </w:pPr>
+      <w:r>
+        <w:t xml:space="preserve">   ElevenLabs converts text into natural-sounding human speech.</w:t>
+      </w:r>
+    </w:p>
+    <w:p>
+      <w:pPr>
+        <w:pStyle w:val="ListBullet"/>
+      </w:pPr>
+      <w:r>
+        <w:t>5. The candidate hears the question and speaks their answer into the microphone.</w:t>
+      </w:r>
+    </w:p>
+    <w:p>
+      <w:pPr>
+        <w:pStyle w:val="ListBullet"/>
+      </w:pPr>
+      <w:r>
+        <w:t>6. Deepgram STT (speech-to-text) converts their speech into text in real time.</w:t>
+      </w:r>
+    </w:p>
+    <w:p>
+      <w:pPr>
+        <w:pStyle w:val="ListBullet"/>
+      </w:pPr>
+      <w:r>
+        <w:t>7. The text is displayed on the screen as "live transcription."</w:t>
+      </w:r>
+    </w:p>
+    <w:p>
+      <w:pPr>
+        <w:pStyle w:val="ListBullet"/>
+      </w:pPr>
+      <w:r>
+        <w:t>8. After all 5 questions, the agent says goodbye and saves a transcript file.</w:t>
+      </w:r>
+    </w:p>
+    <w:p>
+      <w:pPr>
+        <w:pStyle w:val="ListBullet"/>
+      </w:pPr>
+      <w:r>
+        <w:t>9. The candidate can end the interview anytime by clicking End.</w:t>
+      </w:r>
+    </w:p>
+    <w:p/>
+    <w:p>
+      <w:r>
+        <w:rPr>
+          <w:b/>
+        </w:rPr>
+        <w:t xml:space="preserve">Key point: </w:t>
+      </w:r>
+      <w:r>
+        <w:t>The LiveKit agent does NOT use Gemini during the conversation. All 5 questions are pre-loaded from the question generation stage. Gemini is only used before the interview starts (to create the questions). This makes the voice interview faster and more reliable.</w:t>
+      </w:r>
+    </w:p>
+    <w:p>
+      <w:r>
+        <w:br w:type="page"/>
       </w:r>
     </w:p>
     <w:p>
@@ -188,7 +608,12 @@
         <w:pStyle w:val="Heading1"/>
       </w:pPr>
       <w:r>
-        <w:t>3. How It Works — Step by Step</w:t>
+        <w:t>6. Modules — What Each Part Does</w:t>
+      </w:r>
+    </w:p>
+    <w:p>
+      <w:r>
+        <w:t>The project has 7 modules (plus configuration and AI client). Each module has a specific job:</w:t>
       </w:r>
     </w:p>
     <w:p>
@@ -196,23 +621,18 @@
         <w:pStyle w:val="Heading2"/>
       </w:pPr>
       <w:r>
-        <w:t>Step 1: Parse CV &amp; JD</w:t>
+        <w:t>Parsing &amp; Question Generation</w:t>
       </w:r>
     </w:p>
     <w:p>
-      <w:pPr>
-        <w:pStyle w:val="ListBullet"/>
-      </w:pPr>
       <w:r>
-        <w:t>cv_agent.py reads the uploaded CV (PDF or text) and uses Gemini AI to extract: name, list of skills, experience summary.</w:t>
-      </w:r>
-    </w:p>
-    <w:p>
-      <w:pPr>
-        <w:pStyle w:val="ListBullet"/>
-      </w:pPr>
-      <w:r>
-        <w:t>jd_agent.py reads the Job Description and uses Gemini to extract: job title, role level (junior/mid/senior), required skills.</w:t>
+        <w:t>This module handles understanding the inputs and creating questions.</w:t>
+        <w:br/>
+        <w:t>• cv_agent.py — Takes a Resume PDF or text, extracts name + skills + experience using Gemini.</w:t>
+        <w:br/>
+        <w:t>• jd_agent.py — Takes a Job Description, extracts job title + level + required skills using Gemini.</w:t>
+        <w:br/>
+        <w:t>• question_agent.py — Takes the skill analysis topics and generates full interview questions using Gemini.</w:t>
       </w:r>
     </w:p>
     <w:p>
@@ -220,31 +640,14 @@
         <w:pStyle w:val="Heading2"/>
       </w:pPr>
       <w:r>
-        <w:t>Step 2: Build Skill Graph</w:t>
+        <w:t>Answer Scoring (LLM-as-Judge)</w:t>
       </w:r>
     </w:p>
     <w:p>
-      <w:pPr>
-        <w:pStyle w:val="ListBullet"/>
-      </w:pPr>
       <w:r>
-        <w:t>skill_graph.py loads the ESCO taxonomy (1,201 IT skills from a CSV file) into a graph structure using NetworkX.</w:t>
-      </w:r>
-    </w:p>
-    <w:p>
-      <w:pPr>
-        <w:pStyle w:val="ListBullet"/>
-      </w:pPr>
-      <w:r>
-        <w:t>It adds modern technologies (Python, React, Docker, etc.) that are not in the official ESCO list.</w:t>
-      </w:r>
-    </w:p>
-    <w:p>
-      <w:pPr>
-        <w:pStyle w:val="ListBullet"/>
-      </w:pPr>
-      <w:r>
-        <w:t>The candidate's skills and the job's required skills are matched against the graph using fuzzy matching.</w:t>
+        <w:t>This module scores the candidate's answers.</w:t>
+        <w:br/>
+        <w:t>• evaluator.py — For each answer, it first generates an "ideal answer" using Gemini, then compares the candidate's answer against it. Scores on 4 criteria (technical accuracy, completeness, clarity, relevance — each 0-25, total 0-100). Runs two evaluations with different criterion order to reduce AI bias and averages them.</w:t>
       </w:r>
     </w:p>
     <w:p>
@@ -252,31 +655,20 @@
         <w:pStyle w:val="Heading2"/>
       </w:pPr>
       <w:r>
-        <w:t>Step 3: Gap Analysis</w:t>
+        <w:t>Skill Knowledge Graph &amp; State Tracking</w:t>
       </w:r>
     </w:p>
     <w:p>
-      <w:pPr>
-        <w:pStyle w:val="ListBullet"/>
-      </w:pPr>
       <w:r>
-        <w:t>The system compares what the candidate knows vs what the job requires.</w:t>
-      </w:r>
-    </w:p>
-    <w:p>
-      <w:pPr>
-        <w:pStyle w:val="ListBullet"/>
-      </w:pPr>
-      <w:r>
-        <w:t>Skills that are missing or weak become "topics" for the interview.</w:t>
-      </w:r>
-    </w:p>
-    <w:p>
-      <w:pPr>
-        <w:pStyle w:val="ListBullet"/>
-      </w:pPr>
-      <w:r>
-        <w:t>Each topic gets a priority (high/medium/low) and a reason explaining why it was selected.</w:t>
+        <w:t>This module manages the skill database and tracks interview progress.</w:t>
+        <w:br/>
+        <w:t>• skill_graph.py — Builds a map of 1,201 IT skills from ESCO taxonomy CSV files using NetworkX. Adds modern tech not in ESCO. Matches skills using fuzzy logic.</w:t>
+        <w:br/>
+        <w:t>• state.py — Tracks each skill's status during the interview: pending, verified strong, verified weak, confirmed gap. Records scores and decides when a skill is fully tested.</w:t>
+        <w:br/>
+        <w:t>• traversal.py — Decides which skill to ask next. Picks the lowest-scored skill first (adaptive strategy). Also decides if a follow-up question is needed for weak answers.</w:t>
+        <w:br/>
+        <w:t>• visualize.py — Creates charts showing candidate skills, job requirements, gaps, and full skill map.</w:t>
       </w:r>
     </w:p>
     <w:p>
@@ -284,31 +676,14 @@
         <w:pStyle w:val="Heading2"/>
       </w:pPr>
       <w:r>
-        <w:t>Step 4: Generate Questions</w:t>
+        <w:t>Interview Orchestrator</w:t>
       </w:r>
     </w:p>
     <w:p>
-      <w:pPr>
-        <w:pStyle w:val="ListBullet"/>
-      </w:pPr>
       <w:r>
-        <w:t>question_agent.py takes the topics and uses Gemini to generate a full interview question set.</w:t>
-      </w:r>
-    </w:p>
-    <w:p>
-      <w:pPr>
-        <w:pStyle w:val="ListBullet"/>
-      </w:pPr>
-      <w:r>
-        <w:t>The set includes: opening questions (warm-up), technical questions (one per skill), behavioural questions (STAR format), closing questions.</w:t>
-      </w:r>
-    </w:p>
-    <w:p>
-      <w:pPr>
-        <w:pStyle w:val="ListBullet"/>
-      </w:pPr>
-      <w:r>
-        <w:t>Each question has a difficulty level, follow-up probe, and estimated duration.</w:t>
+        <w:t>This is the "brain" that runs the text interview.</w:t>
+        <w:br/>
+        <w:t>• interview_loop.py — The InterviewLoop class runs the question → answer → evaluate cycle. Picks the next skill, generates a question, collects the answer, scores it, updates progress, and repeats until done.</w:t>
       </w:r>
     </w:p>
     <w:p>
@@ -316,63 +691,14 @@
         <w:pStyle w:val="Heading2"/>
       </w:pPr>
       <w:r>
-        <w:t>Step 5: Conduct Interview</w:t>
+        <w:t>Final Report Generator</w:t>
       </w:r>
     </w:p>
     <w:p>
-      <w:pPr>
-        <w:pStyle w:val="ListBullet"/>
-      </w:pPr>
       <w:r>
-        <w:t>The InterviewLoop (interview_loop.py) takes control.</w:t>
-      </w:r>
-    </w:p>
-    <w:p>
-      <w:pPr>
-        <w:pStyle w:val="ListBullet"/>
-      </w:pPr>
-      <w:r>
-        <w:t>It picks the next skill to test — always the one with the lowest score first (adaptive strategy).</w:t>
-      </w:r>
-    </w:p>
-    <w:p>
-      <w:pPr>
-        <w:pStyle w:val="ListBullet"/>
-      </w:pPr>
-      <w:r>
-        <w:t>For each skill, it generates a fresh question on the fly using Gemini.</w:t>
-      </w:r>
-    </w:p>
-    <w:p>
-      <w:pPr>
-        <w:pStyle w:val="ListBullet"/>
-      </w:pPr>
-      <w:r>
-        <w:t>The candidate answers (either by typing in Text Mode or speaking in LiveKit Mode).</w:t>
-      </w:r>
-    </w:p>
-    <w:p>
-      <w:pPr>
-        <w:pStyle w:val="ListBullet"/>
-      </w:pPr>
-      <w:r>
-        <w:t>The answer is scored by evaluator.py using LLM-as-Judge (two parallel Gemini calls to reduce bias).</w:t>
-      </w:r>
-    </w:p>
-    <w:p>
-      <w:pPr>
-        <w:pStyle w:val="ListBullet"/>
-      </w:pPr>
-      <w:r>
-        <w:t>If the answer is weak, a follow-up question may be asked (max 1 per skill).</w:t>
-      </w:r>
-    </w:p>
-    <w:p>
-      <w:pPr>
-        <w:pStyle w:val="ListBullet"/>
-      </w:pPr>
-      <w:r>
-        <w:t>The loop continues until all skills are verified or the question limit is reached.</w:t>
+        <w:t>This module creates the final output after the interview.</w:t>
+        <w:br/>
+        <w:t>• generator.py — Takes all answers and scores, computes overall average, assigns verdict (Strong Hire ≥70, Weak Hire 40-69, No Hire &lt;40), lists strengths and gaps, and builds the complete report with answer log.</w:t>
       </w:r>
     </w:p>
     <w:p>
@@ -380,47 +706,44 @@
         <w:pStyle w:val="Heading2"/>
       </w:pPr>
       <w:r>
-        <w:t>Step 6: Generate Report</w:t>
+        <w:t>Voice Interview System</w:t>
+      </w:r>
+    </w:p>
+    <w:p>
+      <w:r>
+        <w:t>This module handles everything related to voice interviews.</w:t>
+        <w:br/>
+        <w:t>• run_agent.py — The AI voice agent. Speaks questions (ElevenLabs), listens to answers (Deepgram), publishes live transcript to the web page.</w:t>
+        <w:br/>
+        <w:t>• whisper_server.py — A tiny web server that serves the voice interview web page and generates LiveKit access tokens.</w:t>
+        <w:br/>
+        <w:t>• launcher.py — Starts and manages the LiveKit server.</w:t>
+        <w:br/>
+        <w:t>• client.html — The web page the candidate sees: webcam, transcription, chat log.</w:t>
+        <w:br/>
+        <w:t>• livekit.yaml — Configuration file for the LiveKit server.</w:t>
       </w:r>
     </w:p>
     <w:p>
       <w:pPr>
-        <w:pStyle w:val="ListBullet"/>
+        <w:pStyle w:val="Heading2"/>
       </w:pPr>
       <w:r>
-        <w:t>After the interview, report/generator.py creates a final report.</w:t>
+        <w:t>Settings &amp; AI Communication</w:t>
       </w:r>
     </w:p>
     <w:p>
-      <w:pPr>
-        <w:pStyle w:val="ListBullet"/>
-      </w:pPr>
       <w:r>
-        <w:t>It calculates the overall score (average of all answers).</w:t>
+        <w:t>These two files support everything else.</w:t>
+        <w:br/>
+        <w:t>• config.py — Loads .env file, defines all constants (scoring thresholds, question limits, API keys, model names). One central place to change settings.</w:t>
+        <w:br/>
+        <w:t>• llm.py — Talks to Google Gemini API. Has two functions: call_llm() gets text responses, call_llm_json() gets JSON responses (auto-fixes broken JSON).</w:t>
       </w:r>
     </w:p>
     <w:p>
-      <w:pPr>
-        <w:pStyle w:val="ListBullet"/>
-      </w:pPr>
       <w:r>
-        <w:t>It assigns a verdict: Strong Hire (≥70), Weak Hire (40-69), No Hire (&lt;40).</w:t>
-      </w:r>
-    </w:p>
-    <w:p>
-      <w:pPr>
-        <w:pStyle w:val="ListBullet"/>
-      </w:pPr>
-      <w:r>
-        <w:t>It lists strengths (skills scoring ≥70), gaps (skills scoring &lt;40), and development areas.</w:t>
-      </w:r>
-    </w:p>
-    <w:p>
-      <w:pPr>
-        <w:pStyle w:val="ListBullet"/>
-      </w:pPr>
-      <w:r>
-        <w:t>It includes a full answer log with questions, answers, scores, and feedback.</w:t>
+        <w:br w:type="page"/>
       </w:r>
     </w:p>
     <w:p>
@@ -428,21 +751,188 @@
         <w:pStyle w:val="Heading1"/>
       </w:pPr>
       <w:r>
-        <w:t>4. Modules &amp; Components</w:t>
+        <w:t>7. Directory Structure — Every File Inside core/ Explained</w:t>
       </w:r>
     </w:p>
     <w:p>
       <w:r>
-        <w:t>The project has 7 main modules inside core/. Each module has a specific job:</w:t>
+        <w:t>Below is every file and folder inside the core/ directory. Each one is explained in simple terms.</w:t>
       </w:r>
     </w:p>
     <w:p>
       <w:r>
         <w:rPr>
           <w:b/>
-          <w:sz w:val="24"/>
+          <w:sz w:val="22"/>
         </w:rPr>
-        <w:t xml:space="preserve">agents/ </w:t>
+        <w:t>core/config.py</w:t>
+      </w:r>
+    </w:p>
+    <w:p>
+      <w:r>
+        <w:t>Settings file. Loads the .env file and defines all the numbers and rules the project uses: Gemini API key and model, scoring thresholds (70 = strong pass, 40 = weak pass), max questions per session (3), max follow-ups (1), and status labels for the skill graph. Every other file imports from here so settings are in one place.</w:t>
+      </w:r>
+    </w:p>
+    <w:p>
+      <w:r>
+        <w:rPr>
+          <w:b/>
+          <w:sz w:val="22"/>
+        </w:rPr>
+        <w:t>core/llm.py</w:t>
+      </w:r>
+    </w:p>
+    <w:p>
+      <w:r>
+        <w:t>AI communication module. Contains the code that calls Google Gemini API. Two main functions: call_llm() sends text and gets text back. call_llm_json() sends text and expects JSON back — it automatically removes markdown formatting and fixes broken JSON using json_repair library. Used by question generator, evaluator, and all agents.</w:t>
+      </w:r>
+    </w:p>
+    <w:p>
+      <w:r>
+        <w:rPr>
+          <w:b/>
+          <w:sz w:val="22"/>
+        </w:rPr>
+        <w:t>core/agents/ (folder — 3 files)</w:t>
+      </w:r>
+    </w:p>
+    <w:p>
+      <w:r>
+        <w:t>This folder handles input parsing and question creation.</w:t>
+        <w:br/>
+        <w:br/>
+        <w:t>core/agents/cv_agent.py — Reads the Resume. If PDF, extracts text first. Then sends to Gemini to extract: candidate name, skills list, experience summary.</w:t>
+        <w:br/>
+        <w:br/>
+        <w:t>core/agents/jd_agent.py — Reads the Job Description. Sends to Gemini to extract: job title, role level (junior/mid/senior), required skills list.</w:t>
+        <w:br/>
+        <w:br/>
+        <w:t>core/agents/question_agent.py — Creates interview questions. Three functions: generate_interview_questions() creates the full structured question set from skill topics. generate_position_question() creates one question on the fly during the live interview. build_interview_flow() flattens the structured set into a simple ordered list.</w:t>
+      </w:r>
+    </w:p>
+    <w:p>
+      <w:r>
+        <w:rPr>
+          <w:b/>
+          <w:sz w:val="22"/>
+        </w:rPr>
+        <w:t>core/evaluator/ (folder — 1 file)</w:t>
+      </w:r>
+    </w:p>
+    <w:p>
+      <w:r>
+        <w:t>This folder handles scoring the candidate's answers.</w:t>
+        <w:br/>
+        <w:br/>
+        <w:t>core/evaluator/evaluator.py — The scoring engine. For each answer: generates an "ideal" reference answer using Gemini, then compares the real answer against it. Scores on 4 criteria each worth 25 points: technical accuracy, completeness, clarity, relevance. To be fair, it runs the evaluation twice with criteria in different order and averages the scores. Answers shorter than 10 words automatically score 0. Returns score (0-100), verdict, and feedback.</w:t>
+      </w:r>
+    </w:p>
+    <w:p>
+      <w:r>
+        <w:rPr>
+          <w:b/>
+          <w:sz w:val="22"/>
+        </w:rPr>
+        <w:t>core/graph/ (folder — 4 files)</w:t>
+      </w:r>
+    </w:p>
+    <w:p>
+      <w:r>
+        <w:t>This folder manages the skill database and tracks interview progress.</w:t>
+        <w:br/>
+        <w:br/>
+        <w:t>core/graph/skill_graph.py — Builds a skill map from ESCO taxonomy CSVs (1,201 IT skills) using NetworkX. Adds modern tech manually (Python, React, Docker, etc.). Can fuzzy-match skill names. The gap_analysis() function finds what skills the candidate is missing.</w:t>
+        <w:br/>
+        <w:br/>
+        <w:t>core/graph/state.py — Tracks progress during the interview. Each skill has a node that stores: status (pending/verified/gap), scores, questions asked, best score. record_answer() updates status based on score. InterviewState tracks all skills together.</w:t>
+        <w:br/>
+        <w:br/>
+        <w:t>core/graph/traversal.py — Decides which skill to ask next. Picks the lowest-scored skill first, prioritizing high-priority skills, avoiding repeats. decide_follow_up() checks if a weak answer needs a follow-up question.</w:t>
+        <w:br/>
+        <w:br/>
+        <w:t>core/graph/visualize.py — Draws charts showing candidate skills, job requirements, skill gaps, and the full skill map. These appear in the Streamlit UI.</w:t>
+      </w:r>
+    </w:p>
+    <w:p>
+      <w:r>
+        <w:rPr>
+          <w:b/>
+          <w:sz w:val="22"/>
+        </w:rPr>
+        <w:t>core/pipeline/ (folder — 1 file)</w:t>
+      </w:r>
+    </w:p>
+    <w:p>
+      <w:r>
+        <w:t>This folder orchestrates the text interview.</w:t>
+        <w:br/>
+        <w:br/>
+        <w:t>core/pipeline/interview_loop.py — The InterviewLoop class runs the interview cycle: get_next_question() picks the next skill and generates a fresh question. submit_answer() scores the answer and updates state. Keeps going until all skills verified or max questions reached. get_summary() collects everything for the final report.</w:t>
+      </w:r>
+    </w:p>
+    <w:p>
+      <w:r>
+        <w:rPr>
+          <w:b/>
+          <w:sz w:val="22"/>
+        </w:rPr>
+        <w:t>core/report/ (folder — 1 file)</w:t>
+      </w:r>
+    </w:p>
+    <w:p>
+      <w:r>
+        <w:t>This folder creates the final report after the interview.</w:t>
+        <w:br/>
+        <w:br/>
+        <w:t>core/report/generator.py — Takes the InterviewLoop data, computes overall score, assigns verdict (Strong Hire ≥70, Weak Hire 40-69, No Hire &lt;40), lists strengths and gaps, and builds the complete report dictionary with answer log.</w:t>
+      </w:r>
+    </w:p>
+    <w:p>
+      <w:r>
+        <w:rPr>
+          <w:b/>
+          <w:sz w:val="22"/>
+        </w:rPr>
+        <w:t>core/livekit/ (folder — 4 files + client.html + livekit.yaml)</w:t>
+      </w:r>
+    </w:p>
+    <w:p>
+      <w:r>
+        <w:t>This folder handles the voice interview mode.</w:t>
+        <w:br/>
+        <w:br/>
+        <w:t>core/livekit/run_agent.py — The AI voice agent. Connects to LiveKit room, speaks pre-loaded questions using ElevenLabs TTS, listens to answers via Deepgram STT, publishes live transcript to the web page. Saves transcript JSON after all questions.</w:t>
+        <w:br/>
+        <w:br/>
+        <w:t>core/livekit/whisper_server.py — Tiny web server (port 18765). Serves the voice interview web page (client.html) at /livekit. Generates LiveKit tokens at /token. Saves transcripts at /save_transcript. Runs in a background thread.</w:t>
+        <w:br/>
+        <w:br/>
+        <w:t>core/livekit/launcher.py — Manages the LiveKit server. start_livekit_server() launches it if not running. launch() starts everything and returns the client URL. cleanup() shuts everything down on exit.</w:t>
+        <w:br/>
+        <w:br/>
+        <w:t>core/livekit/client.html — The web page the candidate sees during voice interview. Shows webcam feed, real-time transcription, chat conversation log, and current question. Auto-connects to LiveKit on load.</w:t>
+        <w:br/>
+        <w:br/>
+        <w:t>core/livekit/livekit.yaml — Configuration for the LiveKit server: ports, API keys, logging.</w:t>
+      </w:r>
+    </w:p>
+    <w:p>
+      <w:pPr>
+        <w:pStyle w:val="Heading1"/>
+      </w:pPr>
+      <w:r>
+        <w:t>8. Summary</w:t>
+      </w:r>
+    </w:p>
+    <w:p>
+      <w:r>
+        <w:t>InterviewAI takes a Resume + Job Description → parses them → builds a skill graph → finds gaps → generates interview questions → conducts the interview (text or voice) → scores each answer using AI → produces a final report with verdict and recommendations.</w:t>
+      </w:r>
+    </w:p>
+    <w:p/>
+    <w:p>
+      <w:r>
+        <w:t>Three API keys power everything:</w:t>
       </w:r>
     </w:p>
     <w:p>
@@ -450,19 +940,10 @@
         <w:rPr>
           <w:b/>
         </w:rPr>
-        <w:t xml:space="preserve">Parsing &amp; Question Generation: </w:t>
+        <w:t>Gemini</w:t>
       </w:r>
       <w:r>
-        <w:t>Contains 3 files: cv_agent.py (reads CV), jd_agent.py (reads JD), question_agent.py (generates interview questions).</w:t>
-      </w:r>
-    </w:p>
-    <w:p>
-      <w:r>
-        <w:rPr>
-          <w:b/>
-          <w:sz w:val="24"/>
-        </w:rPr>
-        <w:t xml:space="preserve">evaluator/ </w:t>
+        <w:t xml:space="preserve"> — reads CV/JD, generates questions, evaluates answers</w:t>
       </w:r>
     </w:p>
     <w:p>
@@ -470,19 +951,10 @@
         <w:rPr>
           <w:b/>
         </w:rPr>
-        <w:t xml:space="preserve">Answer Scoring: </w:t>
+        <w:t>Deepgram</w:t>
       </w:r>
       <w:r>
-        <w:t>Contains evaluator.py which uses Gemini to score answers on 4 criteria: technical accuracy, completeness, clarity, relevance.</w:t>
-      </w:r>
-    </w:p>
-    <w:p>
-      <w:r>
-        <w:rPr>
-          <w:b/>
-          <w:sz w:val="24"/>
-        </w:rPr>
-        <w:t xml:space="preserve">graph/ </w:t>
+        <w:t xml:space="preserve"> — converts speech to text (voice mode only)</w:t>
       </w:r>
     </w:p>
     <w:p>
@@ -490,420 +962,16 @@
         <w:rPr>
           <w:b/>
         </w:rPr>
-        <w:t xml:space="preserve">Skill Knowledge Graph: </w:t>
+        <w:t>ElevenLabs</w:t>
       </w:r>
       <w:r>
-        <w:t>Contains 4 files: skill_graph.py (builds ESCO graph), state.py (tracks interview progress), traversal.py (chooses next skill), visualize.py (draws charts).</w:t>
+        <w:t xml:space="preserve"> — converts text to speech (voice mode only)</w:t>
       </w:r>
     </w:p>
+    <w:p/>
     <w:p>
       <w:r>
-        <w:rPr>
-          <w:b/>
-          <w:sz w:val="24"/>
-        </w:rPr>
-        <w:t xml:space="preserve">pipeline/ </w:t>
-      </w:r>
-    </w:p>
-    <w:p>
-      <w:r>
-        <w:rPr>
-          <w:b/>
-        </w:rPr>
-        <w:t xml:space="preserve">Interview Orchestrator: </w:t>
-      </w:r>
-      <w:r>
-        <w:t>Contains interview_loop.py which runs the question → answer → evaluate cycle.</w:t>
-      </w:r>
-    </w:p>
-    <w:p>
-      <w:r>
-        <w:rPr>
-          <w:b/>
-          <w:sz w:val="24"/>
-        </w:rPr>
-        <w:t xml:space="preserve">report/ </w:t>
-      </w:r>
-    </w:p>
-    <w:p>
-      <w:r>
-        <w:rPr>
-          <w:b/>
-        </w:rPr>
-        <w:t xml:space="preserve">Final Report: </w:t>
-      </w:r>
-      <w:r>
-        <w:t>Contains generator.py which builds the final structured report.</w:t>
-      </w:r>
-    </w:p>
-    <w:p>
-      <w:r>
-        <w:rPr>
-          <w:b/>
-          <w:sz w:val="24"/>
-        </w:rPr>
-        <w:t xml:space="preserve">livekit/ </w:t>
-      </w:r>
-    </w:p>
-    <w:p>
-      <w:r>
-        <w:rPr>
-          <w:b/>
-        </w:rPr>
-        <w:t xml:space="preserve">Voice Interview System: </w:t>
-      </w:r>
-      <w:r>
-        <w:t>Contains 4 files + client.html: run_agent.py (voice agent), whisper_server.py (HTTP server), launcher.py (server manager), livekit.yaml (config).</w:t>
-      </w:r>
-    </w:p>
-    <w:p>
-      <w:r>
-        <w:rPr>
-          <w:b/>
-          <w:sz w:val="24"/>
-        </w:rPr>
-        <w:t xml:space="preserve">config.py + llm.py </w:t>
-      </w:r>
-    </w:p>
-    <w:p>
-      <w:r>
-        <w:rPr>
-          <w:b/>
-        </w:rPr>
-        <w:t xml:space="preserve">Configuration &amp; AI Client: </w:t>
-      </w:r>
-      <w:r>
-        <w:t>config.py loads settings from .env. llm.py is the unified client for calling Gemini AI.</w:t>
-      </w:r>
-    </w:p>
-    <w:p>
-      <w:pPr>
-        <w:pStyle w:val="Heading1"/>
-      </w:pPr>
-      <w:r>
-        <w:t>5. Directory Structure — InterviewAI/core/</w:t>
-      </w:r>
-    </w:p>
-    <w:p>
-      <w:r>
-        <w:t>Below is every file and folder inside core/, with a plain-English explanation of what it does.</w:t>
-      </w:r>
-    </w:p>
-    <w:p>
-      <w:pPr>
-        <w:pStyle w:val="Heading2"/>
-      </w:pPr>
-      <w:r>
-        <w:t>core/config.py</w:t>
-      </w:r>
-    </w:p>
-    <w:p>
-      <w:r>
-        <w:t>This is the settings file. It loads the .env file and defines all the numbers and rules the project uses: the Gemini API key and model name, the temperature (creativity) of the AI, the maximum number of tokens, the scoring thresholds (70 = strong, 40 = weak), how many questions to ask per session (3), how many follow-ups allowed (1), and the status labels for the graph (pending, verified, confirmed gap). Every other file imports from here so there is one central place to change settings.</w:t>
-      </w:r>
-    </w:p>
-    <w:p>
-      <w:pPr>
-        <w:pStyle w:val="Heading2"/>
-      </w:pPr>
-      <w:r>
-        <w:t>core/llm.py</w:t>
-      </w:r>
-    </w:p>
-    <w:p>
-      <w:r>
-        <w:t>This is the AI communication module. It contains the code that talks to Google's Gemini API. There are three functions: call_llm() sends a text prompt and gets text back. call_llm_json() sends a prompt and expects JSON back — it also cleans up the response (removes markdown formatting) and if the JSON is broken, it uses a library called json_repair to fix it. This is used by the question generator and evaluator to get structured data from the AI.</w:t>
-      </w:r>
-    </w:p>
-    <w:p>
-      <w:pPr>
-        <w:pStyle w:val="Heading2"/>
-      </w:pPr>
-      <w:r>
-        <w:t>core/agents/ (folder)</w:t>
-      </w:r>
-    </w:p>
-    <w:p>
-      <w:r>
-        <w:t>This folder contains 3 files that handle input parsing and question creation.</w:t>
-      </w:r>
-    </w:p>
-    <w:p>
-      <w:pPr>
-        <w:pStyle w:val="Heading3"/>
-      </w:pPr>
-      <w:r>
-        <w:t>core/agents/cv_agent.py</w:t>
-      </w:r>
-    </w:p>
-    <w:p>
-      <w:r>
-        <w:t>Reads a candidate's CV (resume). If the file is a PDF, it first extracts the text using PyPDF2. Then it sends the full text to Gemini with a prompt asking it to extract: the candidate's name, their list of skills, and a short experience summary. Returns this as a dictionary.</w:t>
-      </w:r>
-    </w:p>
-    <w:p>
-      <w:pPr>
-        <w:pStyle w:val="Heading3"/>
-      </w:pPr>
-      <w:r>
-        <w:t>core/agents/jd_agent.py</w:t>
-      </w:r>
-    </w:p>
-    <w:p>
-      <w:r>
-        <w:t>Reads a Job Description text. Sends it to Gemini with a prompt asking it to extract: the job title, the role level (junior/mid/senior), and the list of required skills. Returns this as a dictionary.</w:t>
-      </w:r>
-    </w:p>
-    <w:p>
-      <w:pPr>
-        <w:pStyle w:val="Heading3"/>
-      </w:pPr>
-      <w:r>
-        <w:t>core/agents/question_agent.py</w:t>
-      </w:r>
-    </w:p>
-    <w:p>
-      <w:r>
-        <w:t>Generates interview questions. It has three functions: generate_interview_questions() takes the skill graph topics and creates a full structured question set (opening questions, technical questions per skill, behavioural questions, closing questions) using Gemini. It also calculates estimated total interview duration. generate_position_question() is used during the live interview — it creates a single question on the fly for a specific skill, adjusted for difficulty and whether it's a follow-up. build_interview_flow() takes the structured set and flattens it into a simple ordered list.</w:t>
-      </w:r>
-    </w:p>
-    <w:p>
-      <w:pPr>
-        <w:pStyle w:val="Heading2"/>
-      </w:pPr>
-      <w:r>
-        <w:t>core/evaluator/ (folder)</w:t>
-      </w:r>
-    </w:p>
-    <w:p>
-      <w:r>
-        <w:t>This folder contains 1 file that scores answers.</w:t>
-      </w:r>
-    </w:p>
-    <w:p>
-      <w:pPr>
-        <w:pStyle w:val="Heading3"/>
-      </w:pPr>
-      <w:r>
-        <w:t>core/evaluator/evaluator.py</w:t>
-      </w:r>
-    </w:p>
-    <w:p>
-      <w:r>
-        <w:t>This is the scoring engine. It works like this: first, it generates a "reference answer" (an ideal answer) for the question using Gemini. Then it compares the candidate's real answer against this reference. It scores on 4 criteria: technical accuracy (0-25), completeness (0-25), clarity (0-25), relevance (0-25). To reduce AI bias, it runs the evaluation twice with the criteria in different orders and averages the scores. If the answer is very short (under 10 words), it automatically scores 0. Returns a result with final score (0-100), verdict (strong/weak/gap), feedback, and the reference answer.</w:t>
-      </w:r>
-    </w:p>
-    <w:p>
-      <w:pPr>
-        <w:pStyle w:val="Heading2"/>
-      </w:pPr>
-      <w:r>
-        <w:t>core/graph/ (folder)</w:t>
-      </w:r>
-    </w:p>
-    <w:p>
-      <w:r>
-        <w:t>This folder contains 4 files that build and manage the skill knowledge graph.</w:t>
-      </w:r>
-    </w:p>
-    <w:p>
-      <w:pPr>
-        <w:pStyle w:val="Heading3"/>
-      </w:pPr>
-      <w:r>
-        <w:t>core/graph/skill_graph.py</w:t>
-      </w:r>
-    </w:p>
-    <w:p>
-      <w:r>
-        <w:t>Builds a graph of skills using the ESCO taxonomy (a European standard list of 1,201 IT skills). It loads two CSV files: one with skill names and descriptions, another with relationships between skills (broader/narrower). It creates a NetworkX directed graph where skills are nodes and relationships are edges. Since ESCO is missing many modern tools (Python, React, Docker, etc.), it adds them manually. It can fuzzy-match skill names to the graph using difflib. The gap_analysis() function compares a candidate's skills against job requirements and identifies what's missing.</w:t>
-      </w:r>
-    </w:p>
-    <w:p>
-      <w:pPr>
-        <w:pStyle w:val="Heading3"/>
-      </w:pPr>
-      <w:r>
-        <w:t>core/graph/state.py</w:t>
-      </w:r>
-    </w:p>
-    <w:p>
-      <w:r>
-        <w:t>Tracks the progress of the interview. For each skill being tested, it stores: current status (pending, verified_strong, verified_weak, confirmed_gap), list of scores, how many questions asked, best score so far, and feedback. The record_answer() method updates the status automatically based on the score. The InterviewState class holds all skills together and provides methods like pending_skills, is_complete(), and summary() to check overall progress.</w:t>
-      </w:r>
-    </w:p>
-    <w:p>
-      <w:pPr>
-        <w:pStyle w:val="Heading3"/>
-      </w:pPr>
-      <w:r>
-        <w:t>core/graph/traversal.py</w:t>
-      </w:r>
-    </w:p>
-    <w:p>
-      <w:r>
-        <w:t>Decides which skill to ask about next. The pick_next_skill() function looks at all incomplete skills and picks the one with the lowest average score first (prioritizing high-priority skills). It avoids asking the same skill twice in a row. The decide_follow_up() function checks if a weak answer (below 70) needs a follow-up question, capped at one follow-up per skill.</w:t>
-      </w:r>
-    </w:p>
-    <w:p>
-      <w:pPr>
-        <w:pStyle w:val="Heading3"/>
-      </w:pPr>
-      <w:r>
-        <w:t>core/graph/visualize.py</w:t>
-      </w:r>
-    </w:p>
-    <w:p>
-      <w:r>
-        <w:t>Creates charts (matplotlib figures) to show the skill analysis visually. render_candidate_graph() shows the candidate's skills grouped by category. render_job_graph() shows the job's required skills. render_gap_graph() highlights missing or weak skills. render_full_graph() shows everything together. These charts appear in the Streamlit UI.</w:t>
-      </w:r>
-    </w:p>
-    <w:p>
-      <w:pPr>
-        <w:pStyle w:val="Heading2"/>
-      </w:pPr>
-      <w:r>
-        <w:t>core/pipeline/ (folder)</w:t>
-      </w:r>
-    </w:p>
-    <w:p>
-      <w:r>
-        <w:t>This folder contains 1 file that orchestrates the interview.</w:t>
-      </w:r>
-    </w:p>
-    <w:p>
-      <w:pPr>
-        <w:pStyle w:val="Heading3"/>
-      </w:pPr>
-      <w:r>
-        <w:t>core/pipeline/interview_loop.py</w:t>
-      </w:r>
-    </w:p>
-    <w:p>
-      <w:r>
-        <w:t>This is the brain of the Text Mode interview. The InterviewLoop class: get_next_question() picks the next skill using traversal.py, determines difficulty based on how the candidate has scored so far on that skill, generates a fresh question via question_agent.py, and returns it. submit_answer() takes the candidate's typed answer, sends it to evaluator.py for scoring, updates the graph state, and decides if a follow-up is needed. The loop keeps going until all skills are verified or the maximum questions (3) are asked. get_summary() collects everything for the final report.</w:t>
-      </w:r>
-    </w:p>
-    <w:p>
-      <w:pPr>
-        <w:pStyle w:val="Heading2"/>
-      </w:pPr>
-      <w:r>
-        <w:t>core/report/ (folder)</w:t>
-      </w:r>
-    </w:p>
-    <w:p>
-      <w:r>
-        <w:t>This folder contains 1 file that creates the final output.</w:t>
-      </w:r>
-    </w:p>
-    <w:p>
-      <w:pPr>
-        <w:pStyle w:val="Heading3"/>
-      </w:pPr>
-      <w:r>
-        <w:t>core/report/generator.py</w:t>
-      </w:r>
-    </w:p>
-    <w:p>
-      <w:r>
-        <w:t>After the interview ends, this builds the final report. It takes the InterviewLoop, computes the overall score (average of all answers), picks a verdict: Strong Hire (≥70), Weak Hire (40-69), or No Hire (&lt;40). It creates a per-skill breakdown showing scores and feedback. It identifies strengths (skills scoring ≥70), gaps (skills scoring &lt;40), and development areas. Returns a dictionary with all this information plus a full answer log.</w:t>
-      </w:r>
-    </w:p>
-    <w:p>
-      <w:pPr>
-        <w:pStyle w:val="Heading2"/>
-      </w:pPr>
-      <w:r>
-        <w:t>core/livekit/ (folder)</w:t>
-      </w:r>
-    </w:p>
-    <w:p>
-      <w:r>
-        <w:t>This folder handles the voice interview mode (LiveKit). It has 4 Python files, a config file, and an HTML file.</w:t>
-      </w:r>
-    </w:p>
-    <w:p>
-      <w:pPr>
-        <w:pStyle w:val="Heading3"/>
-      </w:pPr>
-      <w:r>
-        <w:t>core/livekit/run_agent.py</w:t>
-      </w:r>
-    </w:p>
-    <w:p>
-      <w:r>
-        <w:t>This is the AI voice agent. It connects to a LiveKit room and conducts the interview by voice. It speaks pre-generated questions using ElevenLabs TTS (text-to-speech). It listens to the candidate's answers using Deepgram STT (speech-to-text). It does NOT use Gemini for conversation — all questions are pre-loaded. The agent publishes real-time transcript data to the room so the web client can display it. After all questions are done, it saves a transcript JSON file and disconnects.</w:t>
-      </w:r>
-    </w:p>
-    <w:p>
-      <w:pPr>
-        <w:pStyle w:val="Heading3"/>
-      </w:pPr>
-      <w:r>
-        <w:t>core/livekit/whisper_server.py</w:t>
-      </w:r>
-    </w:p>
-    <w:p>
-      <w:r>
-        <w:t>A tiny web server (runs on port 18765) that provides three services: GET /livekit serves the client.html page (the voice interview UI). GET /token generates a LiveKit access token and starts the agent subprocess. POST /save_transcript saves the conversation transcript. It runs in a background thread and is started automatically when app.py launches.</w:t>
-      </w:r>
-    </w:p>
-    <w:p>
-      <w:pPr>
-        <w:pStyle w:val="Heading3"/>
-      </w:pPr>
-      <w:r>
-        <w:t>core/livekit/launcher.py</w:t>
-      </w:r>
-    </w:p>
-    <w:p>
-      <w:r>
-        <w:t>Manages the LiveKit server process. start_livekit_server() checks if LiveKit is already running (on port 7880) and starts it if not. launch() starts both the LiveKit server and the web server, and returns the client URL. cleanup() shuts everything down when the application exits.</w:t>
-      </w:r>
-    </w:p>
-    <w:p>
-      <w:pPr>
-        <w:pStyle w:val="Heading3"/>
-      </w:pPr>
-      <w:r>
-        <w:t>core/livekit/livekit.yaml</w:t>
-      </w:r>
-    </w:p>
-    <w:p>
-      <w:r>
-        <w:t>Configuration file for the LiveKit server. Sets the ports, API keys, logging level, and WebRTC settings. The launcher.py passes this to the livekit-server executable.</w:t>
-      </w:r>
-    </w:p>
-    <w:p>
-      <w:pPr>
-        <w:pStyle w:val="Heading3"/>
-      </w:pPr>
-      <w:r>
-        <w:t>core/livekit/client.html</w:t>
-      </w:r>
-    </w:p>
-    <w:p>
-      <w:r>
-        <w:t>A web page that the candidate uses for the voice interview. It shows: the candidate's webcam feed, real-time transcription of what the AI agent says, a chat-style conversation history, and the current question being asked. It connects to LiveKit using the livekit-client JavaScript SDK, publishes the mic and camera tracks, and subscribes to the agent's audio. It auto-connects when the page loads and saves a transcript when disconnected.</w:t>
-      </w:r>
-    </w:p>
-    <w:p>
-      <w:pPr>
-        <w:pStyle w:val="Heading1"/>
-      </w:pPr>
-      <w:r>
-        <w:t>6. Summary</w:t>
-      </w:r>
-    </w:p>
-    <w:p>
-      <w:r>
-        <w:t>InterviewAI takes a Resume + Job Description → parses them → builds a skill graph → finds gaps → generates questions → conducts an interview (text or voice) → scores each answer using AI → produces a final report with verdict and recommendations.</w:t>
-      </w:r>
-    </w:p>
-    <w:p>
-      <w:r>
-        <w:t>All the logic lives inside core/: config (settings), llm (AI client), agents (parsing &amp; questions), evaluator (scoring), graph (skill knowledge &amp; state), pipeline (interview loop), report (final output), and livekit (voice system).</w:t>
+        <w:t>All the logic lives inside core/. Seven modules handle: settings (config.py), AI communication (llm.py), input parsing (agents/), answer scoring (evaluator/), skill knowledge (graph/), interview orchestration (pipeline/), report generation (report/), and voice interviews (livekit/).</w:t>
       </w:r>
     </w:p>
     <w:sectPr>

</xml_diff>

<commit_message>
Update PROJECT_GUIDE.docx to match current code
Key corrections:
- LiveKit agent uses Gemini dynamically (not pre-loaded questions)
- client.html has Start Interview button (not auto-connect)
- Text Mode = 3 questions, LiveKit Mode = up to 5
- LiveKit binary needs manual download (not automatic)
- Added Deepgram Nova-3 model details
- Added ElevenLabs eleven_flash_v2_5 + streaming_latency=4
- Added turn handling config (interruptions off, 1.5-4s endpointing)
- Added Gemini model details (2.5 Flash default, 2.0 Flash in agent)
</commit_message>
<xml_diff>
--- a/InterviewAI/PROJECT_GUIDE.docx
+++ b/InterviewAI/PROJECT_GUIDE.docx
@@ -5,9 +5,11 @@
     <w:p>
       <w:pPr>
         <w:pStyle w:val="Title"/>
-        <w:jc w:val="center"/>
       </w:pPr>
       <w:r>
+        <w:rPr>
+          <w:color w:val="0F172A"/>
+        </w:rPr>
         <w:t>InterviewAI — Complete Project Guide</w:t>
       </w:r>
     </w:p>
@@ -16,47 +18,35 @@
         <w:jc w:val="center"/>
       </w:pPr>
       <w:r>
-        <w:rPr>
-          <w:i/>
-        </w:rPr>
         <w:t>A simple, clear explanation of the entire project</w:t>
       </w:r>
     </w:p>
-    <w:p/>
     <w:p>
-      <w:pPr>
-        <w:jc w:val="center"/>
-      </w:pPr>
       <w:r>
-        <w:rPr>
-          <w:b/>
-        </w:rPr>
         <w:t>CMP7200 Individual Masters Project</w:t>
       </w:r>
     </w:p>
     <w:p>
-      <w:pPr>
-        <w:jc w:val="center"/>
-      </w:pPr>
       <w:r>
         <w:t>Birmingham City University</w:t>
       </w:r>
     </w:p>
     <w:p>
+      <w:pPr>
+        <w:pStyle w:val="Heading1"/>
+      </w:pPr>
       <w:r>
-        <w:br w:type="page"/>
-      </w:r>
-    </w:p>
-    <w:p>
-      <w:pPr>
-        <w:pStyle w:val="Heading1"/>
-      </w:pPr>
-      <w:r>
+        <w:rPr>
+          <w:color w:val="1A56DB"/>
+        </w:rPr>
         <w:t>1. What Is This Project?</w:t>
       </w:r>
     </w:p>
     <w:p>
       <w:r>
+        <w:rPr>
+          <w:b w:val="0"/>
+        </w:rPr>
         <w:t>InterviewAI is an AI-powered system that conducts technical interviews automatically. A candidate uploads their Resume and a Job Description, and the system:</w:t>
       </w:r>
     </w:p>
@@ -116,16 +106,12 @@
         <w:t>Produces a final report: overall score, strengths, gaps, and hire decision.</w:t>
       </w:r>
     </w:p>
-    <w:p/>
     <w:p>
       <w:r>
         <w:rPr>
-          <w:b/>
+          <w:b w:val="0"/>
         </w:rPr>
-        <w:t xml:space="preserve">You do NOT need any coding knowledge to use this. </w:t>
-      </w:r>
-      <w:r>
-        <w:t>Everything runs through a web browser.</w:t>
+        <w:t>You do NOT need any coding knowledge to use this. Everything runs through a web browser.</w:t>
       </w:r>
     </w:p>
     <w:p>
@@ -133,51 +119,18 @@
         <w:pStyle w:val="Heading1"/>
       </w:pPr>
       <w:r>
+        <w:rPr>
+          <w:color w:val="1A56DB"/>
+        </w:rPr>
         <w:t>2. What Inputs Does It Need?</w:t>
       </w:r>
     </w:p>
     <w:p>
       <w:r>
+        <w:rPr>
+          <w:b w:val="0"/>
+        </w:rPr>
         <w:t>The system needs 3 things to work:</w:t>
-      </w:r>
-    </w:p>
-    <w:p>
-      <w:pPr>
-        <w:pStyle w:val="Heading2"/>
-      </w:pPr>
-      <w:r>
-        <w:t>1. Resume / CV (PDF or text)</w:t>
-      </w:r>
-    </w:p>
-    <w:p>
-      <w:r>
-        <w:t>A file containing the candidate's work history, skills, and qualifications. The system reads this to understand what the candidate already knows.</w:t>
-      </w:r>
-    </w:p>
-    <w:p>
-      <w:pPr>
-        <w:pStyle w:val="Heading2"/>
-      </w:pPr>
-      <w:r>
-        <w:t>2. Job Description (text)</w:t>
-      </w:r>
-    </w:p>
-    <w:p>
-      <w:r>
-        <w:t>A description of the job role — what skills are required, what experience level (junior/mid/senior), and what the role involves. The system reads this to know what skills to test.</w:t>
-      </w:r>
-    </w:p>
-    <w:p>
-      <w:pPr>
-        <w:pStyle w:val="Heading2"/>
-      </w:pPr>
-      <w:r>
-        <w:t>3. API Keys (in .env file)</w:t>
-      </w:r>
-    </w:p>
-    <w:p>
-      <w:r>
-        <w:t>Three API keys are required. These are stored in a file called .env:</w:t>
       </w:r>
     </w:p>
     <w:p>
@@ -185,10 +138,15 @@
         <w:rPr>
           <w:b/>
         </w:rPr>
-        <w:t xml:space="preserve">GEMINI_API_KEY </w:t>
+        <w:t>1. Resume / CV (PDF or text)</w:t>
       </w:r>
+    </w:p>
+    <w:p>
       <w:r>
-        <w:t>— For all AI operations: reading CV/JD, generating questions, evaluating answers.</w:t>
+        <w:rPr>
+          <w:b w:val="0"/>
+        </w:rPr>
+        <w:t>A file containing the candidate's work history, skills, and qualifications. The system reads this to understand what the candidate already knows.</w:t>
       </w:r>
     </w:p>
     <w:p>
@@ -196,10 +154,15 @@
         <w:rPr>
           <w:b/>
         </w:rPr>
-        <w:t xml:space="preserve">DEEPGRAM_API_KEY </w:t>
+        <w:t>2. Job Description (text)</w:t>
       </w:r>
+    </w:p>
+    <w:p>
       <w:r>
-        <w:t>— For voice mode only: converts speech to text (what the candidate says).</w:t>
+        <w:rPr>
+          <w:b w:val="0"/>
+        </w:rPr>
+        <w:t>A description of the job role — what skills are required, what experience level (junior/mid/senior), and what the role involves.</w:t>
       </w:r>
     </w:p>
     <w:p>
@@ -207,28 +170,65 @@
         <w:rPr>
           <w:b/>
         </w:rPr>
-        <w:t xml:space="preserve">ELEVENLABS_API_KEY </w:t>
-      </w:r>
-      <w:r>
-        <w:t>— For voice mode only: converts text to speech (the AI asking questions out loud).</w:t>
-      </w:r>
-    </w:p>
-    <w:p/>
-    <w:p>
-      <w:r>
-        <w:t>For LiveKit Mode, the system also uses its own built-in LiveKit server for managing the voice/video connection. This runs automatically — no extra setup needed.</w:t>
+        <w:t>3. API Keys (in .env file)</w:t>
       </w:r>
     </w:p>
     <w:p>
+      <w:r>
+        <w:rPr>
+          <w:b w:val="0"/>
+        </w:rPr>
+        <w:t>Three API keys are required. These are stored in a file called .env:</w:t>
+      </w:r>
+    </w:p>
+    <w:p>
+      <w:pPr>
+        <w:pStyle w:val="ListBullet"/>
+      </w:pPr>
+      <w:r>
+        <w:t>GEMINI_API_KEY — For all AI operations: reading CV/JD, generating questions, evaluating answers. Uses Gemini 2.5 Flash by default (configurable).</w:t>
+      </w:r>
+    </w:p>
+    <w:p>
+      <w:pPr>
+        <w:pStyle w:val="ListBullet"/>
+      </w:pPr>
+      <w:r>
+        <w:t>DEEPGRAM_API_KEY — For voice mode only: converts speech to text using Deepgram Nova-3 (best model).</w:t>
+      </w:r>
+    </w:p>
+    <w:p>
+      <w:pPr>
+        <w:pStyle w:val="ListBullet"/>
+      </w:pPr>
+      <w:r>
+        <w:t>ELEVENLABS_API_KEY — For voice mode only: converts text to speech using ElevenLabs Flash v2.5 (fastest real-time model).</w:t>
+      </w:r>
+    </w:p>
+    <w:p>
+      <w:r>
+        <w:rPr>
+          <w:b w:val="0"/>
+        </w:rPr>
+        <w:t>For LiveKit Mode, the system also uses a LiveKit server for managing the voice/video connection. You need to download the LiveKit server binary once from github.com/livekit/livekit/releases — it goes to your temp folder automatically. After that, everything starts automatically.</w:t>
+      </w:r>
+    </w:p>
+    <w:p>
       <w:pPr>
         <w:pStyle w:val="Heading1"/>
       </w:pPr>
       <w:r>
+        <w:rPr>
+          <w:color w:val="1A56DB"/>
+        </w:rPr>
         <w:t>3. What Outputs Does It Produce?</w:t>
       </w:r>
     </w:p>
     <w:p>
       <w:r>
+        <w:rPr>
+          <w:b w:val="0"/>
+        </w:rPr>
         <w:t>After the interview, the system produces a Final Report containing:</w:t>
       </w:r>
     </w:p>
@@ -293,646 +293,18 @@
         <w:pStyle w:val="Heading1"/>
       </w:pPr>
       <w:r>
+        <w:rPr>
+          <w:color w:val="1A56DB"/>
+        </w:rPr>
         <w:t>4. How It Works — Step by Step</w:t>
       </w:r>
     </w:p>
     <w:p>
       <w:r>
+        <w:rPr>
+          <w:b w:val="0"/>
+        </w:rPr>
         <w:t>The system runs in 6 stages, one after another:</w:t>
-      </w:r>
-    </w:p>
-    <w:p>
-      <w:pPr>
-        <w:pStyle w:val="Heading2"/>
-      </w:pPr>
-      <w:r>
-        <w:t>Stage 1: Parse CV &amp; JD</w:t>
-      </w:r>
-    </w:p>
-    <w:p>
-      <w:r>
-        <w:t>The candidate uploads their Resume and pastes the Job Description. The system sends both to Gemini AI, which extracts: the candidate's name and skills (from Resume), and the job title, level, and required skills (from JD). All of this is returned as structured data.</w:t>
-      </w:r>
-    </w:p>
-    <w:p>
-      <w:pPr>
-        <w:pStyle w:val="Heading2"/>
-      </w:pPr>
-      <w:r>
-        <w:t>Stage 2: Build Skill Graph</w:t>
-      </w:r>
-    </w:p>
-    <w:p>
-      <w:r>
-        <w:t>The system loads the ESCO taxonomy — a European-standard database of 1,201 IT skills — into a graph (like a map where skills are connected to related skills). It adds modern technologies like Python, React, and Docker that ESCO doesn't cover. The candidate's skills and the job's required skills are matched against this graph.</w:t>
-      </w:r>
-    </w:p>
-    <w:p>
-      <w:pPr>
-        <w:pStyle w:val="Heading2"/>
-      </w:pPr>
-      <w:r>
-        <w:t>Stage 3: Gap Analysis</w:t>
-      </w:r>
-    </w:p>
-    <w:p>
-      <w:r>
-        <w:t>The system compares what the candidate knows vs what the job needs. Skills that are missing or weak become "topics" for the interview. Each topic gets a priority level and a reason.</w:t>
-      </w:r>
-    </w:p>
-    <w:p>
-      <w:pPr>
-        <w:pStyle w:val="Heading2"/>
-      </w:pPr>
-      <w:r>
-        <w:t>Stage 4: Generate Questions</w:t>
-      </w:r>
-    </w:p>
-    <w:p>
-      <w:r>
-        <w:t>Using Gemini AI, the system creates a full interview question set: opening questions (warm-up), technical questions (one per skill to test), behavioural questions (STAR format), and closing questions. Each question has a difficulty level and a follow-up probe.</w:t>
-      </w:r>
-    </w:p>
-    <w:p>
-      <w:pPr>
-        <w:pStyle w:val="Heading2"/>
-      </w:pPr>
-      <w:r>
-        <w:t>Stage 5: Conduct Interview</w:t>
-      </w:r>
-    </w:p>
-    <w:p>
-      <w:r>
-        <w:t>The interview runs in one of two modes:</w:t>
-        <w:br/>
-        <w:t>• Text Mode: Questions appear on screen. The candidate types answers and clicks Submit. Each answer is immediately scored by Gemini AI (two evaluations averaged for accuracy). The system adapts — it picks the weakest skill first and asks follow-ups if needed.</w:t>
-        <w:br/>
-        <w:t>• LiveKit Mode: A voice agent speaks the questions using ElevenLabs (AI voice). The candidate speaks their answers. Deepgram converts speech to text. Everything happens in real time through a web page. At the end, a transcript is saved.</w:t>
-      </w:r>
-    </w:p>
-    <w:p>
-      <w:pPr>
-        <w:pStyle w:val="Heading2"/>
-      </w:pPr>
-      <w:r>
-        <w:t>Stage 6: Generate Report</w:t>
-      </w:r>
-    </w:p>
-    <w:p>
-      <w:r>
-        <w:t>After the interview ends, the system builds the final report: overall score, verdict, per-skill breakdown, strengths, gaps, development areas, and full answer log.</w:t>
-      </w:r>
-    </w:p>
-    <w:p>
-      <w:r>
-        <w:br w:type="page"/>
-      </w:r>
-    </w:p>
-    <w:p>
-      <w:pPr>
-        <w:pStyle w:val="Heading1"/>
-      </w:pPr>
-      <w:r>
-        <w:t>5. The Two Interview Modes</w:t>
-      </w:r>
-    </w:p>
-    <w:p>
-      <w:pPr>
-        <w:pStyle w:val="Heading2"/>
-      </w:pPr>
-      <w:r>
-        <w:t>Text Mode</w:t>
-      </w:r>
-    </w:p>
-    <w:p>
-      <w:r>
-        <w:t>This is the simpler mode. The candidate sees questions on a web page, types their answer in a text box, and clicks Submit. The AI scores it immediately and moves to the next question. No microphone or camera needed.</w:t>
-      </w:r>
-    </w:p>
-    <w:p>
-      <w:r>
-        <w:t>Flow:</w:t>
-      </w:r>
-    </w:p>
-    <w:p>
-      <w:pPr>
-        <w:pStyle w:val="ListBullet"/>
-      </w:pPr>
-      <w:r>
-        <w:t>System picks the lowest-scored skill first.</w:t>
-      </w:r>
-    </w:p>
-    <w:p>
-      <w:pPr>
-        <w:pStyle w:val="ListBullet"/>
-      </w:pPr>
-      <w:r>
-        <w:t>Generates a fresh question for that skill using Gemini.</w:t>
-      </w:r>
-    </w:p>
-    <w:p>
-      <w:pPr>
-        <w:pStyle w:val="ListBullet"/>
-      </w:pPr>
-      <w:r>
-        <w:t>Displays the question on screen.</w:t>
-      </w:r>
-    </w:p>
-    <w:p>
-      <w:pPr>
-        <w:pStyle w:val="ListBullet"/>
-      </w:pPr>
-      <w:r>
-        <w:t>Candidate types answer and clicks Submit.</w:t>
-      </w:r>
-    </w:p>
-    <w:p>
-      <w:pPr>
-        <w:pStyle w:val="ListBullet"/>
-      </w:pPr>
-      <w:r>
-        <w:t>AI evaluates the answer (two Gemini calls, scores averaged).</w:t>
-      </w:r>
-    </w:p>
-    <w:p>
-      <w:pPr>
-        <w:pStyle w:val="ListBullet"/>
-      </w:pPr>
-      <w:r>
-        <w:t>Result shown immediately. If weak, a follow-up may be asked.</w:t>
-      </w:r>
-    </w:p>
-    <w:p>
-      <w:pPr>
-        <w:pStyle w:val="ListBullet"/>
-      </w:pPr>
-      <w:r>
-        <w:t>Repeats until all skills tested or max questions reached.</w:t>
-      </w:r>
-    </w:p>
-    <w:p>
-      <w:pPr>
-        <w:pStyle w:val="ListBullet"/>
-      </w:pPr>
-      <w:r>
-        <w:t>Final report generated automatically.</w:t>
-      </w:r>
-    </w:p>
-    <w:p>
-      <w:pPr>
-        <w:pStyle w:val="Heading2"/>
-      </w:pPr>
-      <w:r>
-        <w:t>LiveKit Mode (Voice Interview)</w:t>
-      </w:r>
-    </w:p>
-    <w:p>
-      <w:r>
-        <w:t>In this mode, the candidate speaks their answers through a microphone and the AI speaks the questions out loud. It works like a real voice call.</w:t>
-      </w:r>
-    </w:p>
-    <w:p>
-      <w:r>
-        <w:t>What is LiveKit?</w:t>
-      </w:r>
-    </w:p>
-    <w:p>
-      <w:r>
-        <w:t>LiveKit is an open-source platform for real-time voice/video communication (similar to Zoom). It runs as a server on your machine. The system starts it automatically when you use voice mode.</w:t>
-      </w:r>
-    </w:p>
-    <w:p>
-      <w:r>
-        <w:t>How the Voice Interview Works:</w:t>
-      </w:r>
-    </w:p>
-    <w:p>
-      <w:pPr>
-        <w:pStyle w:val="ListBullet"/>
-      </w:pPr>
-      <w:r>
-        <w:t>1. The system starts a small web server (port 18765) and the LiveKit server (port 7880).</w:t>
-      </w:r>
-    </w:p>
-    <w:p>
-      <w:pPr>
-        <w:pStyle w:val="ListBullet"/>
-      </w:pPr>
-      <w:r>
-        <w:t>2. The candidate's browser opens a web page (client.html) that shows their webcam and a chat log.</w:t>
-      </w:r>
-    </w:p>
-    <w:p>
-      <w:pPr>
-        <w:pStyle w:val="ListBullet"/>
-      </w:pPr>
-      <w:r>
-        <w:t>3. An AI "agent" (run_agent.py) joins the same room as the candidate.</w:t>
-      </w:r>
-    </w:p>
-    <w:p>
-      <w:pPr>
-        <w:pStyle w:val="ListBullet"/>
-      </w:pPr>
-      <w:r>
-        <w:t>4. The agent speaks pre-generated questions one by one using ElevenLabs TTS (text-to-speech).</w:t>
-      </w:r>
-    </w:p>
-    <w:p>
-      <w:pPr>
-        <w:pStyle w:val="ListBullet"/>
-      </w:pPr>
-      <w:r>
-        <w:t xml:space="preserve">   ElevenLabs converts text into natural-sounding human speech.</w:t>
-      </w:r>
-    </w:p>
-    <w:p>
-      <w:pPr>
-        <w:pStyle w:val="ListBullet"/>
-      </w:pPr>
-      <w:r>
-        <w:t>5. The candidate hears the question and speaks their answer into the microphone.</w:t>
-      </w:r>
-    </w:p>
-    <w:p>
-      <w:pPr>
-        <w:pStyle w:val="ListBullet"/>
-      </w:pPr>
-      <w:r>
-        <w:t>6. Deepgram STT (speech-to-text) converts their speech into text in real time.</w:t>
-      </w:r>
-    </w:p>
-    <w:p>
-      <w:pPr>
-        <w:pStyle w:val="ListBullet"/>
-      </w:pPr>
-      <w:r>
-        <w:t>7. The text is displayed on the screen as "live transcription."</w:t>
-      </w:r>
-    </w:p>
-    <w:p>
-      <w:pPr>
-        <w:pStyle w:val="ListBullet"/>
-      </w:pPr>
-      <w:r>
-        <w:t>8. After all 5 questions, the agent says goodbye and saves a transcript file.</w:t>
-      </w:r>
-    </w:p>
-    <w:p>
-      <w:pPr>
-        <w:pStyle w:val="ListBullet"/>
-      </w:pPr>
-      <w:r>
-        <w:t>9. The candidate can end the interview anytime by clicking End.</w:t>
-      </w:r>
-    </w:p>
-    <w:p/>
-    <w:p>
-      <w:r>
-        <w:rPr>
-          <w:b/>
-        </w:rPr>
-        <w:t xml:space="preserve">Key point: </w:t>
-      </w:r>
-      <w:r>
-        <w:t>The LiveKit agent does NOT use Gemini during the conversation. All 5 questions are pre-loaded from the question generation stage. Gemini is only used before the interview starts (to create the questions). This makes the voice interview faster and more reliable.</w:t>
-      </w:r>
-    </w:p>
-    <w:p>
-      <w:r>
-        <w:br w:type="page"/>
-      </w:r>
-    </w:p>
-    <w:p>
-      <w:pPr>
-        <w:pStyle w:val="Heading1"/>
-      </w:pPr>
-      <w:r>
-        <w:t>6. Modules — What Each Part Does</w:t>
-      </w:r>
-    </w:p>
-    <w:p>
-      <w:r>
-        <w:t>The project has 7 modules (plus configuration and AI client). Each module has a specific job:</w:t>
-      </w:r>
-    </w:p>
-    <w:p>
-      <w:pPr>
-        <w:pStyle w:val="Heading2"/>
-      </w:pPr>
-      <w:r>
-        <w:t>Parsing &amp; Question Generation</w:t>
-      </w:r>
-    </w:p>
-    <w:p>
-      <w:r>
-        <w:t>This module handles understanding the inputs and creating questions.</w:t>
-        <w:br/>
-        <w:t>• cv_agent.py — Takes a Resume PDF or text, extracts name + skills + experience using Gemini.</w:t>
-        <w:br/>
-        <w:t>• jd_agent.py — Takes a Job Description, extracts job title + level + required skills using Gemini.</w:t>
-        <w:br/>
-        <w:t>• question_agent.py — Takes the skill analysis topics and generates full interview questions using Gemini.</w:t>
-      </w:r>
-    </w:p>
-    <w:p>
-      <w:pPr>
-        <w:pStyle w:val="Heading2"/>
-      </w:pPr>
-      <w:r>
-        <w:t>Answer Scoring (LLM-as-Judge)</w:t>
-      </w:r>
-    </w:p>
-    <w:p>
-      <w:r>
-        <w:t>This module scores the candidate's answers.</w:t>
-        <w:br/>
-        <w:t>• evaluator.py — For each answer, it first generates an "ideal answer" using Gemini, then compares the candidate's answer against it. Scores on 4 criteria (technical accuracy, completeness, clarity, relevance — each 0-25, total 0-100). Runs two evaluations with different criterion order to reduce AI bias and averages them.</w:t>
-      </w:r>
-    </w:p>
-    <w:p>
-      <w:pPr>
-        <w:pStyle w:val="Heading2"/>
-      </w:pPr>
-      <w:r>
-        <w:t>Skill Knowledge Graph &amp; State Tracking</w:t>
-      </w:r>
-    </w:p>
-    <w:p>
-      <w:r>
-        <w:t>This module manages the skill database and tracks interview progress.</w:t>
-        <w:br/>
-        <w:t>• skill_graph.py — Builds a map of 1,201 IT skills from ESCO taxonomy CSV files using NetworkX. Adds modern tech not in ESCO. Matches skills using fuzzy logic.</w:t>
-        <w:br/>
-        <w:t>• state.py — Tracks each skill's status during the interview: pending, verified strong, verified weak, confirmed gap. Records scores and decides when a skill is fully tested.</w:t>
-        <w:br/>
-        <w:t>• traversal.py — Decides which skill to ask next. Picks the lowest-scored skill first (adaptive strategy). Also decides if a follow-up question is needed for weak answers.</w:t>
-        <w:br/>
-        <w:t>• visualize.py — Creates charts showing candidate skills, job requirements, gaps, and full skill map.</w:t>
-      </w:r>
-    </w:p>
-    <w:p>
-      <w:pPr>
-        <w:pStyle w:val="Heading2"/>
-      </w:pPr>
-      <w:r>
-        <w:t>Interview Orchestrator</w:t>
-      </w:r>
-    </w:p>
-    <w:p>
-      <w:r>
-        <w:t>This is the "brain" that runs the text interview.</w:t>
-        <w:br/>
-        <w:t>• interview_loop.py — The InterviewLoop class runs the question → answer → evaluate cycle. Picks the next skill, generates a question, collects the answer, scores it, updates progress, and repeats until done.</w:t>
-      </w:r>
-    </w:p>
-    <w:p>
-      <w:pPr>
-        <w:pStyle w:val="Heading2"/>
-      </w:pPr>
-      <w:r>
-        <w:t>Final Report Generator</w:t>
-      </w:r>
-    </w:p>
-    <w:p>
-      <w:r>
-        <w:t>This module creates the final output after the interview.</w:t>
-        <w:br/>
-        <w:t>• generator.py — Takes all answers and scores, computes overall average, assigns verdict (Strong Hire ≥70, Weak Hire 40-69, No Hire &lt;40), lists strengths and gaps, and builds the complete report with answer log.</w:t>
-      </w:r>
-    </w:p>
-    <w:p>
-      <w:pPr>
-        <w:pStyle w:val="Heading2"/>
-      </w:pPr>
-      <w:r>
-        <w:t>Voice Interview System</w:t>
-      </w:r>
-    </w:p>
-    <w:p>
-      <w:r>
-        <w:t>This module handles everything related to voice interviews.</w:t>
-        <w:br/>
-        <w:t>• run_agent.py — The AI voice agent. Speaks questions (ElevenLabs), listens to answers (Deepgram), publishes live transcript to the web page.</w:t>
-        <w:br/>
-        <w:t>• whisper_server.py — A tiny web server that serves the voice interview web page and generates LiveKit access tokens.</w:t>
-        <w:br/>
-        <w:t>• launcher.py — Starts and manages the LiveKit server.</w:t>
-        <w:br/>
-        <w:t>• client.html — The web page the candidate sees: webcam, transcription, chat log.</w:t>
-        <w:br/>
-        <w:t>• livekit.yaml — Configuration file for the LiveKit server.</w:t>
-      </w:r>
-    </w:p>
-    <w:p>
-      <w:pPr>
-        <w:pStyle w:val="Heading2"/>
-      </w:pPr>
-      <w:r>
-        <w:t>Settings &amp; AI Communication</w:t>
-      </w:r>
-    </w:p>
-    <w:p>
-      <w:r>
-        <w:t>These two files support everything else.</w:t>
-        <w:br/>
-        <w:t>• config.py — Loads .env file, defines all constants (scoring thresholds, question limits, API keys, model names). One central place to change settings.</w:t>
-        <w:br/>
-        <w:t>• llm.py — Talks to Google Gemini API. Has two functions: call_llm() gets text responses, call_llm_json() gets JSON responses (auto-fixes broken JSON).</w:t>
-      </w:r>
-    </w:p>
-    <w:p>
-      <w:r>
-        <w:br w:type="page"/>
-      </w:r>
-    </w:p>
-    <w:p>
-      <w:pPr>
-        <w:pStyle w:val="Heading1"/>
-      </w:pPr>
-      <w:r>
-        <w:t>7. Directory Structure — Every File Inside core/ Explained</w:t>
-      </w:r>
-    </w:p>
-    <w:p>
-      <w:r>
-        <w:t>Below is every file and folder inside the core/ directory. Each one is explained in simple terms.</w:t>
-      </w:r>
-    </w:p>
-    <w:p>
-      <w:r>
-        <w:rPr>
-          <w:b/>
-          <w:sz w:val="22"/>
-        </w:rPr>
-        <w:t>core/config.py</w:t>
-      </w:r>
-    </w:p>
-    <w:p>
-      <w:r>
-        <w:t>Settings file. Loads the .env file and defines all the numbers and rules the project uses: Gemini API key and model, scoring thresholds (70 = strong pass, 40 = weak pass), max questions per session (3), max follow-ups (1), and status labels for the skill graph. Every other file imports from here so settings are in one place.</w:t>
-      </w:r>
-    </w:p>
-    <w:p>
-      <w:r>
-        <w:rPr>
-          <w:b/>
-          <w:sz w:val="22"/>
-        </w:rPr>
-        <w:t>core/llm.py</w:t>
-      </w:r>
-    </w:p>
-    <w:p>
-      <w:r>
-        <w:t>AI communication module. Contains the code that calls Google Gemini API. Two main functions: call_llm() sends text and gets text back. call_llm_json() sends text and expects JSON back — it automatically removes markdown formatting and fixes broken JSON using json_repair library. Used by question generator, evaluator, and all agents.</w:t>
-      </w:r>
-    </w:p>
-    <w:p>
-      <w:r>
-        <w:rPr>
-          <w:b/>
-          <w:sz w:val="22"/>
-        </w:rPr>
-        <w:t>core/agents/ (folder — 3 files)</w:t>
-      </w:r>
-    </w:p>
-    <w:p>
-      <w:r>
-        <w:t>This folder handles input parsing and question creation.</w:t>
-        <w:br/>
-        <w:br/>
-        <w:t>core/agents/cv_agent.py — Reads the Resume. If PDF, extracts text first. Then sends to Gemini to extract: candidate name, skills list, experience summary.</w:t>
-        <w:br/>
-        <w:br/>
-        <w:t>core/agents/jd_agent.py — Reads the Job Description. Sends to Gemini to extract: job title, role level (junior/mid/senior), required skills list.</w:t>
-        <w:br/>
-        <w:br/>
-        <w:t>core/agents/question_agent.py — Creates interview questions. Three functions: generate_interview_questions() creates the full structured question set from skill topics. generate_position_question() creates one question on the fly during the live interview. build_interview_flow() flattens the structured set into a simple ordered list.</w:t>
-      </w:r>
-    </w:p>
-    <w:p>
-      <w:r>
-        <w:rPr>
-          <w:b/>
-          <w:sz w:val="22"/>
-        </w:rPr>
-        <w:t>core/evaluator/ (folder — 1 file)</w:t>
-      </w:r>
-    </w:p>
-    <w:p>
-      <w:r>
-        <w:t>This folder handles scoring the candidate's answers.</w:t>
-        <w:br/>
-        <w:br/>
-        <w:t>core/evaluator/evaluator.py — The scoring engine. For each answer: generates an "ideal" reference answer using Gemini, then compares the real answer against it. Scores on 4 criteria each worth 25 points: technical accuracy, completeness, clarity, relevance. To be fair, it runs the evaluation twice with criteria in different order and averages the scores. Answers shorter than 10 words automatically score 0. Returns score (0-100), verdict, and feedback.</w:t>
-      </w:r>
-    </w:p>
-    <w:p>
-      <w:r>
-        <w:rPr>
-          <w:b/>
-          <w:sz w:val="22"/>
-        </w:rPr>
-        <w:t>core/graph/ (folder — 4 files)</w:t>
-      </w:r>
-    </w:p>
-    <w:p>
-      <w:r>
-        <w:t>This folder manages the skill database and tracks interview progress.</w:t>
-        <w:br/>
-        <w:br/>
-        <w:t>core/graph/skill_graph.py — Builds a skill map from ESCO taxonomy CSVs (1,201 IT skills) using NetworkX. Adds modern tech manually (Python, React, Docker, etc.). Can fuzzy-match skill names. The gap_analysis() function finds what skills the candidate is missing.</w:t>
-        <w:br/>
-        <w:br/>
-        <w:t>core/graph/state.py — Tracks progress during the interview. Each skill has a node that stores: status (pending/verified/gap), scores, questions asked, best score. record_answer() updates status based on score. InterviewState tracks all skills together.</w:t>
-        <w:br/>
-        <w:br/>
-        <w:t>core/graph/traversal.py — Decides which skill to ask next. Picks the lowest-scored skill first, prioritizing high-priority skills, avoiding repeats. decide_follow_up() checks if a weak answer needs a follow-up question.</w:t>
-        <w:br/>
-        <w:br/>
-        <w:t>core/graph/visualize.py — Draws charts showing candidate skills, job requirements, skill gaps, and the full skill map. These appear in the Streamlit UI.</w:t>
-      </w:r>
-    </w:p>
-    <w:p>
-      <w:r>
-        <w:rPr>
-          <w:b/>
-          <w:sz w:val="22"/>
-        </w:rPr>
-        <w:t>core/pipeline/ (folder — 1 file)</w:t>
-      </w:r>
-    </w:p>
-    <w:p>
-      <w:r>
-        <w:t>This folder orchestrates the text interview.</w:t>
-        <w:br/>
-        <w:br/>
-        <w:t>core/pipeline/interview_loop.py — The InterviewLoop class runs the interview cycle: get_next_question() picks the next skill and generates a fresh question. submit_answer() scores the answer and updates state. Keeps going until all skills verified or max questions reached. get_summary() collects everything for the final report.</w:t>
-      </w:r>
-    </w:p>
-    <w:p>
-      <w:r>
-        <w:rPr>
-          <w:b/>
-          <w:sz w:val="22"/>
-        </w:rPr>
-        <w:t>core/report/ (folder — 1 file)</w:t>
-      </w:r>
-    </w:p>
-    <w:p>
-      <w:r>
-        <w:t>This folder creates the final report after the interview.</w:t>
-        <w:br/>
-        <w:br/>
-        <w:t>core/report/generator.py — Takes the InterviewLoop data, computes overall score, assigns verdict (Strong Hire ≥70, Weak Hire 40-69, No Hire &lt;40), lists strengths and gaps, and builds the complete report dictionary with answer log.</w:t>
-      </w:r>
-    </w:p>
-    <w:p>
-      <w:r>
-        <w:rPr>
-          <w:b/>
-          <w:sz w:val="22"/>
-        </w:rPr>
-        <w:t>core/livekit/ (folder — 4 files + client.html + livekit.yaml)</w:t>
-      </w:r>
-    </w:p>
-    <w:p>
-      <w:r>
-        <w:t>This folder handles the voice interview mode.</w:t>
-        <w:br/>
-        <w:br/>
-        <w:t>core/livekit/run_agent.py — The AI voice agent. Connects to LiveKit room, speaks pre-loaded questions using ElevenLabs TTS, listens to answers via Deepgram STT, publishes live transcript to the web page. Saves transcript JSON after all questions.</w:t>
-        <w:br/>
-        <w:br/>
-        <w:t>core/livekit/whisper_server.py — Tiny web server (port 18765). Serves the voice interview web page (client.html) at /livekit. Generates LiveKit tokens at /token. Saves transcripts at /save_transcript. Runs in a background thread.</w:t>
-        <w:br/>
-        <w:br/>
-        <w:t>core/livekit/launcher.py — Manages the LiveKit server. start_livekit_server() launches it if not running. launch() starts everything and returns the client URL. cleanup() shuts everything down on exit.</w:t>
-        <w:br/>
-        <w:br/>
-        <w:t>core/livekit/client.html — The web page the candidate sees during voice interview. Shows webcam feed, real-time transcription, chat conversation log, and current question. Auto-connects to LiveKit on load.</w:t>
-        <w:br/>
-        <w:br/>
-        <w:t>core/livekit/livekit.yaml — Configuration for the LiveKit server: ports, API keys, logging.</w:t>
-      </w:r>
-    </w:p>
-    <w:p>
-      <w:pPr>
-        <w:pStyle w:val="Heading1"/>
-      </w:pPr>
-      <w:r>
-        <w:t>8. Summary</w:t>
-      </w:r>
-    </w:p>
-    <w:p>
-      <w:r>
-        <w:t>InterviewAI takes a Resume + Job Description → parses them → builds a skill graph → finds gaps → generates interview questions → conducts the interview (text or voice) → scores each answer using AI → produces a final report with verdict and recommendations.</w:t>
-      </w:r>
-    </w:p>
-    <w:p/>
-    <w:p>
-      <w:r>
-        <w:t>Three API keys power everything:</w:t>
       </w:r>
     </w:p>
     <w:p>
@@ -940,10 +312,15 @@
         <w:rPr>
           <w:b/>
         </w:rPr>
-        <w:t>Gemini</w:t>
+        <w:t>Stage 1: Parse CV &amp; JD</w:t>
       </w:r>
+    </w:p>
+    <w:p>
       <w:r>
-        <w:t xml:space="preserve"> — reads CV/JD, generates questions, evaluates answers</w:t>
+        <w:rPr>
+          <w:b w:val="0"/>
+        </w:rPr>
+        <w:t>The candidate uploads their Resume and pastes the Job Description. The system sends both to Gemini AI, which extracts: the candidate's name and skills (from Resume), and the job title, level, and required skills (from JD). All of this is returned as structured data.</w:t>
       </w:r>
     </w:p>
     <w:p>
@@ -951,10 +328,15 @@
         <w:rPr>
           <w:b/>
         </w:rPr>
-        <w:t>Deepgram</w:t>
+        <w:t>Stage 2: Build Skill Graph</w:t>
       </w:r>
+    </w:p>
+    <w:p>
       <w:r>
-        <w:t xml:space="preserve"> — converts speech to text (voice mode only)</w:t>
+        <w:rPr>
+          <w:b w:val="0"/>
+        </w:rPr>
+        <w:t>The system loads the ESCO taxonomy — a European-standard database of 1,201 IT skills — into a graph (like a map where skills are connected to related skills). It adds modern technologies like Python, React, and Docker that ESCO doesn't cover. The candidate's skills and the job's required skills are matched against this graph.</w:t>
       </w:r>
     </w:p>
     <w:p>
@@ -962,16 +344,942 @@
         <w:rPr>
           <w:b/>
         </w:rPr>
-        <w:t>ElevenLabs</w:t>
-      </w:r>
-      <w:r>
-        <w:t xml:space="preserve"> — converts text to speech (voice mode only)</w:t>
+        <w:t>Stage 3: Gap Analysis</w:t>
       </w:r>
     </w:p>
-    <w:p/>
     <w:p>
       <w:r>
+        <w:rPr>
+          <w:b w:val="0"/>
+        </w:rPr>
+        <w:t>The system compares what the candidate knows vs what the job needs. Skills that are missing or weak become "topics" for the interview. Each topic gets a priority level and a reason.</w:t>
+      </w:r>
+    </w:p>
+    <w:p>
+      <w:r>
+        <w:rPr>
+          <w:b/>
+        </w:rPr>
+        <w:t>Stage 4: Generate Questions</w:t>
+      </w:r>
+    </w:p>
+    <w:p>
+      <w:r>
+        <w:rPr>
+          <w:b w:val="0"/>
+        </w:rPr>
+        <w:t>Using Gemini AI, the system creates a full interview question set: opening questions (warm-up), technical questions (one per skill to test), behavioural questions (STAR format), and closing questions. Each question has a difficulty level and a follow-up probe.</w:t>
+      </w:r>
+    </w:p>
+    <w:p>
+      <w:r>
+        <w:rPr>
+          <w:b/>
+        </w:rPr>
+        <w:t>Stage 5: Conduct Interview</w:t>
+      </w:r>
+    </w:p>
+    <w:p>
+      <w:r>
+        <w:rPr>
+          <w:b w:val="0"/>
+        </w:rPr>
+        <w:t>The interview runs in one of two modes:</w:t>
+      </w:r>
+    </w:p>
+    <w:p>
+      <w:pPr>
+        <w:pStyle w:val="ListBullet"/>
+      </w:pPr>
+      <w:r>
+        <w:t>Text Mode: Questions appear on screen. The candidate types answers and clicks Submit. Each answer is immediately scored by Gemini AI (two evaluations averaged for accuracy). The system picks the weakest skill first and asks follow-ups if needed. Maximum 3 questions in text mode.</w:t>
+      </w:r>
+    </w:p>
+    <w:p>
+      <w:pPr>
+        <w:pStyle w:val="ListBullet"/>
+      </w:pPr>
+      <w:r>
+        <w:t>LiveKit Mode: A voice agent speaks the questions using ElevenLabs (AI voice). The candidate speaks their answers. Deepgram converts speech to text. Everything happens in real time through a web page. The Gemini AI runs dynamically during the conversation — it greets the candidate, asks if they're ready, asks up to 5 questions one by one, handles off-topic answers with warnings, and auto-ends the interview. A full transcript is saved at the end.</w:t>
+      </w:r>
+    </w:p>
+    <w:p>
+      <w:r>
+        <w:rPr>
+          <w:b/>
+        </w:rPr>
+        <w:t>Stage 6: Generate Report</w:t>
+      </w:r>
+    </w:p>
+    <w:p>
+      <w:r>
+        <w:rPr>
+          <w:b w:val="0"/>
+        </w:rPr>
+        <w:t>After the interview ends, the system builds the final report: overall score, verdict, per-skill breakdown, strengths, gaps, development areas, and full answer log.</w:t>
+      </w:r>
+    </w:p>
+    <w:p>
+      <w:pPr>
+        <w:pStyle w:val="Heading1"/>
+      </w:pPr>
+      <w:r>
+        <w:rPr>
+          <w:color w:val="1A56DB"/>
+        </w:rPr>
+        <w:t>5. The Two Interview Modes</w:t>
+      </w:r>
+    </w:p>
+    <w:p>
+      <w:pPr>
+        <w:pStyle w:val="Heading2"/>
+      </w:pPr>
+      <w:r>
+        <w:rPr>
+          <w:color w:val="1A56DB"/>
+        </w:rPr>
+        <w:t>Text Mode</w:t>
+      </w:r>
+    </w:p>
+    <w:p>
+      <w:r>
+        <w:rPr>
+          <w:b w:val="0"/>
+        </w:rPr>
+        <w:t>This is the simpler mode. The candidate sees questions on a web page, types their answer in a text box, and clicks Submit. The AI scores it immediately and moves to the next question. No microphone or camera needed.</w:t>
+      </w:r>
+    </w:p>
+    <w:p>
+      <w:r>
+        <w:rPr>
+          <w:b/>
+        </w:rPr>
+        <w:t>Flow:</w:t>
+      </w:r>
+    </w:p>
+    <w:p>
+      <w:pPr>
+        <w:pStyle w:val="ListBullet"/>
+      </w:pPr>
+      <w:r>
+        <w:t>System picks the lowest-scored skill first.</w:t>
+      </w:r>
+    </w:p>
+    <w:p>
+      <w:pPr>
+        <w:pStyle w:val="ListBullet"/>
+      </w:pPr>
+      <w:r>
+        <w:t>Generates a fresh question for that skill using Gemini.</w:t>
+      </w:r>
+    </w:p>
+    <w:p>
+      <w:pPr>
+        <w:pStyle w:val="ListBullet"/>
+      </w:pPr>
+      <w:r>
+        <w:t>Displays the question on screen.</w:t>
+      </w:r>
+    </w:p>
+    <w:p>
+      <w:pPr>
+        <w:pStyle w:val="ListBullet"/>
+      </w:pPr>
+      <w:r>
+        <w:t>Candidate types answer and clicks Submit.</w:t>
+      </w:r>
+    </w:p>
+    <w:p>
+      <w:pPr>
+        <w:pStyle w:val="ListBullet"/>
+      </w:pPr>
+      <w:r>
+        <w:t>AI evaluates the answer (two Gemini calls, scores averaged).</w:t>
+      </w:r>
+    </w:p>
+    <w:p>
+      <w:pPr>
+        <w:pStyle w:val="ListBullet"/>
+      </w:pPr>
+      <w:r>
+        <w:t>Result shown immediately. If weak, a follow-up may be asked.</w:t>
+      </w:r>
+    </w:p>
+    <w:p>
+      <w:pPr>
+        <w:pStyle w:val="ListBullet"/>
+      </w:pPr>
+      <w:r>
+        <w:t>Repeats until all skills tested or max questions reached (3 questions).</w:t>
+      </w:r>
+    </w:p>
+    <w:p>
+      <w:pPr>
+        <w:pStyle w:val="ListBullet"/>
+      </w:pPr>
+      <w:r>
+        <w:t>Final report generated automatically.</w:t>
+      </w:r>
+    </w:p>
+    <w:p>
+      <w:pPr>
+        <w:pStyle w:val="Heading2"/>
+      </w:pPr>
+      <w:r>
+        <w:rPr>
+          <w:color w:val="1A56DB"/>
+        </w:rPr>
+        <w:t>LiveKit Mode (Voice Interview)</w:t>
+      </w:r>
+    </w:p>
+    <w:p>
+      <w:r>
+        <w:rPr>
+          <w:b w:val="0"/>
+        </w:rPr>
+        <w:t>In this mode, the candidate speaks their answers through a microphone and the AI speaks the questions out loud. It works like a real voice call.</w:t>
+      </w:r>
+    </w:p>
+    <w:p>
+      <w:r>
+        <w:rPr>
+          <w:b/>
+        </w:rPr>
+        <w:t>What is LiveKit?</w:t>
+      </w:r>
+    </w:p>
+    <w:p>
+      <w:r>
+        <w:rPr>
+          <w:b w:val="0"/>
+        </w:rPr>
+        <w:t>LiveKit is an open-source platform for real-time voice/video communication (similar to Zoom). It runs as a server on your machine. You download the LiveKit server binary once, and the system starts it automatically when you use voice mode.</w:t>
+      </w:r>
+    </w:p>
+    <w:p>
+      <w:r>
+        <w:rPr>
+          <w:b/>
+        </w:rPr>
+        <w:t>How the Voice Interview Works:</w:t>
+      </w:r>
+    </w:p>
+    <w:p>
+      <w:pPr>
+        <w:pStyle w:val="ListBullet"/>
+      </w:pPr>
+      <w:r>
+        <w:t>The system starts a small web server (port 18765) and the LiveKit server (port 7880).</w:t>
+      </w:r>
+    </w:p>
+    <w:p>
+      <w:pPr>
+        <w:pStyle w:val="ListBullet"/>
+      </w:pPr>
+      <w:r>
+        <w:t>The candidate opens a web page (client.html) with a "Start Interview" button.</w:t>
+      </w:r>
+    </w:p>
+    <w:p>
+      <w:pPr>
+        <w:pStyle w:val="ListBullet"/>
+      </w:pPr>
+      <w:r>
+        <w:t>After clicking Start, the browser asks for camera/mic permission, then connects to the LiveKit room.</w:t>
+      </w:r>
+    </w:p>
+    <w:p>
+      <w:pPr>
+        <w:pStyle w:val="ListBullet"/>
+      </w:pPr>
+      <w:r>
+        <w:t>An AI "agent" (run_agent.py) joins the same room and begins the interview.</w:t>
+      </w:r>
+    </w:p>
+    <w:p>
+      <w:pPr>
+        <w:pStyle w:val="ListBullet"/>
+      </w:pPr>
+      <w:r>
+        <w:t>The agent greets the candidate by name, mentions the position, and asks if they're ready.</w:t>
+      </w:r>
+    </w:p>
+    <w:p>
+      <w:pPr>
+        <w:pStyle w:val="ListBullet"/>
+      </w:pPr>
+      <w:r>
+        <w:t>Once ready, it asks questions one by one using ElevenLabs TTS (text-to-speech).</w:t>
+      </w:r>
+    </w:p>
+    <w:p>
+      <w:pPr>
+        <w:pStyle w:val="ListBullet"/>
+      </w:pPr>
+      <w:r>
+        <w:t>The candidate hears the question and speaks their answer into the microphone.</w:t>
+      </w:r>
+    </w:p>
+    <w:p>
+      <w:pPr>
+        <w:pStyle w:val="ListBullet"/>
+      </w:pPr>
+      <w:r>
+        <w:t>Deepgram STT (speech-to-text) converts their speech into text in real time.</w:t>
+      </w:r>
+    </w:p>
+    <w:p>
+      <w:pPr>
+        <w:pStyle w:val="ListBullet"/>
+      </w:pPr>
+      <w:r>
+        <w:t>The text is displayed on the screen as "live transcription."</w:t>
+      </w:r>
+    </w:p>
+    <w:p>
+      <w:pPr>
+        <w:pStyle w:val="ListBullet"/>
+      </w:pPr>
+      <w:r>
+        <w:t>The Gemini AI runs in real-time during the conversation. It decides what to say next based on the conversation history, the candidate's CV, and the job requirements.</w:t>
+      </w:r>
+    </w:p>
+    <w:p>
+      <w:pPr>
+        <w:pStyle w:val="ListBullet"/>
+      </w:pPr>
+      <w:r>
+        <w:t>If the candidate goes off-topic, the Gemini gives up to 3 warnings, then moves to the next question.</w:t>
+      </w:r>
+    </w:p>
+    <w:p>
+      <w:pPr>
+        <w:pStyle w:val="ListBullet"/>
+      </w:pPr>
+      <w:r>
+        <w:t>After all questions, the agent thanks the candidate and saves a transcript file.</w:t>
+      </w:r>
+    </w:p>
+    <w:p>
+      <w:pPr>
+        <w:pStyle w:val="ListBullet"/>
+      </w:pPr>
+      <w:r>
+        <w:t>The candidate can end the interview anytime by clicking End.</w:t>
+      </w:r>
+    </w:p>
+    <w:p>
+      <w:r>
+        <w:rPr>
+          <w:b/>
+        </w:rPr>
+        <w:t>Key Tech Specs:</w:t>
+      </w:r>
+    </w:p>
+    <w:p>
+      <w:pPr>
+        <w:pStyle w:val="ListBullet"/>
+      </w:pPr>
+      <w:r>
+        <w:t>ElevenLabs model: eleven_flash_v2_5 (fastest real-time model) with streaming_latency=4 for minimal delay.</w:t>
+      </w:r>
+    </w:p>
+    <w:p>
+      <w:pPr>
+        <w:pStyle w:val="ListBullet"/>
+      </w:pPr>
+      <w:r>
+        <w:t>Deepgram model: nova-3 (best accuracy).</w:t>
+      </w:r>
+    </w:p>
+    <w:p>
+      <w:pPr>
+        <w:pStyle w:val="ListBullet"/>
+      </w:pPr>
+      <w:r>
+        <w:t>Gemini model: 2.0 Flash in the agent, 2.5 Flash in text mode (configurable via .env).</w:t>
+      </w:r>
+    </w:p>
+    <w:p>
+      <w:pPr>
+        <w:pStyle w:val="ListBullet"/>
+      </w:pPr>
+      <w:r>
+        <w:t>Turn handling: interruptions disabled (agent always finishes speaking), endpointing delay 1.5-4 seconds (gives candidate time to think).</w:t>
+      </w:r>
+    </w:p>
+    <w:p>
+      <w:pPr>
+        <w:pStyle w:val="ListBullet"/>
+      </w:pPr>
+      <w:r>
+        <w:t>Maximum 5 questions in LiveKit mode (configurable).</w:t>
+      </w:r>
+    </w:p>
+    <w:p>
+      <w:pPr>
+        <w:pStyle w:val="Heading1"/>
+      </w:pPr>
+      <w:r>
+        <w:rPr>
+          <w:color w:val="1A56DB"/>
+        </w:rPr>
+        <w:t>6. Modules — What Each Part Does</w:t>
+      </w:r>
+    </w:p>
+    <w:p>
+      <w:r>
+        <w:rPr>
+          <w:b w:val="0"/>
+        </w:rPr>
+        <w:t>The project has 7 modules (plus configuration and AI client). Each module has a specific job:</w:t>
+      </w:r>
+    </w:p>
+    <w:p>
+      <w:pPr>
+        <w:pStyle w:val="Heading2"/>
+      </w:pPr>
+      <w:r>
+        <w:rPr>
+          <w:color w:val="1A56DB"/>
+        </w:rPr>
+        <w:t>Parsing &amp; Question Generation</w:t>
+      </w:r>
+    </w:p>
+    <w:p>
+      <w:r>
+        <w:rPr>
+          <w:b w:val="0"/>
+        </w:rPr>
+        <w:t>This module handles understanding the inputs and creating questions.</w:t>
+      </w:r>
+    </w:p>
+    <w:p>
+      <w:pPr>
+        <w:pStyle w:val="ListBullet"/>
+      </w:pPr>
+      <w:r>
+        <w:t>cv_agent.py — Takes a Resume PDF or text, extracts name + skills + experience using Gemini.</w:t>
+      </w:r>
+    </w:p>
+    <w:p>
+      <w:pPr>
+        <w:pStyle w:val="ListBullet"/>
+      </w:pPr>
+      <w:r>
+        <w:t>jd_agent.py — Takes a Job Description, extracts job title + level + required skills using Gemini.</w:t>
+      </w:r>
+    </w:p>
+    <w:p>
+      <w:pPr>
+        <w:pStyle w:val="ListBullet"/>
+      </w:pPr>
+      <w:r>
+        <w:t>question_agent.py — Takes the skill analysis topics and generates full interview questions using Gemini.</w:t>
+      </w:r>
+    </w:p>
+    <w:p>
+      <w:pPr>
+        <w:pStyle w:val="Heading2"/>
+      </w:pPr>
+      <w:r>
+        <w:rPr>
+          <w:color w:val="1A56DB"/>
+        </w:rPr>
+        <w:t>Answer Scoring (LLM-as-Judge)</w:t>
+      </w:r>
+    </w:p>
+    <w:p>
+      <w:pPr>
+        <w:pStyle w:val="ListBullet"/>
+      </w:pPr>
+      <w:r>
+        <w:t>evaluator.py — For each answer, it first generates an "ideal answer" using Gemini, then compares the candidate's answer against it. Scores on 4 criteria (technical accuracy, completeness, clarity, relevance — each 0-25, total 0-100). Runs two evaluations with different criterion order to reduce AI bias and averages them.</w:t>
+      </w:r>
+    </w:p>
+    <w:p>
+      <w:pPr>
+        <w:pStyle w:val="Heading2"/>
+      </w:pPr>
+      <w:r>
+        <w:rPr>
+          <w:color w:val="1A56DB"/>
+        </w:rPr>
+        <w:t>Skill Knowledge Graph &amp; State Tracking</w:t>
+      </w:r>
+    </w:p>
+    <w:p>
+      <w:pPr>
+        <w:pStyle w:val="ListBullet"/>
+      </w:pPr>
+      <w:r>
+        <w:t>skill_graph.py — Builds a map of 1,201 IT skills from ESCO taxonomy CSV files using NetworkX. Adds modern tech not in ESCO. Matches skills using fuzzy logic.</w:t>
+      </w:r>
+    </w:p>
+    <w:p>
+      <w:pPr>
+        <w:pStyle w:val="ListBullet"/>
+      </w:pPr>
+      <w:r>
+        <w:t>state.py — Tracks each skill's status during the interview: pending, verified strong, verified weak, confirmed gap. Records scores and decides when a skill is fully tested.</w:t>
+      </w:r>
+    </w:p>
+    <w:p>
+      <w:pPr>
+        <w:pStyle w:val="ListBullet"/>
+      </w:pPr>
+      <w:r>
+        <w:t>traversal.py — Decides which skill to ask next. Picks the lowest-scored skill first (adaptive strategy). Also decides if a follow-up question is needed for weak answers.</w:t>
+      </w:r>
+    </w:p>
+    <w:p>
+      <w:pPr>
+        <w:pStyle w:val="ListBullet"/>
+      </w:pPr>
+      <w:r>
+        <w:t>visualize.py — Creates charts showing candidate skills, job requirements, gaps, and full skill map.</w:t>
+      </w:r>
+    </w:p>
+    <w:p>
+      <w:pPr>
+        <w:pStyle w:val="Heading2"/>
+      </w:pPr>
+      <w:r>
+        <w:rPr>
+          <w:color w:val="1A56DB"/>
+        </w:rPr>
+        <w:t>Interview Orchestrator</w:t>
+      </w:r>
+    </w:p>
+    <w:p>
+      <w:pPr>
+        <w:pStyle w:val="ListBullet"/>
+      </w:pPr>
+      <w:r>
+        <w:t>interview_loop.py — The InterviewLoop class runs the question → answer → evaluate cycle. Picks the next skill, generates a question, collects the answer, scores it, updates progress, and repeats until done (max 3 questions).</w:t>
+      </w:r>
+    </w:p>
+    <w:p>
+      <w:pPr>
+        <w:pStyle w:val="Heading2"/>
+      </w:pPr>
+      <w:r>
+        <w:rPr>
+          <w:color w:val="1A56DB"/>
+        </w:rPr>
+        <w:t>Final Report Generator</w:t>
+      </w:r>
+    </w:p>
+    <w:p>
+      <w:pPr>
+        <w:pStyle w:val="ListBullet"/>
+      </w:pPr>
+      <w:r>
+        <w:t>generator.py — Takes all answers and scores, computes overall average, assigns verdict (Strong Hire ≥70, Weak Hire 40-69, No Hire &lt;40), lists strengths and gaps, and builds the complete report with answer log.</w:t>
+      </w:r>
+    </w:p>
+    <w:p>
+      <w:pPr>
+        <w:pStyle w:val="Heading2"/>
+      </w:pPr>
+      <w:r>
+        <w:rPr>
+          <w:color w:val="1A56DB"/>
+        </w:rPr>
+        <w:t>Voice Interview System</w:t>
+      </w:r>
+    </w:p>
+    <w:p>
+      <w:pPr>
+        <w:pStyle w:val="ListBullet"/>
+      </w:pPr>
+      <w:r>
+        <w:t>run_agent.py — The AI voice agent. Uses Gemini dynamically to conduct the interview: greets the candidate, asks readiness, asks questions one by one, handles off-topic answers (3 warnings), and auto-ends. Speaks via ElevenLabs TTS (eleven_flash_v2_5), listens via Deepgram STT (nova-3). Turn handling configured with no interruptions and 1.5-4s endpointing delays.</w:t>
+      </w:r>
+    </w:p>
+    <w:p>
+      <w:pPr>
+        <w:pStyle w:val="ListBullet"/>
+      </w:pPr>
+      <w:r>
+        <w:t>whisper_server.py — A tiny web server that serves the voice interview web page and generates LiveKit access tokens.</w:t>
+      </w:r>
+    </w:p>
+    <w:p>
+      <w:pPr>
+        <w:pStyle w:val="ListBullet"/>
+      </w:pPr>
+      <w:r>
+        <w:t>launcher.py — Starts and manages the LiveKit server. Downloads the binary to temp folder; starts it if not already running.</w:t>
+      </w:r>
+    </w:p>
+    <w:p>
+      <w:pPr>
+        <w:pStyle w:val="ListBullet"/>
+      </w:pPr>
+      <w:r>
+        <w:t>client.html — The web page the candidate sees: webcam, transcription, chat log. Has a "Start Interview" button that requests camera/mic permission and connects to the LiveKit room.</w:t>
+      </w:r>
+    </w:p>
+    <w:p>
+      <w:pPr>
+        <w:pStyle w:val="ListBullet"/>
+      </w:pPr>
+      <w:r>
+        <w:t>livekit.yaml — Configuration file for the LiveKit server (ports, API keys, logging).</w:t>
+      </w:r>
+    </w:p>
+    <w:p>
+      <w:pPr>
+        <w:pStyle w:val="Heading2"/>
+      </w:pPr>
+      <w:r>
+        <w:rPr>
+          <w:color w:val="1A56DB"/>
+        </w:rPr>
+        <w:t>Settings &amp; AI Communication</w:t>
+      </w:r>
+    </w:p>
+    <w:p>
+      <w:pPr>
+        <w:pStyle w:val="ListBullet"/>
+      </w:pPr>
+      <w:r>
+        <w:t>config.py — Loads .env file, defines all constants (scoring thresholds, question limits, API keys, model names). One central place to change settings.</w:t>
+      </w:r>
+    </w:p>
+    <w:p>
+      <w:pPr>
+        <w:pStyle w:val="ListBullet"/>
+      </w:pPr>
+      <w:r>
+        <w:t>llm.py — Talks to Google Gemini API. Has two functions: call_llm() gets text responses, call_llm_json() gets JSON responses (auto-fixes broken JSON).</w:t>
+      </w:r>
+    </w:p>
+    <w:p>
+      <w:pPr>
+        <w:pStyle w:val="Heading1"/>
+      </w:pPr>
+      <w:r>
+        <w:rPr>
+          <w:color w:val="1A56DB"/>
+        </w:rPr>
+        <w:t>7. Directory Structure — Every File Inside core/ Explained</w:t>
+      </w:r>
+    </w:p>
+    <w:p>
+      <w:r>
+        <w:rPr>
+          <w:b w:val="0"/>
+        </w:rPr>
+        <w:t>Below is every file and folder inside the core/ directory. Each one is explained in simple terms.</w:t>
+      </w:r>
+    </w:p>
+    <w:p>
+      <w:pPr>
+        <w:pStyle w:val="Heading3"/>
+      </w:pPr>
+      <w:r>
+        <w:rPr>
+          <w:color w:val="1A56DB"/>
+        </w:rPr>
+        <w:t>core/config.py</w:t>
+      </w:r>
+    </w:p>
+    <w:p>
+      <w:r>
+        <w:rPr>
+          <w:b w:val="0"/>
+        </w:rPr>
+        <w:t>Settings file. Loads the .env file and defines all the numbers and rules the project uses: Gemini API key and model (default gemini-2.5-flash), scoring thresholds (70 = strong pass, 40 = weak pass), max questions per session (3 for text mode), max follow-ups (1), and status labels for the skill graph. Every other file imports from here so settings are in one place.</w:t>
+      </w:r>
+    </w:p>
+    <w:p>
+      <w:pPr>
+        <w:pStyle w:val="Heading3"/>
+      </w:pPr>
+      <w:r>
+        <w:rPr>
+          <w:color w:val="1A56DB"/>
+        </w:rPr>
+        <w:t>core/llm.py</w:t>
+      </w:r>
+    </w:p>
+    <w:p>
+      <w:r>
+        <w:rPr>
+          <w:b w:val="0"/>
+        </w:rPr>
+        <w:t>AI communication module. Contains the code that calls Google Gemini API. Two main functions: call_llm() sends text and gets text back. call_llm_json() sends text and expects JSON back — it automatically removes markdown formatting and fixes broken JSON using json_repair library. Used by question generator, evaluator, and all agents.</w:t>
+      </w:r>
+    </w:p>
+    <w:p>
+      <w:pPr>
+        <w:pStyle w:val="Heading3"/>
+      </w:pPr>
+      <w:r>
+        <w:rPr>
+          <w:color w:val="1A56DB"/>
+        </w:rPr>
+        <w:t>core/agents/ (folder — 3 files)</w:t>
+      </w:r>
+    </w:p>
+    <w:p>
+      <w:r>
+        <w:rPr>
+          <w:b w:val="0"/>
+        </w:rPr>
+        <w:t>This folder handles input parsing and question creation.</w:t>
+      </w:r>
+    </w:p>
+    <w:p>
+      <w:pPr>
+        <w:pStyle w:val="ListBullet"/>
+      </w:pPr>
+      <w:r>
+        <w:t>cv_agent.py — Reads the Resume. If PDF, extracts text first. Then sends to Gemini to extract: candidate name, skills list, experience summary.</w:t>
+      </w:r>
+    </w:p>
+    <w:p>
+      <w:pPr>
+        <w:pStyle w:val="ListBullet"/>
+      </w:pPr>
+      <w:r>
+        <w:t>jd_agent.py — Reads the Job Description. Sends to Gemini to extract: job title, role level (junior/mid/senior), required skills list.</w:t>
+      </w:r>
+    </w:p>
+    <w:p>
+      <w:pPr>
+        <w:pStyle w:val="ListBullet"/>
+      </w:pPr>
+      <w:r>
+        <w:t>question_agent.py — Creates interview questions. Three functions: generate_interview_questions() creates the full structured question set from skill topics. generate_position_question() creates one question on the fly during the live interview. build_interview_flow() flattens the structured set into a simple ordered list.</w:t>
+      </w:r>
+    </w:p>
+    <w:p>
+      <w:pPr>
+        <w:pStyle w:val="Heading3"/>
+      </w:pPr>
+      <w:r>
+        <w:rPr>
+          <w:color w:val="1A56DB"/>
+        </w:rPr>
+        <w:t>core/evaluator/ (folder — 1 file)</w:t>
+      </w:r>
+    </w:p>
+    <w:p>
+      <w:pPr>
+        <w:pStyle w:val="ListBullet"/>
+      </w:pPr>
+      <w:r>
+        <w:t>evaluator.py — The scoring engine. For each answer: generates an "ideal" reference answer using Gemini, then compares the real answer against it. Scores on 4 criteria each worth 25 points: technical accuracy, completeness, clarity, relevance. To be fair, it runs the evaluation twice with criteria in different order and averages the scores. Answers shorter than 10 words automatically score 0. Returns score (0-100), verdict, and feedback.</w:t>
+      </w:r>
+    </w:p>
+    <w:p>
+      <w:pPr>
+        <w:pStyle w:val="Heading3"/>
+      </w:pPr>
+      <w:r>
+        <w:rPr>
+          <w:color w:val="1A56DB"/>
+        </w:rPr>
+        <w:t>core/graph/ (folder — 4 files)</w:t>
+      </w:r>
+    </w:p>
+    <w:p>
+      <w:pPr>
+        <w:pStyle w:val="ListBullet"/>
+      </w:pPr>
+      <w:r>
+        <w:t>skill_graph.py — Builds a skill map from ESCO taxonomy CSVs (1,201 IT skills) using NetworkX. Adds modern tech manually (Python, React, Docker, etc.). Can fuzzy-match skill names. The gap_analysis() function finds what skills the candidate is missing.</w:t>
+      </w:r>
+    </w:p>
+    <w:p>
+      <w:pPr>
+        <w:pStyle w:val="ListBullet"/>
+      </w:pPr>
+      <w:r>
+        <w:t>state.py — Tracks progress during the interview. Each skill has a node that stores: status (pending/verified/gap), scores, questions asked, best score. record_answer() updates status based on score. InterviewState tracks all skills together.</w:t>
+      </w:r>
+    </w:p>
+    <w:p>
+      <w:pPr>
+        <w:pStyle w:val="ListBullet"/>
+      </w:pPr>
+      <w:r>
+        <w:t>traversal.py — Decides which skill to ask next. Picks the lowest-scored skill first, prioritizing high-priority skills, avoiding repeats. decide_follow_up() checks if a weak answer needs a follow-up question.</w:t>
+      </w:r>
+    </w:p>
+    <w:p>
+      <w:pPr>
+        <w:pStyle w:val="ListBullet"/>
+      </w:pPr>
+      <w:r>
+        <w:t>visualize.py — Draws charts showing candidate skills, job requirements, skill gaps, and the full skill map. These appear in the Streamlit UI.</w:t>
+      </w:r>
+    </w:p>
+    <w:p>
+      <w:pPr>
+        <w:pStyle w:val="Heading3"/>
+      </w:pPr>
+      <w:r>
+        <w:rPr>
+          <w:color w:val="1A56DB"/>
+        </w:rPr>
+        <w:t>core/pipeline/ (folder — 1 file)</w:t>
+      </w:r>
+    </w:p>
+    <w:p>
+      <w:pPr>
+        <w:pStyle w:val="ListBullet"/>
+      </w:pPr>
+      <w:r>
+        <w:t>interview_loop.py — The InterviewLoop class runs the interview cycle: get_next_question() picks the next skill and generates a fresh question. submit_answer() scores the answer and updates state. Keeps going until all skills verified or max questions reached (3). get_summary() collects everything for the final report.</w:t>
+      </w:r>
+    </w:p>
+    <w:p>
+      <w:pPr>
+        <w:pStyle w:val="Heading3"/>
+      </w:pPr>
+      <w:r>
+        <w:rPr>
+          <w:color w:val="1A56DB"/>
+        </w:rPr>
+        <w:t>core/report/ (folder — 1 file)</w:t>
+      </w:r>
+    </w:p>
+    <w:p>
+      <w:pPr>
+        <w:pStyle w:val="ListBullet"/>
+      </w:pPr>
+      <w:r>
+        <w:t>generator.py — Takes the InterviewLoop data, computes overall score, assigns verdict (Strong Hire ≥70, Weak Hire 40-69, No Hire &lt;40), lists strengths and gaps, and builds the complete report dictionary with answer log.</w:t>
+      </w:r>
+    </w:p>
+    <w:p>
+      <w:pPr>
+        <w:pStyle w:val="Heading3"/>
+      </w:pPr>
+      <w:r>
+        <w:rPr>
+          <w:color w:val="1A56DB"/>
+        </w:rPr>
+        <w:t>core/livekit/ (folder — 4 files + client.html + livekit.yaml)</w:t>
+      </w:r>
+    </w:p>
+    <w:p>
+      <w:r>
+        <w:rPr>
+          <w:b w:val="0"/>
+        </w:rPr>
+        <w:t>This folder handles the voice interview mode.</w:t>
+      </w:r>
+    </w:p>
+    <w:p>
+      <w:pPr>
+        <w:pStyle w:val="ListBullet"/>
+      </w:pPr>
+      <w:r>
+        <w:t>run_agent.py — The AI voice agent. Connects to LiveKit room, uses Gemini dynamically to conduct the full interview: warm greeting with position name, ready check, off-topic handling (3 warnings), auto-end after all questions, full conversation transcript saved. ElevenLabs Flash v2.5 for TTS (streaming_latency=4), Deepgram Nova-3 for STT. Turn handling configured: interruptions OFF, endpointing delay 1.5-4s.</w:t>
+      </w:r>
+    </w:p>
+    <w:p>
+      <w:pPr>
+        <w:pStyle w:val="ListBullet"/>
+      </w:pPr>
+      <w:r>
+        <w:t>whisper_server.py — Tiny web server (port 18765). Serves the voice interview web page (client.html) at /livekit. Generates LiveKit tokens at /token. Saves transcripts at /save_transcript. Runs in a background thread.</w:t>
+      </w:r>
+    </w:p>
+    <w:p>
+      <w:pPr>
+        <w:pStyle w:val="ListBullet"/>
+      </w:pPr>
+      <w:r>
+        <w:t>launcher.py — Manages the LiveKit server. start_livekit_server() checks for the binary in temp folder, downloads if missing? No — you must download it once. Then it launches the server and waits for it to be ready. cleanup() shuts everything down on exit.</w:t>
+      </w:r>
+    </w:p>
+    <w:p>
+      <w:pPr>
+        <w:pStyle w:val="ListBullet"/>
+      </w:pPr>
+      <w:r>
+        <w:t>client.html — The web page the candidate sees during voice interview. Shows webcam feed, real-time transcription, chat conversation log, and current question. Has a "Start Interview" button (no auto-connect).</w:t>
+      </w:r>
+    </w:p>
+    <w:p>
+      <w:pPr>
+        <w:pStyle w:val="ListBullet"/>
+      </w:pPr>
+      <w:r>
+        <w:t>livekit.yaml — Configuration for the LiveKit server: ports, API keys, logging.</w:t>
+      </w:r>
+    </w:p>
+    <w:p>
+      <w:pPr>
+        <w:pStyle w:val="Heading1"/>
+      </w:pPr>
+      <w:r>
+        <w:rPr>
+          <w:color w:val="1A56DB"/>
+        </w:rPr>
+        <w:t>8. Summary</w:t>
+      </w:r>
+    </w:p>
+    <w:p>
+      <w:r>
+        <w:rPr>
+          <w:b w:val="0"/>
+        </w:rPr>
+        <w:t>InterviewAI takes a Resume + Job Description → parses them → builds a skill graph → finds gaps → generates interview questions → conducts the interview (text or voice) → scores each answer using AI → produces a final report with verdict and recommendations.</w:t>
+      </w:r>
+    </w:p>
+    <w:p>
+      <w:r>
+        <w:rPr>
+          <w:b w:val="0"/>
+        </w:rPr>
+        <w:t>Three API keys power everything:</w:t>
+      </w:r>
+    </w:p>
+    <w:p>
+      <w:pPr>
+        <w:pStyle w:val="ListBullet"/>
+      </w:pPr>
+      <w:r>
+        <w:t>Gemini — reads CV/JD, generates questions, evaluates answers, and runs the voice agent conversation dynamically.</w:t>
+      </w:r>
+    </w:p>
+    <w:p>
+      <w:pPr>
+        <w:pStyle w:val="ListBullet"/>
+      </w:pPr>
+      <w:r>
+        <w:t>Deepgram — converts speech to text using Nova-3 model (voice mode only).</w:t>
+      </w:r>
+    </w:p>
+    <w:p>
+      <w:pPr>
+        <w:pStyle w:val="ListBullet"/>
+      </w:pPr>
+      <w:r>
+        <w:t>ElevenLabs — converts text to speech using Flash v2.5 model with low-latency mode (voice mode only).</w:t>
+      </w:r>
+    </w:p>
+    <w:p>
+      <w:r>
+        <w:rPr>
+          <w:b w:val="0"/>
+        </w:rPr>
         <w:t>All the logic lives inside core/. Seven modules handle: settings (config.py), AI communication (llm.py), input parsing (agents/), answer scoring (evaluator/), skill knowledge (graph/), interview orchestration (pipeline/), report generation (report/), and voice interviews (livekit/).</w:t>
+      </w:r>
+    </w:p>
+    <w:p>
+      <w:r>
+        <w:rPr>
+          <w:b w:val="0"/>
+        </w:rPr>
+        <w:t>In Text Mode, Gemini scores each answer with two evaluations (averaged). In LiveKit Mode, Gemini runs the entire conversation dynamically — greeting, readiness check, questions, off-topic detection, and auto-end — with ElevenLabs for speech output and Deepgram for speech input.</w:t>
       </w:r>
     </w:p>
     <w:sectPr>
@@ -1347,6 +1655,9 @@
     <w:name w:val="Normal"/>
     <w:qFormat/>
     <w:rsid w:val="00FC693F"/>
+    <w:pPr>
+      <w:spacing w:after="80"/>
+    </w:pPr>
     <w:rPr>
       <w:rFonts w:ascii="Calibri" w:hAnsi="Calibri"/>
       <w:sz w:val="22"/>

</xml_diff>

<commit_message>
Rewrite PROJECT_GUIDE.docx in plain English for video scripts
- 10 sections with clear, simple language
- One-sentence summary of the whole project
- Who should use this (target audience)
- What inputs/outputs are needed
- 6 steps explained step by step
- Two interview modes explained in detail
- Technology explained with analogies (Gemini=brain, Deepgram=captions, etc.)
- Every file in core/ explained in one sentence
- Glossary of 15 technical terms in plain English
- Quick reference card with paths, API keys, run commands
- Instructions for making a video script from this document
</commit_message>
<xml_diff>
--- a/InterviewAI/PROJECT_GUIDE.docx
+++ b/InterviewAI/PROJECT_GUIDE.docx
@@ -10,25 +10,35 @@
         <w:rPr>
           <w:color w:val="0F172A"/>
         </w:rPr>
-        <w:t>InterviewAI — Complete Project Guide</w:t>
-      </w:r>
-    </w:p>
-    <w:p>
-      <w:pPr>
-        <w:jc w:val="center"/>
-      </w:pPr>
-      <w:r>
-        <w:t>A simple, clear explanation of the entire project</w:t>
+        <w:t>InterviewAI</w:t>
       </w:r>
     </w:p>
     <w:p>
       <w:r>
-        <w:t>CMP7200 Individual Masters Project</w:t>
+        <w:rPr>
+          <w:b w:val="0"/>
+          <w:i w:val="0"/>
+        </w:rPr>
+        <w:t>Complete Project Guide — Simple Version</w:t>
       </w:r>
     </w:p>
     <w:p>
       <w:r>
-        <w:t>Birmingham City University</w:t>
+        <w:rPr>
+          <w:b w:val="0"/>
+          <w:i w:val="0"/>
+        </w:rPr>
+        <w:t>CMP7200 Individual Masters Project — Birmingham City University</w:t>
+      </w:r>
+    </w:p>
+    <w:p/>
+    <w:p>
+      <w:r>
+        <w:rPr>
+          <w:b w:val="0"/>
+          <w:i w:val="0"/>
+        </w:rPr>
+        <w:t>Read this document to understand the whole project. You can also give this to ChatGPT or Claude and ask: "Make a 5-minute video script explaining this project."</w:t>
       </w:r>
     </w:p>
     <w:p>
@@ -39,15 +49,25 @@
         <w:rPr>
           <w:color w:val="1A56DB"/>
         </w:rPr>
-        <w:t>1. What Is This Project?</w:t>
+        <w:t>1. What Is This Project? (One Sentence)</w:t>
       </w:r>
     </w:p>
     <w:p>
       <w:r>
         <w:rPr>
           <w:b w:val="0"/>
+          <w:i/>
         </w:rPr>
-        <w:t>InterviewAI is an AI-powered system that conducts technical interviews automatically. A candidate uploads their Resume and a Job Description, and the system:</w:t>
+        <w:t>InterviewAI is a smart system that automatically conducts a technical job interview. You upload a CV and a Job Description, and the AI asks relevant questions, scores the answers, and gives a hire/don't hire decision.</w:t>
+      </w:r>
+    </w:p>
+    <w:p>
+      <w:r>
+        <w:rPr>
+          <w:b/>
+          <w:i w:val="0"/>
+        </w:rPr>
+        <w:t>Think of it like this:</w:t>
       </w:r>
     </w:p>
     <w:p>
@@ -55,7 +75,7 @@
         <w:pStyle w:val="ListBullet"/>
       </w:pPr>
       <w:r>
-        <w:t>Reads the Resume to find the candidate's skills and experience.</w:t>
+        <w:t>A candidate uploads their CV (their skills and experience).</w:t>
       </w:r>
     </w:p>
     <w:p>
@@ -63,7 +83,7 @@
         <w:pStyle w:val="ListBullet"/>
       </w:pPr>
       <w:r>
-        <w:t>Reads the Job Description to find what skills the job requires.</w:t>
+        <w:t>They also provide a Job Description (what the company needs).</w:t>
       </w:r>
     </w:p>
     <w:p>
@@ -71,7 +91,7 @@
         <w:pStyle w:val="ListBullet"/>
       </w:pPr>
       <w:r>
-        <w:t>Compares both using a standard skill database (ESCO taxonomy) to find gaps.</w:t>
+        <w:t>The system reads both and figures out what skills the candidate is missing or weak at.</w:t>
       </w:r>
     </w:p>
     <w:p>
@@ -79,7 +99,7 @@
         <w:pStyle w:val="ListBullet"/>
       </w:pPr>
       <w:r>
-        <w:t>Generates interview questions targeting the weak or missing skills.</w:t>
+        <w:t>It then asks interview questions — either by typing or by voice — to test those weak areas.</w:t>
       </w:r>
     </w:p>
     <w:p>
@@ -87,7 +107,7 @@
         <w:pStyle w:val="ListBullet"/>
       </w:pPr>
       <w:r>
-        <w:t>Asks questions one by one — either by typing (Text Mode) or by voice (LiveKit Mode).</w:t>
+        <w:t>Each answer gets scored by AI (Google Gemini).</w:t>
       </w:r>
     </w:p>
     <w:p>
@@ -95,23 +115,7 @@
         <w:pStyle w:val="ListBullet"/>
       </w:pPr>
       <w:r>
-        <w:t>Scores each answer using AI (Google Gemini).</w:t>
-      </w:r>
-    </w:p>
-    <w:p>
-      <w:pPr>
-        <w:pStyle w:val="ListBullet"/>
-      </w:pPr>
-      <w:r>
-        <w:t>Produces a final report: overall score, strengths, gaps, and hire decision.</w:t>
-      </w:r>
-    </w:p>
-    <w:p>
-      <w:r>
-        <w:rPr>
-          <w:b w:val="0"/>
-        </w:rPr>
-        <w:t>You do NOT need any coding knowledge to use this. Everything runs through a web browser.</w:t>
+        <w:t>At the end, you get a report: overall score, strengths, gaps, and whether to hire.</w:t>
       </w:r>
     </w:p>
     <w:p>
@@ -122,63 +126,7 @@
         <w:rPr>
           <w:color w:val="1A56DB"/>
         </w:rPr>
-        <w:t>2. What Inputs Does It Need?</w:t>
-      </w:r>
-    </w:p>
-    <w:p>
-      <w:r>
-        <w:rPr>
-          <w:b w:val="0"/>
-        </w:rPr>
-        <w:t>The system needs 3 things to work:</w:t>
-      </w:r>
-    </w:p>
-    <w:p>
-      <w:r>
-        <w:rPr>
-          <w:b/>
-        </w:rPr>
-        <w:t>1. Resume / CV (PDF or text)</w:t>
-      </w:r>
-    </w:p>
-    <w:p>
-      <w:r>
-        <w:rPr>
-          <w:b w:val="0"/>
-        </w:rPr>
-        <w:t>A file containing the candidate's work history, skills, and qualifications. The system reads this to understand what the candidate already knows.</w:t>
-      </w:r>
-    </w:p>
-    <w:p>
-      <w:r>
-        <w:rPr>
-          <w:b/>
-        </w:rPr>
-        <w:t>2. Job Description (text)</w:t>
-      </w:r>
-    </w:p>
-    <w:p>
-      <w:r>
-        <w:rPr>
-          <w:b w:val="0"/>
-        </w:rPr>
-        <w:t>A description of the job role — what skills are required, what experience level (junior/mid/senior), and what the role involves.</w:t>
-      </w:r>
-    </w:p>
-    <w:p>
-      <w:r>
-        <w:rPr>
-          <w:b/>
-        </w:rPr>
-        <w:t>3. API Keys (in .env file)</w:t>
-      </w:r>
-    </w:p>
-    <w:p>
-      <w:r>
-        <w:rPr>
-          <w:b w:val="0"/>
-        </w:rPr>
-        <w:t>Three API keys are required. These are stored in a file called .env:</w:t>
+        <w:t>2. Who Should Use This?</w:t>
       </w:r>
     </w:p>
     <w:p>
@@ -186,7 +134,7 @@
         <w:pStyle w:val="ListBullet"/>
       </w:pPr>
       <w:r>
-        <w:t>GEMINI_API_KEY — For all AI operations: reading CV/JD, generating questions, evaluating answers. Uses Gemini 2.5 Flash by default (configurable).</w:t>
+        <w:t>HR teams — to automatically screen candidates before a real interview.</w:t>
       </w:r>
     </w:p>
     <w:p>
@@ -194,7 +142,7 @@
         <w:pStyle w:val="ListBullet"/>
       </w:pPr>
       <w:r>
-        <w:t>DEEPGRAM_API_KEY — For voice mode only: converts speech to text using Deepgram Nova-3 (best model).</w:t>
+        <w:t>Recruiters — to test technical skills at scale.</w:t>
       </w:r>
     </w:p>
     <w:p>
@@ -202,15 +150,24 @@
         <w:pStyle w:val="ListBullet"/>
       </w:pPr>
       <w:r>
-        <w:t>ELEVENLABS_API_KEY — For voice mode only: converts text to speech using ElevenLabs Flash v2.5 (fastest real-time model).</w:t>
+        <w:t>Students — to practice interviews and get feedback.</w:t>
+      </w:r>
+    </w:p>
+    <w:p>
+      <w:pPr>
+        <w:pStyle w:val="ListBullet"/>
+      </w:pPr>
+      <w:r>
+        <w:t>Managers — to assess candidates objectively without bias.</w:t>
       </w:r>
     </w:p>
     <w:p>
       <w:r>
         <w:rPr>
           <w:b w:val="0"/>
+          <w:i w:val="0"/>
         </w:rPr>
-        <w:t>For LiveKit Mode, the system also uses a LiveKit server for managing the voice/video connection. You need to download the LiveKit server binary once from github.com/livekit/livekit/releases — it goes to your temp folder automatically. After that, everything starts automatically.</w:t>
+        <w:t>You do NOT need any coding knowledge. Everything runs in a web browser.</w:t>
       </w:r>
     </w:p>
     <w:p>
@@ -221,15 +178,16 @@
         <w:rPr>
           <w:color w:val="1A56DB"/>
         </w:rPr>
-        <w:t>3. What Outputs Does It Produce?</w:t>
+        <w:t>3. What Do You Need to Run It?</w:t>
       </w:r>
     </w:p>
     <w:p>
       <w:r>
         <w:rPr>
-          <w:b w:val="0"/>
+          <w:b/>
+          <w:i w:val="0"/>
         </w:rPr>
-        <w:t>After the interview, the system produces a Final Report containing:</w:t>
+        <w:t>Three API keys (like passwords for AI services):</w:t>
       </w:r>
     </w:p>
     <w:p>
@@ -237,7 +195,7 @@
         <w:pStyle w:val="ListBullet"/>
       </w:pPr>
       <w:r>
-        <w:t>Overall Score — an average of all answers (out of 100).</w:t>
+        <w:t>GEMINI_API_KEY — This is the brain. All AI thinking (reading CV, making questions, scoring answers) uses Google Gemini.</w:t>
       </w:r>
     </w:p>
     <w:p>
@@ -245,7 +203,7 @@
         <w:pStyle w:val="ListBullet"/>
       </w:pPr>
       <w:r>
-        <w:t>Verdict — Strong Hire (score ≥70), Weak Hire (40-69), or No Hire (&lt;40).</w:t>
+        <w:t>DEEPGRAM_API_KEY — For voice mode only. Converts spoken words into text (like a super-accurate captions system).</w:t>
       </w:r>
     </w:p>
     <w:p>
@@ -253,39 +211,24 @@
         <w:pStyle w:val="ListBullet"/>
       </w:pPr>
       <w:r>
-        <w:t>Per-Skill Breakdown — each skill tested, its score, and feedback.</w:t>
+        <w:t>ELEVENLABS_API_KEY — For voice mode only. Converts text into spoken voice (makes the AI sound like a real human).</w:t>
       </w:r>
     </w:p>
     <w:p>
-      <w:pPr>
-        <w:pStyle w:val="ListBullet"/>
-      </w:pPr>
       <w:r>
-        <w:t>Strengths — skills where the candidate scored ≥70.</w:t>
+        <w:rPr>
+          <w:b w:val="0"/>
+          <w:i w:val="0"/>
+        </w:rPr>
       </w:r>
     </w:p>
     <w:p>
-      <w:pPr>
-        <w:pStyle w:val="ListBullet"/>
-      </w:pPr>
       <w:r>
-        <w:t>Gaps — skills where the candidate scored &lt;40.</w:t>
-      </w:r>
-    </w:p>
-    <w:p>
-      <w:pPr>
-        <w:pStyle w:val="ListBullet"/>
-      </w:pPr>
-      <w:r>
-        <w:t>Development Areas — skills that need improvement (40-69).</w:t>
-      </w:r>
-    </w:p>
-    <w:p>
-      <w:pPr>
-        <w:pStyle w:val="ListBullet"/>
-      </w:pPr>
-      <w:r>
-        <w:t>Full Answer Log — every question asked, the candidate's answer, the score, and the AI's feedback.</w:t>
+        <w:rPr>
+          <w:b w:val="0"/>
+          <w:i/>
+        </w:rPr>
+        <w:t>You also need to download one file (the LiveKit server) once, and the system handles the rest automatically.</w:t>
       </w:r>
     </w:p>
     <w:p>
@@ -296,95 +239,111 @@
         <w:rPr>
           <w:color w:val="1A56DB"/>
         </w:rPr>
-        <w:t>4. How It Works — Step by Step</w:t>
+        <w:t>4. The Big Picture — 6 Steps</w:t>
       </w:r>
     </w:p>
     <w:p>
       <w:r>
         <w:rPr>
           <w:b w:val="0"/>
+          <w:i w:val="0"/>
         </w:rPr>
-        <w:t>The system runs in 6 stages, one after another:</w:t>
+        <w:t>The whole process happens in 6 steps, shown as tabs in the web app:</w:t>
       </w:r>
     </w:p>
+    <w:p/>
     <w:p>
       <w:r>
         <w:rPr>
           <w:b/>
+          <w:i w:val="0"/>
         </w:rPr>
-        <w:t>Stage 1: Parse CV &amp; JD</w:t>
+        <w:t>Step 1 — Upload CV + Job Description</w:t>
       </w:r>
     </w:p>
     <w:p>
       <w:r>
         <w:rPr>
           <w:b w:val="0"/>
+          <w:i w:val="0"/>
         </w:rPr>
-        <w:t>The candidate uploads their Resume and pastes the Job Description. The system sends both to Gemini AI, which extracts: the candidate's name and skills (from Resume), and the job title, level, and required skills (from JD). All of this is returned as structured data.</w:t>
+        <w:t>The user uploads their resume (PDF or text) and pastes a job description. That's it — two inputs.</w:t>
       </w:r>
     </w:p>
+    <w:p/>
     <w:p>
       <w:r>
         <w:rPr>
           <w:b/>
+          <w:i w:val="0"/>
         </w:rPr>
-        <w:t>Stage 2: Build Skill Graph</w:t>
+        <w:t>Step 2 — Analysis</w:t>
       </w:r>
     </w:p>
     <w:p>
       <w:r>
         <w:rPr>
           <w:b w:val="0"/>
+          <w:i w:val="0"/>
         </w:rPr>
-        <w:t>The system loads the ESCO taxonomy — a European-standard database of 1,201 IT skills — into a graph (like a map where skills are connected to related skills). It adds modern technologies like Python, React, and Docker that ESCO doesn't cover. The candidate's skills and the job's required skills are matched against this graph.</w:t>
+        <w:t>The system sends both documents to Gemini AI, which reads them and extracts: the candidate's name, their skills, the job title, what level the job is (junior/mid/senior), and what skills the job requires.</w:t>
       </w:r>
     </w:p>
+    <w:p/>
     <w:p>
       <w:r>
         <w:rPr>
           <w:b/>
+          <w:i w:val="0"/>
         </w:rPr>
-        <w:t>Stage 3: Gap Analysis</w:t>
+        <w:t>Step 3 — Skill Graph</w:t>
       </w:r>
     </w:p>
     <w:p>
       <w:r>
         <w:rPr>
           <w:b w:val="0"/>
+          <w:i w:val="0"/>
         </w:rPr>
-        <w:t>The system compares what the candidate knows vs what the job needs. Skills that are missing or weak become "topics" for the interview. Each topic gets a priority level and a reason.</w:t>
+        <w:t>The system loads a big database of IT skills called ESCO (1,201 skills — like a dictionary of every tech skill). It builds a "map" where related skills are connected. Then it compares the candidate's skills against what the job needs and finds the gaps — skills the candidate is missing or weak at.</w:t>
       </w:r>
     </w:p>
+    <w:p/>
     <w:p>
       <w:r>
         <w:rPr>
           <w:b/>
+          <w:i w:val="0"/>
         </w:rPr>
-        <w:t>Stage 4: Generate Questions</w:t>
+        <w:t>Step 4 — Generate Questions</w:t>
       </w:r>
     </w:p>
     <w:p>
       <w:r>
         <w:rPr>
           <w:b w:val="0"/>
+          <w:i w:val="0"/>
         </w:rPr>
-        <w:t>Using Gemini AI, the system creates a full interview question set: opening questions (warm-up), technical questions (one per skill to test), behavioural questions (STAR format), and closing questions. Each question has a difficulty level and a follow-up probe.</w:t>
+        <w:t>Gemini AI creates a set of interview questions targeting the weak/missing skills. For each skill, it creates: an opening warm-up question, a technical question, a behavioral question (using the STAR method — Situation, Task, Action, Result), and a closing question.</w:t>
       </w:r>
     </w:p>
+    <w:p/>
     <w:p>
       <w:r>
         <w:rPr>
           <w:b/>
+          <w:i w:val="0"/>
         </w:rPr>
-        <w:t>Stage 5: Conduct Interview</w:t>
+        <w:t>Step 5 — Conduct the Interview</w:t>
       </w:r>
     </w:p>
     <w:p>
       <w:r>
         <w:rPr>
           <w:b w:val="0"/>
+          <w:i w:val="0"/>
         </w:rPr>
-        <w:t>The interview runs in one of two modes:</w:t>
+        <w:t>This is where the actual interview happens. There are two ways to do it:</w:t>
       </w:r>
     </w:p>
     <w:p>
@@ -392,7 +351,7 @@
         <w:pStyle w:val="ListBullet"/>
       </w:pPr>
       <w:r>
-        <w:t>Text Mode: Questions appear on screen. The candidate types answers and clicks Submit. Each answer is immediately scored by Gemini AI (two evaluations averaged for accuracy). The system picks the weakest skill first and asks follow-ups if needed. Maximum 3 questions in text mode.</w:t>
+        <w:t>Text Mode — Questions appear on screen, candidate types answers, AI scores them immediately. Maximum 3 questions.</w:t>
       </w:r>
     </w:p>
     <w:p>
@@ -400,23 +359,26 @@
         <w:pStyle w:val="ListBullet"/>
       </w:pPr>
       <w:r>
-        <w:t>LiveKit Mode: A voice agent speaks the questions using ElevenLabs (AI voice). The candidate speaks their answers. Deepgram converts speech to text. Everything happens in real time through a web page. The Gemini AI runs dynamically during the conversation — it greets the candidate, asks if they're ready, asks up to 5 questions one by one, handles off-topic answers with warnings, and auto-ends the interview. A full transcript is saved at the end.</w:t>
+        <w:t>LiveKit Mode (Voice) — A voice AI speaks the questions out loud using ElevenLabs. The candidate speaks their answers. Deepgram converts speech to text. Gemini runs the conversation in real time. Maximum 5 questions.</w:t>
       </w:r>
     </w:p>
+    <w:p/>
     <w:p>
       <w:r>
         <w:rPr>
           <w:b/>
+          <w:i w:val="0"/>
         </w:rPr>
-        <w:t>Stage 6: Generate Report</w:t>
+        <w:t>Step 6 — Generate Report</w:t>
       </w:r>
     </w:p>
     <w:p>
       <w:r>
         <w:rPr>
           <w:b w:val="0"/>
+          <w:i w:val="0"/>
         </w:rPr>
-        <w:t>After the interview ends, the system builds the final report: overall score, verdict, per-skill breakdown, strengths, gaps, development areas, and full answer log.</w:t>
+        <w:t>The system calculates: an overall score (0-100), a verdict (Strong Hire ≥70, Weak Hire 40-69, Not a Hire &lt;40), a breakdown by skill (strengths, gaps, areas to improve), and the full log of every question and answer.</w:t>
       </w:r>
     </w:p>
     <w:p>
@@ -427,7 +389,7 @@
         <w:rPr>
           <w:color w:val="1A56DB"/>
         </w:rPr>
-        <w:t>5. The Two Interview Modes</w:t>
+        <w:t>5. The Two Interview Modes — Detailed</w:t>
       </w:r>
     </w:p>
     <w:p>
@@ -438,23 +400,25 @@
         <w:rPr>
           <w:color w:val="1A56DB"/>
         </w:rPr>
-        <w:t>Text Mode</w:t>
+        <w:t>5A. Text Mode (Simple)</w:t>
       </w:r>
     </w:p>
     <w:p>
       <w:r>
         <w:rPr>
           <w:b w:val="0"/>
+          <w:i w:val="0"/>
         </w:rPr>
-        <w:t>This is the simpler mode. The candidate sees questions on a web page, types their answer in a text box, and clicks Submit. The AI scores it immediately and moves to the next question. No microphone or camera needed.</w:t>
+        <w:t>This is the simpler mode. No microphone or camera needed.</w:t>
       </w:r>
     </w:p>
     <w:p>
       <w:r>
         <w:rPr>
           <w:b/>
+          <w:i w:val="0"/>
         </w:rPr>
-        <w:t>Flow:</w:t>
+        <w:t>How it works step by step:</w:t>
       </w:r>
     </w:p>
     <w:p>
@@ -462,7 +426,7 @@
         <w:pStyle w:val="ListBullet"/>
       </w:pPr>
       <w:r>
-        <w:t>System picks the lowest-scored skill first.</w:t>
+        <w:t>The system picks the skill the candidate scored lowest on.</w:t>
       </w:r>
     </w:p>
     <w:p>
@@ -470,7 +434,7 @@
         <w:pStyle w:val="ListBullet"/>
       </w:pPr>
       <w:r>
-        <w:t>Generates a fresh question for that skill using Gemini.</w:t>
+        <w:t>Gemini creates a fresh question for that skill.</w:t>
       </w:r>
     </w:p>
     <w:p>
@@ -478,7 +442,7 @@
         <w:pStyle w:val="ListBullet"/>
       </w:pPr>
       <w:r>
-        <w:t>Displays the question on screen.</w:t>
+        <w:t>The question appears on the screen.</w:t>
       </w:r>
     </w:p>
     <w:p>
@@ -486,7 +450,7 @@
         <w:pStyle w:val="ListBullet"/>
       </w:pPr>
       <w:r>
-        <w:t>Candidate types answer and clicks Submit.</w:t>
+        <w:t>The candidate types their answer and clicks "Submit."</w:t>
       </w:r>
     </w:p>
     <w:p>
@@ -494,7 +458,7 @@
         <w:pStyle w:val="ListBullet"/>
       </w:pPr>
       <w:r>
-        <w:t>AI evaluates the answer (two Gemini calls, scores averaged).</w:t>
+        <w:t>Gemini evaluates the answer in two passes (to be fair) and averages the scores.</w:t>
       </w:r>
     </w:p>
     <w:p>
@@ -502,7 +466,7 @@
         <w:pStyle w:val="ListBullet"/>
       </w:pPr>
       <w:r>
-        <w:t>Result shown immediately. If weak, a follow-up may be asked.</w:t>
+        <w:t>If the answer is weak, the AI asks one follow-up question.</w:t>
       </w:r>
     </w:p>
     <w:p>
@@ -510,7 +474,7 @@
         <w:pStyle w:val="ListBullet"/>
       </w:pPr>
       <w:r>
-        <w:t>Repeats until all skills tested or max questions reached (3 questions).</w:t>
+        <w:t>This repeats until all skills are tested or 3 questions have been asked.</w:t>
       </w:r>
     </w:p>
     <w:p>
@@ -518,7 +482,7 @@
         <w:pStyle w:val="ListBullet"/>
       </w:pPr>
       <w:r>
-        <w:t>Final report generated automatically.</w:t>
+        <w:t>A final report is generated automatically.</w:t>
       </w:r>
     </w:p>
     <w:p>
@@ -529,21 +493,33 @@
         <w:rPr>
           <w:color w:val="1A56DB"/>
         </w:rPr>
-        <w:t>LiveKit Mode (Voice Interview)</w:t>
+        <w:t>5B. LiveKit Mode (Voice Interview)</w:t>
       </w:r>
     </w:p>
     <w:p>
       <w:r>
         <w:rPr>
           <w:b w:val="0"/>
+          <w:i w:val="0"/>
         </w:rPr>
-        <w:t>In this mode, the candidate speaks their answers through a microphone and the AI speaks the questions out loud. It works like a real voice call.</w:t>
+        <w:t>In this mode, the AI speaks the questions and the candidate speaks the answers — like a real voice call.</w:t>
       </w:r>
     </w:p>
     <w:p>
       <w:r>
         <w:rPr>
+          <w:b w:val="0"/>
+          <w:i w:val="0"/>
+        </w:rPr>
+        <w:t>You will see yourself on camera (webcam), and a transcript of what is being said.</w:t>
+      </w:r>
+    </w:p>
+    <w:p/>
+    <w:p>
+      <w:r>
+        <w:rPr>
           <w:b/>
+          <w:i w:val="0"/>
         </w:rPr>
         <w:t>What is LiveKit?</w:t>
       </w:r>
@@ -552,16 +528,19 @@
       <w:r>
         <w:rPr>
           <w:b w:val="0"/>
+          <w:i w:val="0"/>
         </w:rPr>
-        <w:t>LiveKit is an open-source platform for real-time voice/video communication (similar to Zoom). It runs as a server on your machine. You download the LiveKit server binary once, and the system starts it automatically when you use voice mode.</w:t>
+        <w:t>LiveKit is a free, open-source tool for real-time voice and video communication (like Zoom but built for AI). It runs as a server on your computer. You download it once, and the system starts it automatically when needed.</w:t>
       </w:r>
     </w:p>
+    <w:p/>
     <w:p>
       <w:r>
         <w:rPr>
           <w:b/>
+          <w:i w:val="0"/>
         </w:rPr>
-        <w:t>How the Voice Interview Works:</w:t>
+        <w:t>How the Voice Interview Works (step by step):</w:t>
       </w:r>
     </w:p>
     <w:p>
@@ -577,7 +556,7 @@
         <w:pStyle w:val="ListBullet"/>
       </w:pPr>
       <w:r>
-        <w:t>The candidate opens a web page (client.html) with a "Start Interview" button.</w:t>
+        <w:t>A web page opens in your browser with a "Start Interview" button.</w:t>
       </w:r>
     </w:p>
     <w:p>
@@ -585,7 +564,7 @@
         <w:pStyle w:val="ListBullet"/>
       </w:pPr>
       <w:r>
-        <w:t>After clicking Start, the browser asks for camera/mic permission, then connects to the LiveKit room.</w:t>
+        <w:t>You click the button. Your browser asks for camera and microphone permission. You allow it.</w:t>
       </w:r>
     </w:p>
     <w:p>
@@ -593,7 +572,7 @@
         <w:pStyle w:val="ListBullet"/>
       </w:pPr>
       <w:r>
-        <w:t>An AI "agent" (run_agent.py) joins the same room and begins the interview.</w:t>
+        <w:t>The browser connects to the LiveKit room. An AI "agent" joins the same room.</w:t>
       </w:r>
     </w:p>
     <w:p>
@@ -601,7 +580,7 @@
         <w:pStyle w:val="ListBullet"/>
       </w:pPr>
       <w:r>
-        <w:t>The agent greets the candidate by name, mentions the position, and asks if they're ready.</w:t>
+        <w:t>The AI agent greets you warmly, mentions your name and the job position.</w:t>
       </w:r>
     </w:p>
     <w:p>
@@ -609,7 +588,7 @@
         <w:pStyle w:val="ListBullet"/>
       </w:pPr>
       <w:r>
-        <w:t>Once ready, it asks questions one by one using ElevenLabs TTS (text-to-speech).</w:t>
+        <w:t>It asks "Are you ready to begin the interview?" You say yes.</w:t>
       </w:r>
     </w:p>
     <w:p>
@@ -617,7 +596,7 @@
         <w:pStyle w:val="ListBullet"/>
       </w:pPr>
       <w:r>
-        <w:t>The candidate hears the question and speaks their answer into the microphone.</w:t>
+        <w:t>The AI starts asking questions one by one. Each question is spoken out loud using ElevenLabs (natural-sounding AI voice).</w:t>
       </w:r>
     </w:p>
     <w:p>
@@ -625,7 +604,7 @@
         <w:pStyle w:val="ListBullet"/>
       </w:pPr>
       <w:r>
-        <w:t>Deepgram STT (speech-to-text) converts their speech into text in real time.</w:t>
+        <w:t>You hear the question and speak your answer into the microphone.</w:t>
       </w:r>
     </w:p>
     <w:p>
@@ -633,7 +612,7 @@
         <w:pStyle w:val="ListBullet"/>
       </w:pPr>
       <w:r>
-        <w:t>The text is displayed on the screen as "live transcription."</w:t>
+        <w:t>Deepgram converts your speech into text in real time (appears on screen as captions).</w:t>
       </w:r>
     </w:p>
     <w:p>
@@ -641,7 +620,7 @@
         <w:pStyle w:val="ListBullet"/>
       </w:pPr>
       <w:r>
-        <w:t>The Gemini AI runs in real-time during the conversation. It decides what to say next based on the conversation history, the candidate's CV, and the job requirements.</w:t>
+        <w:t>Gemini AI thinks about your answer and decides what to say next.</w:t>
       </w:r>
     </w:p>
     <w:p>
@@ -649,7 +628,7 @@
         <w:pStyle w:val="ListBullet"/>
       </w:pPr>
       <w:r>
-        <w:t>If the candidate goes off-topic, the Gemini gives up to 3 warnings, then moves to the next question.</w:t>
+        <w:t>If you go off-topic, Gemini gives you up to 3 warnings, then moves to the next question.</w:t>
       </w:r>
     </w:p>
     <w:p>
@@ -657,7 +636,7 @@
         <w:pStyle w:val="ListBullet"/>
       </w:pPr>
       <w:r>
-        <w:t>After all questions, the agent thanks the candidate and saves a transcript file.</w:t>
+        <w:t>After all questions, the AI thanks you and says goodbye. A transcript is saved.</w:t>
       </w:r>
     </w:p>
     <w:p>
@@ -665,15 +644,17 @@
         <w:pStyle w:val="ListBullet"/>
       </w:pPr>
       <w:r>
-        <w:t>The candidate can end the interview anytime by clicking End.</w:t>
+        <w:t>You can end the interview anytime by clicking the "End" button.</w:t>
       </w:r>
     </w:p>
+    <w:p/>
     <w:p>
       <w:r>
         <w:rPr>
           <w:b/>
+          <w:i w:val="0"/>
         </w:rPr>
-        <w:t>Key Tech Specs:</w:t>
+        <w:t>Technical details (for developers):</w:t>
       </w:r>
     </w:p>
     <w:p>
@@ -681,7 +662,7 @@
         <w:pStyle w:val="ListBullet"/>
       </w:pPr>
       <w:r>
-        <w:t>ElevenLabs model: eleven_flash_v2_5 (fastest real-time model) with streaming_latency=4 for minimal delay.</w:t>
+        <w:t>ElevenLabs model: eleven_flash_v2_5 (the fastest model) with streaming_latency=4 (minimum delay).</w:t>
       </w:r>
     </w:p>
     <w:p>
@@ -689,7 +670,7 @@
         <w:pStyle w:val="ListBullet"/>
       </w:pPr>
       <w:r>
-        <w:t>Deepgram model: nova-3 (best accuracy).</w:t>
+        <w:t>Deepgram model: nova-3 (the most accurate speech-to-text model).</w:t>
       </w:r>
     </w:p>
     <w:p>
@@ -697,23 +678,7 @@
         <w:pStyle w:val="ListBullet"/>
       </w:pPr>
       <w:r>
-        <w:t>Gemini model: 2.0 Flash in the agent, 2.5 Flash in text mode (configurable via .env).</w:t>
-      </w:r>
-    </w:p>
-    <w:p>
-      <w:pPr>
-        <w:pStyle w:val="ListBullet"/>
-      </w:pPr>
-      <w:r>
-        <w:t>Turn handling: interruptions disabled (agent always finishes speaking), endpointing delay 1.5-4 seconds (gives candidate time to think).</w:t>
-      </w:r>
-    </w:p>
-    <w:p>
-      <w:pPr>
-        <w:pStyle w:val="ListBullet"/>
-      </w:pPr>
-      <w:r>
-        <w:t>Maximum 5 questions in LiveKit mode (configurable).</w:t>
+        <w:t>Turn handling: The AI will NOT be interrupted while speaking. After you stop speaking, it waits 1.5-4 seconds before responding (so you have time to think).</w:t>
       </w:r>
     </w:p>
     <w:p>
@@ -724,236 +689,106 @@
         <w:rPr>
           <w:color w:val="1A56DB"/>
         </w:rPr>
-        <w:t>6. Modules — What Each Part Does</w:t>
+        <w:t>6. What Technology Does It Use?</w:t>
       </w:r>
     </w:p>
     <w:p>
       <w:r>
         <w:rPr>
           <w:b w:val="0"/>
+          <w:i w:val="0"/>
         </w:rPr>
-        <w:t>The project has 7 modules (plus configuration and AI client). Each module has a specific job:</w:t>
+        <w:t>Here are the main tools this project uses, explained simply:</w:t>
       </w:r>
     </w:p>
     <w:p>
-      <w:pPr>
-        <w:pStyle w:val="Heading2"/>
-      </w:pPr>
       <w:r>
         <w:rPr>
-          <w:color w:val="1A56DB"/>
+          <w:b/>
+          <w:i w:val="0"/>
         </w:rPr>
-        <w:t>Parsing &amp; Question Generation</w:t>
+        <w:t>Google Gemini (AI Brain)</w:t>
       </w:r>
     </w:p>
     <w:p>
       <w:r>
         <w:rPr>
           <w:b w:val="0"/>
+          <w:i w:val="0"/>
         </w:rPr>
-        <w:t>This module handles understanding the inputs and creating questions.</w:t>
+        <w:t>This is the "brain" of the system. Gemini reads the CV and job description, creates questions, evaluates answers, and runs the voice conversation. Everything smart that happens is Gemini.</w:t>
       </w:r>
     </w:p>
     <w:p>
-      <w:pPr>
-        <w:pStyle w:val="ListBullet"/>
-      </w:pPr>
       <w:r>
-        <w:t>cv_agent.py — Takes a Resume PDF or text, extracts name + skills + experience using Gemini.</w:t>
+        <w:rPr>
+          <w:b/>
+          <w:i w:val="0"/>
+        </w:rPr>
+        <w:t>LiveKit (Video/Voice Platform)</w:t>
       </w:r>
     </w:p>
     <w:p>
-      <w:pPr>
-        <w:pStyle w:val="ListBullet"/>
-      </w:pPr>
       <w:r>
-        <w:t>jd_agent.py — Takes a Job Description, extracts job title + level + required skills using Gemini.</w:t>
+        <w:rPr>
+          <w:b w:val="0"/>
+          <w:i w:val="0"/>
+        </w:rPr>
+        <w:t>Think of this like a private Zoom that runs on your own computer. It handles the real-time connection between the candidate's browser and the AI agent.</w:t>
       </w:r>
     </w:p>
     <w:p>
-      <w:pPr>
-        <w:pStyle w:val="ListBullet"/>
-      </w:pPr>
       <w:r>
-        <w:t>question_agent.py — Takes the skill analysis topics and generates full interview questions using Gemini.</w:t>
+        <w:rPr>
+          <w:b/>
+          <w:i w:val="0"/>
+        </w:rPr>
+        <w:t>Deepgram (Speech-to-Text)</w:t>
       </w:r>
     </w:p>
     <w:p>
-      <w:pPr>
-        <w:pStyle w:val="Heading2"/>
-      </w:pPr>
       <w:r>
         <w:rPr>
-          <w:color w:val="1A56DB"/>
+          <w:b w:val="0"/>
+          <w:i w:val="0"/>
         </w:rPr>
-        <w:t>Answer Scoring (LLM-as-Judge)</w:t>
+        <w:t>Deepgram listens to what the candidate says and converts it into text. It uses the "Nova-3" model — their most accurate one. Like supercharged YouTube captions.</w:t>
       </w:r>
     </w:p>
     <w:p>
-      <w:pPr>
-        <w:pStyle w:val="ListBullet"/>
-      </w:pPr>
       <w:r>
-        <w:t>evaluator.py — For each answer, it first generates an "ideal answer" using Gemini, then compares the candidate's answer against it. Scores on 4 criteria (technical accuracy, completeness, clarity, relevance — each 0-25, total 0-100). Runs two evaluations with different criterion order to reduce AI bias and averages them.</w:t>
+        <w:rPr>
+          <w:b/>
+          <w:i w:val="0"/>
+        </w:rPr>
+        <w:t>ElevenLabs (Text-to-Speech)</w:t>
       </w:r>
     </w:p>
     <w:p>
-      <w:pPr>
-        <w:pStyle w:val="Heading2"/>
-      </w:pPr>
       <w:r>
         <w:rPr>
-          <w:color w:val="1A56DB"/>
+          <w:b w:val="0"/>
+          <w:i w:val="0"/>
         </w:rPr>
-        <w:t>Skill Knowledge Graph &amp; State Tracking</w:t>
+        <w:t>ElevenLabs takes the AI's text and converts it into spoken words that sound like a real human. Uses the "Flash v2.5" model — optimized for speed.</w:t>
       </w:r>
     </w:p>
     <w:p>
-      <w:pPr>
-        <w:pStyle w:val="ListBullet"/>
-      </w:pPr>
       <w:r>
-        <w:t>skill_graph.py — Builds a map of 1,201 IT skills from ESCO taxonomy CSV files using NetworkX. Adds modern tech not in ESCO. Matches skills using fuzzy logic.</w:t>
+        <w:rPr>
+          <w:b/>
+          <w:i w:val="0"/>
+        </w:rPr>
+        <w:t>ESCO (Skill Database)</w:t>
       </w:r>
     </w:p>
     <w:p>
-      <w:pPr>
-        <w:pStyle w:val="ListBullet"/>
-      </w:pPr>
-      <w:r>
-        <w:t>state.py — Tracks each skill's status during the interview: pending, verified strong, verified weak, confirmed gap. Records scores and decides when a skill is fully tested.</w:t>
-      </w:r>
-    </w:p>
-    <w:p>
-      <w:pPr>
-        <w:pStyle w:val="ListBullet"/>
-      </w:pPr>
-      <w:r>
-        <w:t>traversal.py — Decides which skill to ask next. Picks the lowest-scored skill first (adaptive strategy). Also decides if a follow-up question is needed for weak answers.</w:t>
-      </w:r>
-    </w:p>
-    <w:p>
-      <w:pPr>
-        <w:pStyle w:val="ListBullet"/>
-      </w:pPr>
-      <w:r>
-        <w:t>visualize.py — Creates charts showing candidate skills, job requirements, gaps, and full skill map.</w:t>
-      </w:r>
-    </w:p>
-    <w:p>
-      <w:pPr>
-        <w:pStyle w:val="Heading2"/>
-      </w:pPr>
       <w:r>
         <w:rPr>
-          <w:color w:val="1A56DB"/>
+          <w:b w:val="0"/>
+          <w:i w:val="0"/>
         </w:rPr>
-        <w:t>Interview Orchestrator</w:t>
-      </w:r>
-    </w:p>
-    <w:p>
-      <w:pPr>
-        <w:pStyle w:val="ListBullet"/>
-      </w:pPr>
-      <w:r>
-        <w:t>interview_loop.py — The InterviewLoop class runs the question → answer → evaluate cycle. Picks the next skill, generates a question, collects the answer, scores it, updates progress, and repeats until done (max 3 questions).</w:t>
-      </w:r>
-    </w:p>
-    <w:p>
-      <w:pPr>
-        <w:pStyle w:val="Heading2"/>
-      </w:pPr>
-      <w:r>
-        <w:rPr>
-          <w:color w:val="1A56DB"/>
-        </w:rPr>
-        <w:t>Final Report Generator</w:t>
-      </w:r>
-    </w:p>
-    <w:p>
-      <w:pPr>
-        <w:pStyle w:val="ListBullet"/>
-      </w:pPr>
-      <w:r>
-        <w:t>generator.py — Takes all answers and scores, computes overall average, assigns verdict (Strong Hire ≥70, Weak Hire 40-69, No Hire &lt;40), lists strengths and gaps, and builds the complete report with answer log.</w:t>
-      </w:r>
-    </w:p>
-    <w:p>
-      <w:pPr>
-        <w:pStyle w:val="Heading2"/>
-      </w:pPr>
-      <w:r>
-        <w:rPr>
-          <w:color w:val="1A56DB"/>
-        </w:rPr>
-        <w:t>Voice Interview System</w:t>
-      </w:r>
-    </w:p>
-    <w:p>
-      <w:pPr>
-        <w:pStyle w:val="ListBullet"/>
-      </w:pPr>
-      <w:r>
-        <w:t>run_agent.py — The AI voice agent. Uses Gemini dynamically to conduct the interview: greets the candidate, asks readiness, asks questions one by one, handles off-topic answers (3 warnings), and auto-ends. Speaks via ElevenLabs TTS (eleven_flash_v2_5), listens via Deepgram STT (nova-3). Turn handling configured with no interruptions and 1.5-4s endpointing delays.</w:t>
-      </w:r>
-    </w:p>
-    <w:p>
-      <w:pPr>
-        <w:pStyle w:val="ListBullet"/>
-      </w:pPr>
-      <w:r>
-        <w:t>whisper_server.py — A tiny web server that serves the voice interview web page and generates LiveKit access tokens.</w:t>
-      </w:r>
-    </w:p>
-    <w:p>
-      <w:pPr>
-        <w:pStyle w:val="ListBullet"/>
-      </w:pPr>
-      <w:r>
-        <w:t>launcher.py — Starts and manages the LiveKit server. Downloads the binary to temp folder; starts it if not already running.</w:t>
-      </w:r>
-    </w:p>
-    <w:p>
-      <w:pPr>
-        <w:pStyle w:val="ListBullet"/>
-      </w:pPr>
-      <w:r>
-        <w:t>client.html — The web page the candidate sees: webcam, transcription, chat log. Has a "Start Interview" button that requests camera/mic permission and connects to the LiveKit room.</w:t>
-      </w:r>
-    </w:p>
-    <w:p>
-      <w:pPr>
-        <w:pStyle w:val="ListBullet"/>
-      </w:pPr>
-      <w:r>
-        <w:t>livekit.yaml — Configuration file for the LiveKit server (ports, API keys, logging).</w:t>
-      </w:r>
-    </w:p>
-    <w:p>
-      <w:pPr>
-        <w:pStyle w:val="Heading2"/>
-      </w:pPr>
-      <w:r>
-        <w:rPr>
-          <w:color w:val="1A56DB"/>
-        </w:rPr>
-        <w:t>Settings &amp; AI Communication</w:t>
-      </w:r>
-    </w:p>
-    <w:p>
-      <w:pPr>
-        <w:pStyle w:val="ListBullet"/>
-      </w:pPr>
-      <w:r>
-        <w:t>config.py — Loads .env file, defines all constants (scoring thresholds, question limits, API keys, model names). One central place to change settings.</w:t>
-      </w:r>
-    </w:p>
-    <w:p>
-      <w:pPr>
-        <w:pStyle w:val="ListBullet"/>
-      </w:pPr>
-      <w:r>
-        <w:t>llm.py — Talks to Google Gemini API. Has two functions: call_llm() gets text responses, call_llm_json() gets JSON responses (auto-fixes broken JSON).</w:t>
+        <w:t>A big European-standard database of 1,201 IT skills. The system uses this to make a "map" of all IT skills and find gaps in the candidate's knowledge.</w:t>
       </w:r>
     </w:p>
     <w:p>
@@ -964,72 +799,80 @@
         <w:rPr>
           <w:color w:val="1A56DB"/>
         </w:rPr>
-        <w:t>7. Directory Structure — Every File Inside core/ Explained</w:t>
+        <w:t>7. The File Structure — Every File Explained</w:t>
       </w:r>
     </w:p>
     <w:p>
       <w:r>
         <w:rPr>
           <w:b w:val="0"/>
+          <w:i w:val="0"/>
         </w:rPr>
-        <w:t>Below is every file and folder inside the core/ directory. Each one is explained in simple terms.</w:t>
+        <w:t>The code is organized inside a folder called "core/". Here is every file and what it does:</w:t>
       </w:r>
     </w:p>
+    <w:p/>
     <w:p>
-      <w:pPr>
-        <w:pStyle w:val="Heading3"/>
-      </w:pPr>
       <w:r>
         <w:rPr>
-          <w:color w:val="1A56DB"/>
+          <w:b/>
+          <w:i w:val="0"/>
         </w:rPr>
-        <w:t>core/config.py</w:t>
+        <w:t>Core Files (inside core/ folder):</w:t>
       </w:r>
     </w:p>
     <w:p>
       <w:r>
         <w:rPr>
           <w:b w:val="0"/>
+          <w:i/>
         </w:rPr>
-        <w:t>Settings file. Loads the .env file and defines all the numbers and rules the project uses: Gemini API key and model (default gemini-2.5-flash), scoring thresholds (70 = strong pass, 40 = weak pass), max questions per session (3 for text mode), max follow-ups (1), and status labels for the skill graph. Every other file imports from here so settings are in one place.</w:t>
-      </w:r>
-    </w:p>
-    <w:p>
-      <w:pPr>
-        <w:pStyle w:val="Heading3"/>
-      </w:pPr>
-      <w:r>
-        <w:rPr>
-          <w:color w:val="1A56DB"/>
-        </w:rPr>
-        <w:t>core/llm.py</w:t>
+        <w:t>config.py</w:t>
       </w:r>
     </w:p>
     <w:p>
       <w:r>
         <w:rPr>
           <w:b w:val="0"/>
+          <w:i w:val="0"/>
         </w:rPr>
-        <w:t>AI communication module. Contains the code that calls Google Gemini API. Two main functions: call_llm() sends text and gets text back. call_llm_json() sends text and expects JSON back — it automatically removes markdown formatting and fixes broken JSON using json_repair library. Used by question generator, evaluator, and all agents.</w:t>
-      </w:r>
-    </w:p>
-    <w:p>
-      <w:pPr>
-        <w:pStyle w:val="Heading3"/>
-      </w:pPr>
-      <w:r>
-        <w:rPr>
-          <w:color w:val="1A56DB"/>
-        </w:rPr>
-        <w:t>core/agents/ (folder — 3 files)</w:t>
+        <w:t>The settings file. It loads your API keys from the .env file and stores all the numbers the system uses — like what counts as a "pass" (score 70+) and a "fail" (score below 40). If you want to change how strict the interview is, you change numbers here.</w:t>
       </w:r>
     </w:p>
     <w:p>
       <w:r>
         <w:rPr>
           <w:b w:val="0"/>
+          <w:i/>
         </w:rPr>
-        <w:t>This folder handles input parsing and question creation.</w:t>
+        <w:t>llm.py</w:t>
+      </w:r>
+    </w:p>
+    <w:p>
+      <w:r>
+        <w:rPr>
+          <w:b w:val="0"/>
+          <w:i w:val="0"/>
+        </w:rPr>
+        <w:t>The communication module. This file contains the code that talks to Google Gemini. Two functions: call_llm() sends text and gets text back; call_llm_json() sends text and expects a structured answer (JSON) back. It also auto-fixes broken JSON using a repair library.</w:t>
+      </w:r>
+    </w:p>
+    <w:p>
+      <w:r>
+        <w:rPr>
+          <w:b w:val="0"/>
+          <w:i/>
+        </w:rPr>
+        <w:t>agents/ folder (3 files):</w:t>
+      </w:r>
+    </w:p>
+    <w:p>
+      <w:r>
+        <w:rPr>
+          <w:b w:val="0"/>
+          <w:i w:val="0"/>
+        </w:rPr>
+        <w:t>This folder handles reading inputs and creating questions.</w:t>
       </w:r>
     </w:p>
     <w:p>
@@ -1037,7 +880,7 @@
         <w:pStyle w:val="ListBullet"/>
       </w:pPr>
       <w:r>
-        <w:t>cv_agent.py — Reads the Resume. If PDF, extracts text first. Then sends to Gemini to extract: candidate name, skills list, experience summary.</w:t>
+        <w:t>cv_agent.py — Reads the CV/Resume. If it's a PDF, it extracts the text first. Then sends it to Gemini to pull out: candidate name, skills, and experience summary.</w:t>
       </w:r>
     </w:p>
     <w:p>
@@ -1045,7 +888,7 @@
         <w:pStyle w:val="ListBullet"/>
       </w:pPr>
       <w:r>
-        <w:t>jd_agent.py — Reads the Job Description. Sends to Gemini to extract: job title, role level (junior/mid/senior), required skills list.</w:t>
+        <w:t>jd_agent.py — Reads the Job Description. Sends to Gemini to extract: job title, experience level (junior/mid/senior), and required skills.</w:t>
       </w:r>
     </w:p>
     <w:p>
@@ -1053,18 +896,43 @@
         <w:pStyle w:val="ListBullet"/>
       </w:pPr>
       <w:r>
-        <w:t>question_agent.py — Creates interview questions. Three functions: generate_interview_questions() creates the full structured question set from skill topics. generate_position_question() creates one question on the fly during the live interview. build_interview_flow() flattens the structured set into a simple ordered list.</w:t>
+        <w:t>question_agent.py — Creates interview questions. Takes the skill gaps and generates: opening questions, technical questions, behavioral questions (STAR), and closing questions.</w:t>
       </w:r>
     </w:p>
     <w:p>
-      <w:pPr>
-        <w:pStyle w:val="Heading3"/>
-      </w:pPr>
       <w:r>
         <w:rPr>
-          <w:color w:val="1A56DB"/>
+          <w:b w:val="0"/>
+          <w:i/>
         </w:rPr>
-        <w:t>core/evaluator/ (folder — 1 file)</w:t>
+        <w:t>evaluator/ folder (1 file):</w:t>
+      </w:r>
+    </w:p>
+    <w:p>
+      <w:r>
+        <w:rPr>
+          <w:b w:val="0"/>
+          <w:i w:val="0"/>
+        </w:rPr>
+        <w:t>The scoring engine. For each answer the candidate gives, Gemini first creates an "ideal answer," then compares the candidate's answer against it. It scores on 4 criteria: technical accuracy, completeness, clarity, and relevance. It does this twice with criteria in different order to be fair, then averages the two scores.</w:t>
+      </w:r>
+    </w:p>
+    <w:p>
+      <w:r>
+        <w:rPr>
+          <w:b w:val="0"/>
+          <w:i/>
+        </w:rPr>
+        <w:t>graph/ folder (4 files):</w:t>
+      </w:r>
+    </w:p>
+    <w:p>
+      <w:r>
+        <w:rPr>
+          <w:b w:val="0"/>
+          <w:i w:val="0"/>
+        </w:rPr>
+        <w:t>This folder manages the skill database and tracks progress.</w:t>
       </w:r>
     </w:p>
     <w:p>
@@ -1072,18 +940,7 @@
         <w:pStyle w:val="ListBullet"/>
       </w:pPr>
       <w:r>
-        <w:t>evaluator.py — The scoring engine. For each answer: generates an "ideal" reference answer using Gemini, then compares the real answer against it. Scores on 4 criteria each worth 25 points: technical accuracy, completeness, clarity, relevance. To be fair, it runs the evaluation twice with criteria in different order and averages the scores. Answers shorter than 10 words automatically score 0. Returns score (0-100), verdict, and feedback.</w:t>
-      </w:r>
-    </w:p>
-    <w:p>
-      <w:pPr>
-        <w:pStyle w:val="Heading3"/>
-      </w:pPr>
-      <w:r>
-        <w:rPr>
-          <w:color w:val="1A56DB"/>
-        </w:rPr>
-        <w:t>core/graph/ (folder — 4 files)</w:t>
+        <w:t>skill_graph.py — Builds a map of 1,201 IT skills from ESCO data. Adds modern skills like Python and React that aren't in the standard database. Can match skill names even if spelled slightly differently.</w:t>
       </w:r>
     </w:p>
     <w:p>
@@ -1091,7 +948,7 @@
         <w:pStyle w:val="ListBullet"/>
       </w:pPr>
       <w:r>
-        <w:t>skill_graph.py — Builds a skill map from ESCO taxonomy CSVs (1,201 IT skills) using NetworkX. Adds modern tech manually (Python, React, Docker, etc.). Can fuzzy-match skill names. The gap_analysis() function finds what skills the candidate is missing.</w:t>
+        <w:t>state.py — Tracks each skill during the interview. Stores: status (pending/verified/gap), scores, how many questions asked, best score.</w:t>
       </w:r>
     </w:p>
     <w:p>
@@ -1099,7 +956,7 @@
         <w:pStyle w:val="ListBullet"/>
       </w:pPr>
       <w:r>
-        <w:t>state.py — Tracks progress during the interview. Each skill has a node that stores: status (pending/verified/gap), scores, questions asked, best score. record_answer() updates status based on score. InterviewState tracks all skills together.</w:t>
+        <w:t>traversal.py — Decides which skill to ask about next. Always picks the lowest-scored skill first. Also decides if a weak answer needs a follow-up question.</w:t>
       </w:r>
     </w:p>
     <w:p>
@@ -1107,70 +964,59 @@
         <w:pStyle w:val="ListBullet"/>
       </w:pPr>
       <w:r>
-        <w:t>traversal.py — Decides which skill to ask next. Picks the lowest-scored skill first, prioritizing high-priority skills, avoiding repeats. decide_follow_up() checks if a weak answer needs a follow-up question.</w:t>
-      </w:r>
-    </w:p>
-    <w:p>
-      <w:pPr>
-        <w:pStyle w:val="ListBullet"/>
-      </w:pPr>
-      <w:r>
-        <w:t>visualize.py — Draws charts showing candidate skills, job requirements, skill gaps, and the full skill map. These appear in the Streamlit UI.</w:t>
-      </w:r>
-    </w:p>
-    <w:p>
-      <w:pPr>
-        <w:pStyle w:val="Heading3"/>
-      </w:pPr>
-      <w:r>
-        <w:rPr>
-          <w:color w:val="1A56DB"/>
-        </w:rPr>
-        <w:t>core/pipeline/ (folder — 1 file)</w:t>
-      </w:r>
-    </w:p>
-    <w:p>
-      <w:pPr>
-        <w:pStyle w:val="ListBullet"/>
-      </w:pPr>
-      <w:r>
-        <w:t>interview_loop.py — The InterviewLoop class runs the interview cycle: get_next_question() picks the next skill and generates a fresh question. submit_answer() scores the answer and updates state. Keeps going until all skills verified or max questions reached (3). get_summary() collects everything for the final report.</w:t>
-      </w:r>
-    </w:p>
-    <w:p>
-      <w:pPr>
-        <w:pStyle w:val="Heading3"/>
-      </w:pPr>
-      <w:r>
-        <w:rPr>
-          <w:color w:val="1A56DB"/>
-        </w:rPr>
-        <w:t>core/report/ (folder — 1 file)</w:t>
-      </w:r>
-    </w:p>
-    <w:p>
-      <w:pPr>
-        <w:pStyle w:val="ListBullet"/>
-      </w:pPr>
-      <w:r>
-        <w:t>generator.py — Takes the InterviewLoop data, computes overall score, assigns verdict (Strong Hire ≥70, Weak Hire 40-69, No Hire &lt;40), lists strengths and gaps, and builds the complete report dictionary with answer log.</w:t>
-      </w:r>
-    </w:p>
-    <w:p>
-      <w:pPr>
-        <w:pStyle w:val="Heading3"/>
-      </w:pPr>
-      <w:r>
-        <w:rPr>
-          <w:color w:val="1A56DB"/>
-        </w:rPr>
-        <w:t>core/livekit/ (folder — 4 files + client.html + livekit.yaml)</w:t>
+        <w:t>visualize.py — Creates charts showing the candidate's skills, job requirements, gaps, and full skill map. These appear in the web app.</w:t>
       </w:r>
     </w:p>
     <w:p>
       <w:r>
         <w:rPr>
           <w:b w:val="0"/>
+          <w:i/>
+        </w:rPr>
+        <w:t>pipeline/ folder (1 file):</w:t>
+      </w:r>
+    </w:p>
+    <w:p>
+      <w:r>
+        <w:rPr>
+          <w:b w:val="0"/>
+          <w:i w:val="0"/>
+        </w:rPr>
+        <w:t>This is the "brain" that runs the text interview. The interview_loop.py file runs the cycle: pick next skill → generate question → show question → collect answer → score it → update progress → repeat. Stops after 3 questions or all skills tested.</w:t>
+      </w:r>
+    </w:p>
+    <w:p>
+      <w:r>
+        <w:rPr>
+          <w:b w:val="0"/>
+          <w:i/>
+        </w:rPr>
+        <w:t>report/ folder (1 file):</w:t>
+      </w:r>
+    </w:p>
+    <w:p>
+      <w:r>
+        <w:rPr>
+          <w:b w:val="0"/>
+          <w:i w:val="0"/>
+        </w:rPr>
+        <w:t>Creates the final report. Takes all answers and scores, calculates overall average, assigns verdict (Strong Hire ≥70, Weak Hire 40-69, No Hire &lt;40), lists strengths and gaps, and builds the complete report with answer log.</w:t>
+      </w:r>
+    </w:p>
+    <w:p>
+      <w:r>
+        <w:rPr>
+          <w:b w:val="0"/>
+          <w:i/>
+        </w:rPr>
+        <w:t>livekit/ folder (5 files):</w:t>
+      </w:r>
+    </w:p>
+    <w:p>
+      <w:r>
+        <w:rPr>
+          <w:b w:val="0"/>
+          <w:i w:val="0"/>
         </w:rPr>
         <w:t>This folder handles the voice interview mode.</w:t>
       </w:r>
@@ -1180,7 +1026,7 @@
         <w:pStyle w:val="ListBullet"/>
       </w:pPr>
       <w:r>
-        <w:t>run_agent.py — The AI voice agent. Connects to LiveKit room, uses Gemini dynamically to conduct the full interview: warm greeting with position name, ready check, off-topic handling (3 warnings), auto-end after all questions, full conversation transcript saved. ElevenLabs Flash v2.5 for TTS (streaming_latency=4), Deepgram Nova-3 for STT. Turn handling configured: interruptions OFF, endpointing delay 1.5-4s.</w:t>
+        <w:t>run_agent.py — The AI voice agent. Connects to LiveKit, uses Gemini to run the interview: greeting, ready check, questions, off-topic warnings, auto-end. Speaks via ElevenLabs, listens via Deepgram. Saves transcript at the end.</w:t>
       </w:r>
     </w:p>
     <w:p>
@@ -1188,7 +1034,7 @@
         <w:pStyle w:val="ListBullet"/>
       </w:pPr>
       <w:r>
-        <w:t>whisper_server.py — Tiny web server (port 18765). Serves the voice interview web page (client.html) at /livekit. Generates LiveKit tokens at /token. Saves transcripts at /save_transcript. Runs in a background thread.</w:t>
+        <w:t>whisper_server.py — A tiny web server (port 18765). Serves the voice interview web page (client.html). Generates access tokens so the browser can connect to LiveKit.</w:t>
       </w:r>
     </w:p>
     <w:p>
@@ -1196,7 +1042,7 @@
         <w:pStyle w:val="ListBullet"/>
       </w:pPr>
       <w:r>
-        <w:t>launcher.py — Manages the LiveKit server. start_livekit_server() checks for the binary in temp folder, downloads if missing? No — you must download it once. Then it launches the server and waits for it to be ready. cleanup() shuts everything down on exit.</w:t>
+        <w:t>launcher.py — Starts and manages the LiveKit server. Checks if the server binary exists, starts it, and waits for it to be ready. Shuts everything down cleanly on exit.</w:t>
       </w:r>
     </w:p>
     <w:p>
@@ -1204,7 +1050,7 @@
         <w:pStyle w:val="ListBullet"/>
       </w:pPr>
       <w:r>
-        <w:t>client.html — The web page the candidate sees during voice interview. Shows webcam feed, real-time transcription, chat conversation log, and current question. Has a "Start Interview" button (no auto-connect).</w:t>
+        <w:t>client.html — The web page the candidate sees during voice interview. Shows: webcam feed, real-time transcription, chat log, current question. Has a "Start Interview" button that requests camera and microphone access.</w:t>
       </w:r>
     </w:p>
     <w:p>
@@ -1212,7 +1058,25 @@
         <w:pStyle w:val="ListBullet"/>
       </w:pPr>
       <w:r>
-        <w:t>livekit.yaml — Configuration for the LiveKit server: ports, API keys, logging.</w:t>
+        <w:t>livekit.yaml — Configuration file for the LiveKit server. Defines ports, API keys, and logging settings.</w:t>
+      </w:r>
+    </w:p>
+    <w:p>
+      <w:r>
+        <w:rPr>
+          <w:b/>
+          <w:i w:val="0"/>
+        </w:rPr>
+        <w:t>Root File:</w:t>
+      </w:r>
+    </w:p>
+    <w:p>
+      <w:r>
+        <w:rPr>
+          <w:b w:val="0"/>
+          <w:i w:val="0"/>
+        </w:rPr>
+        <w:t>app.py — The main application. Run this with "streamlit run app.py" to start everything. It shows the 6-step process in a web browser.</w:t>
       </w:r>
     </w:p>
     <w:p>
@@ -1223,23 +1087,263 @@
         <w:rPr>
           <w:color w:val="1A56DB"/>
         </w:rPr>
-        <w:t>8. Summary</w:t>
+        <w:t>8. Glossary — Hard Words Explained Simply</w:t>
+      </w:r>
+    </w:p>
+    <w:p/>
+    <w:p>
+      <w:r>
+        <w:rPr>
+          <w:b/>
+          <w:i w:val="0"/>
+        </w:rPr>
+        <w:t>API Key</w:t>
       </w:r>
     </w:p>
     <w:p>
       <w:r>
         <w:rPr>
           <w:b w:val="0"/>
+          <w:i w:val="0"/>
         </w:rPr>
-        <w:t>InterviewAI takes a Resume + Job Description → parses them → builds a skill graph → finds gaps → generates interview questions → conducts the interview (text or voice) → scores each answer using AI → produces a final report with verdict and recommendations.</w:t>
+        <w:t>A secret password that lets the system use a service like Gemini, Deepgram, or ElevenLabs. You get these from the service's website.</w:t>
+      </w:r>
+    </w:p>
+    <w:p>
+      <w:r>
+        <w:rPr>
+          <w:b/>
+          <w:i w:val="0"/>
+        </w:rPr>
+        <w:t>ESCO Taxonomy</w:t>
       </w:r>
     </w:p>
     <w:p>
       <w:r>
         <w:rPr>
           <w:b w:val="0"/>
+          <w:i w:val="0"/>
         </w:rPr>
-        <w:t>Three API keys power everything:</w:t>
+        <w:t>A big list of 1,201 IT skills created by the European Union. The system uses this as a dictionary to understand what skills exist and how they relate to each other.</w:t>
+      </w:r>
+    </w:p>
+    <w:p>
+      <w:r>
+        <w:rPr>
+          <w:b/>
+          <w:i w:val="0"/>
+        </w:rPr>
+        <w:t>Gemini</w:t>
+      </w:r>
+    </w:p>
+    <w:p>
+      <w:r>
+        <w:rPr>
+          <w:b w:val="0"/>
+          <w:i w:val="0"/>
+        </w:rPr>
+        <w:t>Google's AI (like ChatGPT). This is the "brain" that reads, thinks, and makes decisions.</w:t>
+      </w:r>
+    </w:p>
+    <w:p>
+      <w:r>
+        <w:rPr>
+          <w:b/>
+          <w:i w:val="0"/>
+        </w:rPr>
+        <w:t>STT (Speech-to-Text)</w:t>
+      </w:r>
+    </w:p>
+    <w:p>
+      <w:r>
+        <w:rPr>
+          <w:b w:val="0"/>
+          <w:i w:val="0"/>
+        </w:rPr>
+        <w:t>Technology that listens to spoken words and writes them down as text. Deepgram does this.</w:t>
+      </w:r>
+    </w:p>
+    <w:p>
+      <w:r>
+        <w:rPr>
+          <w:b/>
+          <w:i w:val="0"/>
+        </w:rPr>
+        <w:t>TTS (Text-to-Speech)</w:t>
+      </w:r>
+    </w:p>
+    <w:p>
+      <w:r>
+        <w:rPr>
+          <w:b w:val="0"/>
+          <w:i w:val="0"/>
+        </w:rPr>
+        <w:t>Technology that reads text out loud in a human-like voice. ElevenLabs does this.</w:t>
+      </w:r>
+    </w:p>
+    <w:p>
+      <w:r>
+        <w:rPr>
+          <w:b/>
+          <w:i w:val="0"/>
+        </w:rPr>
+        <w:t>LiveKit</w:t>
+      </w:r>
+    </w:p>
+    <w:p>
+      <w:r>
+        <w:rPr>
+          <w:b w:val="0"/>
+          <w:i w:val="0"/>
+        </w:rPr>
+        <w:t>An open-source platform for real-time voice/video (like Zoom). Runs on your computer.</w:t>
+      </w:r>
+    </w:p>
+    <w:p>
+      <w:r>
+        <w:rPr>
+          <w:b/>
+          <w:i w:val="0"/>
+        </w:rPr>
+        <w:t>WebRTC</w:t>
+      </w:r>
+    </w:p>
+    <w:p>
+      <w:r>
+        <w:rPr>
+          <w:b w:val="0"/>
+          <w:i w:val="0"/>
+        </w:rPr>
+        <w:t>The technology that lets web browsers do real-time audio/video calls without installing extra software.</w:t>
+      </w:r>
+    </w:p>
+    <w:p>
+      <w:r>
+        <w:rPr>
+          <w:b/>
+          <w:i w:val="0"/>
+        </w:rPr>
+        <w:t>VAD (Voice Activity Detection)</w:t>
+      </w:r>
+    </w:p>
+    <w:p>
+      <w:r>
+        <w:rPr>
+          <w:b w:val="0"/>
+          <w:i w:val="0"/>
+        </w:rPr>
+        <w:t>Technology that detects when a person is speaking vs when they are silent. Helps the system know when to listen and when to respond.</w:t>
+      </w:r>
+    </w:p>
+    <w:p>
+      <w:r>
+        <w:rPr>
+          <w:b/>
+          <w:i w:val="0"/>
+        </w:rPr>
+        <w:t>Endpointing</w:t>
+      </w:r>
+    </w:p>
+    <w:p>
+      <w:r>
+        <w:rPr>
+          <w:b w:val="0"/>
+          <w:i w:val="0"/>
+        </w:rPr>
+        <w:t>Deciding when the person has finished speaking. If they pause for 2 seconds, is it a thinking pause or are they done? The system waits 1.5-4 seconds to be sure.</w:t>
+      </w:r>
+    </w:p>
+    <w:p>
+      <w:r>
+        <w:rPr>
+          <w:b/>
+          <w:i w:val="0"/>
+        </w:rPr>
+        <w:t>JSON</w:t>
+      </w:r>
+    </w:p>
+    <w:p>
+      <w:r>
+        <w:rPr>
+          <w:b w:val="0"/>
+          <w:i w:val="0"/>
+        </w:rPr>
+        <w:t>A way to organize data so computers can read it. Like a structured form with labeled fields.</w:t>
+      </w:r>
+    </w:p>
+    <w:p>
+      <w:r>
+        <w:rPr>
+          <w:b/>
+          <w:i w:val="0"/>
+        </w:rPr>
+        <w:t>NetworkX</w:t>
+      </w:r>
+    </w:p>
+    <w:p>
+      <w:r>
+        <w:rPr>
+          <w:b w:val="0"/>
+          <w:i w:val="0"/>
+        </w:rPr>
+        <w:t>A Python library that creates and manages graphs — maps of connected things (like skills linked to related skills).</w:t>
+      </w:r>
+    </w:p>
+    <w:p>
+      <w:r>
+        <w:rPr>
+          <w:b/>
+          <w:i w:val="0"/>
+        </w:rPr>
+        <w:t>Star Method</w:t>
+      </w:r>
+    </w:p>
+    <w:p>
+      <w:r>
+        <w:rPr>
+          <w:b w:val="0"/>
+          <w:i w:val="0"/>
+        </w:rPr>
+        <w:t>A way to answer behavioral questions: describe the Situation, the Task, what Action you took, and the Result.</w:t>
+      </w:r>
+    </w:p>
+    <w:p>
+      <w:r>
+        <w:rPr>
+          <w:b/>
+          <w:i w:val="0"/>
+        </w:rPr>
+        <w:t>Streamlit</w:t>
+      </w:r>
+    </w:p>
+    <w:p>
+      <w:r>
+        <w:rPr>
+          <w:b w:val="0"/>
+          <w:i w:val="0"/>
+        </w:rPr>
+        <w:t>A tool that turns Python code into a web page. The whole app runs on Streamlit.</w:t>
+      </w:r>
+    </w:p>
+    <w:p>
+      <w:pPr>
+        <w:pStyle w:val="Heading1"/>
+      </w:pPr>
+      <w:r>
+        <w:rPr>
+          <w:color w:val="1A56DB"/>
+        </w:rPr>
+        <w:t>9. Quick Reference Card</w:t>
+      </w:r>
+    </w:p>
+    <w:p/>
+    <w:p>
+      <w:r>
+        <w:rPr>
+          <w:b/>
+          <w:i w:val="0"/>
+        </w:rPr>
+        <w:t>Where is everything?</w:t>
       </w:r>
     </w:p>
     <w:p>
@@ -1247,7 +1351,7 @@
         <w:pStyle w:val="ListBullet"/>
       </w:pPr>
       <w:r>
-        <w:t>Gemini — reads CV/JD, generates questions, evaluates answers, and runs the voice agent conversation dynamically.</w:t>
+        <w:t>Main app: InterviewAI/app.py</w:t>
       </w:r>
     </w:p>
     <w:p>
@@ -1255,7 +1359,7 @@
         <w:pStyle w:val="ListBullet"/>
       </w:pPr>
       <w:r>
-        <w:t>Deepgram — converts speech to text using Nova-3 model (voice mode only).</w:t>
+        <w:t>Settings: InterviewAI/core/config.py</w:t>
       </w:r>
     </w:p>
     <w:p>
@@ -1263,23 +1367,350 @@
         <w:pStyle w:val="ListBullet"/>
       </w:pPr>
       <w:r>
-        <w:t>ElevenLabs — converts text to speech using Flash v2.5 model with low-latency mode (voice mode only).</w:t>
+        <w:t>AI communication: InterviewAI/core/llm.py</w:t>
+      </w:r>
+    </w:p>
+    <w:p>
+      <w:pPr>
+        <w:pStyle w:val="ListBullet"/>
+      </w:pPr>
+      <w:r>
+        <w:t>CV parser: InterviewAI/core/agents/cv_agent.py</w:t>
+      </w:r>
+    </w:p>
+    <w:p>
+      <w:pPr>
+        <w:pStyle w:val="ListBullet"/>
+      </w:pPr>
+      <w:r>
+        <w:t>JD parser: InterviewAI/core/agents/jd_agent.py</w:t>
+      </w:r>
+    </w:p>
+    <w:p>
+      <w:pPr>
+        <w:pStyle w:val="ListBullet"/>
+      </w:pPr>
+      <w:r>
+        <w:t>Question generator: InterviewAI/core/agents/question_agent.py</w:t>
+      </w:r>
+    </w:p>
+    <w:p>
+      <w:pPr>
+        <w:pStyle w:val="ListBullet"/>
+      </w:pPr>
+      <w:r>
+        <w:t>Answer scorer: InterviewAI/core/evaluator/evaluator.py</w:t>
+      </w:r>
+    </w:p>
+    <w:p>
+      <w:pPr>
+        <w:pStyle w:val="ListBullet"/>
+      </w:pPr>
+      <w:r>
+        <w:t>Skill graph: InterviewAI/core/graph/skill_graph.py</w:t>
+      </w:r>
+    </w:p>
+    <w:p>
+      <w:pPr>
+        <w:pStyle w:val="ListBullet"/>
+      </w:pPr>
+      <w:r>
+        <w:t>State tracker: InterviewAI/core/graph/state.py</w:t>
+      </w:r>
+    </w:p>
+    <w:p>
+      <w:pPr>
+        <w:pStyle w:val="ListBullet"/>
+      </w:pPr>
+      <w:r>
+        <w:t>Next question picker: InterviewAI/core/graph/traversal.py</w:t>
+      </w:r>
+    </w:p>
+    <w:p>
+      <w:pPr>
+        <w:pStyle w:val="ListBullet"/>
+      </w:pPr>
+      <w:r>
+        <w:t>Charts: InterviewAI/core/graph/visualize.py</w:t>
+      </w:r>
+    </w:p>
+    <w:p>
+      <w:pPr>
+        <w:pStyle w:val="ListBullet"/>
+      </w:pPr>
+      <w:r>
+        <w:t>Interview loop: InterviewAI/core/pipeline/interview_loop.py</w:t>
+      </w:r>
+    </w:p>
+    <w:p>
+      <w:pPr>
+        <w:pStyle w:val="ListBullet"/>
+      </w:pPr>
+      <w:r>
+        <w:t>Report generator: InterviewAI/core/report/generator.py</w:t>
+      </w:r>
+    </w:p>
+    <w:p>
+      <w:pPr>
+        <w:pStyle w:val="ListBullet"/>
+      </w:pPr>
+      <w:r>
+        <w:t>Voice agent: InterviewAI/core/livekit/run_agent.py</w:t>
+      </w:r>
+    </w:p>
+    <w:p>
+      <w:pPr>
+        <w:pStyle w:val="ListBullet"/>
+      </w:pPr>
+      <w:r>
+        <w:t>Web server: InterviewAI/core/livekit/whisper_server.py</w:t>
+      </w:r>
+    </w:p>
+    <w:p>
+      <w:pPr>
+        <w:pStyle w:val="ListBullet"/>
+      </w:pPr>
+      <w:r>
+        <w:t>Server launcher: InterviewAI/core/livekit/launcher.py</w:t>
+      </w:r>
+    </w:p>
+    <w:p>
+      <w:pPr>
+        <w:pStyle w:val="ListBullet"/>
+      </w:pPr>
+      <w:r>
+        <w:t>Voice UI page: InterviewAI/core/livekit/client.html</w:t>
+      </w:r>
+    </w:p>
+    <w:p>
+      <w:pPr>
+        <w:pStyle w:val="ListBullet"/>
+      </w:pPr>
+      <w:r>
+        <w:t>LiveKit config: InterviewAI/core/livekit/livekit.yaml</w:t>
+      </w:r>
+    </w:p>
+    <w:p/>
+    <w:p>
+      <w:r>
+        <w:rPr>
+          <w:b/>
+          <w:i w:val="0"/>
+        </w:rPr>
+        <w:t>API Keys needed (in .env file):</w:t>
+      </w:r>
+    </w:p>
+    <w:p>
+      <w:pPr>
+        <w:pStyle w:val="ListBullet"/>
+      </w:pPr>
+      <w:r>
+        <w:t>GEMINI_API_KEY — AI brain (required for everything)</w:t>
+      </w:r>
+    </w:p>
+    <w:p>
+      <w:pPr>
+        <w:pStyle w:val="ListBullet"/>
+      </w:pPr>
+      <w:r>
+        <w:t>DEEPGRAM_API_KEY — Speech-to-text (required for voice mode)</w:t>
+      </w:r>
+    </w:p>
+    <w:p>
+      <w:pPr>
+        <w:pStyle w:val="ListBullet"/>
+      </w:pPr>
+      <w:r>
+        <w:t>ELEVENLABS_API_KEY — Text-to-speech (required for voice mode)</w:t>
+      </w:r>
+    </w:p>
+    <w:p/>
+    <w:p>
+      <w:r>
+        <w:rPr>
+          <w:b/>
+          <w:i w:val="0"/>
+        </w:rPr>
+        <w:t>How to run:</w:t>
+      </w:r>
+    </w:p>
+    <w:p>
+      <w:pPr>
+        <w:pStyle w:val="ListBullet"/>
+      </w:pPr>
+      <w:r>
+        <w:t>Text Mode: streamlit run InterviewAI/app.py</w:t>
+      </w:r>
+    </w:p>
+    <w:p>
+      <w:pPr>
+        <w:pStyle w:val="ListBullet"/>
+      </w:pPr>
+      <w:r>
+        <w:t>Voice Mode: python InterviewAI/core/livekit/launcher.py (then open the URL)</w:t>
+      </w:r>
+    </w:p>
+    <w:p>
+      <w:pPr>
+        <w:pStyle w:val="ListBullet"/>
+      </w:pPr>
+      <w:r>
+        <w:t>Docker: docker-compose up (from project root)</w:t>
+      </w:r>
+    </w:p>
+    <w:p/>
+    <w:p>
+      <w:r>
+        <w:rPr>
+          <w:b/>
+          <w:i w:val="0"/>
+        </w:rPr>
+        <w:t>Scoring thresholds:</w:t>
+      </w:r>
+    </w:p>
+    <w:p>
+      <w:pPr>
+        <w:pStyle w:val="ListBullet"/>
+      </w:pPr>
+      <w:r>
+        <w:t>Strong Hire: score ≥ 70 out of 100</w:t>
+      </w:r>
+    </w:p>
+    <w:p>
+      <w:pPr>
+        <w:pStyle w:val="ListBullet"/>
+      </w:pPr>
+      <w:r>
+        <w:t>Weak Hire: score 40 to 69</w:t>
+      </w:r>
+    </w:p>
+    <w:p>
+      <w:pPr>
+        <w:pStyle w:val="ListBullet"/>
+      </w:pPr>
+      <w:r>
+        <w:t>No Hire: score &lt; 40</w:t>
+      </w:r>
+    </w:p>
+    <w:p/>
+    <w:p>
+      <w:r>
+        <w:rPr>
+          <w:b/>
+          <w:i w:val="0"/>
+        </w:rPr>
+        <w:t>Question limits:</w:t>
+      </w:r>
+    </w:p>
+    <w:p>
+      <w:pPr>
+        <w:pStyle w:val="ListBullet"/>
+      </w:pPr>
+      <w:r>
+        <w:t>Text Mode: maximum 3 questions</w:t>
+      </w:r>
+    </w:p>
+    <w:p>
+      <w:pPr>
+        <w:pStyle w:val="ListBullet"/>
+      </w:pPr>
+      <w:r>
+        <w:t>LiveKit Mode: maximum 5 questions</w:t>
+      </w:r>
+    </w:p>
+    <w:p>
+      <w:pPr>
+        <w:pStyle w:val="Heading1"/>
+      </w:pPr>
+      <w:r>
+        <w:rPr>
+          <w:color w:val="1A56DB"/>
+        </w:rPr>
+        <w:t>10. How to Make a Video Script from This Document</w:t>
       </w:r>
     </w:p>
     <w:p>
       <w:r>
         <w:rPr>
           <w:b w:val="0"/>
+          <w:i/>
         </w:rPr>
-        <w:t>All the logic lives inside core/. Seven modules handle: settings (config.py), AI communication (llm.py), input parsing (agents/), answer scoring (evaluator/), skill knowledge (graph/), interview orchestration (pipeline/), report generation (report/), and voice interviews (livekit/).</w:t>
+        <w:t>Option 1: Give this whole document to ChatGPT or Claude and ask:</w:t>
       </w:r>
     </w:p>
     <w:p>
       <w:r>
         <w:rPr>
           <w:b w:val="0"/>
+          <w:i w:val="0"/>
         </w:rPr>
-        <w:t>In Text Mode, Gemini scores each answer with two evaluations (averaged). In LiveKit Mode, Gemini runs the entire conversation dynamically — greeting, readiness check, questions, off-topic detection, and auto-end — with ElevenLabs for speech output and Deepgram for speech input.</w:t>
+        <w:t>"Create a 5-minute video script explaining the InterviewAI project. Start with what problem it solves, then walk through the 6 steps, then show the two interview modes. Use simple language for a non-technical audience."</w:t>
+      </w:r>
+    </w:p>
+    <w:p/>
+    <w:p>
+      <w:r>
+        <w:rPr>
+          <w:b/>
+          <w:i w:val="0"/>
+        </w:rPr>
+        <w:t>Option 2: Key points to cover in any presentation:</w:t>
+      </w:r>
+    </w:p>
+    <w:p>
+      <w:pPr>
+        <w:pStyle w:val="ListBullet"/>
+      </w:pPr>
+      <w:r>
+        <w:t>Problem: Technical interviews are time-consuming and inconsistent.</w:t>
+      </w:r>
+    </w:p>
+    <w:p>
+      <w:pPr>
+        <w:pStyle w:val="ListBullet"/>
+      </w:pPr>
+      <w:r>
+        <w:t>Solution: AI that conducts interviews automatically and objectively.</w:t>
+      </w:r>
+    </w:p>
+    <w:p>
+      <w:pPr>
+        <w:pStyle w:val="ListBullet"/>
+      </w:pPr>
+      <w:r>
+        <w:t>Input: Just a CV + Job Description.</w:t>
+      </w:r>
+    </w:p>
+    <w:p>
+      <w:pPr>
+        <w:pStyle w:val="ListBullet"/>
+      </w:pPr>
+      <w:r>
+        <w:t>Process: 6 steps from upload to final report.</w:t>
+      </w:r>
+    </w:p>
+    <w:p>
+      <w:pPr>
+        <w:pStyle w:val="ListBullet"/>
+      </w:pPr>
+      <w:r>
+        <w:t>Two modes: Text (simple) and Voice (like real interview).</w:t>
+      </w:r>
+    </w:p>
+    <w:p>
+      <w:pPr>
+        <w:pStyle w:val="ListBullet"/>
+      </w:pPr>
+      <w:r>
+        <w:t>Output: Full report with score, strengths, gaps, and verdict.</w:t>
+      </w:r>
+    </w:p>
+    <w:p>
+      <w:pPr>
+        <w:pStyle w:val="ListBullet"/>
+      </w:pPr>
+      <w:r>
+        <w:t>Tech: Gemini (brain), LiveKit (video/voice), Deepgram (listening), ElevenLabs (speaking).</w:t>
       </w:r>
     </w:p>
     <w:sectPr>
@@ -1656,7 +2087,7 @@
     <w:qFormat/>
     <w:rsid w:val="00FC693F"/>
     <w:pPr>
-      <w:spacing w:after="80"/>
+      <w:spacing w:after="120"/>
     </w:pPr>
     <w:rPr>
       <w:rFonts w:ascii="Calibri" w:hAnsi="Calibri"/>

</xml_diff>

<commit_message>
Rewrite PROJECT_GUIDE.docx — supervisor-ready, simple wording, verified accurate
</commit_message>
<xml_diff>
--- a/InterviewAI/PROJECT_GUIDE.docx
+++ b/InterviewAI/PROJECT_GUIDE.docx
@@ -19,7 +19,7 @@
           <w:b w:val="0"/>
           <w:i w:val="0"/>
         </w:rPr>
-        <w:t>Complete Project Guide — Simple Version</w:t>
+        <w:t>Complete Project Guide</w:t>
       </w:r>
     </w:p>
     <w:p>
@@ -28,19 +28,44 @@
           <w:b w:val="0"/>
           <w:i w:val="0"/>
         </w:rPr>
-        <w:t>CMP7200 Individual Masters Project — Birmingham City University</w:t>
+        <w:t>CMP7200 — Individual Masters Project — Birmingham City University</w:t>
       </w:r>
     </w:p>
     <w:p/>
     <w:p>
       <w:r>
         <w:rPr>
-          <w:b w:val="0"/>
+          <w:b/>
           <w:i w:val="0"/>
         </w:rPr>
-        <w:t>Read this document to understand the whole project. You can also give this to ChatGPT or Claude and ask: "Make a 5-minute video script explaining this project."</w:t>
-      </w:r>
-    </w:p>
+        <w:t>Purpose of this document:</w:t>
+      </w:r>
+    </w:p>
+    <w:p>
+      <w:pPr>
+        <w:pStyle w:val="ListBullet"/>
+      </w:pPr>
+      <w:r>
+        <w:t>Understand the entire project from start to finish — in simple words.</w:t>
+      </w:r>
+    </w:p>
+    <w:p>
+      <w:pPr>
+        <w:pStyle w:val="ListBullet"/>
+      </w:pPr>
+      <w:r>
+        <w:t>Explain it clearly to your supervisor during your next meeting.</w:t>
+      </w:r>
+    </w:p>
+    <w:p>
+      <w:pPr>
+        <w:pStyle w:val="ListBullet"/>
+      </w:pPr>
+      <w:r>
+        <w:t>Give it to ChatGPT/Claude and ask: "Turn this into a 5-minute video script."</w:t>
+      </w:r>
+    </w:p>
+    <w:p/>
     <w:p>
       <w:pPr>
         <w:pStyle w:val="Heading1"/>
@@ -49,7 +74,7 @@
         <w:rPr>
           <w:color w:val="1A56DB"/>
         </w:rPr>
-        <w:t>1. What Is This Project? (One Sentence)</w:t>
+        <w:t>1. Project Overview — What Is This?</w:t>
       </w:r>
     </w:p>
     <w:p>
@@ -58,9 +83,10 @@
           <w:b w:val="0"/>
           <w:i/>
         </w:rPr>
-        <w:t>InterviewAI is a smart system that automatically conducts a technical job interview. You upload a CV and a Job Description, and the AI asks relevant questions, scores the answers, and gives a hire/don't hire decision.</w:t>
-      </w:r>
-    </w:p>
+        <w:t>InterviewAI is a computer system that conducts job interviews automatically. Instead of a human asking questions, the AI does it — and then scores the answers to decide if the candidate should be hired.</w:t>
+      </w:r>
+    </w:p>
+    <w:p/>
     <w:p>
       <w:r>
         <w:rPr>
@@ -75,7 +101,7 @@
         <w:pStyle w:val="ListBullet"/>
       </w:pPr>
       <w:r>
-        <w:t>A candidate uploads their CV (their skills and experience).</w:t>
+        <w:t>You upload a candidate's CV (their skills and experience).</w:t>
       </w:r>
     </w:p>
     <w:p>
@@ -83,7 +109,7 @@
         <w:pStyle w:val="ListBullet"/>
       </w:pPr>
       <w:r>
-        <w:t>They also provide a Job Description (what the company needs).</w:t>
+        <w:t>You also paste the Job Description (what skills the job requires).</w:t>
       </w:r>
     </w:p>
     <w:p>
@@ -91,7 +117,7 @@
         <w:pStyle w:val="ListBullet"/>
       </w:pPr>
       <w:r>
-        <w:t>The system reads both and figures out what skills the candidate is missing or weak at.</w:t>
+        <w:t>The AI compares the two and finds what skills the candidate is missing or weak at.</w:t>
       </w:r>
     </w:p>
     <w:p>
@@ -99,7 +125,7 @@
         <w:pStyle w:val="ListBullet"/>
       </w:pPr>
       <w:r>
-        <w:t>It then asks interview questions — either by typing or by voice — to test those weak areas.</w:t>
+        <w:t>The AI asks interview questions — either as text on screen or by voice — to test those weak areas.</w:t>
       </w:r>
     </w:p>
     <w:p>
@@ -107,7 +133,7 @@
         <w:pStyle w:val="ListBullet"/>
       </w:pPr>
       <w:r>
-        <w:t>Each answer gets scored by AI (Google Gemini).</w:t>
+        <w:t>Each answer is scored by Google Gemini (the AI brain).</w:t>
       </w:r>
     </w:p>
     <w:p>
@@ -115,7 +141,17 @@
         <w:pStyle w:val="ListBullet"/>
       </w:pPr>
       <w:r>
-        <w:t>At the end, you get a report: overall score, strengths, gaps, and whether to hire.</w:t>
+        <w:t>At the end, you get a report: score out of 100, strengths, gaps, and a hire/don't hire decision.</w:t>
+      </w:r>
+    </w:p>
+    <w:p/>
+    <w:p>
+      <w:r>
+        <w:rPr>
+          <w:b/>
+          <w:i w:val="0"/>
+        </w:rPr>
+        <w:t>The system runs in a web browser. No coding needed to use it.</w:t>
       </w:r>
     </w:p>
     <w:p>
@@ -126,7 +162,145 @@
         <w:rPr>
           <w:color w:val="1A56DB"/>
         </w:rPr>
-        <w:t>2. Who Should Use This?</w:t>
+        <w:t>2. Project Scope — How Many Components?</w:t>
+      </w:r>
+    </w:p>
+    <w:p>
+      <w:r>
+        <w:rPr>
+          <w:b w:val="0"/>
+          <w:i/>
+        </w:rPr>
+        <w:t>The project has 7 modules (groups of code) plus 2 support files. In total: 18 files across 6 folders.</w:t>
+      </w:r>
+    </w:p>
+    <w:p/>
+    <w:p>
+      <w:r>
+        <w:rPr>
+          <w:b/>
+          <w:i w:val="0"/>
+        </w:rPr>
+        <w:t>2A. The 7 Modules (groups of related code):</w:t>
+      </w:r>
+    </w:p>
+    <w:p>
+      <w:r>
+        <w:rPr>
+          <w:b/>
+        </w:rPr>
+        <w:t xml:space="preserve">1. </w:t>
+      </w:r>
+      <w:r>
+        <w:t>Parsing (2 files) — Reads the CV and Job Description.</w:t>
+      </w:r>
+    </w:p>
+    <w:p>
+      <w:r>
+        <w:rPr>
+          <w:b/>
+        </w:rPr>
+        <w:t xml:space="preserve">2. </w:t>
+      </w:r>
+      <w:r>
+        <w:t>Question Generation (1 file) — Creates interview questions using AI.</w:t>
+      </w:r>
+    </w:p>
+    <w:p>
+      <w:r>
+        <w:rPr>
+          <w:b/>
+        </w:rPr>
+        <w:t xml:space="preserve">3. </w:t>
+      </w:r>
+      <w:r>
+        <w:t>Answer Evaluator (1 file) — Scores each answer against an ideal answer.</w:t>
+      </w:r>
+    </w:p>
+    <w:p>
+      <w:r>
+        <w:rPr>
+          <w:b/>
+        </w:rPr>
+        <w:t xml:space="preserve">4. </w:t>
+      </w:r>
+      <w:r>
+        <w:t>Skill Graph (4 files) — Database of 1,201 IT skills. Finds gaps.</w:t>
+      </w:r>
+    </w:p>
+    <w:p>
+      <w:r>
+        <w:rPr>
+          <w:b/>
+        </w:rPr>
+        <w:t xml:space="preserve">5. </w:t>
+      </w:r>
+      <w:r>
+        <w:t>Interview Pipeline (1 file) — Runs the text-based interview cycle.</w:t>
+      </w:r>
+    </w:p>
+    <w:p>
+      <w:r>
+        <w:rPr>
+          <w:b/>
+        </w:rPr>
+        <w:t xml:space="preserve">6. </w:t>
+      </w:r>
+      <w:r>
+        <w:t>Report Generator (1 file) — Builds the final report with scores.</w:t>
+      </w:r>
+    </w:p>
+    <w:p>
+      <w:r>
+        <w:rPr>
+          <w:b/>
+        </w:rPr>
+        <w:t xml:space="preserve">7. </w:t>
+      </w:r>
+      <w:r>
+        <w:t>Voice Interview System (5 files) — Handles the voice-based interview mode.</w:t>
+      </w:r>
+    </w:p>
+    <w:p/>
+    <w:p>
+      <w:r>
+        <w:rPr>
+          <w:b/>
+          <w:i w:val="0"/>
+        </w:rPr>
+        <w:t>2B. The 2 Support Files:</w:t>
+      </w:r>
+    </w:p>
+    <w:p>
+      <w:r>
+        <w:rPr>
+          <w:b/>
+        </w:rPr>
+        <w:t xml:space="preserve">1. </w:t>
+      </w:r>
+      <w:r>
+        <w:t>config.py — Settings: API keys, scoring thresholds, limits.</w:t>
+      </w:r>
+    </w:p>
+    <w:p>
+      <w:r>
+        <w:rPr>
+          <w:b/>
+        </w:rPr>
+        <w:t xml:space="preserve">2. </w:t>
+      </w:r>
+      <w:r>
+        <w:t>llm.py — Communication: talks to Google Gemini AI.</w:t>
+      </w:r>
+    </w:p>
+    <w:p/>
+    <w:p>
+      <w:r>
+        <w:rPr>
+          <w:b/>
+          <w:i w:val="0"/>
+        </w:rPr>
+        <w:t>2C. The Main App (1 file):</w:t>
       </w:r>
     </w:p>
     <w:p>
@@ -134,31 +308,29 @@
         <w:pStyle w:val="ListBullet"/>
       </w:pPr>
       <w:r>
-        <w:t>HR teams — to automatically screen candidates before a real interview.</w:t>
-      </w:r>
-    </w:p>
-    <w:p>
-      <w:pPr>
-        <w:pStyle w:val="ListBullet"/>
-      </w:pPr>
-      <w:r>
-        <w:t>Recruiters — to test technical skills at scale.</w:t>
-      </w:r>
-    </w:p>
-    <w:p>
-      <w:pPr>
-        <w:pStyle w:val="ListBullet"/>
-      </w:pPr>
-      <w:r>
-        <w:t>Students — to practice interviews and get feedback.</w:t>
-      </w:r>
-    </w:p>
-    <w:p>
-      <w:pPr>
-        <w:pStyle w:val="ListBullet"/>
-      </w:pPr>
-      <w:r>
-        <w:t>Managers — to assess candidates objectively without bias.</w:t>
+        <w:t>app.py — The web application. Run this to start everything.</w:t>
+      </w:r>
+    </w:p>
+    <w:p/>
+    <w:p>
+      <w:r>
+        <w:rPr>
+          <w:b/>
+          <w:i w:val="0"/>
+        </w:rPr>
+        <w:t>Total: 18 files organized in 6 folders, plus the main app.</w:t>
+      </w:r>
+    </w:p>
+    <w:p/>
+    <w:p>
+      <w:pPr>
+        <w:pStyle w:val="Heading1"/>
+      </w:pPr>
+      <w:r>
+        <w:rPr>
+          <w:color w:val="1A56DB"/>
+        </w:rPr>
+        <w:t>3. What Do You Need to Use It?</w:t>
       </w:r>
     </w:p>
     <w:p>
@@ -167,7 +339,65 @@
           <w:b w:val="0"/>
           <w:i w:val="0"/>
         </w:rPr>
-        <w:t>You do NOT need any coding knowledge. Everything runs in a web browser.</w:t>
+        <w:t>Three API keys (like passwords for AI services):</w:t>
+      </w:r>
+    </w:p>
+    <w:p>
+      <w:pPr>
+        <w:pStyle w:val="ListBullet"/>
+      </w:pPr>
+      <w:r>
+        <w:t>GEMINI_API_KEY — The AI brain. Used for everything: reading CV, making questions, scoring answers, running the voice conversation. (Google Gemini 2.5 Flash)</w:t>
+      </w:r>
+    </w:p>
+    <w:p>
+      <w:pPr>
+        <w:pStyle w:val="ListBullet"/>
+      </w:pPr>
+      <w:r>
+        <w:t>DEEPGRAM_API_KEY — For voice mode. Converts spoken words into text. Like super-accurate captions. (Deepgram Nova-3 model)</w:t>
+      </w:r>
+    </w:p>
+    <w:p>
+      <w:pPr>
+        <w:pStyle w:val="ListBullet"/>
+      </w:pPr>
+      <w:r>
+        <w:t>ELEVENLABS_API_KEY — For voice mode. Converts text into spoken words. Makes the AI sound human. (ElevenLabs Flash v2.5 model)</w:t>
+      </w:r>
+    </w:p>
+    <w:p/>
+    <w:p>
+      <w:r>
+        <w:rPr>
+          <w:b w:val="0"/>
+          <w:i w:val="0"/>
+        </w:rPr>
+        <w:t>You also need:</w:t>
+      </w:r>
+    </w:p>
+    <w:p>
+      <w:pPr>
+        <w:pStyle w:val="ListBullet"/>
+      </w:pPr>
+      <w:r>
+        <w:t>Python 3.11 installed on your computer.</w:t>
+      </w:r>
+    </w:p>
+    <w:p>
+      <w:pPr>
+        <w:pStyle w:val="ListBullet"/>
+      </w:pPr>
+      <w:r>
+        <w:t>The LiveKit server binary — download once from github.com/livekit/livekit/releases. The system finds it automatically in your temp folder.</w:t>
+      </w:r>
+    </w:p>
+    <w:p>
+      <w:pPr>
+        <w:pStyle w:val="ListBullet"/>
+      </w:pPr>
+      <w:r>
+        <w:t>Internet connection — the system calls Google Gemini, Deepgram, and ElevenLabs over the internet.</w:t>
       </w:r>
     </w:p>
     <w:p>
@@ -178,40 +408,26 @@
         <w:rPr>
           <w:color w:val="1A56DB"/>
         </w:rPr>
-        <w:t>3. What Do You Need to Run It?</w:t>
-      </w:r>
-    </w:p>
+        <w:t>4. Data Flow — How Information Moves Through the System</w:t>
+      </w:r>
+    </w:p>
+    <w:p>
+      <w:r>
+        <w:rPr>
+          <w:b w:val="0"/>
+          <w:i/>
+        </w:rPr>
+        <w:t>Imagine water flowing through pipes. Here is how the data flows from start to finish:</w:t>
+      </w:r>
+    </w:p>
+    <w:p/>
     <w:p>
       <w:r>
         <w:rPr>
           <w:b/>
           <w:i w:val="0"/>
         </w:rPr>
-        <w:t>Three API keys (like passwords for AI services):</w:t>
-      </w:r>
-    </w:p>
-    <w:p>
-      <w:pPr>
-        <w:pStyle w:val="ListBullet"/>
-      </w:pPr>
-      <w:r>
-        <w:t>GEMINI_API_KEY — This is the brain. All AI thinking (reading CV, making questions, scoring answers) uses Google Gemini.</w:t>
-      </w:r>
-    </w:p>
-    <w:p>
-      <w:pPr>
-        <w:pStyle w:val="ListBullet"/>
-      </w:pPr>
-      <w:r>
-        <w:t>DEEPGRAM_API_KEY — For voice mode only. Converts spoken words into text (like a super-accurate captions system).</w:t>
-      </w:r>
-    </w:p>
-    <w:p>
-      <w:pPr>
-        <w:pStyle w:val="ListBullet"/>
-      </w:pPr>
-      <w:r>
-        <w:t>ELEVENLABS_API_KEY — For voice mode only. Converts text into spoken voice (makes the AI sound like a real human).</w:t>
+        <w:t>Step 1: Input</w:t>
       </w:r>
     </w:p>
     <w:p>
@@ -220,269 +436,289 @@
           <w:b w:val="0"/>
           <w:i w:val="0"/>
         </w:rPr>
-      </w:r>
-    </w:p>
+        <w:t>You upload a CV (PDF or text) and paste a Job Description. These are the only two things the system needs from you.</w:t>
+      </w:r>
+    </w:p>
+    <w:p/>
+    <w:p>
+      <w:r>
+        <w:rPr>
+          <w:b/>
+          <w:i w:val="0"/>
+        </w:rPr>
+        <w:t>Step 2: Parsing (core/agents/)</w:t>
+      </w:r>
+    </w:p>
+    <w:p>
+      <w:r>
+        <w:rPr>
+          <w:b w:val="0"/>
+          <w:i w:val="0"/>
+        </w:rPr>
+        <w:t>cv_agent.py reads the CV and extracts: the candidate's name, their skills, their experience summary.</w:t>
+      </w:r>
+    </w:p>
+    <w:p>
+      <w:r>
+        <w:rPr>
+          <w:b w:val="0"/>
+          <w:i w:val="0"/>
+        </w:rPr>
+        <w:t>jd_agent.py reads the Job Description and extracts: the job title, the level (junior/mid/senior), the required skills.</w:t>
+      </w:r>
+    </w:p>
+    <w:p>
+      <w:r>
+        <w:rPr>
+          <w:b w:val="0"/>
+          <w:i w:val="0"/>
+        </w:rPr>
+        <w:t>Both use Gemini AI to extract this information automatically.</w:t>
+      </w:r>
+    </w:p>
+    <w:p/>
+    <w:p>
+      <w:r>
+        <w:rPr>
+          <w:b/>
+          <w:i w:val="0"/>
+        </w:rPr>
+        <w:t>Step 3: Skill Graph (core/graph/)</w:t>
+      </w:r>
+    </w:p>
+    <w:p>
+      <w:r>
+        <w:rPr>
+          <w:b w:val="0"/>
+          <w:i w:val="0"/>
+        </w:rPr>
+        <w:t>skill_graph.py loads a database called ESCO (1,201 IT skills) and builds a "map" where related skills are linked together. Example: "Python" is linked to "Django" and "Flask" because they are related.</w:t>
+      </w:r>
+    </w:p>
+    <w:p>
+      <w:r>
+        <w:rPr>
+          <w:b w:val="0"/>
+          <w:i w:val="0"/>
+        </w:rPr>
+        <w:t>Then it compares the candidate's skills against the job's required skills. Skills the candidate is missing or weak at become "interview topics."</w:t>
+      </w:r>
+    </w:p>
+    <w:p/>
+    <w:p>
+      <w:r>
+        <w:rPr>
+          <w:b/>
+          <w:i w:val="0"/>
+        </w:rPr>
+        <w:t>Step 4: Question Generation (core/agents/question_agent.py)</w:t>
+      </w:r>
+    </w:p>
+    <w:p>
+      <w:r>
+        <w:rPr>
+          <w:b w:val="0"/>
+          <w:i w:val="0"/>
+        </w:rPr>
+        <w:t>Gemini AI takes the interview topics and creates: opening questions (warm-up), technical questions (one per weak skill), behavioral questions (using STAR method), and closing questions.</w:t>
+      </w:r>
+    </w:p>
+    <w:p>
+      <w:r>
+        <w:rPr>
+          <w:b w:val="0"/>
+          <w:i w:val="0"/>
+        </w:rPr>
+        <w:t>In text mode, it can also generate a fresh question on the fly during the interview (generate_position_question).</w:t>
+      </w:r>
+    </w:p>
+    <w:p/>
+    <w:p>
+      <w:r>
+        <w:rPr>
+          <w:b/>
+          <w:i w:val="0"/>
+        </w:rPr>
+        <w:t>Step 5A: Text Interview (core/pipeline/interview_loop.py)</w:t>
+      </w:r>
+    </w:p>
+    <w:p>
+      <w:r>
+        <w:rPr>
+          <w:b w:val="0"/>
+          <w:i w:val="0"/>
+        </w:rPr>
+        <w:t>The InterviewLoop runs a cycle: pick the weakest skill → generate a question → show it on screen → wait for typed answer → score it → decide if follow-up needed → repeat. Maximum 3 questions.</w:t>
+      </w:r>
+    </w:p>
+    <w:p/>
+    <w:p>
+      <w:r>
+        <w:rPr>
+          <w:b/>
+          <w:i w:val="0"/>
+        </w:rPr>
+        <w:t>Step 5B: Voice Interview (core/livekit/)</w:t>
+      </w:r>
+    </w:p>
+    <w:p>
+      <w:r>
+        <w:rPr>
+          <w:b w:val="0"/>
+          <w:i w:val="0"/>
+        </w:rPr>
+        <w:t>A web page opens in the browser. The candidate clicks "Start Interview." An AI agent joins the same video/audio room via LiveKit. The agent speaks questions using ElevenLabs, the candidate speaks answers, Deepgram converts speech to text, and Gemini runs the conversation in real time. Maximum 5 questions.</w:t>
+      </w:r>
+    </w:p>
+    <w:p/>
+    <w:p>
+      <w:r>
+        <w:rPr>
+          <w:b/>
+          <w:i w:val="0"/>
+        </w:rPr>
+        <w:t>Step 6: Report Generation (core/report/generator.py)</w:t>
+      </w:r>
+    </w:p>
+    <w:p>
+      <w:r>
+        <w:rPr>
+          <w:b w:val="0"/>
+          <w:i w:val="0"/>
+        </w:rPr>
+        <w:t>All scores are collected. The system calculates: overall score (0-100), verdict (Strong Hire ≥70, Weak Hire 40-69, No Hire &lt;40), per-skill breakdown, strengths list, gaps list, and full answer log.</w:t>
+      </w:r>
+    </w:p>
+    <w:p/>
+    <w:p>
+      <w:r>
+        <w:rPr>
+          <w:b/>
+          <w:i w:val="0"/>
+        </w:rPr>
+        <w:t>Step 7: Output</w:t>
+      </w:r>
+    </w:p>
+    <w:p>
+      <w:r>
+        <w:rPr>
+          <w:b w:val="0"/>
+          <w:i w:val="0"/>
+        </w:rPr>
+        <w:t>The final report appears on screen. You can see it, save it, or print it.</w:t>
+      </w:r>
+    </w:p>
+    <w:p>
+      <w:pPr>
+        <w:pStyle w:val="Heading1"/>
+      </w:pPr>
+      <w:r>
+        <w:rPr>
+          <w:color w:val="1A56DB"/>
+        </w:rPr>
+        <w:t>5. The Two Interview Modes — Text vs Voice</w:t>
+      </w:r>
+    </w:p>
+    <w:p>
+      <w:pPr>
+        <w:pStyle w:val="Heading2"/>
+      </w:pPr>
+      <w:r>
+        <w:rPr>
+          <w:color w:val="1A56DB"/>
+        </w:rPr>
+        <w:t>5A. Text Mode (Typing)</w:t>
+      </w:r>
+    </w:p>
+    <w:p>
+      <w:r>
+        <w:rPr>
+          <w:b/>
+          <w:i w:val="0"/>
+        </w:rPr>
+        <w:t>How it works (simple):</w:t>
+      </w:r>
+    </w:p>
+    <w:p>
+      <w:pPr>
+        <w:pStyle w:val="ListBullet"/>
+      </w:pPr>
+      <w:r>
+        <w:t>The system picks the skill the candidate is worst at.</w:t>
+      </w:r>
+    </w:p>
+    <w:p>
+      <w:pPr>
+        <w:pStyle w:val="ListBullet"/>
+      </w:pPr>
+      <w:r>
+        <w:t>Gemini creates a question for that skill.</w:t>
+      </w:r>
+    </w:p>
+    <w:p>
+      <w:pPr>
+        <w:pStyle w:val="ListBullet"/>
+      </w:pPr>
+      <w:r>
+        <w:t>The question appears on screen with a text box.</w:t>
+      </w:r>
+    </w:p>
+    <w:p>
+      <w:pPr>
+        <w:pStyle w:val="ListBullet"/>
+      </w:pPr>
+      <w:r>
+        <w:t>The candidate types their answer and clicks Submit.</w:t>
+      </w:r>
+    </w:p>
+    <w:p>
+      <w:pPr>
+        <w:pStyle w:val="ListBullet"/>
+      </w:pPr>
+      <w:r>
+        <w:t>Gemini evaluates the answer: it first creates an "ideal answer," then compares the candidate's answer against it. Scores on 4 criteria: technical accuracy, completeness, clarity, relevance. Each out of 25, total out of 100.</w:t>
+      </w:r>
+    </w:p>
+    <w:p>
+      <w:pPr>
+        <w:pStyle w:val="ListBullet"/>
+      </w:pPr>
+      <w:r>
+        <w:t>The evaluation runs TWICE with criteria in different order (to be fair) and averages the scores.</w:t>
+      </w:r>
+    </w:p>
+    <w:p>
+      <w:pPr>
+        <w:pStyle w:val="ListBullet"/>
+      </w:pPr>
+      <w:r>
+        <w:t>If the answer is weak (score below 40), the AI asks one follow-up question.</w:t>
+      </w:r>
+    </w:p>
+    <w:p>
+      <w:pPr>
+        <w:pStyle w:val="ListBullet"/>
+      </w:pPr>
+      <w:r>
+        <w:t>The cycle repeats. Stops after 3 questions or when all skills are tested.</w:t>
+      </w:r>
+    </w:p>
+    <w:p>
+      <w:pPr>
+        <w:pStyle w:val="ListBullet"/>
+      </w:pPr>
+      <w:r>
+        <w:t>Final report is generated automatically.</w:t>
+      </w:r>
+    </w:p>
+    <w:p/>
     <w:p>
       <w:r>
         <w:rPr>
           <w:b w:val="0"/>
           <w:i/>
         </w:rPr>
-        <w:t>You also need to download one file (the LiveKit server) once, and the system handles the rest automatically.</w:t>
-      </w:r>
-    </w:p>
-    <w:p>
-      <w:pPr>
-        <w:pStyle w:val="Heading1"/>
-      </w:pPr>
-      <w:r>
-        <w:rPr>
-          <w:color w:val="1A56DB"/>
-        </w:rPr>
-        <w:t>4. The Big Picture — 6 Steps</w:t>
-      </w:r>
-    </w:p>
-    <w:p>
-      <w:r>
-        <w:rPr>
-          <w:b w:val="0"/>
-          <w:i w:val="0"/>
-        </w:rPr>
-        <w:t>The whole process happens in 6 steps, shown as tabs in the web app:</w:t>
-      </w:r>
-    </w:p>
-    <w:p/>
-    <w:p>
-      <w:r>
-        <w:rPr>
-          <w:b/>
-          <w:i w:val="0"/>
-        </w:rPr>
-        <w:t>Step 1 — Upload CV + Job Description</w:t>
-      </w:r>
-    </w:p>
-    <w:p>
-      <w:r>
-        <w:rPr>
-          <w:b w:val="0"/>
-          <w:i w:val="0"/>
-        </w:rPr>
-        <w:t>The user uploads their resume (PDF or text) and pastes a job description. That's it — two inputs.</w:t>
-      </w:r>
-    </w:p>
-    <w:p/>
-    <w:p>
-      <w:r>
-        <w:rPr>
-          <w:b/>
-          <w:i w:val="0"/>
-        </w:rPr>
-        <w:t>Step 2 — Analysis</w:t>
-      </w:r>
-    </w:p>
-    <w:p>
-      <w:r>
-        <w:rPr>
-          <w:b w:val="0"/>
-          <w:i w:val="0"/>
-        </w:rPr>
-        <w:t>The system sends both documents to Gemini AI, which reads them and extracts: the candidate's name, their skills, the job title, what level the job is (junior/mid/senior), and what skills the job requires.</w:t>
-      </w:r>
-    </w:p>
-    <w:p/>
-    <w:p>
-      <w:r>
-        <w:rPr>
-          <w:b/>
-          <w:i w:val="0"/>
-        </w:rPr>
-        <w:t>Step 3 — Skill Graph</w:t>
-      </w:r>
-    </w:p>
-    <w:p>
-      <w:r>
-        <w:rPr>
-          <w:b w:val="0"/>
-          <w:i w:val="0"/>
-        </w:rPr>
-        <w:t>The system loads a big database of IT skills called ESCO (1,201 skills — like a dictionary of every tech skill). It builds a "map" where related skills are connected. Then it compares the candidate's skills against what the job needs and finds the gaps — skills the candidate is missing or weak at.</w:t>
-      </w:r>
-    </w:p>
-    <w:p/>
-    <w:p>
-      <w:r>
-        <w:rPr>
-          <w:b/>
-          <w:i w:val="0"/>
-        </w:rPr>
-        <w:t>Step 4 — Generate Questions</w:t>
-      </w:r>
-    </w:p>
-    <w:p>
-      <w:r>
-        <w:rPr>
-          <w:b w:val="0"/>
-          <w:i w:val="0"/>
-        </w:rPr>
-        <w:t>Gemini AI creates a set of interview questions targeting the weak/missing skills. For each skill, it creates: an opening warm-up question, a technical question, a behavioral question (using the STAR method — Situation, Task, Action, Result), and a closing question.</w:t>
-      </w:r>
-    </w:p>
-    <w:p/>
-    <w:p>
-      <w:r>
-        <w:rPr>
-          <w:b/>
-          <w:i w:val="0"/>
-        </w:rPr>
-        <w:t>Step 5 — Conduct the Interview</w:t>
-      </w:r>
-    </w:p>
-    <w:p>
-      <w:r>
-        <w:rPr>
-          <w:b w:val="0"/>
-          <w:i w:val="0"/>
-        </w:rPr>
-        <w:t>This is where the actual interview happens. There are two ways to do it:</w:t>
-      </w:r>
-    </w:p>
-    <w:p>
-      <w:pPr>
-        <w:pStyle w:val="ListBullet"/>
-      </w:pPr>
-      <w:r>
-        <w:t>Text Mode — Questions appear on screen, candidate types answers, AI scores them immediately. Maximum 3 questions.</w:t>
-      </w:r>
-    </w:p>
-    <w:p>
-      <w:pPr>
-        <w:pStyle w:val="ListBullet"/>
-      </w:pPr>
-      <w:r>
-        <w:t>LiveKit Mode (Voice) — A voice AI speaks the questions out loud using ElevenLabs. The candidate speaks their answers. Deepgram converts speech to text. Gemini runs the conversation in real time. Maximum 5 questions.</w:t>
-      </w:r>
-    </w:p>
-    <w:p/>
-    <w:p>
-      <w:r>
-        <w:rPr>
-          <w:b/>
-          <w:i w:val="0"/>
-        </w:rPr>
-        <w:t>Step 6 — Generate Report</w:t>
-      </w:r>
-    </w:p>
-    <w:p>
-      <w:r>
-        <w:rPr>
-          <w:b w:val="0"/>
-          <w:i w:val="0"/>
-        </w:rPr>
-        <w:t>The system calculates: an overall score (0-100), a verdict (Strong Hire ≥70, Weak Hire 40-69, Not a Hire &lt;40), a breakdown by skill (strengths, gaps, areas to improve), and the full log of every question and answer.</w:t>
-      </w:r>
-    </w:p>
-    <w:p>
-      <w:pPr>
-        <w:pStyle w:val="Heading1"/>
-      </w:pPr>
-      <w:r>
-        <w:rPr>
-          <w:color w:val="1A56DB"/>
-        </w:rPr>
-        <w:t>5. The Two Interview Modes — Detailed</w:t>
-      </w:r>
-    </w:p>
-    <w:p>
-      <w:pPr>
-        <w:pStyle w:val="Heading2"/>
-      </w:pPr>
-      <w:r>
-        <w:rPr>
-          <w:color w:val="1A56DB"/>
-        </w:rPr>
-        <w:t>5A. Text Mode (Simple)</w:t>
-      </w:r>
-    </w:p>
-    <w:p>
-      <w:r>
-        <w:rPr>
-          <w:b w:val="0"/>
-          <w:i w:val="0"/>
-        </w:rPr>
-        <w:t>This is the simpler mode. No microphone or camera needed.</w:t>
-      </w:r>
-    </w:p>
-    <w:p>
-      <w:r>
-        <w:rPr>
-          <w:b/>
-          <w:i w:val="0"/>
-        </w:rPr>
-        <w:t>How it works step by step:</w:t>
-      </w:r>
-    </w:p>
-    <w:p>
-      <w:pPr>
-        <w:pStyle w:val="ListBullet"/>
-      </w:pPr>
-      <w:r>
-        <w:t>The system picks the skill the candidate scored lowest on.</w:t>
-      </w:r>
-    </w:p>
-    <w:p>
-      <w:pPr>
-        <w:pStyle w:val="ListBullet"/>
-      </w:pPr>
-      <w:r>
-        <w:t>Gemini creates a fresh question for that skill.</w:t>
-      </w:r>
-    </w:p>
-    <w:p>
-      <w:pPr>
-        <w:pStyle w:val="ListBullet"/>
-      </w:pPr>
-      <w:r>
-        <w:t>The question appears on the screen.</w:t>
-      </w:r>
-    </w:p>
-    <w:p>
-      <w:pPr>
-        <w:pStyle w:val="ListBullet"/>
-      </w:pPr>
-      <w:r>
-        <w:t>The candidate types their answer and clicks "Submit."</w:t>
-      </w:r>
-    </w:p>
-    <w:p>
-      <w:pPr>
-        <w:pStyle w:val="ListBullet"/>
-      </w:pPr>
-      <w:r>
-        <w:t>Gemini evaluates the answer in two passes (to be fair) and averages the scores.</w:t>
-      </w:r>
-    </w:p>
-    <w:p>
-      <w:pPr>
-        <w:pStyle w:val="ListBullet"/>
-      </w:pPr>
-      <w:r>
-        <w:t>If the answer is weak, the AI asks one follow-up question.</w:t>
-      </w:r>
-    </w:p>
-    <w:p>
-      <w:pPr>
-        <w:pStyle w:val="ListBullet"/>
-      </w:pPr>
-      <w:r>
-        <w:t>This repeats until all skills are tested or 3 questions have been asked.</w:t>
-      </w:r>
-    </w:p>
-    <w:p>
-      <w:pPr>
-        <w:pStyle w:val="ListBullet"/>
-      </w:pPr>
-      <w:r>
-        <w:t>A final report is generated automatically.</w:t>
+        <w:t>Key fact: Text mode uses a method called "LLM-as-Judge." The same AI that creates the questions also evaluates the answers. But it evaluates twice with different criteria order to avoid bias.</w:t>
       </w:r>
     </w:p>
     <w:p>
@@ -496,25 +732,6 @@
         <w:t>5B. LiveKit Mode (Voice Interview)</w:t>
       </w:r>
     </w:p>
-    <w:p>
-      <w:r>
-        <w:rPr>
-          <w:b w:val="0"/>
-          <w:i w:val="0"/>
-        </w:rPr>
-        <w:t>In this mode, the AI speaks the questions and the candidate speaks the answers — like a real voice call.</w:t>
-      </w:r>
-    </w:p>
-    <w:p>
-      <w:r>
-        <w:rPr>
-          <w:b w:val="0"/>
-          <w:i w:val="0"/>
-        </w:rPr>
-        <w:t>You will see yourself on camera (webcam), and a transcript of what is being said.</w:t>
-      </w:r>
-    </w:p>
-    <w:p/>
     <w:p>
       <w:r>
         <w:rPr>
@@ -530,7 +747,7 @@
           <w:b w:val="0"/>
           <w:i w:val="0"/>
         </w:rPr>
-        <w:t>LiveKit is a free, open-source tool for real-time voice and video communication (like Zoom but built for AI). It runs as a server on your computer. You download it once, and the system starts it automatically when needed.</w:t>
+        <w:t>LiveKit is an open-source platform for real-time voice/video calls (like a Zoom that runs on your computer). It connects the candidate's browser to the AI agent.</w:t>
       </w:r>
     </w:p>
     <w:p/>
@@ -540,7 +757,7 @@
           <w:b/>
           <w:i w:val="0"/>
         </w:rPr>
-        <w:t>How the Voice Interview Works (step by step):</w:t>
+        <w:t>How it works (simple):</w:t>
       </w:r>
     </w:p>
     <w:p>
@@ -548,7 +765,7 @@
         <w:pStyle w:val="ListBullet"/>
       </w:pPr>
       <w:r>
-        <w:t>The system starts a small web server (port 18765) and the LiveKit server (port 7880).</w:t>
+        <w:t>The system starts two servers: a small web server (port 18765) and the LiveKit server (port 7880).</w:t>
       </w:r>
     </w:p>
     <w:p>
@@ -556,7 +773,7 @@
         <w:pStyle w:val="ListBullet"/>
       </w:pPr>
       <w:r>
-        <w:t>A web page opens in your browser with a "Start Interview" button.</w:t>
+        <w:t>A web page opens in the browser with a "Start Interview" button.</w:t>
       </w:r>
     </w:p>
     <w:p>
@@ -564,7 +781,7 @@
         <w:pStyle w:val="ListBullet"/>
       </w:pPr>
       <w:r>
-        <w:t>You click the button. Your browser asks for camera and microphone permission. You allow it.</w:t>
+        <w:t>The candidate clicks the button. The browser asks for camera and microphone permission.</w:t>
       </w:r>
     </w:p>
     <w:p>
@@ -572,7 +789,7 @@
         <w:pStyle w:val="ListBullet"/>
       </w:pPr>
       <w:r>
-        <w:t>The browser connects to the LiveKit room. An AI "agent" joins the same room.</w:t>
+        <w:t>The browser connects to a "room" in the LiveKit server. An AI agent joins the same room.</w:t>
       </w:r>
     </w:p>
     <w:p>
@@ -580,7 +797,7 @@
         <w:pStyle w:val="ListBullet"/>
       </w:pPr>
       <w:r>
-        <w:t>The AI agent greets you warmly, mentions your name and the job position.</w:t>
+        <w:t>Now it's like a video call between the candidate and the AI.</w:t>
       </w:r>
     </w:p>
     <w:p>
@@ -588,7 +805,7 @@
         <w:pStyle w:val="ListBullet"/>
       </w:pPr>
       <w:r>
-        <w:t>It asks "Are you ready to begin the interview?" You say yes.</w:t>
+        <w:t>The AI agent greets the candidate by name, mentions the job position.</w:t>
       </w:r>
     </w:p>
     <w:p>
@@ -596,7 +813,7 @@
         <w:pStyle w:val="ListBullet"/>
       </w:pPr>
       <w:r>
-        <w:t>The AI starts asking questions one by one. Each question is spoken out loud using ElevenLabs (natural-sounding AI voice).</w:t>
+        <w:t>The AI asks "Are you ready to begin?" Once the candidate says yes, the interview starts.</w:t>
       </w:r>
     </w:p>
     <w:p>
@@ -604,7 +821,7 @@
         <w:pStyle w:val="ListBullet"/>
       </w:pPr>
       <w:r>
-        <w:t>You hear the question and speak your answer into the microphone.</w:t>
+        <w:t>For each question: the AI's text is converted to speech by ElevenLabs (sounds like a real human).</w:t>
       </w:r>
     </w:p>
     <w:p>
@@ -612,7 +829,7 @@
         <w:pStyle w:val="ListBullet"/>
       </w:pPr>
       <w:r>
-        <w:t>Deepgram converts your speech into text in real time (appears on screen as captions).</w:t>
+        <w:t>The candidate hears the question and speaks their answer into the microphone.</w:t>
       </w:r>
     </w:p>
     <w:p>
@@ -620,7 +837,7 @@
         <w:pStyle w:val="ListBullet"/>
       </w:pPr>
       <w:r>
-        <w:t>Gemini AI thinks about your answer and decides what to say next.</w:t>
+        <w:t>Deepgram converts the spoken answer into text in real time (appears on screen as captions).</w:t>
       </w:r>
     </w:p>
     <w:p>
@@ -628,7 +845,7 @@
         <w:pStyle w:val="ListBullet"/>
       </w:pPr>
       <w:r>
-        <w:t>If you go off-topic, Gemini gives you up to 3 warnings, then moves to the next question.</w:t>
+        <w:t>Gemini AI reads the transcribed text, thinks about it, and decides what to say next.</w:t>
       </w:r>
     </w:p>
     <w:p>
@@ -636,7 +853,7 @@
         <w:pStyle w:val="ListBullet"/>
       </w:pPr>
       <w:r>
-        <w:t>After all questions, the AI thanks you and says goodbye. A transcript is saved.</w:t>
+        <w:t>If the candidate goes off-topic, Gemini gives up to 3 warnings, then moves to the next question.</w:t>
       </w:r>
     </w:p>
     <w:p>
@@ -644,7 +861,7 @@
         <w:pStyle w:val="ListBullet"/>
       </w:pPr>
       <w:r>
-        <w:t>You can end the interview anytime by clicking the "End" button.</w:t>
+        <w:t>After all 5 questions, the AI says goodbye. A full transcript is saved to a file.</w:t>
       </w:r>
     </w:p>
     <w:p/>
@@ -654,7 +871,7 @@
           <w:b/>
           <w:i w:val="0"/>
         </w:rPr>
-        <w:t>Technical details (for developers):</w:t>
+        <w:t>Technical setup:</w:t>
       </w:r>
     </w:p>
     <w:p>
@@ -662,7 +879,7 @@
         <w:pStyle w:val="ListBullet"/>
       </w:pPr>
       <w:r>
-        <w:t>ElevenLabs model: eleven_flash_v2_5 (the fastest model) with streaming_latency=4 (minimum delay).</w:t>
+        <w:t>ElevenLabs uses "eleven_flash_v2_5" model with streaming_latency=4 — the fastest possible speech generation.</w:t>
       </w:r>
     </w:p>
     <w:p>
@@ -670,7 +887,7 @@
         <w:pStyle w:val="ListBullet"/>
       </w:pPr>
       <w:r>
-        <w:t>Deepgram model: nova-3 (the most accurate speech-to-text model).</w:t>
+        <w:t>Deepgram uses "nova-3" model — their most accurate speech-to-text.</w:t>
       </w:r>
     </w:p>
     <w:p>
@@ -678,7 +895,7 @@
         <w:pStyle w:val="ListBullet"/>
       </w:pPr>
       <w:r>
-        <w:t>Turn handling: The AI will NOT be interrupted while speaking. After you stop speaking, it waits 1.5-4 seconds before responding (so you have time to think).</w:t>
+        <w:t>The AI will NOT be interrupted while speaking. After you finish speaking, the system waits 1.5 to 4 seconds before responding — so you have time to think without being cut off.</w:t>
       </w:r>
     </w:p>
     <w:p>
@@ -689,7 +906,7 @@
         <w:rPr>
           <w:color w:val="1A56DB"/>
         </w:rPr>
-        <w:t>6. What Technology Does It Use?</w:t>
+        <w:t>6. Technology Stack — The Tools Used</w:t>
       </w:r>
     </w:p>
     <w:p>
@@ -698,16 +915,1887 @@
           <w:b w:val="0"/>
           <w:i w:val="0"/>
         </w:rPr>
-        <w:t>Here are the main tools this project uses, explained simply:</w:t>
-      </w:r>
-    </w:p>
+        <w:t>Here are all the technologies used in this project, explained simply:</w:t>
+      </w:r>
+    </w:p>
+    <w:p/>
+    <w:p>
+      <w:r>
+        <w:rPr>
+          <w:b/>
+          <w:color w:val="1A56DB"/>
+          <w:sz w:val="24"/>
+        </w:rPr>
+        <w:t>Google Gemini — The AI Brain</w:t>
+      </w:r>
+    </w:p>
+    <w:p>
+      <w:r>
+        <w:rPr>
+          <w:b w:val="0"/>
+          <w:i/>
+        </w:rPr>
+        <w:t>Gemini is the "intelligence" of the system. It reads the CV and job description, creates questions, evaluates answers, and runs the voice conversation. Everything smart that happens comes from Gemini. Uses the "2.5 Flash" model by default (fast and accurate).</w:t>
+      </w:r>
+    </w:p>
+    <w:p/>
+    <w:p>
+      <w:r>
+        <w:rPr>
+          <w:b/>
+          <w:color w:val="1A56DB"/>
+          <w:sz w:val="24"/>
+        </w:rPr>
+        <w:t>LiveKit — The Video/Voice Platform</w:t>
+      </w:r>
+    </w:p>
+    <w:p>
+      <w:r>
+        <w:rPr>
+          <w:b w:val="0"/>
+          <w:i/>
+        </w:rPr>
+        <w:t>Think of LiveKit as a private Zoom that runs on your own computer. It manages the real-time audio/video connection between the candidate's browser and the AI agent. Open source. Free. Runs locally.</w:t>
+      </w:r>
+    </w:p>
+    <w:p/>
+    <w:p>
+      <w:r>
+        <w:rPr>
+          <w:b/>
+          <w:color w:val="1A56DB"/>
+          <w:sz w:val="24"/>
+        </w:rPr>
+        <w:t>Deepgram — The Listener (Speech-to-Text)</w:t>
+      </w:r>
+    </w:p>
+    <w:p>
+      <w:r>
+        <w:rPr>
+          <w:b w:val="0"/>
+          <w:i/>
+        </w:rPr>
+        <w:t>Deepgram listens to what the candidate says and writes it down as text. Like YouTube captions, but super accurate. Uses the "Nova-3" model — their best one.</w:t>
+      </w:r>
+    </w:p>
+    <w:p/>
+    <w:p>
+      <w:r>
+        <w:rPr>
+          <w:b/>
+          <w:color w:val="1A56DB"/>
+          <w:sz w:val="24"/>
+        </w:rPr>
+        <w:t>ElevenLabs — The Speaker (Text-to-Speech)</w:t>
+      </w:r>
+    </w:p>
+    <w:p>
+      <w:r>
+        <w:rPr>
+          <w:b w:val="0"/>
+          <w:i/>
+        </w:rPr>
+        <w:t>ElevenLabs takes the AI's written response and reads it out loud in a natural, human-like voice. Uses the "Flash v2.5" model, optimized for speed. The streaming_latency=4 setting makes it start speaking as fast as possible.</w:t>
+      </w:r>
+    </w:p>
+    <w:p/>
+    <w:p>
+      <w:r>
+        <w:rPr>
+          <w:b/>
+          <w:color w:val="1A56DB"/>
+          <w:sz w:val="24"/>
+        </w:rPr>
+        <w:t>ESCO — The Skill Database</w:t>
+      </w:r>
+    </w:p>
+    <w:p>
+      <w:r>
+        <w:rPr>
+          <w:b w:val="0"/>
+          <w:i/>
+        </w:rPr>
+        <w:t>ESCO is a European Union standard database of 1,201 IT skills. The system loads this into a "skill graph" — a map where related skills are connected (like Python connected to Django). This helps find what skills the candidate has vs what they're missing.</w:t>
+      </w:r>
+    </w:p>
+    <w:p/>
+    <w:p>
+      <w:r>
+        <w:rPr>
+          <w:b/>
+          <w:color w:val="1A56DB"/>
+          <w:sz w:val="24"/>
+        </w:rPr>
+        <w:t>Streamlit — The Web App Framework</w:t>
+      </w:r>
+    </w:p>
+    <w:p>
+      <w:r>
+        <w:rPr>
+          <w:b w:val="0"/>
+          <w:i/>
+        </w:rPr>
+        <w:t>Streamlit is a tool that turns Python code into a web page automatically. The entire InterviewAI app runs on Streamlit. No HTML or CSS needed to build it.</w:t>
+      </w:r>
+    </w:p>
+    <w:p/>
+    <w:p>
+      <w:r>
+        <w:rPr>
+          <w:b/>
+          <w:color w:val="1A56DB"/>
+          <w:sz w:val="24"/>
+        </w:rPr>
+        <w:t>NetworkX — The Graph Library</w:t>
+      </w:r>
+    </w:p>
+    <w:p>
+      <w:r>
+        <w:rPr>
+          <w:b w:val="0"/>
+          <w:i/>
+        </w:rPr>
+        <w:t>NetworkX is a Python library that creates and manages graphs — maps of connected things. The skill graph uses NetworkX to link related skills together.</w:t>
+      </w:r>
+    </w:p>
+    <w:p>
+      <w:pPr>
+        <w:pStyle w:val="Heading1"/>
+      </w:pPr>
+      <w:r>
+        <w:rPr>
+          <w:color w:val="1A56DB"/>
+        </w:rPr>
+        <w:t>7. Folder Structure — Every File Explained</w:t>
+      </w:r>
+    </w:p>
+    <w:p>
+      <w:r>
+        <w:rPr>
+          <w:b w:val="0"/>
+          <w:i/>
+        </w:rPr>
+        <w:t>Here is the complete folder structure of the project. Read this to understand what each file does:</w:t>
+      </w:r>
+    </w:p>
+    <w:p/>
+    <w:p>
+      <w:r>
+        <w:rPr>
+          <w:rFonts w:ascii="Courier New" w:hAnsi="Courier New"/>
+          <w:sz w:val="18"/>
+        </w:rPr>
+        <w:t>InterviewAI/</w:t>
+      </w:r>
+    </w:p>
+    <w:p>
+      <w:r>
+        <w:rPr>
+          <w:rFonts w:ascii="Courier New" w:hAnsi="Courier New"/>
+          <w:sz w:val="18"/>
+        </w:rPr>
+        <w:t>│</w:t>
+      </w:r>
+    </w:p>
+    <w:p>
+      <w:r>
+        <w:rPr>
+          <w:rFonts w:ascii="Courier New" w:hAnsi="Courier New"/>
+          <w:sz w:val="18"/>
+        </w:rPr>
+        <w:t xml:space="preserve">├── app.py                    </w:t>
+      </w:r>
+      <w:r>
+        <w:rPr>
+          <w:rFonts w:ascii="Courier New" w:hAnsi="Courier New"/>
+          <w:b/>
+          <w:color w:val="DC2626"/>
+          <w:sz w:val="18"/>
+        </w:rPr>
+        <w:t>★</w:t>
+      </w:r>
+      <w:r>
+        <w:rPr>
+          <w:rFonts w:ascii="Courier New" w:hAnsi="Courier New"/>
+          <w:i/>
+          <w:sz w:val="18"/>
+        </w:rPr>
+        <w:t xml:space="preserve"> MAIN APP — Run this (streamlit run app.py)</w:t>
+      </w:r>
+    </w:p>
+    <w:p>
+      <w:r>
+        <w:rPr>
+          <w:rFonts w:ascii="Courier New" w:hAnsi="Courier New"/>
+          <w:sz w:val="18"/>
+        </w:rPr>
+        <w:t>│</w:t>
+      </w:r>
+    </w:p>
+    <w:p>
+      <w:r>
+        <w:rPr>
+          <w:rFonts w:ascii="Courier New" w:hAnsi="Courier New"/>
+          <w:sz w:val="18"/>
+        </w:rPr>
+        <w:t xml:space="preserve">├── core/                     </w:t>
+      </w:r>
+      <w:r>
+        <w:rPr>
+          <w:rFonts w:ascii="Courier New" w:hAnsi="Courier New"/>
+          <w:b/>
+          <w:color w:val="DC2626"/>
+          <w:sz w:val="18"/>
+        </w:rPr>
+        <w:t>★</w:t>
+      </w:r>
+      <w:r>
+        <w:rPr>
+          <w:rFonts w:ascii="Courier New" w:hAnsi="Courier New"/>
+          <w:i/>
+          <w:sz w:val="18"/>
+        </w:rPr>
+        <w:t xml:space="preserve"> ALL code lives here</w:t>
+      </w:r>
+    </w:p>
+    <w:p>
+      <w:r>
+        <w:rPr>
+          <w:rFonts w:ascii="Courier New" w:hAnsi="Courier New"/>
+          <w:sz w:val="18"/>
+        </w:rPr>
+        <w:t>│   │</w:t>
+      </w:r>
+    </w:p>
+    <w:p>
+      <w:r>
+        <w:rPr>
+          <w:rFonts w:ascii="Courier New" w:hAnsi="Courier New"/>
+          <w:sz w:val="18"/>
+        </w:rPr>
+        <w:t>│   ├── config.py             SETTINGS — API keys, score thresholds, limits</w:t>
+      </w:r>
+    </w:p>
+    <w:p>
+      <w:r>
+        <w:rPr>
+          <w:rFonts w:ascii="Courier New" w:hAnsi="Courier New"/>
+          <w:sz w:val="18"/>
+        </w:rPr>
+        <w:t>│   ├── llm.py                AI COMMUNICATION — Talks to Google Gemini</w:t>
+      </w:r>
+    </w:p>
+    <w:p>
+      <w:r>
+        <w:rPr>
+          <w:rFonts w:ascii="Courier New" w:hAnsi="Courier New"/>
+          <w:sz w:val="18"/>
+        </w:rPr>
+        <w:t>│   │</w:t>
+      </w:r>
+    </w:p>
+    <w:p>
+      <w:r>
+        <w:rPr>
+          <w:rFonts w:ascii="Courier New" w:hAnsi="Courier New"/>
+          <w:sz w:val="18"/>
+        </w:rPr>
+        <w:t>│   ├── agents/               INPUT PARSING + QUESTION CREATION</w:t>
+      </w:r>
+    </w:p>
+    <w:p>
+      <w:r>
+        <w:rPr>
+          <w:rFonts w:ascii="Courier New" w:hAnsi="Courier New"/>
+          <w:sz w:val="18"/>
+        </w:rPr>
+        <w:t>│   │   ├── cv_agent.py       Reads CV/Resume, extracts name + skills via Gemini</w:t>
+      </w:r>
+    </w:p>
+    <w:p>
+      <w:r>
+        <w:rPr>
+          <w:rFonts w:ascii="Courier New" w:hAnsi="Courier New"/>
+          <w:sz w:val="18"/>
+        </w:rPr>
+        <w:t>│   │   ├── jd_agent.py       Reads Job Description, extracts title + level + skills</w:t>
+      </w:r>
+    </w:p>
+    <w:p>
+      <w:r>
+        <w:rPr>
+          <w:rFonts w:ascii="Courier New" w:hAnsi="Courier New"/>
+          <w:sz w:val="18"/>
+        </w:rPr>
+        <w:t>│   │   └── question_agent.py Creates interview questions from skill gaps</w:t>
+      </w:r>
+    </w:p>
+    <w:p>
+      <w:r>
+        <w:rPr>
+          <w:rFonts w:ascii="Courier New" w:hAnsi="Courier New"/>
+          <w:sz w:val="18"/>
+        </w:rPr>
+        <w:t>│   │</w:t>
+      </w:r>
+    </w:p>
+    <w:p>
+      <w:r>
+        <w:rPr>
+          <w:rFonts w:ascii="Courier New" w:hAnsi="Courier New"/>
+          <w:sz w:val="18"/>
+        </w:rPr>
+        <w:t>│   ├── evaluator/            ANSWER SCORING</w:t>
+      </w:r>
+    </w:p>
+    <w:p>
+      <w:r>
+        <w:rPr>
+          <w:rFonts w:ascii="Courier New" w:hAnsi="Courier New"/>
+          <w:sz w:val="18"/>
+        </w:rPr>
+        <w:t>│   │   └── evaluator.py      Scores answers (creates ideal answer, compares, scores twice)</w:t>
+      </w:r>
+    </w:p>
+    <w:p>
+      <w:r>
+        <w:rPr>
+          <w:rFonts w:ascii="Courier New" w:hAnsi="Courier New"/>
+          <w:sz w:val="18"/>
+        </w:rPr>
+        <w:t>│   │</w:t>
+      </w:r>
+    </w:p>
+    <w:p>
+      <w:r>
+        <w:rPr>
+          <w:rFonts w:ascii="Courier New" w:hAnsi="Courier New"/>
+          <w:sz w:val="18"/>
+        </w:rPr>
+        <w:t>│   ├── graph/                SKILL KNOWLEDGE + STATE TRACKING</w:t>
+      </w:r>
+    </w:p>
+    <w:p>
+      <w:r>
+        <w:rPr>
+          <w:rFonts w:ascii="Courier New" w:hAnsi="Courier New"/>
+          <w:sz w:val="18"/>
+        </w:rPr>
+        <w:t>│   │   ├── skill_graph.py    Builds skill map from 1,201 ESCO skills + modern tech</w:t>
+      </w:r>
+    </w:p>
+    <w:p>
+      <w:r>
+        <w:rPr>
+          <w:rFonts w:ascii="Courier New" w:hAnsi="Courier New"/>
+          <w:sz w:val="18"/>
+        </w:rPr>
+        <w:t>│   │   ├── state.py          Tracks each skill's status during interview</w:t>
+      </w:r>
+    </w:p>
+    <w:p>
+      <w:r>
+        <w:rPr>
+          <w:rFonts w:ascii="Courier New" w:hAnsi="Courier New"/>
+          <w:sz w:val="18"/>
+        </w:rPr>
+        <w:t>│   │   ├── traversal.py      Decides which skill to ask next</w:t>
+      </w:r>
+    </w:p>
+    <w:p>
+      <w:r>
+        <w:rPr>
+          <w:rFonts w:ascii="Courier New" w:hAnsi="Courier New"/>
+          <w:sz w:val="18"/>
+        </w:rPr>
+        <w:t>│   │   └── visualize.py      Creates charts of skills, gaps, requirements</w:t>
+      </w:r>
+    </w:p>
+    <w:p>
+      <w:r>
+        <w:rPr>
+          <w:rFonts w:ascii="Courier New" w:hAnsi="Courier New"/>
+          <w:sz w:val="18"/>
+        </w:rPr>
+        <w:t>│   │</w:t>
+      </w:r>
+    </w:p>
+    <w:p>
+      <w:r>
+        <w:rPr>
+          <w:rFonts w:ascii="Courier New" w:hAnsi="Courier New"/>
+          <w:sz w:val="18"/>
+        </w:rPr>
+        <w:t>│   ├── pipeline/             TEXT INTERVIEW ENGINE</w:t>
+      </w:r>
+    </w:p>
+    <w:p>
+      <w:r>
+        <w:rPr>
+          <w:rFonts w:ascii="Courier New" w:hAnsi="Courier New"/>
+          <w:sz w:val="18"/>
+        </w:rPr>
+        <w:t>│   │   └── interview_loop.py Runs the question→answer→score→repeat cycle</w:t>
+      </w:r>
+    </w:p>
+    <w:p>
+      <w:r>
+        <w:rPr>
+          <w:rFonts w:ascii="Courier New" w:hAnsi="Courier New"/>
+          <w:sz w:val="18"/>
+        </w:rPr>
+        <w:t>│   │</w:t>
+      </w:r>
+    </w:p>
+    <w:p>
+      <w:r>
+        <w:rPr>
+          <w:rFonts w:ascii="Courier New" w:hAnsi="Courier New"/>
+          <w:sz w:val="18"/>
+        </w:rPr>
+        <w:t>│   ├── report/               FINAL REPORT</w:t>
+      </w:r>
+    </w:p>
+    <w:p>
+      <w:r>
+        <w:rPr>
+          <w:rFonts w:ascii="Courier New" w:hAnsi="Courier New"/>
+          <w:sz w:val="18"/>
+        </w:rPr>
+        <w:t>│   │   └── generator.py      Builds final report with scores, verdict, strengths, gaps</w:t>
+      </w:r>
+    </w:p>
+    <w:p>
+      <w:r>
+        <w:rPr>
+          <w:rFonts w:ascii="Courier New" w:hAnsi="Courier New"/>
+          <w:sz w:val="18"/>
+        </w:rPr>
+        <w:t>│   │</w:t>
+      </w:r>
+    </w:p>
+    <w:p>
+      <w:r>
+        <w:rPr>
+          <w:rFonts w:ascii="Courier New" w:hAnsi="Courier New"/>
+          <w:sz w:val="18"/>
+        </w:rPr>
+        <w:t>│   └── livekit/              VOICE INTERVIEW SYSTEM</w:t>
+      </w:r>
+    </w:p>
+    <w:p>
+      <w:r>
+        <w:rPr>
+          <w:rFonts w:ascii="Courier New" w:hAnsi="Courier New"/>
+          <w:sz w:val="18"/>
+        </w:rPr>
+        <w:t>│       ├── run_agent.py      The AI voice agent — greets, asks, listens, ends</w:t>
+      </w:r>
+    </w:p>
+    <w:p>
+      <w:r>
+        <w:rPr>
+          <w:rFonts w:ascii="Courier New" w:hAnsi="Courier New"/>
+          <w:sz w:val="18"/>
+        </w:rPr>
+        <w:t>│       ├── whisper_server.py Web server — serves client page + generates tokens</w:t>
+      </w:r>
+    </w:p>
+    <w:p>
+      <w:r>
+        <w:rPr>
+          <w:rFonts w:ascii="Courier New" w:hAnsi="Courier New"/>
+          <w:sz w:val="18"/>
+        </w:rPr>
+        <w:t>│       ├── launcher.py       Starts/stops the LiveKit server</w:t>
+      </w:r>
+    </w:p>
+    <w:p>
+      <w:r>
+        <w:rPr>
+          <w:rFonts w:ascii="Courier New" w:hAnsi="Courier New"/>
+          <w:sz w:val="18"/>
+        </w:rPr>
+        <w:t>│       ├── client.html       Web page the candidate sees (webcam, chat, transcript)</w:t>
+      </w:r>
+    </w:p>
+    <w:p>
+      <w:r>
+        <w:rPr>
+          <w:rFonts w:ascii="Courier New" w:hAnsi="Courier New"/>
+          <w:sz w:val="18"/>
+        </w:rPr>
+        <w:t>│       └── livekit.yaml      LiveKit server settings (ports, keys, logging)</w:t>
+      </w:r>
+    </w:p>
+    <w:p>
+      <w:r>
+        <w:rPr>
+          <w:rFonts w:ascii="Courier New" w:hAnsi="Courier New"/>
+          <w:sz w:val="18"/>
+        </w:rPr>
+        <w:t>│</w:t>
+      </w:r>
+    </w:p>
+    <w:p>
+      <w:r>
+        <w:rPr>
+          <w:rFonts w:ascii="Courier New" w:hAnsi="Courier New"/>
+          <w:sz w:val="18"/>
+        </w:rPr>
+        <w:t>├── .env                      SECRET — API keys (NEVER share this)</w:t>
+      </w:r>
+    </w:p>
+    <w:p>
+      <w:r>
+        <w:rPr>
+          <w:rFonts w:ascii="Courier New" w:hAnsi="Courier New"/>
+          <w:sz w:val="18"/>
+        </w:rPr>
+        <w:t>├── requirements.txt          List of Python packages needed</w:t>
+      </w:r>
+    </w:p>
+    <w:p>
+      <w:r>
+        <w:rPr>
+          <w:rFonts w:ascii="Courier New" w:hAnsi="Courier New"/>
+          <w:sz w:val="18"/>
+        </w:rPr>
+        <w:t>├── Dockerfile                For running inside a container</w:t>
+      </w:r>
+    </w:p>
+    <w:p>
+      <w:r>
+        <w:rPr>
+          <w:rFonts w:ascii="Courier New" w:hAnsi="Courier New"/>
+          <w:sz w:val="18"/>
+        </w:rPr>
+        <w:t>├── docker-compose.yml        For running with Docker</w:t>
+      </w:r>
+    </w:p>
+    <w:p>
+      <w:r>
+        <w:rPr>
+          <w:rFonts w:ascii="Courier New" w:hAnsi="Courier New"/>
+          <w:sz w:val="18"/>
+        </w:rPr>
+        <w:t>└── PROJECT_GUIDE.docx        This document</w:t>
+      </w:r>
+    </w:p>
+    <w:p/>
+    <w:p>
+      <w:pPr>
+        <w:pStyle w:val="Heading1"/>
+      </w:pPr>
+      <w:r>
+        <w:rPr>
+          <w:color w:val="1A56DB"/>
+        </w:rPr>
+        <w:t>8. How Each Component Works — Deep Dive</w:t>
+      </w:r>
+    </w:p>
+    <w:p>
+      <w:r>
+        <w:rPr>
+          <w:b/>
+          <w:color w:val="1A56DB"/>
+          <w:sz w:val="24"/>
+        </w:rPr>
+        <w:t>config.py — Settings</w:t>
+      </w:r>
+    </w:p>
+    <w:p>
+      <w:r>
+        <w:rPr>
+          <w:b w:val="0"/>
+          <w:i w:val="0"/>
+        </w:rPr>
+        <w:t>This is the control panel. It loads the .env file that contains your API keys. It also stores numbers like:</w:t>
+      </w:r>
+    </w:p>
+    <w:p>
+      <w:pPr>
+        <w:pStyle w:val="ListBullet"/>
+      </w:pPr>
+      <w:r>
+        <w:t>SCORE_STRONG_THRESHOLD = 70 — if score is 70+, candidate is "Strong Hire."</w:t>
+      </w:r>
+    </w:p>
+    <w:p>
+      <w:pPr>
+        <w:pStyle w:val="ListBullet"/>
+      </w:pPr>
+      <w:r>
+        <w:t>SCORE_WEAK_THRESHOLD = 40 — if score is below 40, it is a "gap."</w:t>
+      </w:r>
+    </w:p>
+    <w:p>
+      <w:pPr>
+        <w:pStyle w:val="ListBullet"/>
+      </w:pPr>
+      <w:r>
+        <w:t>MAX_QUESTIONS_PER_SESSION = 3 — text mode asks at most 3 questions.</w:t>
+      </w:r>
+    </w:p>
+    <w:p>
+      <w:pPr>
+        <w:pStyle w:val="ListBullet"/>
+      </w:pPr>
+      <w:r>
+        <w:t>MAX_FOLLOW_UP_QUESTIONS = 1 — only one follow-up per weak answer.</w:t>
+      </w:r>
+    </w:p>
+    <w:p>
+      <w:pPr>
+        <w:pStyle w:val="ListBullet"/>
+      </w:pPr>
+      <w:r>
+        <w:t>GEMINI_MODEL = "gemini-2.5-flash" — which Gemini model to use.</w:t>
+      </w:r>
+    </w:p>
+    <w:p>
+      <w:r>
+        <w:rPr>
+          <w:b w:val="0"/>
+          <w:i w:val="0"/>
+        </w:rPr>
+        <w:t>To change how the system behaves (e.g., make it stricter or allow more questions), you change numbers in this one file.</w:t>
+      </w:r>
+    </w:p>
+    <w:p/>
+    <w:p>
+      <w:r>
+        <w:rPr>
+          <w:b/>
+          <w:color w:val="1A56DB"/>
+          <w:sz w:val="24"/>
+        </w:rPr>
+        <w:t>llm.py — AI Communication</w:t>
+      </w:r>
+    </w:p>
+    <w:p>
+      <w:r>
+        <w:rPr>
+          <w:b w:val="0"/>
+          <w:i w:val="0"/>
+        </w:rPr>
+        <w:t>This file contains the code that talks to Google Gemini. It has two functions:</w:t>
+      </w:r>
+    </w:p>
+    <w:p>
+      <w:pPr>
+        <w:pStyle w:val="ListBullet"/>
+      </w:pPr>
+      <w:r>
+        <w:t>call_llm() — Sends text to Gemini, gets text back. Used for simple requests like "Generate a question about Python."</w:t>
+      </w:r>
+    </w:p>
+    <w:p>
+      <w:pPr>
+        <w:pStyle w:val="ListBullet"/>
+      </w:pPr>
+      <w:r>
+        <w:t>call_llm_json() — Sends text, expects structured data (JSON) back. Used when the result needs to be organized, like a question set with categories. It also automatically fixes broken JSON using a repair library.</w:t>
+      </w:r>
+    </w:p>
+    <w:p>
+      <w:r>
+        <w:rPr>
+          <w:b w:val="0"/>
+          <w:i w:val="0"/>
+        </w:rPr>
+        <w:t>Every module in the project uses this file to talk to Gemini.</w:t>
+      </w:r>
+    </w:p>
+    <w:p/>
+    <w:p>
+      <w:r>
+        <w:rPr>
+          <w:b/>
+          <w:color w:val="1A56DB"/>
+          <w:sz w:val="24"/>
+        </w:rPr>
+        <w:t>cv_agent.py — CV/Resume Reader</w:t>
+      </w:r>
+    </w:p>
+    <w:p>
+      <w:r>
+        <w:rPr>
+          <w:b w:val="0"/>
+          <w:i w:val="0"/>
+        </w:rPr>
+        <w:t>Takes a resume file (PDF or text). If it is a PDF, it first extracts the text. Then sends the text to Gemini with a prompt like: "Extract the candidate's name, skills, and experience from this resume." Gemini returns structured data: name, list of skills, experience summary. This data is used throughout the rest of the system.</w:t>
+      </w:r>
+    </w:p>
+    <w:p/>
+    <w:p>
+      <w:r>
+        <w:rPr>
+          <w:b/>
+          <w:color w:val="1A56DB"/>
+          <w:sz w:val="24"/>
+        </w:rPr>
+        <w:t>jd_agent.py — Job Description Reader</w:t>
+      </w:r>
+    </w:p>
+    <w:p>
+      <w:r>
+        <w:rPr>
+          <w:b w:val="0"/>
+          <w:i w:val="0"/>
+        </w:rPr>
+        <w:t>Takes the job description text. Sends it to Gemini with a prompt like: "Extract the job title, experience level, and required skills." Returns: job title, role level (junior/mid/senior), required skills list. This is used to compare against the candidate's skills.</w:t>
+      </w:r>
+    </w:p>
+    <w:p/>
+    <w:p>
+      <w:r>
+        <w:rPr>
+          <w:b/>
+          <w:color w:val="1A56DB"/>
+          <w:sz w:val="24"/>
+        </w:rPr>
+        <w:t>question_agent.py — Question Creator</w:t>
+      </w:r>
+    </w:p>
+    <w:p>
+      <w:r>
+        <w:rPr>
+          <w:b w:val="0"/>
+          <w:i w:val="0"/>
+        </w:rPr>
+        <w:t>Two main functions:</w:t>
+      </w:r>
+    </w:p>
+    <w:p>
+      <w:pPr>
+        <w:pStyle w:val="ListBullet"/>
+      </w:pPr>
+      <w:r>
+        <w:t>generate_interview_questions() — Takes the skill gap topics and creates a full structured question set: opening questions (warm-up), technical questions (one per skill), behavioral questions (STAR method), closing questions.</w:t>
+      </w:r>
+    </w:p>
+    <w:p>
+      <w:pPr>
+        <w:pStyle w:val="ListBullet"/>
+      </w:pPr>
+      <w:r>
+        <w:t>generate_position_question() — Creates one single question on the fly during the live interview. The text mode uses this to generate fresh questions dynamically. It considers: the skill to test, the difficulty level (easy/medium/hard), the job title, and whether it is a follow-up.</w:t>
+      </w:r>
+    </w:p>
+    <w:p/>
+    <w:p>
+      <w:r>
+        <w:rPr>
+          <w:b/>
+          <w:color w:val="1A56DB"/>
+          <w:sz w:val="24"/>
+        </w:rPr>
+        <w:t>evaluator.py — Answer Scorer</w:t>
+      </w:r>
+    </w:p>
+    <w:p>
+      <w:r>
+        <w:rPr>
+          <w:b w:val="0"/>
+          <w:i w:val="0"/>
+        </w:rPr>
+        <w:t>This is the "LLM-as-Judge" system. For each answer the candidate gives:</w:t>
+      </w:r>
+    </w:p>
+    <w:p>
+      <w:pPr>
+        <w:pStyle w:val="ListBullet"/>
+      </w:pPr>
+      <w:r>
+        <w:t>Step 1: generate_reference_answer() — Asks Gemini to write a perfect "ideal answer" for the question.</w:t>
+      </w:r>
+    </w:p>
+    <w:p>
+      <w:pPr>
+        <w:pStyle w:val="ListBullet"/>
+      </w:pPr>
+      <w:r>
+        <w:t>Step 2: track_a_evaluate() — Asks Gemini to compare the candidate's answer against the ideal answer. Scores on 4 criteria: technical accuracy (0-25), completeness (0-25), clarity (0-25), relevance (0-25). Total out of 100.</w:t>
+      </w:r>
+    </w:p>
+    <w:p>
+      <w:pPr>
+        <w:pStyle w:val="ListBullet"/>
+      </w:pPr>
+      <w:r>
+        <w:t>Step 3: Runs the evaluation TWICE with criteria in different order. This reduces AI bias (Gemini might favor the first criteria it sees). Averages the two scores.</w:t>
+      </w:r>
+    </w:p>
+    <w:p>
+      <w:pPr>
+        <w:pStyle w:val="ListBullet"/>
+      </w:pPr>
+      <w:r>
+        <w:t>If the candidate's answer is less than 10 words, it automatically scores 0.</w:t>
+      </w:r>
+    </w:p>
+    <w:p>
+      <w:r>
+        <w:rPr>
+          <w:b w:val="0"/>
+          <w:i w:val="0"/>
+        </w:rPr>
+        <w:t>The final result: score (0-100), verdict (strong/weak/gap), feedback, and the ideal answer for reference.</w:t>
+      </w:r>
+    </w:p>
+    <w:p/>
+    <w:p>
+      <w:r>
+        <w:rPr>
+          <w:b/>
+          <w:color w:val="1A56DB"/>
+          <w:sz w:val="24"/>
+        </w:rPr>
+        <w:t>skill_graph.py — Skill Map Builder</w:t>
+      </w:r>
+    </w:p>
+    <w:p>
+      <w:pPr>
+        <w:pStyle w:val="ListBullet"/>
+      </w:pPr>
+      <w:r>
+        <w:t>Loads 1,201 IT skills from the ESCO taxonomy CSV files.</w:t>
+      </w:r>
+    </w:p>
+    <w:p>
+      <w:pPr>
+        <w:pStyle w:val="ListBullet"/>
+      </w:pPr>
+      <w:r>
+        <w:t>Adds modern skills not in ESCO (like Python, React, Docker, Kubernetes, etc.).</w:t>
+      </w:r>
+    </w:p>
+    <w:p>
+      <w:pPr>
+        <w:pStyle w:val="ListBullet"/>
+      </w:pPr>
+      <w:r>
+        <w:t>Builds a graph using NetworkX where skills are connected to related skills.</w:t>
+      </w:r>
+    </w:p>
+    <w:p>
+      <w:pPr>
+        <w:pStyle w:val="ListBullet"/>
+      </w:pPr>
+      <w:r>
+        <w:t>Matches skills using fuzzy logic (so "Java Script" still matches "JavaScript").</w:t>
+      </w:r>
+    </w:p>
+    <w:p>
+      <w:pPr>
+        <w:pStyle w:val="ListBullet"/>
+      </w:pPr>
+      <w:r>
+        <w:t>The gap_analysis() function compares candidate skills vs job skills and returns a list of topics (missing or weak skills) with priority levels.</w:t>
+      </w:r>
+    </w:p>
+    <w:p/>
+    <w:p>
+      <w:r>
+        <w:rPr>
+          <w:b/>
+          <w:color w:val="1A56DB"/>
+          <w:sz w:val="24"/>
+        </w:rPr>
+        <w:t>state.py — Interview State Tracker</w:t>
+      </w:r>
+    </w:p>
+    <w:p>
+      <w:pPr>
+        <w:pStyle w:val="ListBullet"/>
+      </w:pPr>
+      <w:r>
+        <w:t>Tracks each skill's status: pending (not tested), verified_strong (passed), verified_weak (needs follow-up), confirmed_gap (failed).</w:t>
+      </w:r>
+    </w:p>
+    <w:p>
+      <w:pPr>
+        <w:pStyle w:val="ListBullet"/>
+      </w:pPr>
+      <w:r>
+        <w:t>Stores: scores per question, best score, number of questions asked.</w:t>
+      </w:r>
+    </w:p>
+    <w:p>
+      <w:pPr>
+        <w:pStyle w:val="ListBullet"/>
+      </w:pPr>
+      <w:r>
+        <w:t>The record_answer() method updates the status based on the score.</w:t>
+      </w:r>
+    </w:p>
+    <w:p/>
+    <w:p>
+      <w:r>
+        <w:rPr>
+          <w:b/>
+          <w:color w:val="1A56DB"/>
+          <w:sz w:val="24"/>
+        </w:rPr>
+        <w:t>traversal.py — Question Picker</w:t>
+      </w:r>
+    </w:p>
+    <w:p>
+      <w:pPr>
+        <w:pStyle w:val="ListBullet"/>
+      </w:pPr>
+      <w:r>
+        <w:t>Decides which skill to ask about next. Always picks the lowest-scored skill first (adaptive strategy).</w:t>
+      </w:r>
+    </w:p>
+    <w:p>
+      <w:pPr>
+        <w:pStyle w:val="ListBullet"/>
+      </w:pPr>
+      <w:r>
+        <w:t>Prioritizes high-priority skills over low-priority ones.</w:t>
+      </w:r>
+    </w:p>
+    <w:p>
+      <w:pPr>
+        <w:pStyle w:val="ListBullet"/>
+      </w:pPr>
+      <w:r>
+        <w:t>Avoids asking about the same skill twice in a row.</w:t>
+      </w:r>
+    </w:p>
+    <w:p>
+      <w:pPr>
+        <w:pStyle w:val="ListBullet"/>
+      </w:pPr>
+      <w:r>
+        <w:t>The decide_follow_up() function checks if a weak answer (score &lt; 40) needs a follow-up question.</w:t>
+      </w:r>
+    </w:p>
+    <w:p/>
+    <w:p>
+      <w:r>
+        <w:rPr>
+          <w:b/>
+          <w:color w:val="1A56DB"/>
+          <w:sz w:val="24"/>
+        </w:rPr>
+        <w:t>visualize.py — Chart Creator</w:t>
+      </w:r>
+    </w:p>
+    <w:p>
+      <w:pPr>
+        <w:pStyle w:val="ListBullet"/>
+      </w:pPr>
+      <w:r>
+        <w:t>Creates 4 charts: candidate skills, job requirements, skill gaps, and the full skill map.</w:t>
+      </w:r>
+    </w:p>
+    <w:p>
+      <w:pPr>
+        <w:pStyle w:val="ListBullet"/>
+      </w:pPr>
+      <w:r>
+        <w:t>These appear in the Streamlit web app under the Skill Graph tab.</w:t>
+      </w:r>
+    </w:p>
+    <w:p>
+      <w:pPr>
+        <w:pStyle w:val="ListBullet"/>
+      </w:pPr>
+      <w:r>
+        <w:t>Uses Matplotlib and NetworkX for drawing.</w:t>
+      </w:r>
+    </w:p>
+    <w:p/>
+    <w:p>
+      <w:r>
+        <w:rPr>
+          <w:b/>
+          <w:color w:val="1A56DB"/>
+          <w:sz w:val="24"/>
+        </w:rPr>
+        <w:t>interview_loop.py — Text Interview Engine</w:t>
+      </w:r>
+    </w:p>
+    <w:p>
+      <w:r>
+        <w:rPr>
+          <w:b w:val="0"/>
+          <w:i w:val="0"/>
+        </w:rPr>
+        <w:t>This is the engine that runs the text interview. The InterviewLoop class:</w:t>
+      </w:r>
+    </w:p>
+    <w:p>
+      <w:pPr>
+        <w:pStyle w:val="ListBullet"/>
+      </w:pPr>
+      <w:r>
+        <w:t>Initializes with interview topics, CV data, JD data.</w:t>
+      </w:r>
+    </w:p>
+    <w:p>
+      <w:pPr>
+        <w:pStyle w:val="ListBullet"/>
+      </w:pPr>
+      <w:r>
+        <w:t>get_next_question() — Picks the next skill (via traversal.py), creates a question (via question_agent.py), and returns it.</w:t>
+      </w:r>
+    </w:p>
+    <w:p>
+      <w:pPr>
+        <w:pStyle w:val="ListBullet"/>
+      </w:pPr>
+      <w:r>
+        <w:t>submit_answer() — Takes the answer, scores it (via evaluator.py), updates state (via state.py), checks if follow-up is needed (via traversal.py).</w:t>
+      </w:r>
+    </w:p>
+    <w:p>
+      <w:pPr>
+        <w:pStyle w:val="ListBullet"/>
+      </w:pPr>
+      <w:r>
+        <w:t>Keeps going until all skills are tested or MAX_QUESTIONS_PER_SESSION (3) is reached.</w:t>
+      </w:r>
+    </w:p>
+    <w:p>
+      <w:pPr>
+        <w:pStyle w:val="ListBullet"/>
+      </w:pPr>
+      <w:r>
+        <w:t>get_summary() — Collects everything for the report.</w:t>
+      </w:r>
+    </w:p>
+    <w:p/>
+    <w:p>
+      <w:r>
+        <w:rPr>
+          <w:b/>
+          <w:color w:val="1A56DB"/>
+          <w:sz w:val="24"/>
+        </w:rPr>
+        <w:t>generator.py — Report Builder</w:t>
+      </w:r>
+    </w:p>
+    <w:p>
+      <w:pPr>
+        <w:pStyle w:val="ListBullet"/>
+      </w:pPr>
+      <w:r>
+        <w:t>Takes all answers and scores from the InterviewLoop.</w:t>
+      </w:r>
+    </w:p>
+    <w:p>
+      <w:pPr>
+        <w:pStyle w:val="ListBullet"/>
+      </w:pPr>
+      <w:r>
+        <w:t>Computes overall average score.</w:t>
+      </w:r>
+    </w:p>
+    <w:p>
+      <w:pPr>
+        <w:pStyle w:val="ListBullet"/>
+      </w:pPr>
+      <w:r>
+        <w:t>Assigns verdict: Strong Hire (≥70), Weak Hire (40-69), No Hire (&lt;40).</w:t>
+      </w:r>
+    </w:p>
+    <w:p>
+      <w:pPr>
+        <w:pStyle w:val="ListBullet"/>
+      </w:pPr>
+      <w:r>
+        <w:t>Lists strengths: skills where score ≥ 70.</w:t>
+      </w:r>
+    </w:p>
+    <w:p>
+      <w:pPr>
+        <w:pStyle w:val="ListBullet"/>
+      </w:pPr>
+      <w:r>
+        <w:t>Lists gaps: skills where score &lt; 40.</w:t>
+      </w:r>
+    </w:p>
+    <w:p>
+      <w:pPr>
+        <w:pStyle w:val="ListBullet"/>
+      </w:pPr>
+      <w:r>
+        <w:t>Lists development areas: skills where score 40-69.</w:t>
+      </w:r>
+    </w:p>
+    <w:p>
+      <w:pPr>
+        <w:pStyle w:val="ListBullet"/>
+      </w:pPr>
+      <w:r>
+        <w:t>Builds the complete answer log with question, answer, score, and feedback.</w:t>
+      </w:r>
+    </w:p>
+    <w:p>
+      <w:pPr>
+        <w:pStyle w:val="ListBullet"/>
+      </w:pPr>
+      <w:r>
+        <w:t>Returns a dictionary that the web app displays as a formatted report.</w:t>
+      </w:r>
+    </w:p>
+    <w:p/>
+    <w:p>
+      <w:r>
+        <w:rPr>
+          <w:b/>
+          <w:color w:val="1A56DB"/>
+          <w:sz w:val="24"/>
+        </w:rPr>
+        <w:t>run_agent.py — Voice AI Agent</w:t>
+      </w:r>
+    </w:p>
+    <w:p>
+      <w:r>
+        <w:rPr>
+          <w:b w:val="0"/>
+          <w:i w:val="0"/>
+        </w:rPr>
+        <w:t>This is the "person" that speaks during the voice interview. It connects to a LiveKit room and:</w:t>
+      </w:r>
+    </w:p>
+    <w:p>
+      <w:pPr>
+        <w:pStyle w:val="ListBullet"/>
+      </w:pPr>
+      <w:r>
+        <w:t>Greets the candidate warmly, mentioning their name and the job position.</w:t>
+      </w:r>
+    </w:p>
+    <w:p>
+      <w:pPr>
+        <w:pStyle w:val="ListBullet"/>
+      </w:pPr>
+      <w:r>
+        <w:t>Asks "Are you ready to begin?" Waits for a yes/no response.</w:t>
+      </w:r>
+    </w:p>
+    <w:p>
+      <w:pPr>
+        <w:pStyle w:val="ListBullet"/>
+      </w:pPr>
+      <w:r>
+        <w:t>Once ready: asks questions one by one from the pre-loaded list.</w:t>
+      </w:r>
+    </w:p>
+    <w:p>
+      <w:pPr>
+        <w:pStyle w:val="ListBullet"/>
+      </w:pPr>
+      <w:r>
+        <w:t>Uses ElevenLabs TTS to speak each question out loud.</w:t>
+      </w:r>
+    </w:p>
+    <w:p>
+      <w:pPr>
+        <w:pStyle w:val="ListBullet"/>
+      </w:pPr>
+      <w:r>
+        <w:t>Uses Deepgram STT to convert the candidate's spoken answer to text.</w:t>
+      </w:r>
+    </w:p>
+    <w:p>
+      <w:pPr>
+        <w:pStyle w:val="ListBullet"/>
+      </w:pPr>
+      <w:r>
+        <w:t>Uses Gemini dynamically to decide what to say next — it reads the conversation history, checks for off-topic answers, handles warnings, and advances through questions.</w:t>
+      </w:r>
+    </w:p>
+    <w:p>
+      <w:pPr>
+        <w:pStyle w:val="ListBullet"/>
+      </w:pPr>
+      <w:r>
+        <w:t>Off-topic handling: 1st warning = "Please answer directly." 2nd = "I need you to answer." 3rd = "Moving to next question."</w:t>
+      </w:r>
+    </w:p>
+    <w:p>
+      <w:pPr>
+        <w:pStyle w:val="ListBullet"/>
+      </w:pPr>
+      <w:r>
+        <w:t>After all questions: thanks the candidate, says goodbye, saves a transcript to a JSON file.</w:t>
+      </w:r>
+    </w:p>
+    <w:p>
+      <w:pPr>
+        <w:pStyle w:val="ListBullet"/>
+      </w:pPr>
+      <w:r>
+        <w:t>Turn handling: interruptions disabled (AI finishes speaking), endpointing delay 1.5-4 seconds (waits for candidate to finish thinking).</w:t>
+      </w:r>
+    </w:p>
+    <w:p/>
+    <w:p>
+      <w:r>
+        <w:rPr>
+          <w:b/>
+          <w:color w:val="1A56DB"/>
+          <w:sz w:val="24"/>
+        </w:rPr>
+        <w:t>whisper_server.py — Web Server</w:t>
+      </w:r>
+    </w:p>
+    <w:p>
+      <w:r>
+        <w:rPr>
+          <w:b w:val="0"/>
+          <w:i w:val="0"/>
+        </w:rPr>
+        <w:t>A tiny web server that runs on port 18765. It:</w:t>
+      </w:r>
+    </w:p>
+    <w:p>
+      <w:pPr>
+        <w:pStyle w:val="ListBullet"/>
+      </w:pPr>
+      <w:r>
+        <w:t>Serves the client.html page at /livekit.</w:t>
+      </w:r>
+    </w:p>
+    <w:p>
+      <w:pPr>
+        <w:pStyle w:val="ListBullet"/>
+      </w:pPr>
+      <w:r>
+        <w:t>Generates LiveKit access tokens at /token (so the browser can join the room).</w:t>
+      </w:r>
+    </w:p>
+    <w:p>
+      <w:pPr>
+        <w:pStyle w:val="ListBullet"/>
+      </w:pPr>
+      <w:r>
+        <w:t>Saves interview transcripts at /save_transcript.</w:t>
+      </w:r>
+    </w:p>
+    <w:p>
+      <w:pPr>
+        <w:pStyle w:val="ListBullet"/>
+      </w:pPr>
+      <w:r>
+        <w:t>Runs in the background. Starts automatically when you launch the system.</w:t>
+      </w:r>
+    </w:p>
+    <w:p/>
+    <w:p>
+      <w:r>
+        <w:rPr>
+          <w:b/>
+          <w:color w:val="1A56DB"/>
+          <w:sz w:val="24"/>
+        </w:rPr>
+        <w:t>launcher.py — LiveKit Server Manager</w:t>
+      </w:r>
+    </w:p>
+    <w:p>
+      <w:pPr>
+        <w:pStyle w:val="ListBullet"/>
+      </w:pPr>
+      <w:r>
+        <w:t>Checks if the LiveKit server binary exists in the temp folder. If not, tells you to download it.</w:t>
+      </w:r>
+    </w:p>
+    <w:p>
+      <w:pPr>
+        <w:pStyle w:val="ListBullet"/>
+      </w:pPr>
+      <w:r>
+        <w:t>Starts the LiveKit server process with the configuration from livekit.yaml.</w:t>
+      </w:r>
+    </w:p>
+    <w:p>
+      <w:pPr>
+        <w:pStyle w:val="ListBullet"/>
+      </w:pPr>
+      <w:r>
+        <w:t>Waits for the server to be ready (checks port 7880).</w:t>
+      </w:r>
+    </w:p>
+    <w:p>
+      <w:pPr>
+        <w:pStyle w:val="ListBullet"/>
+      </w:pPr>
+      <w:r>
+        <w:t>Starts the web server (whisper_server.py).</w:t>
+      </w:r>
+    </w:p>
+    <w:p>
+      <w:pPr>
+        <w:pStyle w:val="ListBullet"/>
+      </w:pPr>
+      <w:r>
+        <w:t>Passes data (CV, JD, questions) to the agent via environment variables.</w:t>
+      </w:r>
+    </w:p>
+    <w:p>
+      <w:pPr>
+        <w:pStyle w:val="ListBullet"/>
+      </w:pPr>
+      <w:r>
+        <w:t>Returns the URL to open in the browser.</w:t>
+      </w:r>
+    </w:p>
+    <w:p>
+      <w:pPr>
+        <w:pStyle w:val="ListBullet"/>
+      </w:pPr>
+      <w:r>
+        <w:t>Cleans up on exit: stops all processes.</w:t>
+      </w:r>
+    </w:p>
+    <w:p/>
+    <w:p>
+      <w:r>
+        <w:rPr>
+          <w:b/>
+          <w:color w:val="1A56DB"/>
+          <w:sz w:val="24"/>
+        </w:rPr>
+        <w:t>client.html — The Web Page</w:t>
+      </w:r>
+    </w:p>
+    <w:p>
+      <w:r>
+        <w:rPr>
+          <w:b w:val="0"/>
+          <w:i w:val="0"/>
+        </w:rPr>
+        <w:t>This is the page the candidate sees during the voice interview. It shows:</w:t>
+      </w:r>
+    </w:p>
+    <w:p>
+      <w:pPr>
+        <w:pStyle w:val="ListBullet"/>
+      </w:pPr>
+      <w:r>
+        <w:t>A webcam feed (the candidate sees themselves).</w:t>
+      </w:r>
+    </w:p>
+    <w:p>
+      <w:pPr>
+        <w:pStyle w:val="ListBullet"/>
+      </w:pPr>
+      <w:r>
+        <w:t>A transcription box (their speech converted to text in real time).</w:t>
+      </w:r>
+    </w:p>
+    <w:p>
+      <w:pPr>
+        <w:pStyle w:val="ListBullet"/>
+      </w:pPr>
+      <w:r>
+        <w:t>A chat log (the full conversation).</w:t>
+      </w:r>
+    </w:p>
+    <w:p>
+      <w:pPr>
+        <w:pStyle w:val="ListBullet"/>
+      </w:pPr>
+      <w:r>
+        <w:t>The current question (displayed prominently).</w:t>
+      </w:r>
+    </w:p>
+    <w:p>
+      <w:pPr>
+        <w:pStyle w:val="ListBullet"/>
+      </w:pPr>
+      <w:r>
+        <w:t>A "Start Interview" button (click to begin — no auto-connect).</w:t>
+      </w:r>
+    </w:p>
+    <w:p>
+      <w:pPr>
+        <w:pStyle w:val="ListBullet"/>
+      </w:pPr>
+      <w:r>
+        <w:t>An "End Interview" button (click to end the session).</w:t>
+      </w:r>
+    </w:p>
+    <w:p>
+      <w:pPr>
+        <w:pStyle w:val="ListBullet"/>
+      </w:pPr>
+      <w:r>
+        <w:t>The page connects to LiveKit using the livekit-client JavaScript library.</w:t>
+      </w:r>
+    </w:p>
+    <w:p>
+      <w:pPr>
+        <w:pStyle w:val="Heading1"/>
+      </w:pPr>
+      <w:r>
+        <w:rPr>
+          <w:color w:val="1A56DB"/>
+        </w:rPr>
+        <w:t>9. Key Technical Details</w:t>
+      </w:r>
+    </w:p>
+    <w:p>
+      <w:r>
+        <w:rPr>
+          <w:b w:val="0"/>
+          <w:i/>
+        </w:rPr>
+        <w:t>Important numbers and facts to remember:</w:t>
+      </w:r>
+    </w:p>
+    <w:p/>
     <w:p>
       <w:r>
         <w:rPr>
           <w:b/>
           <w:i w:val="0"/>
         </w:rPr>
-        <w:t>Google Gemini (AI Brain)</w:t>
+        <w:t>API Keys:</w:t>
+      </w:r>
+    </w:p>
+    <w:p>
+      <w:pPr>
+        <w:pStyle w:val="ListBullet"/>
+      </w:pPr>
+      <w:r>
+        <w:t>GEMINI_API_KEY — Required for everything. System does not work without it.</w:t>
+      </w:r>
+    </w:p>
+    <w:p>
+      <w:pPr>
+        <w:pStyle w:val="ListBullet"/>
+      </w:pPr>
+      <w:r>
+        <w:t>DEEPGRAM_API_KEY — Required only for voice (LiveKit) mode.</w:t>
+      </w:r>
+    </w:p>
+    <w:p>
+      <w:pPr>
+        <w:pStyle w:val="ListBullet"/>
+      </w:pPr>
+      <w:r>
+        <w:t>ELEVENLABS_API_KEY — Required only for voice (LiveKit) mode.</w:t>
+      </w:r>
+    </w:p>
+    <w:p/>
+    <w:p>
+      <w:r>
+        <w:rPr>
+          <w:b/>
+          <w:i w:val="0"/>
+        </w:rPr>
+        <w:t>Models Used:</w:t>
+      </w:r>
+    </w:p>
+    <w:p>
+      <w:pPr>
+        <w:pStyle w:val="ListBullet"/>
+      </w:pPr>
+      <w:r>
+        <w:t>Gemini: gemini-2.5-flash (config.py default), gemini-2.0-flash (agent fallback). Change via GEMINI_MODEL in .env.</w:t>
+      </w:r>
+    </w:p>
+    <w:p>
+      <w:pPr>
+        <w:pStyle w:val="ListBullet"/>
+      </w:pPr>
+      <w:r>
+        <w:t>Deepgram: nova-3 (best accuracy, set in run_agent.py).</w:t>
+      </w:r>
+    </w:p>
+    <w:p>
+      <w:pPr>
+        <w:pStyle w:val="ListBullet"/>
+      </w:pPr>
+      <w:r>
+        <w:t>ElevenLabs: eleven_flash_v2_5 with streaming_latency=4 (fastest, set in run_agent.py).</w:t>
+      </w:r>
+    </w:p>
+    <w:p/>
+    <w:p>
+      <w:r>
+        <w:rPr>
+          <w:b/>
+          <w:i w:val="0"/>
+        </w:rPr>
+        <w:t>Scoring:</w:t>
+      </w:r>
+    </w:p>
+    <w:p>
+      <w:pPr>
+        <w:pStyle w:val="ListBullet"/>
+      </w:pPr>
+      <w:r>
+        <w:t>Score ≥ 70 = Strong Hire.</w:t>
+      </w:r>
+    </w:p>
+    <w:p>
+      <w:pPr>
+        <w:pStyle w:val="ListBullet"/>
+      </w:pPr>
+      <w:r>
+        <w:t>Score 40-69 = Weak Hire.</w:t>
+      </w:r>
+    </w:p>
+    <w:p>
+      <w:pPr>
+        <w:pStyle w:val="ListBullet"/>
+      </w:pPr>
+      <w:r>
+        <w:t>Score &lt; 40 = No Hire / Gap.</w:t>
+      </w:r>
+    </w:p>
+    <w:p>
+      <w:pPr>
+        <w:pStyle w:val="ListBullet"/>
+      </w:pPr>
+      <w:r>
+        <w:t>Each evaluation runs TWICE and averages the scores.</w:t>
+      </w:r>
+    </w:p>
+    <w:p>
+      <w:pPr>
+        <w:pStyle w:val="ListBullet"/>
+      </w:pPr>
+      <w:r>
+        <w:t>Answers under 10 words = automatic 0.</w:t>
+      </w:r>
+    </w:p>
+    <w:p/>
+    <w:p>
+      <w:r>
+        <w:rPr>
+          <w:b/>
+          <w:i w:val="0"/>
+        </w:rPr>
+        <w:t>Question Limits:</w:t>
+      </w:r>
+    </w:p>
+    <w:p>
+      <w:pPr>
+        <w:pStyle w:val="ListBullet"/>
+      </w:pPr>
+      <w:r>
+        <w:t>Text Mode: maximum 3 questions (set in config.py).</w:t>
+      </w:r>
+    </w:p>
+    <w:p>
+      <w:pPr>
+        <w:pStyle w:val="ListBullet"/>
+      </w:pPr>
+      <w:r>
+        <w:t>LiveKit Mode: maximum 5 questions (set in run_agent.py).</w:t>
+      </w:r>
+    </w:p>
+    <w:p>
+      <w:pPr>
+        <w:pStyle w:val="ListBullet"/>
+      </w:pPr>
+      <w:r>
+        <w:t>Follow-ups: maximum 1 per skill.</w:t>
+      </w:r>
+    </w:p>
+    <w:p/>
+    <w:p>
+      <w:r>
+        <w:rPr>
+          <w:b/>
+          <w:i w:val="0"/>
+        </w:rPr>
+        <w:t>Ports Used:</w:t>
+      </w:r>
+    </w:p>
+    <w:p>
+      <w:pPr>
+        <w:pStyle w:val="ListBullet"/>
+      </w:pPr>
+      <w:r>
+        <w:t>LiveKit server: port 7880.</w:t>
+      </w:r>
+    </w:p>
+    <w:p>
+      <w:pPr>
+        <w:pStyle w:val="ListBullet"/>
+      </w:pPr>
+      <w:r>
+        <w:t>Web server: port 18765.</w:t>
+      </w:r>
+    </w:p>
+    <w:p/>
+    <w:p>
+      <w:r>
+        <w:rPr>
+          <w:b/>
+          <w:i w:val="0"/>
+        </w:rPr>
+        <w:t>Turn Handling (Voice):</w:t>
+      </w:r>
+    </w:p>
+    <w:p>
+      <w:pPr>
+        <w:pStyle w:val="ListBullet"/>
+      </w:pPr>
+      <w:r>
+        <w:t>Interruptions: DISABLED — the AI always finishes speaking.</w:t>
+      </w:r>
+    </w:p>
+    <w:p>
+      <w:pPr>
+        <w:pStyle w:val="ListBullet"/>
+      </w:pPr>
+      <w:r>
+        <w:t>Endpointing delay: 1.5 seconds minimum, 4 seconds maximum — the system waits this long after you stop speaking before responding.</w:t>
+      </w:r>
+    </w:p>
+    <w:p/>
+    <w:p>
+      <w:r>
+        <w:rPr>
+          <w:b/>
+          <w:i w:val="0"/>
+        </w:rPr>
+        <w:t>Transcripts Saved:</w:t>
+      </w:r>
+    </w:p>
+    <w:p>
+      <w:pPr>
+        <w:pStyle w:val="ListBullet"/>
+      </w:pPr>
+      <w:r>
+        <w:t>Voice interviews: saved to temp folder as JSON files.</w:t>
+      </w:r>
+    </w:p>
+    <w:p>
+      <w:pPr>
+        <w:pStyle w:val="ListBullet"/>
+      </w:pPr>
+      <w:r>
+        <w:t>File format: session name, questions asked, full conversation with timestamps.</w:t>
+      </w:r>
+    </w:p>
+    <w:p>
+      <w:pPr>
+        <w:pStyle w:val="Heading1"/>
+      </w:pPr>
+      <w:r>
+        <w:rPr>
+          <w:color w:val="1A56DB"/>
+        </w:rPr>
+        <w:t>10. Glossary — Hard Words Explained</w:t>
+      </w:r>
+    </w:p>
+    <w:p/>
+    <w:p>
+      <w:r>
+        <w:rPr>
+          <w:b/>
+        </w:rPr>
+        <w:t xml:space="preserve">API Key: </w:t>
+      </w:r>
+      <w:r>
+        <w:t>A secret password that lets your program use a service like Gemini or Deepgram. Keep it private.</w:t>
+      </w:r>
+    </w:p>
+    <w:p>
+      <w:r>
+        <w:rPr>
+          <w:b/>
+        </w:rPr>
+        <w:t xml:space="preserve">ESCO: </w:t>
+      </w:r>
+      <w:r>
+        <w:t>European database of 1,201 IT skills. The system uses it as a dictionary of all possible skills.</w:t>
+      </w:r>
+    </w:p>
+    <w:p>
+      <w:r>
+        <w:rPr>
+          <w:b/>
+        </w:rPr>
+        <w:t xml:space="preserve">Gemini: </w:t>
+      </w:r>
+      <w:r>
+        <w:t>Google's AI model (like ChatGPT). The brain of the system.</w:t>
+      </w:r>
+    </w:p>
+    <w:p>
+      <w:r>
+        <w:rPr>
+          <w:b/>
+        </w:rPr>
+        <w:t xml:space="preserve">STT (Speech-to-Text): </w:t>
+      </w:r>
+      <w:r>
+        <w:t>Technology that listens to speech and writes it as text. Deepgram does this.</w:t>
+      </w:r>
+    </w:p>
+    <w:p>
+      <w:r>
+        <w:rPr>
+          <w:b/>
+        </w:rPr>
+        <w:t xml:space="preserve">TTS (Text-to-Speech): </w:t>
+      </w:r>
+      <w:r>
+        <w:t>Technology that reads text out loud. ElevenLabs does this.</w:t>
+      </w:r>
+    </w:p>
+    <w:p>
+      <w:r>
+        <w:rPr>
+          <w:b/>
+        </w:rPr>
+        <w:t xml:space="preserve">LiveKit: </w:t>
+      </w:r>
+      <w:r>
+        <w:t>An open-source platform for real-time voice/video calls. Like a private Zoom.</w:t>
+      </w:r>
+    </w:p>
+    <w:p>
+      <w:r>
+        <w:rPr>
+          <w:b/>
+        </w:rPr>
+        <w:t xml:space="preserve">WebRTC: </w:t>
+      </w:r>
+      <w:r>
+        <w:t>Technology that lets web browsers do real-time audio/video without extra software.</w:t>
+      </w:r>
+    </w:p>
+    <w:p>
+      <w:r>
+        <w:rPr>
+          <w:b/>
+        </w:rPr>
+        <w:t xml:space="preserve">VAD (Voice Activity Detection): </w:t>
+      </w:r>
+      <w:r>
+        <w:t>Detects when someone is speaking vs silent. Helps the system listen at the right time.</w:t>
+      </w:r>
+    </w:p>
+    <w:p>
+      <w:r>
+        <w:rPr>
+          <w:b/>
+        </w:rPr>
+        <w:t xml:space="preserve">Endpointing: </w:t>
+      </w:r>
+      <w:r>
+        <w:t>Deciding when the person has finished speaking. If they pause, is it a thinking pause or are they done?</w:t>
+      </w:r>
+    </w:p>
+    <w:p>
+      <w:r>
+        <w:rPr>
+          <w:b/>
+        </w:rPr>
+        <w:t xml:space="preserve">JSON: </w:t>
+      </w:r>
+      <w:r>
+        <w:t>A structured way to organize data so computers can read it. Like a form with labeled fields.</w:t>
+      </w:r>
+    </w:p>
+    <w:p>
+      <w:r>
+        <w:rPr>
+          <w:b/>
+        </w:rPr>
+        <w:t xml:space="preserve">NetworkX: </w:t>
+      </w:r>
+      <w:r>
+        <w:t>A Python library for creating graphs — maps of connected things.</w:t>
+      </w:r>
+    </w:p>
+    <w:p>
+      <w:r>
+        <w:rPr>
+          <w:b/>
+        </w:rPr>
+        <w:t xml:space="preserve">STAR Method: </w:t>
+      </w:r>
+      <w:r>
+        <w:t>A way to answer behavioral interview questions: Situation, Task, Action, Result.</w:t>
+      </w:r>
+    </w:p>
+    <w:p>
+      <w:r>
+        <w:rPr>
+          <w:b/>
+        </w:rPr>
+        <w:t xml:space="preserve">Streamlit: </w:t>
+      </w:r>
+      <w:r>
+        <w:t>A tool that turns Python code into a web page automatically.</w:t>
+      </w:r>
+    </w:p>
+    <w:p>
+      <w:r>
+        <w:rPr>
+          <w:b/>
+        </w:rPr>
+        <w:t xml:space="preserve">LLM-as-Judge: </w:t>
+      </w:r>
+      <w:r>
+        <w:t>Using AI (LLM) to evaluate answers instead of a human. The LLM scores answers against criteria.</w:t>
+      </w:r>
+    </w:p>
+    <w:p>
+      <w:r>
+        <w:rPr>
+          <w:b/>
+        </w:rPr>
+        <w:t xml:space="preserve">Fuzzy Matching: </w:t>
+      </w:r>
+      <w:r>
+        <w:t>Finding matches even when spellings are slightly different (e.g., "Java Script" matches "JavaScript").</w:t>
+      </w:r>
+    </w:p>
+    <w:p>
+      <w:r>
+        <w:rPr>
+          <w:b/>
+        </w:rPr>
+        <w:t xml:space="preserve">Taxonomy: </w:t>
+      </w:r>
+      <w:r>
+        <w:t>A structured classification system. ESCO is a taxonomy of skills.</w:t>
+      </w:r>
+    </w:p>
+    <w:p>
+      <w:pPr>
+        <w:pStyle w:val="Heading1"/>
+      </w:pPr>
+      <w:r>
+        <w:rPr>
+          <w:color w:val="1A56DB"/>
+        </w:rPr>
+        <w:t>11. How to Present This to Your Supervisor</w:t>
+      </w:r>
+    </w:p>
+    <w:p>
+      <w:r>
+        <w:rPr>
+          <w:b w:val="0"/>
+          <w:i/>
+        </w:rPr>
+        <w:t>Here is a suggested 5-minute explanation flow:</w:t>
+      </w:r>
+    </w:p>
+    <w:p/>
+    <w:p>
+      <w:r>
+        <w:rPr>
+          <w:b/>
+          <w:i w:val="0"/>
+        </w:rPr>
+        <w:t>Minute 1 — The Problem:</w:t>
       </w:r>
     </w:p>
     <w:p>
@@ -716,16 +2804,17 @@
           <w:b w:val="0"/>
           <w:i w:val="0"/>
         </w:rPr>
-        <w:t>This is the "brain" of the system. Gemini reads the CV and job description, creates questions, evaluates answers, and runs the voice conversation. Everything smart that happens is Gemini.</w:t>
-      </w:r>
-    </w:p>
+        <w:t>"Technical interviews take a lot of time and human effort. Results can be inconsistent because different interviewers ask different questions. InterviewAI solves this by using AI to conduct consistent, objective interviews automatically."</w:t>
+      </w:r>
+    </w:p>
+    <w:p/>
     <w:p>
       <w:r>
         <w:rPr>
           <w:b/>
           <w:i w:val="0"/>
         </w:rPr>
-        <w:t>LiveKit (Video/Voice Platform)</w:t>
+        <w:t>Minute 2 — What It Does:</w:t>
       </w:r>
     </w:p>
     <w:p>
@@ -734,16 +2823,17 @@
           <w:b w:val="0"/>
           <w:i w:val="0"/>
         </w:rPr>
-        <w:t>Think of this like a private Zoom that runs on your own computer. It handles the real-time connection between the candidate's browser and the AI agent.</w:t>
-      </w:r>
-    </w:p>
+        <w:t>"You upload a CV and a Job Description. The system reads both using Google Gemini, builds a skill graph from 1,201 skills, identifies gaps, generates targeted questions, conducts the interview (text or voice), scores each answer, and produces a final hire/don't hire report."</w:t>
+      </w:r>
+    </w:p>
+    <w:p/>
     <w:p>
       <w:r>
         <w:rPr>
           <w:b/>
           <w:i w:val="0"/>
         </w:rPr>
-        <w:t>Deepgram (Speech-to-Text)</w:t>
+        <w:t>Minute 3 — The Two Modes:</w:t>
       </w:r>
     </w:p>
     <w:p>
@@ -752,16 +2842,17 @@
           <w:b w:val="0"/>
           <w:i w:val="0"/>
         </w:rPr>
-        <w:t>Deepgram listens to what the candidate says and converts it into text. It uses the "Nova-3" model — their most accurate one. Like supercharged YouTube captions.</w:t>
-      </w:r>
-    </w:p>
+        <w:t>"Text mode: candidate types answers, AI scores them, max 3 questions. Voice mode: AI speaks using ElevenLabs, candidate speaks, Deepgram converts speech to text, Gemini runs the conversation, max 5 questions."</w:t>
+      </w:r>
+    </w:p>
+    <w:p/>
     <w:p>
       <w:r>
         <w:rPr>
           <w:b/>
           <w:i w:val="0"/>
         </w:rPr>
-        <w:t>ElevenLabs (Text-to-Speech)</w:t>
+        <w:t>Minute 4 — The Technology:</w:t>
       </w:r>
     </w:p>
     <w:p>
@@ -770,16 +2861,17 @@
           <w:b w:val="0"/>
           <w:i w:val="0"/>
         </w:rPr>
-        <w:t>ElevenLabs takes the AI's text and converts it into spoken words that sound like a real human. Uses the "Flash v2.5" model — optimized for speed.</w:t>
-      </w:r>
-    </w:p>
+        <w:t>"Google Gemini is the brain. LiveKit handles the video/voice connection like a private Zoom. Deepgram listens and converts speech to text. ElevenLabs speaks the AI's text out loud. ESCO provides the skill database. All code is in Python using Streamlit for the web interface."</w:t>
+      </w:r>
+    </w:p>
+    <w:p/>
     <w:p>
       <w:r>
         <w:rPr>
           <w:b/>
           <w:i w:val="0"/>
         </w:rPr>
-        <w:t>ESCO (Skill Database)</w:t>
+        <w:t>Minute 5 — The Results:</w:t>
       </w:r>
     </w:p>
     <w:p>
@@ -788,929 +2880,17 @@
           <w:b w:val="0"/>
           <w:i w:val="0"/>
         </w:rPr>
-        <w:t>A big European-standard database of 1,201 IT skills. The system uses this to make a "map" of all IT skills and find gaps in the candidate's knowledge.</w:t>
-      </w:r>
-    </w:p>
-    <w:p>
-      <w:pPr>
-        <w:pStyle w:val="Heading1"/>
-      </w:pPr>
-      <w:r>
-        <w:rPr>
-          <w:color w:val="1A56DB"/>
-        </w:rPr>
-        <w:t>7. The File Structure — Every File Explained</w:t>
-      </w:r>
-    </w:p>
-    <w:p>
-      <w:r>
-        <w:rPr>
-          <w:b w:val="0"/>
-          <w:i w:val="0"/>
-        </w:rPr>
-        <w:t>The code is organized inside a folder called "core/". Here is every file and what it does:</w:t>
+        <w:t>"Output is a full report with: overall score (0-100), verdict (Strong Hire/Weak Hire/No Hire), per-skill breakdown, strengths, gaps, development areas, and complete answer log. Everything is automated — from upload to final report."</w:t>
       </w:r>
     </w:p>
     <w:p/>
-    <w:p>
-      <w:r>
-        <w:rPr>
-          <w:b/>
-          <w:i w:val="0"/>
-        </w:rPr>
-        <w:t>Core Files (inside core/ folder):</w:t>
-      </w:r>
-    </w:p>
     <w:p>
       <w:r>
         <w:rPr>
           <w:b w:val="0"/>
           <w:i/>
         </w:rPr>
-        <w:t>config.py</w:t>
-      </w:r>
-    </w:p>
-    <w:p>
-      <w:r>
-        <w:rPr>
-          <w:b w:val="0"/>
-          <w:i w:val="0"/>
-        </w:rPr>
-        <w:t>The settings file. It loads your API keys from the .env file and stores all the numbers the system uses — like what counts as a "pass" (score 70+) and a "fail" (score below 40). If you want to change how strict the interview is, you change numbers here.</w:t>
-      </w:r>
-    </w:p>
-    <w:p>
-      <w:r>
-        <w:rPr>
-          <w:b w:val="0"/>
-          <w:i/>
-        </w:rPr>
-        <w:t>llm.py</w:t>
-      </w:r>
-    </w:p>
-    <w:p>
-      <w:r>
-        <w:rPr>
-          <w:b w:val="0"/>
-          <w:i w:val="0"/>
-        </w:rPr>
-        <w:t>The communication module. This file contains the code that talks to Google Gemini. Two functions: call_llm() sends text and gets text back; call_llm_json() sends text and expects a structured answer (JSON) back. It also auto-fixes broken JSON using a repair library.</w:t>
-      </w:r>
-    </w:p>
-    <w:p>
-      <w:r>
-        <w:rPr>
-          <w:b w:val="0"/>
-          <w:i/>
-        </w:rPr>
-        <w:t>agents/ folder (3 files):</w:t>
-      </w:r>
-    </w:p>
-    <w:p>
-      <w:r>
-        <w:rPr>
-          <w:b w:val="0"/>
-          <w:i w:val="0"/>
-        </w:rPr>
-        <w:t>This folder handles reading inputs and creating questions.</w:t>
-      </w:r>
-    </w:p>
-    <w:p>
-      <w:pPr>
-        <w:pStyle w:val="ListBullet"/>
-      </w:pPr>
-      <w:r>
-        <w:t>cv_agent.py — Reads the CV/Resume. If it's a PDF, it extracts the text first. Then sends it to Gemini to pull out: candidate name, skills, and experience summary.</w:t>
-      </w:r>
-    </w:p>
-    <w:p>
-      <w:pPr>
-        <w:pStyle w:val="ListBullet"/>
-      </w:pPr>
-      <w:r>
-        <w:t>jd_agent.py — Reads the Job Description. Sends to Gemini to extract: job title, experience level (junior/mid/senior), and required skills.</w:t>
-      </w:r>
-    </w:p>
-    <w:p>
-      <w:pPr>
-        <w:pStyle w:val="ListBullet"/>
-      </w:pPr>
-      <w:r>
-        <w:t>question_agent.py — Creates interview questions. Takes the skill gaps and generates: opening questions, technical questions, behavioral questions (STAR), and closing questions.</w:t>
-      </w:r>
-    </w:p>
-    <w:p>
-      <w:r>
-        <w:rPr>
-          <w:b w:val="0"/>
-          <w:i/>
-        </w:rPr>
-        <w:t>evaluator/ folder (1 file):</w:t>
-      </w:r>
-    </w:p>
-    <w:p>
-      <w:r>
-        <w:rPr>
-          <w:b w:val="0"/>
-          <w:i w:val="0"/>
-        </w:rPr>
-        <w:t>The scoring engine. For each answer the candidate gives, Gemini first creates an "ideal answer," then compares the candidate's answer against it. It scores on 4 criteria: technical accuracy, completeness, clarity, and relevance. It does this twice with criteria in different order to be fair, then averages the two scores.</w:t>
-      </w:r>
-    </w:p>
-    <w:p>
-      <w:r>
-        <w:rPr>
-          <w:b w:val="0"/>
-          <w:i/>
-        </w:rPr>
-        <w:t>graph/ folder (4 files):</w:t>
-      </w:r>
-    </w:p>
-    <w:p>
-      <w:r>
-        <w:rPr>
-          <w:b w:val="0"/>
-          <w:i w:val="0"/>
-        </w:rPr>
-        <w:t>This folder manages the skill database and tracks progress.</w:t>
-      </w:r>
-    </w:p>
-    <w:p>
-      <w:pPr>
-        <w:pStyle w:val="ListBullet"/>
-      </w:pPr>
-      <w:r>
-        <w:t>skill_graph.py — Builds a map of 1,201 IT skills from ESCO data. Adds modern skills like Python and React that aren't in the standard database. Can match skill names even if spelled slightly differently.</w:t>
-      </w:r>
-    </w:p>
-    <w:p>
-      <w:pPr>
-        <w:pStyle w:val="ListBullet"/>
-      </w:pPr>
-      <w:r>
-        <w:t>state.py — Tracks each skill during the interview. Stores: status (pending/verified/gap), scores, how many questions asked, best score.</w:t>
-      </w:r>
-    </w:p>
-    <w:p>
-      <w:pPr>
-        <w:pStyle w:val="ListBullet"/>
-      </w:pPr>
-      <w:r>
-        <w:t>traversal.py — Decides which skill to ask about next. Always picks the lowest-scored skill first. Also decides if a weak answer needs a follow-up question.</w:t>
-      </w:r>
-    </w:p>
-    <w:p>
-      <w:pPr>
-        <w:pStyle w:val="ListBullet"/>
-      </w:pPr>
-      <w:r>
-        <w:t>visualize.py — Creates charts showing the candidate's skills, job requirements, gaps, and full skill map. These appear in the web app.</w:t>
-      </w:r>
-    </w:p>
-    <w:p>
-      <w:r>
-        <w:rPr>
-          <w:b w:val="0"/>
-          <w:i/>
-        </w:rPr>
-        <w:t>pipeline/ folder (1 file):</w:t>
-      </w:r>
-    </w:p>
-    <w:p>
-      <w:r>
-        <w:rPr>
-          <w:b w:val="0"/>
-          <w:i w:val="0"/>
-        </w:rPr>
-        <w:t>This is the "brain" that runs the text interview. The interview_loop.py file runs the cycle: pick next skill → generate question → show question → collect answer → score it → update progress → repeat. Stops after 3 questions or all skills tested.</w:t>
-      </w:r>
-    </w:p>
-    <w:p>
-      <w:r>
-        <w:rPr>
-          <w:b w:val="0"/>
-          <w:i/>
-        </w:rPr>
-        <w:t>report/ folder (1 file):</w:t>
-      </w:r>
-    </w:p>
-    <w:p>
-      <w:r>
-        <w:rPr>
-          <w:b w:val="0"/>
-          <w:i w:val="0"/>
-        </w:rPr>
-        <w:t>Creates the final report. Takes all answers and scores, calculates overall average, assigns verdict (Strong Hire ≥70, Weak Hire 40-69, No Hire &lt;40), lists strengths and gaps, and builds the complete report with answer log.</w:t>
-      </w:r>
-    </w:p>
-    <w:p>
-      <w:r>
-        <w:rPr>
-          <w:b w:val="0"/>
-          <w:i/>
-        </w:rPr>
-        <w:t>livekit/ folder (5 files):</w:t>
-      </w:r>
-    </w:p>
-    <w:p>
-      <w:r>
-        <w:rPr>
-          <w:b w:val="0"/>
-          <w:i w:val="0"/>
-        </w:rPr>
-        <w:t>This folder handles the voice interview mode.</w:t>
-      </w:r>
-    </w:p>
-    <w:p>
-      <w:pPr>
-        <w:pStyle w:val="ListBullet"/>
-      </w:pPr>
-      <w:r>
-        <w:t>run_agent.py — The AI voice agent. Connects to LiveKit, uses Gemini to run the interview: greeting, ready check, questions, off-topic warnings, auto-end. Speaks via ElevenLabs, listens via Deepgram. Saves transcript at the end.</w:t>
-      </w:r>
-    </w:p>
-    <w:p>
-      <w:pPr>
-        <w:pStyle w:val="ListBullet"/>
-      </w:pPr>
-      <w:r>
-        <w:t>whisper_server.py — A tiny web server (port 18765). Serves the voice interview web page (client.html). Generates access tokens so the browser can connect to LiveKit.</w:t>
-      </w:r>
-    </w:p>
-    <w:p>
-      <w:pPr>
-        <w:pStyle w:val="ListBullet"/>
-      </w:pPr>
-      <w:r>
-        <w:t>launcher.py — Starts and manages the LiveKit server. Checks if the server binary exists, starts it, and waits for it to be ready. Shuts everything down cleanly on exit.</w:t>
-      </w:r>
-    </w:p>
-    <w:p>
-      <w:pPr>
-        <w:pStyle w:val="ListBullet"/>
-      </w:pPr>
-      <w:r>
-        <w:t>client.html — The web page the candidate sees during voice interview. Shows: webcam feed, real-time transcription, chat log, current question. Has a "Start Interview" button that requests camera and microphone access.</w:t>
-      </w:r>
-    </w:p>
-    <w:p>
-      <w:pPr>
-        <w:pStyle w:val="ListBullet"/>
-      </w:pPr>
-      <w:r>
-        <w:t>livekit.yaml — Configuration file for the LiveKit server. Defines ports, API keys, and logging settings.</w:t>
-      </w:r>
-    </w:p>
-    <w:p>
-      <w:r>
-        <w:rPr>
-          <w:b/>
-          <w:i w:val="0"/>
-        </w:rPr>
-        <w:t>Root File:</w:t>
-      </w:r>
-    </w:p>
-    <w:p>
-      <w:r>
-        <w:rPr>
-          <w:b w:val="0"/>
-          <w:i w:val="0"/>
-        </w:rPr>
-        <w:t>app.py — The main application. Run this with "streamlit run app.py" to start everything. It shows the 6-step process in a web browser.</w:t>
-      </w:r>
-    </w:p>
-    <w:p>
-      <w:pPr>
-        <w:pStyle w:val="Heading1"/>
-      </w:pPr>
-      <w:r>
-        <w:rPr>
-          <w:color w:val="1A56DB"/>
-        </w:rPr>
-        <w:t>8. Glossary — Hard Words Explained Simply</w:t>
-      </w:r>
-    </w:p>
-    <w:p/>
-    <w:p>
-      <w:r>
-        <w:rPr>
-          <w:b/>
-          <w:i w:val="0"/>
-        </w:rPr>
-        <w:t>API Key</w:t>
-      </w:r>
-    </w:p>
-    <w:p>
-      <w:r>
-        <w:rPr>
-          <w:b w:val="0"/>
-          <w:i w:val="0"/>
-        </w:rPr>
-        <w:t>A secret password that lets the system use a service like Gemini, Deepgram, or ElevenLabs. You get these from the service's website.</w:t>
-      </w:r>
-    </w:p>
-    <w:p>
-      <w:r>
-        <w:rPr>
-          <w:b/>
-          <w:i w:val="0"/>
-        </w:rPr>
-        <w:t>ESCO Taxonomy</w:t>
-      </w:r>
-    </w:p>
-    <w:p>
-      <w:r>
-        <w:rPr>
-          <w:b w:val="0"/>
-          <w:i w:val="0"/>
-        </w:rPr>
-        <w:t>A big list of 1,201 IT skills created by the European Union. The system uses this as a dictionary to understand what skills exist and how they relate to each other.</w:t>
-      </w:r>
-    </w:p>
-    <w:p>
-      <w:r>
-        <w:rPr>
-          <w:b/>
-          <w:i w:val="0"/>
-        </w:rPr>
-        <w:t>Gemini</w:t>
-      </w:r>
-    </w:p>
-    <w:p>
-      <w:r>
-        <w:rPr>
-          <w:b w:val="0"/>
-          <w:i w:val="0"/>
-        </w:rPr>
-        <w:t>Google's AI (like ChatGPT). This is the "brain" that reads, thinks, and makes decisions.</w:t>
-      </w:r>
-    </w:p>
-    <w:p>
-      <w:r>
-        <w:rPr>
-          <w:b/>
-          <w:i w:val="0"/>
-        </w:rPr>
-        <w:t>STT (Speech-to-Text)</w:t>
-      </w:r>
-    </w:p>
-    <w:p>
-      <w:r>
-        <w:rPr>
-          <w:b w:val="0"/>
-          <w:i w:val="0"/>
-        </w:rPr>
-        <w:t>Technology that listens to spoken words and writes them down as text. Deepgram does this.</w:t>
-      </w:r>
-    </w:p>
-    <w:p>
-      <w:r>
-        <w:rPr>
-          <w:b/>
-          <w:i w:val="0"/>
-        </w:rPr>
-        <w:t>TTS (Text-to-Speech)</w:t>
-      </w:r>
-    </w:p>
-    <w:p>
-      <w:r>
-        <w:rPr>
-          <w:b w:val="0"/>
-          <w:i w:val="0"/>
-        </w:rPr>
-        <w:t>Technology that reads text out loud in a human-like voice. ElevenLabs does this.</w:t>
-      </w:r>
-    </w:p>
-    <w:p>
-      <w:r>
-        <w:rPr>
-          <w:b/>
-          <w:i w:val="0"/>
-        </w:rPr>
-        <w:t>LiveKit</w:t>
-      </w:r>
-    </w:p>
-    <w:p>
-      <w:r>
-        <w:rPr>
-          <w:b w:val="0"/>
-          <w:i w:val="0"/>
-        </w:rPr>
-        <w:t>An open-source platform for real-time voice/video (like Zoom). Runs on your computer.</w:t>
-      </w:r>
-    </w:p>
-    <w:p>
-      <w:r>
-        <w:rPr>
-          <w:b/>
-          <w:i w:val="0"/>
-        </w:rPr>
-        <w:t>WebRTC</w:t>
-      </w:r>
-    </w:p>
-    <w:p>
-      <w:r>
-        <w:rPr>
-          <w:b w:val="0"/>
-          <w:i w:val="0"/>
-        </w:rPr>
-        <w:t>The technology that lets web browsers do real-time audio/video calls without installing extra software.</w:t>
-      </w:r>
-    </w:p>
-    <w:p>
-      <w:r>
-        <w:rPr>
-          <w:b/>
-          <w:i w:val="0"/>
-        </w:rPr>
-        <w:t>VAD (Voice Activity Detection)</w:t>
-      </w:r>
-    </w:p>
-    <w:p>
-      <w:r>
-        <w:rPr>
-          <w:b w:val="0"/>
-          <w:i w:val="0"/>
-        </w:rPr>
-        <w:t>Technology that detects when a person is speaking vs when they are silent. Helps the system know when to listen and when to respond.</w:t>
-      </w:r>
-    </w:p>
-    <w:p>
-      <w:r>
-        <w:rPr>
-          <w:b/>
-          <w:i w:val="0"/>
-        </w:rPr>
-        <w:t>Endpointing</w:t>
-      </w:r>
-    </w:p>
-    <w:p>
-      <w:r>
-        <w:rPr>
-          <w:b w:val="0"/>
-          <w:i w:val="0"/>
-        </w:rPr>
-        <w:t>Deciding when the person has finished speaking. If they pause for 2 seconds, is it a thinking pause or are they done? The system waits 1.5-4 seconds to be sure.</w:t>
-      </w:r>
-    </w:p>
-    <w:p>
-      <w:r>
-        <w:rPr>
-          <w:b/>
-          <w:i w:val="0"/>
-        </w:rPr>
-        <w:t>JSON</w:t>
-      </w:r>
-    </w:p>
-    <w:p>
-      <w:r>
-        <w:rPr>
-          <w:b w:val="0"/>
-          <w:i w:val="0"/>
-        </w:rPr>
-        <w:t>A way to organize data so computers can read it. Like a structured form with labeled fields.</w:t>
-      </w:r>
-    </w:p>
-    <w:p>
-      <w:r>
-        <w:rPr>
-          <w:b/>
-          <w:i w:val="0"/>
-        </w:rPr>
-        <w:t>NetworkX</w:t>
-      </w:r>
-    </w:p>
-    <w:p>
-      <w:r>
-        <w:rPr>
-          <w:b w:val="0"/>
-          <w:i w:val="0"/>
-        </w:rPr>
-        <w:t>A Python library that creates and manages graphs — maps of connected things (like skills linked to related skills).</w:t>
-      </w:r>
-    </w:p>
-    <w:p>
-      <w:r>
-        <w:rPr>
-          <w:b/>
-          <w:i w:val="0"/>
-        </w:rPr>
-        <w:t>Star Method</w:t>
-      </w:r>
-    </w:p>
-    <w:p>
-      <w:r>
-        <w:rPr>
-          <w:b w:val="0"/>
-          <w:i w:val="0"/>
-        </w:rPr>
-        <w:t>A way to answer behavioral questions: describe the Situation, the Task, what Action you took, and the Result.</w:t>
-      </w:r>
-    </w:p>
-    <w:p>
-      <w:r>
-        <w:rPr>
-          <w:b/>
-          <w:i w:val="0"/>
-        </w:rPr>
-        <w:t>Streamlit</w:t>
-      </w:r>
-    </w:p>
-    <w:p>
-      <w:r>
-        <w:rPr>
-          <w:b w:val="0"/>
-          <w:i w:val="0"/>
-        </w:rPr>
-        <w:t>A tool that turns Python code into a web page. The whole app runs on Streamlit.</w:t>
-      </w:r>
-    </w:p>
-    <w:p>
-      <w:pPr>
-        <w:pStyle w:val="Heading1"/>
-      </w:pPr>
-      <w:r>
-        <w:rPr>
-          <w:color w:val="1A56DB"/>
-        </w:rPr>
-        <w:t>9. Quick Reference Card</w:t>
-      </w:r>
-    </w:p>
-    <w:p/>
-    <w:p>
-      <w:r>
-        <w:rPr>
-          <w:b/>
-          <w:i w:val="0"/>
-        </w:rPr>
-        <w:t>Where is everything?</w:t>
-      </w:r>
-    </w:p>
-    <w:p>
-      <w:pPr>
-        <w:pStyle w:val="ListBullet"/>
-      </w:pPr>
-      <w:r>
-        <w:t>Main app: InterviewAI/app.py</w:t>
-      </w:r>
-    </w:p>
-    <w:p>
-      <w:pPr>
-        <w:pStyle w:val="ListBullet"/>
-      </w:pPr>
-      <w:r>
-        <w:t>Settings: InterviewAI/core/config.py</w:t>
-      </w:r>
-    </w:p>
-    <w:p>
-      <w:pPr>
-        <w:pStyle w:val="ListBullet"/>
-      </w:pPr>
-      <w:r>
-        <w:t>AI communication: InterviewAI/core/llm.py</w:t>
-      </w:r>
-    </w:p>
-    <w:p>
-      <w:pPr>
-        <w:pStyle w:val="ListBullet"/>
-      </w:pPr>
-      <w:r>
-        <w:t>CV parser: InterviewAI/core/agents/cv_agent.py</w:t>
-      </w:r>
-    </w:p>
-    <w:p>
-      <w:pPr>
-        <w:pStyle w:val="ListBullet"/>
-      </w:pPr>
-      <w:r>
-        <w:t>JD parser: InterviewAI/core/agents/jd_agent.py</w:t>
-      </w:r>
-    </w:p>
-    <w:p>
-      <w:pPr>
-        <w:pStyle w:val="ListBullet"/>
-      </w:pPr>
-      <w:r>
-        <w:t>Question generator: InterviewAI/core/agents/question_agent.py</w:t>
-      </w:r>
-    </w:p>
-    <w:p>
-      <w:pPr>
-        <w:pStyle w:val="ListBullet"/>
-      </w:pPr>
-      <w:r>
-        <w:t>Answer scorer: InterviewAI/core/evaluator/evaluator.py</w:t>
-      </w:r>
-    </w:p>
-    <w:p>
-      <w:pPr>
-        <w:pStyle w:val="ListBullet"/>
-      </w:pPr>
-      <w:r>
-        <w:t>Skill graph: InterviewAI/core/graph/skill_graph.py</w:t>
-      </w:r>
-    </w:p>
-    <w:p>
-      <w:pPr>
-        <w:pStyle w:val="ListBullet"/>
-      </w:pPr>
-      <w:r>
-        <w:t>State tracker: InterviewAI/core/graph/state.py</w:t>
-      </w:r>
-    </w:p>
-    <w:p>
-      <w:pPr>
-        <w:pStyle w:val="ListBullet"/>
-      </w:pPr>
-      <w:r>
-        <w:t>Next question picker: InterviewAI/core/graph/traversal.py</w:t>
-      </w:r>
-    </w:p>
-    <w:p>
-      <w:pPr>
-        <w:pStyle w:val="ListBullet"/>
-      </w:pPr>
-      <w:r>
-        <w:t>Charts: InterviewAI/core/graph/visualize.py</w:t>
-      </w:r>
-    </w:p>
-    <w:p>
-      <w:pPr>
-        <w:pStyle w:val="ListBullet"/>
-      </w:pPr>
-      <w:r>
-        <w:t>Interview loop: InterviewAI/core/pipeline/interview_loop.py</w:t>
-      </w:r>
-    </w:p>
-    <w:p>
-      <w:pPr>
-        <w:pStyle w:val="ListBullet"/>
-      </w:pPr>
-      <w:r>
-        <w:t>Report generator: InterviewAI/core/report/generator.py</w:t>
-      </w:r>
-    </w:p>
-    <w:p>
-      <w:pPr>
-        <w:pStyle w:val="ListBullet"/>
-      </w:pPr>
-      <w:r>
-        <w:t>Voice agent: InterviewAI/core/livekit/run_agent.py</w:t>
-      </w:r>
-    </w:p>
-    <w:p>
-      <w:pPr>
-        <w:pStyle w:val="ListBullet"/>
-      </w:pPr>
-      <w:r>
-        <w:t>Web server: InterviewAI/core/livekit/whisper_server.py</w:t>
-      </w:r>
-    </w:p>
-    <w:p>
-      <w:pPr>
-        <w:pStyle w:val="ListBullet"/>
-      </w:pPr>
-      <w:r>
-        <w:t>Server launcher: InterviewAI/core/livekit/launcher.py</w:t>
-      </w:r>
-    </w:p>
-    <w:p>
-      <w:pPr>
-        <w:pStyle w:val="ListBullet"/>
-      </w:pPr>
-      <w:r>
-        <w:t>Voice UI page: InterviewAI/core/livekit/client.html</w:t>
-      </w:r>
-    </w:p>
-    <w:p>
-      <w:pPr>
-        <w:pStyle w:val="ListBullet"/>
-      </w:pPr>
-      <w:r>
-        <w:t>LiveKit config: InterviewAI/core/livekit/livekit.yaml</w:t>
-      </w:r>
-    </w:p>
-    <w:p/>
-    <w:p>
-      <w:r>
-        <w:rPr>
-          <w:b/>
-          <w:i w:val="0"/>
-        </w:rPr>
-        <w:t>API Keys needed (in .env file):</w:t>
-      </w:r>
-    </w:p>
-    <w:p>
-      <w:pPr>
-        <w:pStyle w:val="ListBullet"/>
-      </w:pPr>
-      <w:r>
-        <w:t>GEMINI_API_KEY — AI brain (required for everything)</w:t>
-      </w:r>
-    </w:p>
-    <w:p>
-      <w:pPr>
-        <w:pStyle w:val="ListBullet"/>
-      </w:pPr>
-      <w:r>
-        <w:t>DEEPGRAM_API_KEY — Speech-to-text (required for voice mode)</w:t>
-      </w:r>
-    </w:p>
-    <w:p>
-      <w:pPr>
-        <w:pStyle w:val="ListBullet"/>
-      </w:pPr>
-      <w:r>
-        <w:t>ELEVENLABS_API_KEY — Text-to-speech (required for voice mode)</w:t>
-      </w:r>
-    </w:p>
-    <w:p/>
-    <w:p>
-      <w:r>
-        <w:rPr>
-          <w:b/>
-          <w:i w:val="0"/>
-        </w:rPr>
-        <w:t>How to run:</w:t>
-      </w:r>
-    </w:p>
-    <w:p>
-      <w:pPr>
-        <w:pStyle w:val="ListBullet"/>
-      </w:pPr>
-      <w:r>
-        <w:t>Text Mode: streamlit run InterviewAI/app.py</w:t>
-      </w:r>
-    </w:p>
-    <w:p>
-      <w:pPr>
-        <w:pStyle w:val="ListBullet"/>
-      </w:pPr>
-      <w:r>
-        <w:t>Voice Mode: python InterviewAI/core/livekit/launcher.py (then open the URL)</w:t>
-      </w:r>
-    </w:p>
-    <w:p>
-      <w:pPr>
-        <w:pStyle w:val="ListBullet"/>
-      </w:pPr>
-      <w:r>
-        <w:t>Docker: docker-compose up (from project root)</w:t>
-      </w:r>
-    </w:p>
-    <w:p/>
-    <w:p>
-      <w:r>
-        <w:rPr>
-          <w:b/>
-          <w:i w:val="0"/>
-        </w:rPr>
-        <w:t>Scoring thresholds:</w:t>
-      </w:r>
-    </w:p>
-    <w:p>
-      <w:pPr>
-        <w:pStyle w:val="ListBullet"/>
-      </w:pPr>
-      <w:r>
-        <w:t>Strong Hire: score ≥ 70 out of 100</w:t>
-      </w:r>
-    </w:p>
-    <w:p>
-      <w:pPr>
-        <w:pStyle w:val="ListBullet"/>
-      </w:pPr>
-      <w:r>
-        <w:t>Weak Hire: score 40 to 69</w:t>
-      </w:r>
-    </w:p>
-    <w:p>
-      <w:pPr>
-        <w:pStyle w:val="ListBullet"/>
-      </w:pPr>
-      <w:r>
-        <w:t>No Hire: score &lt; 40</w:t>
-      </w:r>
-    </w:p>
-    <w:p/>
-    <w:p>
-      <w:r>
-        <w:rPr>
-          <w:b/>
-          <w:i w:val="0"/>
-        </w:rPr>
-        <w:t>Question limits:</w:t>
-      </w:r>
-    </w:p>
-    <w:p>
-      <w:pPr>
-        <w:pStyle w:val="ListBullet"/>
-      </w:pPr>
-      <w:r>
-        <w:t>Text Mode: maximum 3 questions</w:t>
-      </w:r>
-    </w:p>
-    <w:p>
-      <w:pPr>
-        <w:pStyle w:val="ListBullet"/>
-      </w:pPr>
-      <w:r>
-        <w:t>LiveKit Mode: maximum 5 questions</w:t>
-      </w:r>
-    </w:p>
-    <w:p>
-      <w:pPr>
-        <w:pStyle w:val="Heading1"/>
-      </w:pPr>
-      <w:r>
-        <w:rPr>
-          <w:color w:val="1A56DB"/>
-        </w:rPr>
-        <w:t>10. How to Make a Video Script from This Document</w:t>
-      </w:r>
-    </w:p>
-    <w:p>
-      <w:r>
-        <w:rPr>
-          <w:b w:val="0"/>
-          <w:i/>
-        </w:rPr>
-        <w:t>Option 1: Give this whole document to ChatGPT or Claude and ask:</w:t>
-      </w:r>
-    </w:p>
-    <w:p>
-      <w:r>
-        <w:rPr>
-          <w:b w:val="0"/>
-          <w:i w:val="0"/>
-        </w:rPr>
-        <w:t>"Create a 5-minute video script explaining the InterviewAI project. Start with what problem it solves, then walk through the 6 steps, then show the two interview modes. Use simple language for a non-technical audience."</w:t>
-      </w:r>
-    </w:p>
-    <w:p/>
-    <w:p>
-      <w:r>
-        <w:rPr>
-          <w:b/>
-          <w:i w:val="0"/>
-        </w:rPr>
-        <w:t>Option 2: Key points to cover in any presentation:</w:t>
-      </w:r>
-    </w:p>
-    <w:p>
-      <w:pPr>
-        <w:pStyle w:val="ListBullet"/>
-      </w:pPr>
-      <w:r>
-        <w:t>Problem: Technical interviews are time-consuming and inconsistent.</w:t>
-      </w:r>
-    </w:p>
-    <w:p>
-      <w:pPr>
-        <w:pStyle w:val="ListBullet"/>
-      </w:pPr>
-      <w:r>
-        <w:t>Solution: AI that conducts interviews automatically and objectively.</w:t>
-      </w:r>
-    </w:p>
-    <w:p>
-      <w:pPr>
-        <w:pStyle w:val="ListBullet"/>
-      </w:pPr>
-      <w:r>
-        <w:t>Input: Just a CV + Job Description.</w:t>
-      </w:r>
-    </w:p>
-    <w:p>
-      <w:pPr>
-        <w:pStyle w:val="ListBullet"/>
-      </w:pPr>
-      <w:r>
-        <w:t>Process: 6 steps from upload to final report.</w:t>
-      </w:r>
-    </w:p>
-    <w:p>
-      <w:pPr>
-        <w:pStyle w:val="ListBullet"/>
-      </w:pPr>
-      <w:r>
-        <w:t>Two modes: Text (simple) and Voice (like real interview).</w:t>
-      </w:r>
-    </w:p>
-    <w:p>
-      <w:pPr>
-        <w:pStyle w:val="ListBullet"/>
-      </w:pPr>
-      <w:r>
-        <w:t>Output: Full report with score, strengths, gaps, and verdict.</w:t>
-      </w:r>
-    </w:p>
-    <w:p>
-      <w:pPr>
-        <w:pStyle w:val="ListBullet"/>
-      </w:pPr>
-      <w:r>
-        <w:t>Tech: Gemini (brain), LiveKit (video/voice), Deepgram (listening), ElevenLabs (speaking).</w:t>
+        <w:t>During the meeting, keep this document open and point to the relevant sections.</w:t>
       </w:r>
     </w:p>
     <w:sectPr>
@@ -2087,7 +3267,7 @@
     <w:qFormat/>
     <w:rsid w:val="00FC693F"/>
     <w:pPr>
-      <w:spacing w:after="120"/>
+      <w:spacing w:after="120" w:line="276" w:lineRule="auto"/>
     </w:pPr>
     <w:rPr>
       <w:rFonts w:ascii="Calibri" w:hAnsi="Calibri"/>

</xml_diff>

<commit_message>
Add real-time facial expression tracking to voice interview
- Integrated face-api.js (face-api@0.22.2) in client.html
- Loads TinyFaceDetector + FaceExpressionNet models from CDN
- Detects 7 emotions every 2 seconds: happy, sad, angry, fearful, surprised, disgusted, neutral
- Live mood panel shows: emoji, name, confidence bar, percentage
- Mood timeline with color-coded dots and hover tooltips
- Mood summary (dominant emotion + breakdown) saved with transcript at end
- Models loaded once, cached by browser after first load
- Graceful fallback if model fails to load

Updated PROJECT_GUIDE.docx to document the feature
</commit_message>
<xml_diff>
--- a/InterviewAI/PROJECT_GUIDE.docx
+++ b/InterviewAI/PROJECT_GUIDE.docx
@@ -1416,7 +1416,7 @@
           <w:rFonts w:ascii="Courier New" w:hAnsi="Courier New"/>
           <w:sz w:val="18"/>
         </w:rPr>
-        <w:t>│       ├── client.html       Web page the candidate sees (webcam, chat, transcript)</w:t>
+        <w:t>│       ├── client.html       Web page the candidate sees (webcam, mood tracking, chat, transcript)</w:t>
       </w:r>
     </w:p>
     <w:p>
@@ -2271,7 +2271,7 @@
           <w:b w:val="0"/>
           <w:i w:val="0"/>
         </w:rPr>
-        <w:t>This is the page the candidate sees during the voice interview. It shows:</w:t>
+        <w:t>This is the page the candidate sees during the voice interview. It shows: webcam feed, live mood tracking (facial expressions like happy/sad/neutral), real-time transcription, chat log, current question.</w:t>
       </w:r>
     </w:p>
     <w:p>
@@ -2279,7 +2279,7 @@
         <w:pStyle w:val="ListBullet"/>
       </w:pPr>
       <w:r>
-        <w:t>A webcam feed (the candidate sees themselves).</w:t>
+        <w:t>A webcam feed with a live mood panel (real-time facial expression detection using face-api.js — shows emoji + confidence bar + timeline of mood changes).</w:t>
       </w:r>
     </w:p>
     <w:p>

</xml_diff>